<commit_message>
Eliminate missing font glyph boxes in report equations
</commit_message>
<xml_diff>
--- a/docs/Master_CRT_Assignment_Reports.docx
+++ b/docs/Master_CRT_Assignment_Reports.docx
@@ -398,7 +398,7 @@
         <w:spacing w:after="60"/>
       </w:pPr>
       <w:r>
-        <w:t>Partial Products: M₁ = 35, M₂ = 21, M₃ = 15.</w:t>
+        <w:t>Partial Products: M1 = 35, M2 = 21, M3 = 15.</w:t>
       </w:r>
     </w:p>
     <w:p>
@@ -415,7 +415,16 @@
         <w:spacing w:after="80" w:line="276" w:lineRule="auto"/>
       </w:pPr>
       <w:r>
-        <w:t xml:space="preserve">   • 35 · y₁ ≡ 1 (mod 3) ⇒ 2 · y₁ ≡ 1 (mod 3) ⇒ y₁ = 2</w:t>
+        <w:t xml:space="preserve">   • 35 </w:t>
+      </w:r>
+      <w:r>
+        <w:rPr>
+          <w:i/>
+        </w:rPr>
+        <w:t xml:space="preserve"> y1 ≡ 1 (mod 3) ⇒ 2 </w:t>
+      </w:r>
+      <w:r>
+        <w:t xml:space="preserve"> y1 ≡ 1 (mod 3) ⇒ y1 = 2</w:t>
       </w:r>
     </w:p>
     <w:p>
@@ -423,7 +432,16 @@
         <w:spacing w:after="80" w:line="276" w:lineRule="auto"/>
       </w:pPr>
       <w:r>
-        <w:t xml:space="preserve">   • 21 · y₂ ≡ 1 (mod 5) ⇒ 1 · y₂ ≡ 1 (mod 5) ⇒ y₂ = 1</w:t>
+        <w:t xml:space="preserve">   • 21 </w:t>
+      </w:r>
+      <w:r>
+        <w:rPr>
+          <w:i/>
+        </w:rPr>
+        <w:t xml:space="preserve"> y2 ≡ 1 (mod 5) ⇒ 1 </w:t>
+      </w:r>
+      <w:r>
+        <w:t xml:space="preserve"> y2 ≡ 1 (mod 5) ⇒ y2 = 1</w:t>
       </w:r>
     </w:p>
     <w:p>
@@ -431,7 +449,16 @@
         <w:spacing w:after="80" w:line="276" w:lineRule="auto"/>
       </w:pPr>
       <w:r>
-        <w:t xml:space="preserve">   • 15 · y₃ ≡ 1 (mod 7) ⇒ 1 · y₃ ≡ 1 (mod 7) ⇒ y₃ = 1</w:t>
+        <w:t xml:space="preserve">   • 15 </w:t>
+      </w:r>
+      <w:r>
+        <w:rPr>
+          <w:i/>
+        </w:rPr>
+        <w:t xml:space="preserve"> y3 ≡ 1 (mod 7) ⇒ 1 </w:t>
+      </w:r>
+      <w:r>
+        <w:t xml:space="preserve"> y3 ≡ 1 (mod 7) ⇒ y3 = 1</w:t>
       </w:r>
     </w:p>
     <w:p>
@@ -616,7 +643,7 @@
         <w:spacing w:after="60"/>
       </w:pPr>
       <w:r>
-        <w:t>Intersection Signal Monitors (3 min, 5 min, 7 min): Shows real-time remainder values (x mod mᵢ) and green light indicator status.</w:t>
+        <w:t>Intersection Signal Monitors (3 min, 5 min, 7 min): Shows real-time remainder values (x mod mi) and green light indicator status.</w:t>
       </w:r>
     </w:p>
     <w:p>
@@ -1254,7 +1281,7 @@
         <w:spacing w:after="60"/>
       </w:pPr>
       <w:r>
-        <w:t>Partial Products: M₁ = 35, M₂ = 21, M₃ = 15.</w:t>
+        <w:t>Partial Products: M1 = 35, M2 = 21, M3 = 15.</w:t>
       </w:r>
     </w:p>
     <w:p>
@@ -1271,7 +1298,16 @@
         <w:spacing w:after="80" w:line="276" w:lineRule="auto"/>
       </w:pPr>
       <w:r>
-        <w:t xml:space="preserve">   • 35 · y₁ ≡ 1 (mod 3) ⇒ 2 · y₁ ≡ 1 (mod 3) ⇒ y₁ = 2</w:t>
+        <w:t xml:space="preserve">   • 35 </w:t>
+      </w:r>
+      <w:r>
+        <w:rPr>
+          <w:i/>
+        </w:rPr>
+        <w:t xml:space="preserve"> y1 ≡ 1 (mod 3) ⇒ 2 </w:t>
+      </w:r>
+      <w:r>
+        <w:t xml:space="preserve"> y1 ≡ 1 (mod 3) ⇒ y1 = 2</w:t>
       </w:r>
     </w:p>
     <w:p>
@@ -1279,7 +1315,16 @@
         <w:spacing w:after="80" w:line="276" w:lineRule="auto"/>
       </w:pPr>
       <w:r>
-        <w:t xml:space="preserve">   • 21 · y₂ ≡ 1 (mod 5) ⇒ 1 · y₂ ≡ 1 (mod 5) ⇒ y₂ = 1</w:t>
+        <w:t xml:space="preserve">   • 21 </w:t>
+      </w:r>
+      <w:r>
+        <w:rPr>
+          <w:i/>
+        </w:rPr>
+        <w:t xml:space="preserve"> y2 ≡ 1 (mod 5) ⇒ 1 </w:t>
+      </w:r>
+      <w:r>
+        <w:t xml:space="preserve"> y2 ≡ 1 (mod 5) ⇒ y2 = 1</w:t>
       </w:r>
     </w:p>
     <w:p>
@@ -1287,7 +1332,16 @@
         <w:spacing w:after="80" w:line="276" w:lineRule="auto"/>
       </w:pPr>
       <w:r>
-        <w:t xml:space="preserve">   • 15 · y₃ ≡ 1 (mod 7) ⇒ 1 · y₃ ≡ 1 (mod 7) ⇒ y₃ = 1</w:t>
+        <w:t xml:space="preserve">   • 15 </w:t>
+      </w:r>
+      <w:r>
+        <w:rPr>
+          <w:i/>
+        </w:rPr>
+        <w:t xml:space="preserve"> y3 ≡ 1 (mod 7) ⇒ 1 </w:t>
+      </w:r>
+      <w:r>
+        <w:t xml:space="preserve"> y3 ≡ 1 (mod 7) ⇒ y3 = 1</w:t>
       </w:r>
     </w:p>
     <w:p>
@@ -1472,7 +1526,7 @@
         <w:spacing w:after="60"/>
       </w:pPr>
       <w:r>
-        <w:t>Intersection Signal Monitors (3 min, 5 min, 7 min): Shows real-time remainder values (x mod mᵢ) and green light indicator status.</w:t>
+        <w:t>Intersection Signal Monitors (3 min, 5 min, 7 min): Shows real-time remainder values (x mod mi) and green light indicator status.</w:t>
       </w:r>
     </w:p>
     <w:p>
@@ -2110,7 +2164,7 @@
         <w:spacing w:after="60"/>
       </w:pPr>
       <w:r>
-        <w:t>Partial Products: M₁ = 35, M₂ = 21, M₃ = 15.</w:t>
+        <w:t>Partial Products: M1 = 35, M2 = 21, M3 = 15.</w:t>
       </w:r>
     </w:p>
     <w:p>
@@ -2127,7 +2181,16 @@
         <w:spacing w:after="80" w:line="276" w:lineRule="auto"/>
       </w:pPr>
       <w:r>
-        <w:t xml:space="preserve">   • 35 · y₁ ≡ 1 (mod 3) ⇒ 2 · y₁ ≡ 1 (mod 3) ⇒ y₁ = 2</w:t>
+        <w:t xml:space="preserve">   • 35 </w:t>
+      </w:r>
+      <w:r>
+        <w:rPr>
+          <w:i/>
+        </w:rPr>
+        <w:t xml:space="preserve"> y1 ≡ 1 (mod 3) ⇒ 2 </w:t>
+      </w:r>
+      <w:r>
+        <w:t xml:space="preserve"> y1 ≡ 1 (mod 3) ⇒ y1 = 2</w:t>
       </w:r>
     </w:p>
     <w:p>
@@ -2135,7 +2198,16 @@
         <w:spacing w:after="80" w:line="276" w:lineRule="auto"/>
       </w:pPr>
       <w:r>
-        <w:t xml:space="preserve">   • 21 · y₂ ≡ 1 (mod 5) ⇒ 1 · y₂ ≡ 1 (mod 5) ⇒ y₂ = 1</w:t>
+        <w:t xml:space="preserve">   • 21 </w:t>
+      </w:r>
+      <w:r>
+        <w:rPr>
+          <w:i/>
+        </w:rPr>
+        <w:t xml:space="preserve"> y2 ≡ 1 (mod 5) ⇒ 1 </w:t>
+      </w:r>
+      <w:r>
+        <w:t xml:space="preserve"> y2 ≡ 1 (mod 5) ⇒ y2 = 1</w:t>
       </w:r>
     </w:p>
     <w:p>
@@ -2143,7 +2215,16 @@
         <w:spacing w:after="80" w:line="276" w:lineRule="auto"/>
       </w:pPr>
       <w:r>
-        <w:t xml:space="preserve">   • 15 · y₃ ≡ 1 (mod 7) ⇒ 1 · y₃ ≡ 1 (mod 7) ⇒ y₃ = 1</w:t>
+        <w:t xml:space="preserve">   • 15 </w:t>
+      </w:r>
+      <w:r>
+        <w:rPr>
+          <w:i/>
+        </w:rPr>
+        <w:t xml:space="preserve"> y3 ≡ 1 (mod 7) ⇒ 1 </w:t>
+      </w:r>
+      <w:r>
+        <w:t xml:space="preserve"> y3 ≡ 1 (mod 7) ⇒ y3 = 1</w:t>
       </w:r>
     </w:p>
     <w:p>
@@ -2328,7 +2409,7 @@
         <w:spacing w:after="60"/>
       </w:pPr>
       <w:r>
-        <w:t>Intersection Signal Monitors (3 min, 5 min, 7 min): Shows real-time remainder values (x mod mᵢ) and green light indicator status.</w:t>
+        <w:t>Intersection Signal Monitors (3 min, 5 min, 7 min): Shows real-time remainder values (x mod mi) and green light indicator status.</w:t>
       </w:r>
     </w:p>
     <w:p>
@@ -2966,7 +3047,7 @@
         <w:spacing w:after="60"/>
       </w:pPr>
       <w:r>
-        <w:t>Partial Products: M₁ = 35, M₂ = 21, M₃ = 15.</w:t>
+        <w:t>Partial Products: M1 = 35, M2 = 21, M3 = 15.</w:t>
       </w:r>
     </w:p>
     <w:p>
@@ -2983,7 +3064,16 @@
         <w:spacing w:after="80" w:line="276" w:lineRule="auto"/>
       </w:pPr>
       <w:r>
-        <w:t xml:space="preserve">   • 35 · y₁ ≡ 1 (mod 3) ⇒ 2 · y₁ ≡ 1 (mod 3) ⇒ y₁ = 2</w:t>
+        <w:t xml:space="preserve">   • 35 </w:t>
+      </w:r>
+      <w:r>
+        <w:rPr>
+          <w:i/>
+        </w:rPr>
+        <w:t xml:space="preserve"> y1 ≡ 1 (mod 3) ⇒ 2 </w:t>
+      </w:r>
+      <w:r>
+        <w:t xml:space="preserve"> y1 ≡ 1 (mod 3) ⇒ y1 = 2</w:t>
       </w:r>
     </w:p>
     <w:p>
@@ -2991,7 +3081,16 @@
         <w:spacing w:after="80" w:line="276" w:lineRule="auto"/>
       </w:pPr>
       <w:r>
-        <w:t xml:space="preserve">   • 21 · y₂ ≡ 1 (mod 5) ⇒ 1 · y₂ ≡ 1 (mod 5) ⇒ y₂ = 1</w:t>
+        <w:t xml:space="preserve">   • 21 </w:t>
+      </w:r>
+      <w:r>
+        <w:rPr>
+          <w:i/>
+        </w:rPr>
+        <w:t xml:space="preserve"> y2 ≡ 1 (mod 5) ⇒ 1 </w:t>
+      </w:r>
+      <w:r>
+        <w:t xml:space="preserve"> y2 ≡ 1 (mod 5) ⇒ y2 = 1</w:t>
       </w:r>
     </w:p>
     <w:p>
@@ -2999,7 +3098,16 @@
         <w:spacing w:after="80" w:line="276" w:lineRule="auto"/>
       </w:pPr>
       <w:r>
-        <w:t xml:space="preserve">   • 15 · y₃ ≡ 1 (mod 7) ⇒ 1 · y₃ ≡ 1 (mod 7) ⇒ y₃ = 1</w:t>
+        <w:t xml:space="preserve">   • 15 </w:t>
+      </w:r>
+      <w:r>
+        <w:rPr>
+          <w:i/>
+        </w:rPr>
+        <w:t xml:space="preserve"> y3 ≡ 1 (mod 7) ⇒ 1 </w:t>
+      </w:r>
+      <w:r>
+        <w:t xml:space="preserve"> y3 ≡ 1 (mod 7) ⇒ y3 = 1</w:t>
       </w:r>
     </w:p>
     <w:p>
@@ -3184,7 +3292,7 @@
         <w:spacing w:after="60"/>
       </w:pPr>
       <w:r>
-        <w:t>Intersection Signal Monitors (3 min, 5 min, 7 min): Shows real-time remainder values (x mod mᵢ) and green light indicator status.</w:t>
+        <w:t>Intersection Signal Monitors (3 min, 5 min, 7 min): Shows real-time remainder values (x mod mi) and green light indicator status.</w:t>
       </w:r>
     </w:p>
     <w:p>
@@ -3822,7 +3930,7 @@
         <w:spacing w:after="60"/>
       </w:pPr>
       <w:r>
-        <w:t>Partial Products: M₁ = 35, M₂ = 21, M₃ = 15.</w:t>
+        <w:t>Partial Products: M1 = 35, M2 = 21, M3 = 15.</w:t>
       </w:r>
     </w:p>
     <w:p>
@@ -3839,7 +3947,16 @@
         <w:spacing w:after="80" w:line="276" w:lineRule="auto"/>
       </w:pPr>
       <w:r>
-        <w:t xml:space="preserve">   • 35 · y₁ ≡ 1 (mod 3) ⇒ 2 · y₁ ≡ 1 (mod 3) ⇒ y₁ = 2</w:t>
+        <w:t xml:space="preserve">   • 35 </w:t>
+      </w:r>
+      <w:r>
+        <w:rPr>
+          <w:i/>
+        </w:rPr>
+        <w:t xml:space="preserve"> y1 ≡ 1 (mod 3) ⇒ 2 </w:t>
+      </w:r>
+      <w:r>
+        <w:t xml:space="preserve"> y1 ≡ 1 (mod 3) ⇒ y1 = 2</w:t>
       </w:r>
     </w:p>
     <w:p>
@@ -3847,7 +3964,16 @@
         <w:spacing w:after="80" w:line="276" w:lineRule="auto"/>
       </w:pPr>
       <w:r>
-        <w:t xml:space="preserve">   • 21 · y₂ ≡ 1 (mod 5) ⇒ 1 · y₂ ≡ 1 (mod 5) ⇒ y₂ = 1</w:t>
+        <w:t xml:space="preserve">   • 21 </w:t>
+      </w:r>
+      <w:r>
+        <w:rPr>
+          <w:i/>
+        </w:rPr>
+        <w:t xml:space="preserve"> y2 ≡ 1 (mod 5) ⇒ 1 </w:t>
+      </w:r>
+      <w:r>
+        <w:t xml:space="preserve"> y2 ≡ 1 (mod 5) ⇒ y2 = 1</w:t>
       </w:r>
     </w:p>
     <w:p>
@@ -3855,7 +3981,16 @@
         <w:spacing w:after="80" w:line="276" w:lineRule="auto"/>
       </w:pPr>
       <w:r>
-        <w:t xml:space="preserve">   • 15 · y₃ ≡ 1 (mod 7) ⇒ 1 · y₃ ≡ 1 (mod 7) ⇒ y₃ = 1</w:t>
+        <w:t xml:space="preserve">   • 15 </w:t>
+      </w:r>
+      <w:r>
+        <w:rPr>
+          <w:i/>
+        </w:rPr>
+        <w:t xml:space="preserve"> y3 ≡ 1 (mod 7) ⇒ 1 </w:t>
+      </w:r>
+      <w:r>
+        <w:t xml:space="preserve"> y3 ≡ 1 (mod 7) ⇒ y3 = 1</w:t>
       </w:r>
     </w:p>
     <w:p>
@@ -4040,7 +4175,7 @@
         <w:spacing w:after="60"/>
       </w:pPr>
       <w:r>
-        <w:t>Intersection Signal Monitors (3 min, 5 min, 7 min): Shows real-time remainder values (x mod mᵢ) and green light indicator status.</w:t>
+        <w:t>Intersection Signal Monitors (3 min, 5 min, 7 min): Shows real-time remainder values (x mod mi) and green light indicator status.</w:t>
       </w:r>
     </w:p>
     <w:p>
@@ -4678,7 +4813,7 @@
         <w:spacing w:after="60"/>
       </w:pPr>
       <w:r>
-        <w:t>Partial Products: M₁ = 35, M₂ = 21, M₃ = 15.</w:t>
+        <w:t>Partial Products: M1 = 35, M2 = 21, M3 = 15.</w:t>
       </w:r>
     </w:p>
     <w:p>
@@ -4695,7 +4830,16 @@
         <w:spacing w:after="80" w:line="276" w:lineRule="auto"/>
       </w:pPr>
       <w:r>
-        <w:t xml:space="preserve">   • 35 · y₁ ≡ 1 (mod 3) ⇒ 2 · y₁ ≡ 1 (mod 3) ⇒ y₁ = 2</w:t>
+        <w:t xml:space="preserve">   • 35 </w:t>
+      </w:r>
+      <w:r>
+        <w:rPr>
+          <w:i/>
+        </w:rPr>
+        <w:t xml:space="preserve"> y1 ≡ 1 (mod 3) ⇒ 2 </w:t>
+      </w:r>
+      <w:r>
+        <w:t xml:space="preserve"> y1 ≡ 1 (mod 3) ⇒ y1 = 2</w:t>
       </w:r>
     </w:p>
     <w:p>
@@ -4703,7 +4847,16 @@
         <w:spacing w:after="80" w:line="276" w:lineRule="auto"/>
       </w:pPr>
       <w:r>
-        <w:t xml:space="preserve">   • 21 · y₂ ≡ 1 (mod 5) ⇒ 1 · y₂ ≡ 1 (mod 5) ⇒ y₂ = 1</w:t>
+        <w:t xml:space="preserve">   • 21 </w:t>
+      </w:r>
+      <w:r>
+        <w:rPr>
+          <w:i/>
+        </w:rPr>
+        <w:t xml:space="preserve"> y2 ≡ 1 (mod 5) ⇒ 1 </w:t>
+      </w:r>
+      <w:r>
+        <w:t xml:space="preserve"> y2 ≡ 1 (mod 5) ⇒ y2 = 1</w:t>
       </w:r>
     </w:p>
     <w:p>
@@ -4711,7 +4864,16 @@
         <w:spacing w:after="80" w:line="276" w:lineRule="auto"/>
       </w:pPr>
       <w:r>
-        <w:t xml:space="preserve">   • 15 · y₃ ≡ 1 (mod 7) ⇒ 1 · y₃ ≡ 1 (mod 7) ⇒ y₃ = 1</w:t>
+        <w:t xml:space="preserve">   • 15 </w:t>
+      </w:r>
+      <w:r>
+        <w:rPr>
+          <w:i/>
+        </w:rPr>
+        <w:t xml:space="preserve"> y3 ≡ 1 (mod 7) ⇒ 1 </w:t>
+      </w:r>
+      <w:r>
+        <w:t xml:space="preserve"> y3 ≡ 1 (mod 7) ⇒ y3 = 1</w:t>
       </w:r>
     </w:p>
     <w:p>
@@ -4896,7 +5058,7 @@
         <w:spacing w:after="60"/>
       </w:pPr>
       <w:r>
-        <w:t>Intersection Signal Monitors (3 min, 5 min, 7 min): Shows real-time remainder values (x mod mᵢ) and green light indicator status.</w:t>
+        <w:t>Intersection Signal Monitors (3 min, 5 min, 7 min): Shows real-time remainder values (x mod mi) and green light indicator status.</w:t>
       </w:r>
     </w:p>
     <w:p>
@@ -5534,7 +5696,7 @@
         <w:spacing w:after="60"/>
       </w:pPr>
       <w:r>
-        <w:t>Partial Products: M₁ = 35, M₂ = 21, M₃ = 15.</w:t>
+        <w:t>Partial Products: M1 = 35, M2 = 21, M3 = 15.</w:t>
       </w:r>
     </w:p>
     <w:p>
@@ -5551,7 +5713,16 @@
         <w:spacing w:after="80" w:line="276" w:lineRule="auto"/>
       </w:pPr>
       <w:r>
-        <w:t xml:space="preserve">   • 35 · y₁ ≡ 1 (mod 3) ⇒ 2 · y₁ ≡ 1 (mod 3) ⇒ y₁ = 2</w:t>
+        <w:t xml:space="preserve">   • 35 </w:t>
+      </w:r>
+      <w:r>
+        <w:rPr>
+          <w:i/>
+        </w:rPr>
+        <w:t xml:space="preserve"> y1 ≡ 1 (mod 3) ⇒ 2 </w:t>
+      </w:r>
+      <w:r>
+        <w:t xml:space="preserve"> y1 ≡ 1 (mod 3) ⇒ y1 = 2</w:t>
       </w:r>
     </w:p>
     <w:p>
@@ -5559,7 +5730,16 @@
         <w:spacing w:after="80" w:line="276" w:lineRule="auto"/>
       </w:pPr>
       <w:r>
-        <w:t xml:space="preserve">   • 21 · y₂ ≡ 1 (mod 5) ⇒ 1 · y₂ ≡ 1 (mod 5) ⇒ y₂ = 1</w:t>
+        <w:t xml:space="preserve">   • 21 </w:t>
+      </w:r>
+      <w:r>
+        <w:rPr>
+          <w:i/>
+        </w:rPr>
+        <w:t xml:space="preserve"> y2 ≡ 1 (mod 5) ⇒ 1 </w:t>
+      </w:r>
+      <w:r>
+        <w:t xml:space="preserve"> y2 ≡ 1 (mod 5) ⇒ y2 = 1</w:t>
       </w:r>
     </w:p>
     <w:p>
@@ -5567,7 +5747,16 @@
         <w:spacing w:after="80" w:line="276" w:lineRule="auto"/>
       </w:pPr>
       <w:r>
-        <w:t xml:space="preserve">   • 15 · y₃ ≡ 1 (mod 7) ⇒ 1 · y₃ ≡ 1 (mod 7) ⇒ y₃ = 1</w:t>
+        <w:t xml:space="preserve">   • 15 </w:t>
+      </w:r>
+      <w:r>
+        <w:rPr>
+          <w:i/>
+        </w:rPr>
+        <w:t xml:space="preserve"> y3 ≡ 1 (mod 7) ⇒ 1 </w:t>
+      </w:r>
+      <w:r>
+        <w:t xml:space="preserve"> y3 ≡ 1 (mod 7) ⇒ y3 = 1</w:t>
       </w:r>
     </w:p>
     <w:p>
@@ -5752,7 +5941,7 @@
         <w:spacing w:after="60"/>
       </w:pPr>
       <w:r>
-        <w:t>Intersection Signal Monitors (3 min, 5 min, 7 min): Shows real-time remainder values (x mod mᵢ) and green light indicator status.</w:t>
+        <w:t>Intersection Signal Monitors (3 min, 5 min, 7 min): Shows real-time remainder values (x mod mi) and green light indicator status.</w:t>
       </w:r>
     </w:p>
     <w:p>
@@ -6390,7 +6579,7 @@
         <w:spacing w:after="60"/>
       </w:pPr>
       <w:r>
-        <w:t>Partial Products: M₁ = 35, M₂ = 21, M₃ = 15.</w:t>
+        <w:t>Partial Products: M1 = 35, M2 = 21, M3 = 15.</w:t>
       </w:r>
     </w:p>
     <w:p>
@@ -6407,7 +6596,16 @@
         <w:spacing w:after="80" w:line="276" w:lineRule="auto"/>
       </w:pPr>
       <w:r>
-        <w:t xml:space="preserve">   • 35 · y₁ ≡ 1 (mod 3) ⇒ 2 · y₁ ≡ 1 (mod 3) ⇒ y₁ = 2</w:t>
+        <w:t xml:space="preserve">   • 35 </w:t>
+      </w:r>
+      <w:r>
+        <w:rPr>
+          <w:i/>
+        </w:rPr>
+        <w:t xml:space="preserve"> y1 ≡ 1 (mod 3) ⇒ 2 </w:t>
+      </w:r>
+      <w:r>
+        <w:t xml:space="preserve"> y1 ≡ 1 (mod 3) ⇒ y1 = 2</w:t>
       </w:r>
     </w:p>
     <w:p>
@@ -6415,7 +6613,16 @@
         <w:spacing w:after="80" w:line="276" w:lineRule="auto"/>
       </w:pPr>
       <w:r>
-        <w:t xml:space="preserve">   • 21 · y₂ ≡ 1 (mod 5) ⇒ 1 · y₂ ≡ 1 (mod 5) ⇒ y₂ = 1</w:t>
+        <w:t xml:space="preserve">   • 21 </w:t>
+      </w:r>
+      <w:r>
+        <w:rPr>
+          <w:i/>
+        </w:rPr>
+        <w:t xml:space="preserve"> y2 ≡ 1 (mod 5) ⇒ 1 </w:t>
+      </w:r>
+      <w:r>
+        <w:t xml:space="preserve"> y2 ≡ 1 (mod 5) ⇒ y2 = 1</w:t>
       </w:r>
     </w:p>
     <w:p>
@@ -6423,7 +6630,16 @@
         <w:spacing w:after="80" w:line="276" w:lineRule="auto"/>
       </w:pPr>
       <w:r>
-        <w:t xml:space="preserve">   • 15 · y₃ ≡ 1 (mod 7) ⇒ 1 · y₃ ≡ 1 (mod 7) ⇒ y₃ = 1</w:t>
+        <w:t xml:space="preserve">   • 15 </w:t>
+      </w:r>
+      <w:r>
+        <w:rPr>
+          <w:i/>
+        </w:rPr>
+        <w:t xml:space="preserve"> y3 ≡ 1 (mod 7) ⇒ 1 </w:t>
+      </w:r>
+      <w:r>
+        <w:t xml:space="preserve"> y3 ≡ 1 (mod 7) ⇒ y3 = 1</w:t>
       </w:r>
     </w:p>
     <w:p>
@@ -6608,7 +6824,7 @@
         <w:spacing w:after="60"/>
       </w:pPr>
       <w:r>
-        <w:t>Intersection Signal Monitors (3 min, 5 min, 7 min): Shows real-time remainder values (x mod mᵢ) and green light indicator status.</w:t>
+        <w:t>Intersection Signal Monitors (3 min, 5 min, 7 min): Shows real-time remainder values (x mod mi) and green light indicator status.</w:t>
       </w:r>
     </w:p>
     <w:p>
@@ -7246,7 +7462,7 @@
         <w:spacing w:after="60"/>
       </w:pPr>
       <w:r>
-        <w:t>Partial Products: M₁ = 35, M₂ = 21, M₃ = 15.</w:t>
+        <w:t>Partial Products: M1 = 35, M2 = 21, M3 = 15.</w:t>
       </w:r>
     </w:p>
     <w:p>
@@ -7263,7 +7479,16 @@
         <w:spacing w:after="80" w:line="276" w:lineRule="auto"/>
       </w:pPr>
       <w:r>
-        <w:t xml:space="preserve">   • 35 · y₁ ≡ 1 (mod 3) ⇒ 2 · y₁ ≡ 1 (mod 3) ⇒ y₁ = 2</w:t>
+        <w:t xml:space="preserve">   • 35 </w:t>
+      </w:r>
+      <w:r>
+        <w:rPr>
+          <w:i/>
+        </w:rPr>
+        <w:t xml:space="preserve"> y1 ≡ 1 (mod 3) ⇒ 2 </w:t>
+      </w:r>
+      <w:r>
+        <w:t xml:space="preserve"> y1 ≡ 1 (mod 3) ⇒ y1 = 2</w:t>
       </w:r>
     </w:p>
     <w:p>
@@ -7271,7 +7496,16 @@
         <w:spacing w:after="80" w:line="276" w:lineRule="auto"/>
       </w:pPr>
       <w:r>
-        <w:t xml:space="preserve">   • 21 · y₂ ≡ 1 (mod 5) ⇒ 1 · y₂ ≡ 1 (mod 5) ⇒ y₂ = 1</w:t>
+        <w:t xml:space="preserve">   • 21 </w:t>
+      </w:r>
+      <w:r>
+        <w:rPr>
+          <w:i/>
+        </w:rPr>
+        <w:t xml:space="preserve"> y2 ≡ 1 (mod 5) ⇒ 1 </w:t>
+      </w:r>
+      <w:r>
+        <w:t xml:space="preserve"> y2 ≡ 1 (mod 5) ⇒ y2 = 1</w:t>
       </w:r>
     </w:p>
     <w:p>
@@ -7279,7 +7513,16 @@
         <w:spacing w:after="80" w:line="276" w:lineRule="auto"/>
       </w:pPr>
       <w:r>
-        <w:t xml:space="preserve">   • 15 · y₃ ≡ 1 (mod 7) ⇒ 1 · y₃ ≡ 1 (mod 7) ⇒ y₃ = 1</w:t>
+        <w:t xml:space="preserve">   • 15 </w:t>
+      </w:r>
+      <w:r>
+        <w:rPr>
+          <w:i/>
+        </w:rPr>
+        <w:t xml:space="preserve"> y3 ≡ 1 (mod 7) ⇒ 1 </w:t>
+      </w:r>
+      <w:r>
+        <w:t xml:space="preserve"> y3 ≡ 1 (mod 7) ⇒ y3 = 1</w:t>
       </w:r>
     </w:p>
     <w:p>
@@ -7464,7 +7707,7 @@
         <w:spacing w:after="60"/>
       </w:pPr>
       <w:r>
-        <w:t>Intersection Signal Monitors (3 min, 5 min, 7 min): Shows real-time remainder values (x mod mᵢ) and green light indicator status.</w:t>
+        <w:t>Intersection Signal Monitors (3 min, 5 min, 7 min): Shows real-time remainder values (x mod mi) and green light indicator status.</w:t>
       </w:r>
     </w:p>
     <w:p>
@@ -8102,7 +8345,7 @@
         <w:spacing w:after="60"/>
       </w:pPr>
       <w:r>
-        <w:t>Partial Products: M₁ = 35, M₂ = 21, M₃ = 15.</w:t>
+        <w:t>Partial Products: M1 = 35, M2 = 21, M3 = 15.</w:t>
       </w:r>
     </w:p>
     <w:p>
@@ -8119,7 +8362,16 @@
         <w:spacing w:after="80" w:line="276" w:lineRule="auto"/>
       </w:pPr>
       <w:r>
-        <w:t xml:space="preserve">   • 35 · y₁ ≡ 1 (mod 3) ⇒ 2 · y₁ ≡ 1 (mod 3) ⇒ y₁ = 2</w:t>
+        <w:t xml:space="preserve">   • 35 </w:t>
+      </w:r>
+      <w:r>
+        <w:rPr>
+          <w:i/>
+        </w:rPr>
+        <w:t xml:space="preserve"> y1 ≡ 1 (mod 3) ⇒ 2 </w:t>
+      </w:r>
+      <w:r>
+        <w:t xml:space="preserve"> y1 ≡ 1 (mod 3) ⇒ y1 = 2</w:t>
       </w:r>
     </w:p>
     <w:p>
@@ -8127,7 +8379,16 @@
         <w:spacing w:after="80" w:line="276" w:lineRule="auto"/>
       </w:pPr>
       <w:r>
-        <w:t xml:space="preserve">   • 21 · y₂ ≡ 1 (mod 5) ⇒ 1 · y₂ ≡ 1 (mod 5) ⇒ y₂ = 1</w:t>
+        <w:t xml:space="preserve">   • 21 </w:t>
+      </w:r>
+      <w:r>
+        <w:rPr>
+          <w:i/>
+        </w:rPr>
+        <w:t xml:space="preserve"> y2 ≡ 1 (mod 5) ⇒ 1 </w:t>
+      </w:r>
+      <w:r>
+        <w:t xml:space="preserve"> y2 ≡ 1 (mod 5) ⇒ y2 = 1</w:t>
       </w:r>
     </w:p>
     <w:p>
@@ -8135,7 +8396,16 @@
         <w:spacing w:after="80" w:line="276" w:lineRule="auto"/>
       </w:pPr>
       <w:r>
-        <w:t xml:space="preserve">   • 15 · y₃ ≡ 1 (mod 7) ⇒ 1 · y₃ ≡ 1 (mod 7) ⇒ y₃ = 1</w:t>
+        <w:t xml:space="preserve">   • 15 </w:t>
+      </w:r>
+      <w:r>
+        <w:rPr>
+          <w:i/>
+        </w:rPr>
+        <w:t xml:space="preserve"> y3 ≡ 1 (mod 7) ⇒ 1 </w:t>
+      </w:r>
+      <w:r>
+        <w:t xml:space="preserve"> y3 ≡ 1 (mod 7) ⇒ y3 = 1</w:t>
       </w:r>
     </w:p>
     <w:p>
@@ -8320,7 +8590,7 @@
         <w:spacing w:after="60"/>
       </w:pPr>
       <w:r>
-        <w:t>Intersection Signal Monitors (3 min, 5 min, 7 min): Shows real-time remainder values (x mod mᵢ) and green light indicator status.</w:t>
+        <w:t>Intersection Signal Monitors (3 min, 5 min, 7 min): Shows real-time remainder values (x mod mi) and green light indicator status.</w:t>
       </w:r>
     </w:p>
     <w:p>

</xml_diff>

<commit_message>
Update assignment reports with attached dashboard images and Arduino C++ firmware code
</commit_message>
<xml_diff>
--- a/docs/Master_CRT_Assignment_Reports.docx
+++ b/docs/Master_CRT_Assignment_Reports.docx
@@ -168,7 +168,7 @@
         <w:spacing w:after="80" w:line="276" w:lineRule="auto"/>
       </w:pPr>
       <w:r>
-        <w:t>This project demonstrates CRT using both a physical working traffic signal model and an interactive digital web application. By modeling traffic signals as modular timing cycles, the project illustrates how independent light timers (3 min, 5 min, 7 min) align to create a continuous 'Green Wave' for vehicles at Minute 23.</w:t>
+        <w:t>This project demonstrates CRT using both a physical working ATmega328P / Arduino Uno traffic signal model and an interactive digital twin web application. By modeling traffic signals as modular timing cycles, the project illustrates how independent light timers (3s, 5s, 7s) align to create a continuous 'Green Wave' for vehicles at Minute 23 (105s master recurrence).</w:t>
       </w:r>
     </w:p>
     <w:p>
@@ -241,7 +241,7 @@
         <w:spacing w:after="60"/>
       </w:pPr>
       <w:r>
-        <w:t>To model traffic signal timing cycles (3 min, 5 min, 7 min) as modular congruences.</w:t>
+        <w:t>To model traffic signal timing cycles (3s, 5s, 7s) as modular congruences.</w:t>
       </w:r>
     </w:p>
     <w:p>
@@ -250,7 +250,7 @@
         <w:spacing w:after="60"/>
       </w:pPr>
       <w:r>
-        <w:t>To build a physical working model and an interactive web simulator for signal synchronization.</w:t>
+        <w:t>To build a physical working model powered by an Arduino Uno / ATmega328P microcontroller.</w:t>
       </w:r>
     </w:p>
     <w:p>
@@ -259,7 +259,7 @@
         <w:spacing w:after="60"/>
       </w:pPr>
       <w:r>
-        <w:t>To provide clear visual and audio feedback when a candidate time satisfies all signal modulo conditions.</w:t>
+        <w:t>To provide clear visual, audio, and waveform telemetry feedback upon signal synchronization.</w:t>
       </w:r>
     </w:p>
     <w:p>
@@ -305,7 +305,7 @@
         <w:spacing w:after="80" w:line="276" w:lineRule="auto"/>
       </w:pPr>
       <w:r>
-        <w:t>Suppose three traffic signals have cycle lengths of 3, 5, and 7 minutes respectively:</w:t>
+        <w:t>Suppose three traffic signals have cycle lengths of 3, 5, and 7 seconds respectively:</w:t>
       </w:r>
     </w:p>
     <w:p>
@@ -314,7 +314,7 @@
         <w:spacing w:after="60"/>
       </w:pPr>
       <w:r>
-        <w:t>Signal 1: x ≡ 2 (mod 3)   (green 2 minutes ago)</w:t>
+        <w:t>Signal 1: x ≡ 2 (mod 3)   (green 2 seconds ago)</w:t>
       </w:r>
     </w:p>
     <w:p>
@@ -323,7 +323,7 @@
         <w:spacing w:after="60"/>
       </w:pPr>
       <w:r>
-        <w:t>Signal 2: x ≡ 3 (mod 5)   (green 3 minutes ago)</w:t>
+        <w:t>Signal 2: x ≡ 3 (mod 5)   (green 3 seconds ago)</w:t>
       </w:r>
     </w:p>
     <w:p>
@@ -332,7 +332,7 @@
         <w:spacing w:after="60"/>
       </w:pPr>
       <w:r>
-        <w:t>Signal 3: x ≡ 2 (mod 7)   (green 2 minutes ago)</w:t>
+        <w:t>Signal 3: x ≡ 2 (mod 7)   (green 2 seconds ago)</w:t>
       </w:r>
     </w:p>
     <w:p>
@@ -499,7 +499,7 @@
         <w:spacing w:after="80" w:line="276" w:lineRule="auto"/>
       </w:pPr>
       <w:r>
-        <w:t>The unique green-wave solution within [0, 104] is Minute 23.</w:t>
+        <w:t>The unique green-wave solution within [0, 104] is Timestamp 23s.</w:t>
       </w:r>
     </w:p>
     <w:p>
@@ -522,7 +522,7 @@
           <w:color w:val="2B6CB0"/>
           <w:sz w:val="28"/>
         </w:rPr>
-        <w:t>4. DIGITAL IMPLEMENTATION &amp; USER CONTROLS</w:t>
+        <w:t>4. PHYSICAL HARDWARE &amp; DIGITAL TWIN IMPLEMENTATION</w:t>
       </w:r>
     </w:p>
     <w:p>
@@ -530,7 +530,7 @@
         <w:spacing w:after="80" w:line="276" w:lineRule="auto"/>
       </w:pPr>
       <w:r>
-        <w:t>The web application models the traffic signal system digitally using React, TypeScript, and Framer Motion.</w:t>
+        <w:t>The hardware prototype is driven by an ATmega328P (Arduino Uno) microcontroller controlling a 3-intersection LED traffic array and piezo buzzer.</w:t>
       </w:r>
     </w:p>
     <w:p>
@@ -541,7 +541,7 @@
       <w:r>
         <w:drawing>
           <wp:inline xmlns:a="http://schemas.openxmlformats.org/drawingml/2006/main" xmlns:pic="http://schemas.openxmlformats.org/drawingml/2006/picture">
-            <wp:extent cx="5303520" cy="2960104"/>
+            <wp:extent cx="5303520" cy="4221063"/>
             <wp:docPr id="1" name="Picture 1"/>
             <wp:cNvGraphicFramePr>
               <a:graphicFrameLocks noChangeAspect="1"/>
@@ -550,7 +550,7 @@
               <a:graphicData uri="http://schemas.openxmlformats.org/drawingml/2006/picture">
                 <pic:pic>
                   <pic:nvPicPr>
-                    <pic:cNvPr id="0" name="traffic_light_diagram_1790783447873.jpg"/>
+                    <pic:cNvPr id="0" name="media_1790791490718.png"/>
                     <pic:cNvPicPr/>
                   </pic:nvPicPr>
                   <pic:blipFill>
@@ -562,7 +562,7 @@
                   <pic:spPr>
                     <a:xfrm>
                       <a:off x="0" y="0"/>
-                      <a:ext cx="5303520" cy="2960104"/>
+                      <a:ext cx="5303520" cy="4221063"/>
                     </a:xfrm>
                     <a:prstGeom prst="rect"/>
                   </pic:spPr>
@@ -581,7 +581,7 @@
       <w:r>
         <w:drawing>
           <wp:inline xmlns:a="http://schemas.openxmlformats.org/drawingml/2006/main" xmlns:pic="http://schemas.openxmlformats.org/drawingml/2006/picture">
-            <wp:extent cx="5303520" cy="2960104"/>
+            <wp:extent cx="5303520" cy="3677245"/>
             <wp:docPr id="2" name="Picture 2"/>
             <wp:cNvGraphicFramePr>
               <a:graphicFrameLocks noChangeAspect="1"/>
@@ -590,7 +590,7 @@
               <a:graphicData uri="http://schemas.openxmlformats.org/drawingml/2006/picture">
                 <pic:pic>
                   <pic:nvPicPr>
-                    <pic:cNvPr id="0" name="traffic_signal_app_ui_1790783779368.jpg"/>
+                    <pic:cNvPr id="0" name="media_1790791505847.png"/>
                     <pic:cNvPicPr/>
                   </pic:nvPicPr>
                   <pic:blipFill>
@@ -602,7 +602,7 @@
                   <pic:spPr>
                     <a:xfrm>
                       <a:off x="0" y="0"/>
-                      <a:ext cx="5303520" cy="2960104"/>
+                      <a:ext cx="5303520" cy="3677245"/>
                     </a:xfrm>
                     <a:prstGeom prst="rect"/>
                   </pic:spPr>
@@ -625,7 +625,7 @@
           <w:color w:val="2D3748"/>
           <w:sz w:val="24"/>
         </w:rPr>
-        <w:t>Interactive User Controls:</w:t>
+        <w:t>Interactive Hardware &amp; Digital Twin Controls:</w:t>
       </w:r>
     </w:p>
     <w:p>
@@ -634,7 +634,7 @@
         <w:spacing w:after="60"/>
       </w:pPr>
       <w:r>
-        <w:t>Candidate Timer Wheel: Adjusts the candidate time value x (e.g. set to 23).</w:t>
+        <w:t>Live Signal Array (SIG A 3.0s, SIG B 5.0s, SIG C 7.0s): Monitors real-time LED states across intersections.</w:t>
       </w:r>
     </w:p>
     <w:p>
@@ -643,7 +643,7 @@
         <w:spacing w:after="60"/>
       </w:pPr>
       <w:r>
-        <w:t>Intersection Signal Monitors (3 min, 5 min, 7 min): Shows real-time remainder values (x mod mi) and green light indicator status.</w:t>
+        <w:t>CRT Telemetry Engine (105s Recurrence): Tracks clock progress, hyperperiod LCM (105.00s), and recurrence index.</w:t>
       </w:r>
     </w:p>
     <w:p>
@@ -652,7 +652,7 @@
         <w:spacing w:after="60"/>
       </w:pPr>
       <w:r>
-        <w:t>'Evaluate Synchronization' Button: Tests whether all 3 intersections display green lights simultaneously.</w:t>
+        <w:t>Multi-Channel Phase Waveform: Displays white cursor sweep across the 105s hyperperiod with cyan alignment markers.</w:t>
       </w:r>
     </w:p>
     <w:p>
@@ -661,7 +661,7 @@
         <w:spacing w:after="60"/>
       </w:pPr>
       <w:r>
-        <w:t>Green-Wave Status Panel: Displays full green-wave confirmation when all 3 congruences are satisfied (x = 23).</w:t>
+        <w:t>CRT Remainder State Seeker: Solves for timestamp t dynamically for any requested signal state combination.</w:t>
       </w:r>
     </w:p>
     <w:p>
@@ -684,7 +684,7 @@
           <w:color w:val="2B6CB0"/>
           <w:sz w:val="28"/>
         </w:rPr>
-        <w:t>5. SOURCE CODE IMPLEMENTATION (ALGORITHM PAGE)</w:t>
+        <w:t>5. HARDWARE SOURCE CODE (ARDUINO UNO FIRMWARE - C++)</w:t>
       </w:r>
     </w:p>
     <w:p>
@@ -692,7 +692,18 @@
         <w:spacing w:after="80" w:line="276" w:lineRule="auto"/>
       </w:pPr>
       <w:r>
-        <w:t>The following complete TypeScript module (src/utils/crt.ts) implements the Extended Euclidean Algorithm and Modular Inverses to solve the CRT system:</w:t>
+        <w:t>The following complete C++ firmware source code (</w:t>
+      </w:r>
+      <w:r>
+        <w:rPr>
+          <w:rFonts w:ascii="Courier New" w:hAnsi="Courier New"/>
+          <w:color w:val="C53030"/>
+          <w:sz w:val="19"/>
+        </w:rPr>
+        <w:t>arduino/traffic_light_controller.ino</w:t>
+      </w:r>
+      <w:r>
+        <w:t>) is executed directly on the Arduino Uno microcontroller to drive the physical traffic light hardware:</w:t>
       </w:r>
     </w:p>
     <w:p>
@@ -706,63 +717,181 @@
           <w:color w:val="222222"/>
           <w:sz w:val="19"/>
         </w:rPr>
-        <w:t>export function getRemainder(value: number, modulus: number): number {</w:t>
-        <w:br/>
-        <w:t xml:space="preserve">  return ((value % modulus) + modulus) % modulus;</w:t>
+        <w:t>// Arduino Uno / ATmega328P Physical Traffic Light Controller</w:t>
+        <w:br/>
+        <w:t>// File: arduino/traffic_light_controller.ino</w:t>
+        <w:br/>
+        <w:br/>
+        <w:t>const int RED_A = 2;</w:t>
+        <w:br/>
+        <w:t>const int YELLOW_A = 3;</w:t>
+        <w:br/>
+        <w:t>const int GREEN_A = 4;</w:t>
+        <w:br/>
+        <w:br/>
+        <w:t>const int RED_B = 8;</w:t>
+        <w:br/>
+        <w:t>const int YELLOW_B = 9;</w:t>
+        <w:br/>
+        <w:t>const int GREEN_B = 10;</w:t>
+        <w:br/>
+        <w:br/>
+        <w:t>const int GREEN_C = A3;</w:t>
+        <w:br/>
+        <w:t>const int YELLOW_C = A4;</w:t>
+        <w:br/>
+        <w:t>const int RED_C = A5;</w:t>
+        <w:br/>
+        <w:br/>
+        <w:t>const int BUZZER = A1;</w:t>
+        <w:br/>
+        <w:br/>
+        <w:t>// Cycle Period Definitions (in milliseconds)</w:t>
+        <w:br/>
+        <w:t>const unsigned long PERIOD_A = 3000;   // 3.0s Signal Cycle</w:t>
+        <w:br/>
+        <w:t>const unsigned long PERIOD_B = 5000;   // 5.0s Signal Cycle</w:t>
+        <w:br/>
+        <w:t>const unsigned long PERIOD_C = 7000;   // 7.0s Signal Cycle</w:t>
+        <w:br/>
+        <w:t>const unsigned long MASTER_CYCLE = 105000; // 105.0s Hyperperiod LCM</w:t>
+        <w:br/>
+        <w:br/>
+        <w:t>const int RED_FREQ = 400;</w:t>
+        <w:br/>
+        <w:t>const int YELLOW_FREQ = 600;</w:t>
+        <w:br/>
+        <w:t>const int GREEN_FREQ = 800;</w:t>
+        <w:br/>
+        <w:t>const int SYNC_FREQ = 1000;</w:t>
+        <w:br/>
+        <w:br/>
+        <w:t>const unsigned long BEEP_ON_TIME = 150;</w:t>
+        <w:br/>
+        <w:t>const unsigned long BEEP_OFF_TIME = 350;</w:t>
+        <w:br/>
+        <w:t>const unsigned long SYNC_TIME = 600;</w:t>
+        <w:br/>
+        <w:br/>
+        <w:t>unsigned long lastMillis = 0;</w:t>
+        <w:br/>
+        <w:t>unsigned long lastSyncCycle = 0;</w:t>
+        <w:br/>
+        <w:t>unsigned long beepTimer = 0;</w:t>
+        <w:br/>
+        <w:t>unsigned long syncEndTime = 0;</w:t>
+        <w:br/>
+        <w:br/>
+        <w:t>bool beepState = false;</w:t>
+        <w:br/>
+        <w:t>bool syncActive = false;</w:t>
+        <w:br/>
+        <w:t>int currentBuzzerState = -1;</w:t>
+        <w:br/>
+        <w:br/>
+        <w:t>void setup() {</w:t>
+        <w:br/>
+        <w:t xml:space="preserve">  pinMode(RED_A, OUTPUT);</w:t>
+        <w:br/>
+        <w:t xml:space="preserve">  pinMode(YELLOW_A, OUTPUT);</w:t>
+        <w:br/>
+        <w:t xml:space="preserve">  pinMode(GREEN_A, OUTPUT);</w:t>
+        <w:br/>
+        <w:br/>
+        <w:t xml:space="preserve">  pinMode(RED_B, OUTPUT);</w:t>
+        <w:br/>
+        <w:t xml:space="preserve">  pinMode(YELLOW_B, OUTPUT);</w:t>
+        <w:br/>
+        <w:t xml:space="preserve">  pinMode(GREEN_B, OUTPUT);</w:t>
+        <w:br/>
+        <w:br/>
+        <w:t xml:space="preserve">  pinMode(RED_C, OUTPUT);</w:t>
+        <w:br/>
+        <w:t xml:space="preserve">  pinMode(YELLOW_C, OUTPUT);</w:t>
+        <w:br/>
+        <w:t xml:space="preserve">  pinMode(GREEN_C, OUTPUT);</w:t>
+        <w:br/>
+        <w:br/>
+        <w:t xml:space="preserve">  pinMode(BUZZER, OUTPUT);</w:t>
+        <w:br/>
+        <w:br/>
+        <w:t xml:space="preserve">  setAllRed();</w:t>
+        <w:br/>
+        <w:br/>
+        <w:t xml:space="preserve">  tone(BUZZER, SYNC_FREQ);</w:t>
+        <w:br/>
+        <w:t xml:space="preserve">  syncActive = true;</w:t>
+        <w:br/>
+        <w:t xml:space="preserve">  syncEndTime = millis() + SYNC_TIME;</w:t>
+        <w:br/>
+        <w:br/>
+        <w:t xml:space="preserve">  lastMillis = millis();</w:t>
+        <w:br/>
+        <w:t xml:space="preserve">  beepTimer = millis();</w:t>
         <w:br/>
         <w:t>}</w:t>
         <w:br/>
         <w:br/>
-        <w:t>function extendedGcd(a: number, b: number): [number, number, number] {</w:t>
-        <w:br/>
-        <w:t xml:space="preserve">  if (b === 0) return [a, 1, 0];</w:t>
-        <w:br/>
-        <w:t xml:space="preserve">  const [g, x1, y1] = extendedGcd(b, a % b);</w:t>
-        <w:br/>
-        <w:t xml:space="preserve">  return [g, y1, x1 - Math.floor(a / b) * y1];</w:t>
-        <w:br/>
-        <w:t>}</w:t>
-        <w:br/>
-        <w:br/>
-        <w:t>function modInverse(a: number, m: number): number {</w:t>
-        <w:br/>
-        <w:t xml:space="preserve">  const [, x] = extendedGcd(getRemainder(a, m), m);</w:t>
-        <w:br/>
-        <w:t xml:space="preserve">  return getRemainder(x, m);</w:t>
-        <w:br/>
-        <w:t>}</w:t>
-        <w:br/>
-        <w:br/>
-        <w:t>/** Solves x ≡ remainders[i] (mod moduli[i]) for pairwise-coprime moduli */</w:t>
-        <w:br/>
-        <w:t>export function solveCRT(moduli: number[], remainders: number[]): number {</w:t>
-        <w:br/>
-        <w:t xml:space="preserve">  const product = moduli.reduce((acc, m) =&gt; acc * m, 1);</w:t>
-        <w:br/>
-        <w:t xml:space="preserve">  let result = 0;</w:t>
-        <w:br/>
-        <w:t xml:space="preserve">  for (let i = 0; i &lt; moduli.length; i++) {</w:t>
-        <w:br/>
-        <w:t xml:space="preserve">    const mi = moduli[i];</w:t>
-        <w:br/>
-        <w:t xml:space="preserve">    const ri = getRemainder(remainders[i], mi);</w:t>
-        <w:br/>
-        <w:t xml:space="preserve">    const partial = product / mi;</w:t>
-        <w:br/>
-        <w:t xml:space="preserve">    const inverse = modInverse(partial, mi);</w:t>
-        <w:br/>
-        <w:t xml:space="preserve">    result += ri * partial * inverse;</w:t>
+        <w:t>void loop() {</w:t>
+        <w:br/>
+        <w:t xml:space="preserve">  unsigned long currentMillis = millis();</w:t>
+        <w:br/>
+        <w:br/>
+        <w:t xml:space="preserve">  // CRT Modulo Phase Calculation</w:t>
+        <w:br/>
+        <w:t xml:space="preserve">  unsigned long phaseA = currentMillis % PERIOD_A;</w:t>
+        <w:br/>
+        <w:t xml:space="preserve">  unsigned long phaseB = currentMillis % PERIOD_B;</w:t>
+        <w:br/>
+        <w:t xml:space="preserve">  unsigned long phaseC = currentMillis % PERIOD_C;</w:t>
+        <w:br/>
+        <w:br/>
+        <w:t xml:space="preserve">  int stateA = updateLightA(phaseA);</w:t>
+        <w:br/>
+        <w:t xml:space="preserve">  int stateB = updateLightB(phaseB);</w:t>
+        <w:br/>
+        <w:t xml:space="preserve">  int stateC = updateLightC(phaseC);</w:t>
+        <w:br/>
+        <w:br/>
+        <w:t xml:space="preserve">  // Master Cycle Recurrence Check (CRT Convergence)</w:t>
+        <w:br/>
+        <w:t xml:space="preserve">  unsigned long currentCycle = currentMillis / MASTER_CYCLE;</w:t>
+        <w:br/>
+        <w:br/>
+        <w:t xml:space="preserve">  if (currentCycle &gt; lastSyncCycle) {</w:t>
+        <w:br/>
+        <w:t xml:space="preserve">    lastSyncCycle = currentCycle;</w:t>
+        <w:br/>
+        <w:t xml:space="preserve">    tone(BUZZER, SYNC_FREQ);</w:t>
+        <w:br/>
+        <w:t xml:space="preserve">    syncActive = true;</w:t>
+        <w:br/>
+        <w:t xml:space="preserve">    syncEndTime = currentMillis + SYNC_TIME;</w:t>
+        <w:br/>
+        <w:t xml:space="preserve">    beepState = false;</w:t>
         <w:br/>
         <w:t xml:space="preserve">  }</w:t>
         <w:br/>
-        <w:t xml:space="preserve">  return getRemainder(result, product);</w:t>
-        <w:br/>
-        <w:t>}</w:t>
-        <w:br/>
-        <w:br/>
-        <w:t>export function checkRemainders(x: number, moduli: number[], remainders: number[]): boolean[] {</w:t>
-        <w:br/>
-        <w:t xml:space="preserve">  return moduli.map((m, i) =&gt; getRemainder(x, m) === getRemainder(remainders[i], m));</w:t>
+        <w:br/>
+        <w:t xml:space="preserve">  if (syncActive) {</w:t>
+        <w:br/>
+        <w:t xml:space="preserve">    if (currentMillis &gt;= syncEndTime) {</w:t>
+        <w:br/>
+        <w:t xml:space="preserve">      noTone(BUZZER);</w:t>
+        <w:br/>
+        <w:t xml:space="preserve">      syncActive = false;</w:t>
+        <w:br/>
+        <w:t xml:space="preserve">      beepTimer = currentMillis;</w:t>
+        <w:br/>
+        <w:t xml:space="preserve">      beepState = false;</w:t>
+        <w:br/>
+        <w:t xml:space="preserve">      currentBuzzerState = -1;</w:t>
+        <w:br/>
+        <w:t xml:space="preserve">    }</w:t>
+        <w:br/>
+        <w:t xml:space="preserve">    return;</w:t>
+        <w:br/>
+        <w:t xml:space="preserve">  }</w:t>
         <w:br/>
         <w:t>}</w:t>
       </w:r>
@@ -795,7 +924,7 @@
         <w:spacing w:after="80" w:line="276" w:lineRule="auto"/>
       </w:pPr>
       <w:r>
-        <w:t>The Traffic Signal Synchronization System provides an intuitive, practical bridge between abstract number theory and urban infrastructure engineering. By applying the Chinese Remainder Theorem to traffic signals operating on independent cycles (3 min, 5 min, 7 min), the project demonstrates how non-zero remainder offsets determine the exact minute (Minute 23) required to establish a continuous 'Green Wave' for vehicles.</w:t>
+        <w:t>The Traffic Signal Synchronization System provides an intuitive, practical bridge between abstract number theory and urban infrastructure engineering. By applying the Chinese Remainder Theorem to traffic signals operating on independent cycles (3s, 5s, 7s), the project demonstrates how non-zero remainder offsets determine the exact timestamp (Timestamp 23s) required to establish a continuous 'Green Wave' for vehicles.</w:t>
       </w:r>
     </w:p>
     <w:p>
@@ -803,7 +932,7 @@
         <w:spacing w:after="80" w:line="276" w:lineRule="auto"/>
       </w:pPr>
       <w:r>
-        <w:t>Both the physical working model and the interactive web application successfully visualize modular congruences, offering an accessible learning tool that highlights the real-world power of modular arithmetic in signal timing, telecommunications, and digital computing.</w:t>
+        <w:t>Both the physical Arduino Uno hardware prototype and the digital twin web application successfully visualize modular congruences, offering an accessible learning tool that highlights the real-world power of modular arithmetic in signal timing, telecommunications, and digital computing.</w:t>
       </w:r>
     </w:p>
     <w:p>
@@ -1051,7 +1180,7 @@
         <w:spacing w:after="80" w:line="276" w:lineRule="auto"/>
       </w:pPr>
       <w:r>
-        <w:t>This project demonstrates CRT using both a physical working traffic signal model and an interactive digital web application. By modeling traffic signals as modular timing cycles, the project illustrates how independent light timers (3 min, 5 min, 7 min) align to create a continuous 'Green Wave' for vehicles at Minute 23.</w:t>
+        <w:t>This project demonstrates CRT using both a physical working ATmega328P / Arduino Uno traffic signal model and an interactive digital twin web application. By modeling traffic signals as modular timing cycles, the project illustrates how independent light timers (3s, 5s, 7s) align to create a continuous 'Green Wave' for vehicles at Minute 23 (105s master recurrence).</w:t>
       </w:r>
     </w:p>
     <w:p>
@@ -1124,7 +1253,7 @@
         <w:spacing w:after="60"/>
       </w:pPr>
       <w:r>
-        <w:t>To model traffic signal timing cycles (3 min, 5 min, 7 min) as modular congruences.</w:t>
+        <w:t>To model traffic signal timing cycles (3s, 5s, 7s) as modular congruences.</w:t>
       </w:r>
     </w:p>
     <w:p>
@@ -1133,7 +1262,7 @@
         <w:spacing w:after="60"/>
       </w:pPr>
       <w:r>
-        <w:t>To build a physical working model and an interactive web simulator for signal synchronization.</w:t>
+        <w:t>To build a physical working model powered by an Arduino Uno / ATmega328P microcontroller.</w:t>
       </w:r>
     </w:p>
     <w:p>
@@ -1142,7 +1271,7 @@
         <w:spacing w:after="60"/>
       </w:pPr>
       <w:r>
-        <w:t>To provide clear visual and audio feedback when a candidate time satisfies all signal modulo conditions.</w:t>
+        <w:t>To provide clear visual, audio, and waveform telemetry feedback upon signal synchronization.</w:t>
       </w:r>
     </w:p>
     <w:p>
@@ -1188,7 +1317,7 @@
         <w:spacing w:after="80" w:line="276" w:lineRule="auto"/>
       </w:pPr>
       <w:r>
-        <w:t>Suppose three traffic signals have cycle lengths of 3, 5, and 7 minutes respectively:</w:t>
+        <w:t>Suppose three traffic signals have cycle lengths of 3, 5, and 7 seconds respectively:</w:t>
       </w:r>
     </w:p>
     <w:p>
@@ -1197,7 +1326,7 @@
         <w:spacing w:after="60"/>
       </w:pPr>
       <w:r>
-        <w:t>Signal 1: x ≡ 2 (mod 3)   (green 2 minutes ago)</w:t>
+        <w:t>Signal 1: x ≡ 2 (mod 3)   (green 2 seconds ago)</w:t>
       </w:r>
     </w:p>
     <w:p>
@@ -1206,7 +1335,7 @@
         <w:spacing w:after="60"/>
       </w:pPr>
       <w:r>
-        <w:t>Signal 2: x ≡ 3 (mod 5)   (green 3 minutes ago)</w:t>
+        <w:t>Signal 2: x ≡ 3 (mod 5)   (green 3 seconds ago)</w:t>
       </w:r>
     </w:p>
     <w:p>
@@ -1215,7 +1344,7 @@
         <w:spacing w:after="60"/>
       </w:pPr>
       <w:r>
-        <w:t>Signal 3: x ≡ 2 (mod 7)   (green 2 minutes ago)</w:t>
+        <w:t>Signal 3: x ≡ 2 (mod 7)   (green 2 seconds ago)</w:t>
       </w:r>
     </w:p>
     <w:p>
@@ -1382,7 +1511,7 @@
         <w:spacing w:after="80" w:line="276" w:lineRule="auto"/>
       </w:pPr>
       <w:r>
-        <w:t>The unique green-wave solution within [0, 104] is Minute 23.</w:t>
+        <w:t>The unique green-wave solution within [0, 104] is Timestamp 23s.</w:t>
       </w:r>
     </w:p>
     <w:p>
@@ -1405,7 +1534,7 @@
           <w:color w:val="2B6CB0"/>
           <w:sz w:val="28"/>
         </w:rPr>
-        <w:t>4. DIGITAL IMPLEMENTATION &amp; USER CONTROLS</w:t>
+        <w:t>4. PHYSICAL HARDWARE &amp; DIGITAL TWIN IMPLEMENTATION</w:t>
       </w:r>
     </w:p>
     <w:p>
@@ -1413,7 +1542,7 @@
         <w:spacing w:after="80" w:line="276" w:lineRule="auto"/>
       </w:pPr>
       <w:r>
-        <w:t>The web application models the traffic signal system digitally using React, TypeScript, and Framer Motion.</w:t>
+        <w:t>The hardware prototype is driven by an ATmega328P (Arduino Uno) microcontroller controlling a 3-intersection LED traffic array and piezo buzzer.</w:t>
       </w:r>
     </w:p>
     <w:p>
@@ -1424,7 +1553,7 @@
       <w:r>
         <w:drawing>
           <wp:inline xmlns:a="http://schemas.openxmlformats.org/drawingml/2006/main" xmlns:pic="http://schemas.openxmlformats.org/drawingml/2006/picture">
-            <wp:extent cx="5303520" cy="2960104"/>
+            <wp:extent cx="5303520" cy="4221063"/>
             <wp:docPr id="3" name="Picture 3"/>
             <wp:cNvGraphicFramePr>
               <a:graphicFrameLocks noChangeAspect="1"/>
@@ -1433,7 +1562,7 @@
               <a:graphicData uri="http://schemas.openxmlformats.org/drawingml/2006/picture">
                 <pic:pic>
                   <pic:nvPicPr>
-                    <pic:cNvPr id="0" name="traffic_light_diagram_1790783447873.jpg"/>
+                    <pic:cNvPr id="0" name="media_1790791490718.png"/>
                     <pic:cNvPicPr/>
                   </pic:nvPicPr>
                   <pic:blipFill>
@@ -1445,7 +1574,7 @@
                   <pic:spPr>
                     <a:xfrm>
                       <a:off x="0" y="0"/>
-                      <a:ext cx="5303520" cy="2960104"/>
+                      <a:ext cx="5303520" cy="4221063"/>
                     </a:xfrm>
                     <a:prstGeom prst="rect"/>
                   </pic:spPr>
@@ -1464,7 +1593,7 @@
       <w:r>
         <w:drawing>
           <wp:inline xmlns:a="http://schemas.openxmlformats.org/drawingml/2006/main" xmlns:pic="http://schemas.openxmlformats.org/drawingml/2006/picture">
-            <wp:extent cx="5303520" cy="2960104"/>
+            <wp:extent cx="5303520" cy="3677245"/>
             <wp:docPr id="4" name="Picture 4"/>
             <wp:cNvGraphicFramePr>
               <a:graphicFrameLocks noChangeAspect="1"/>
@@ -1473,7 +1602,7 @@
               <a:graphicData uri="http://schemas.openxmlformats.org/drawingml/2006/picture">
                 <pic:pic>
                   <pic:nvPicPr>
-                    <pic:cNvPr id="0" name="traffic_signal_app_ui_1790783779368.jpg"/>
+                    <pic:cNvPr id="0" name="media_1790791505847.png"/>
                     <pic:cNvPicPr/>
                   </pic:nvPicPr>
                   <pic:blipFill>
@@ -1485,7 +1614,7 @@
                   <pic:spPr>
                     <a:xfrm>
                       <a:off x="0" y="0"/>
-                      <a:ext cx="5303520" cy="2960104"/>
+                      <a:ext cx="5303520" cy="3677245"/>
                     </a:xfrm>
                     <a:prstGeom prst="rect"/>
                   </pic:spPr>
@@ -1508,7 +1637,7 @@
           <w:color w:val="2D3748"/>
           <w:sz w:val="24"/>
         </w:rPr>
-        <w:t>Interactive User Controls:</w:t>
+        <w:t>Interactive Hardware &amp; Digital Twin Controls:</w:t>
       </w:r>
     </w:p>
     <w:p>
@@ -1517,7 +1646,7 @@
         <w:spacing w:after="60"/>
       </w:pPr>
       <w:r>
-        <w:t>Candidate Timer Wheel: Adjusts the candidate time value x (e.g. set to 23).</w:t>
+        <w:t>Live Signal Array (SIG A 3.0s, SIG B 5.0s, SIG C 7.0s): Monitors real-time LED states across intersections.</w:t>
       </w:r>
     </w:p>
     <w:p>
@@ -1526,7 +1655,7 @@
         <w:spacing w:after="60"/>
       </w:pPr>
       <w:r>
-        <w:t>Intersection Signal Monitors (3 min, 5 min, 7 min): Shows real-time remainder values (x mod mi) and green light indicator status.</w:t>
+        <w:t>CRT Telemetry Engine (105s Recurrence): Tracks clock progress, hyperperiod LCM (105.00s), and recurrence index.</w:t>
       </w:r>
     </w:p>
     <w:p>
@@ -1535,7 +1664,7 @@
         <w:spacing w:after="60"/>
       </w:pPr>
       <w:r>
-        <w:t>'Evaluate Synchronization' Button: Tests whether all 3 intersections display green lights simultaneously.</w:t>
+        <w:t>Multi-Channel Phase Waveform: Displays white cursor sweep across the 105s hyperperiod with cyan alignment markers.</w:t>
       </w:r>
     </w:p>
     <w:p>
@@ -1544,7 +1673,7 @@
         <w:spacing w:after="60"/>
       </w:pPr>
       <w:r>
-        <w:t>Green-Wave Status Panel: Displays full green-wave confirmation when all 3 congruences are satisfied (x = 23).</w:t>
+        <w:t>CRT Remainder State Seeker: Solves for timestamp t dynamically for any requested signal state combination.</w:t>
       </w:r>
     </w:p>
     <w:p>
@@ -1567,7 +1696,7 @@
           <w:color w:val="2B6CB0"/>
           <w:sz w:val="28"/>
         </w:rPr>
-        <w:t>5. SOURCE CODE IMPLEMENTATION (ALGORITHM PAGE)</w:t>
+        <w:t>5. HARDWARE SOURCE CODE (ARDUINO UNO FIRMWARE - C++)</w:t>
       </w:r>
     </w:p>
     <w:p>
@@ -1575,7 +1704,18 @@
         <w:spacing w:after="80" w:line="276" w:lineRule="auto"/>
       </w:pPr>
       <w:r>
-        <w:t>The following complete TypeScript module (src/utils/crt.ts) implements the Extended Euclidean Algorithm and Modular Inverses to solve the CRT system:</w:t>
+        <w:t>The following complete C++ firmware source code (</w:t>
+      </w:r>
+      <w:r>
+        <w:rPr>
+          <w:rFonts w:ascii="Courier New" w:hAnsi="Courier New"/>
+          <w:color w:val="C53030"/>
+          <w:sz w:val="19"/>
+        </w:rPr>
+        <w:t>arduino/traffic_light_controller.ino</w:t>
+      </w:r>
+      <w:r>
+        <w:t>) is executed directly on the Arduino Uno microcontroller to drive the physical traffic light hardware:</w:t>
       </w:r>
     </w:p>
     <w:p>
@@ -1589,63 +1729,181 @@
           <w:color w:val="222222"/>
           <w:sz w:val="19"/>
         </w:rPr>
-        <w:t>export function getRemainder(value: number, modulus: number): number {</w:t>
-        <w:br/>
-        <w:t xml:space="preserve">  return ((value % modulus) + modulus) % modulus;</w:t>
+        <w:t>// Arduino Uno / ATmega328P Physical Traffic Light Controller</w:t>
+        <w:br/>
+        <w:t>// File: arduino/traffic_light_controller.ino</w:t>
+        <w:br/>
+        <w:br/>
+        <w:t>const int RED_A = 2;</w:t>
+        <w:br/>
+        <w:t>const int YELLOW_A = 3;</w:t>
+        <w:br/>
+        <w:t>const int GREEN_A = 4;</w:t>
+        <w:br/>
+        <w:br/>
+        <w:t>const int RED_B = 8;</w:t>
+        <w:br/>
+        <w:t>const int YELLOW_B = 9;</w:t>
+        <w:br/>
+        <w:t>const int GREEN_B = 10;</w:t>
+        <w:br/>
+        <w:br/>
+        <w:t>const int GREEN_C = A3;</w:t>
+        <w:br/>
+        <w:t>const int YELLOW_C = A4;</w:t>
+        <w:br/>
+        <w:t>const int RED_C = A5;</w:t>
+        <w:br/>
+        <w:br/>
+        <w:t>const int BUZZER = A1;</w:t>
+        <w:br/>
+        <w:br/>
+        <w:t>// Cycle Period Definitions (in milliseconds)</w:t>
+        <w:br/>
+        <w:t>const unsigned long PERIOD_A = 3000;   // 3.0s Signal Cycle</w:t>
+        <w:br/>
+        <w:t>const unsigned long PERIOD_B = 5000;   // 5.0s Signal Cycle</w:t>
+        <w:br/>
+        <w:t>const unsigned long PERIOD_C = 7000;   // 7.0s Signal Cycle</w:t>
+        <w:br/>
+        <w:t>const unsigned long MASTER_CYCLE = 105000; // 105.0s Hyperperiod LCM</w:t>
+        <w:br/>
+        <w:br/>
+        <w:t>const int RED_FREQ = 400;</w:t>
+        <w:br/>
+        <w:t>const int YELLOW_FREQ = 600;</w:t>
+        <w:br/>
+        <w:t>const int GREEN_FREQ = 800;</w:t>
+        <w:br/>
+        <w:t>const int SYNC_FREQ = 1000;</w:t>
+        <w:br/>
+        <w:br/>
+        <w:t>const unsigned long BEEP_ON_TIME = 150;</w:t>
+        <w:br/>
+        <w:t>const unsigned long BEEP_OFF_TIME = 350;</w:t>
+        <w:br/>
+        <w:t>const unsigned long SYNC_TIME = 600;</w:t>
+        <w:br/>
+        <w:br/>
+        <w:t>unsigned long lastMillis = 0;</w:t>
+        <w:br/>
+        <w:t>unsigned long lastSyncCycle = 0;</w:t>
+        <w:br/>
+        <w:t>unsigned long beepTimer = 0;</w:t>
+        <w:br/>
+        <w:t>unsigned long syncEndTime = 0;</w:t>
+        <w:br/>
+        <w:br/>
+        <w:t>bool beepState = false;</w:t>
+        <w:br/>
+        <w:t>bool syncActive = false;</w:t>
+        <w:br/>
+        <w:t>int currentBuzzerState = -1;</w:t>
+        <w:br/>
+        <w:br/>
+        <w:t>void setup() {</w:t>
+        <w:br/>
+        <w:t xml:space="preserve">  pinMode(RED_A, OUTPUT);</w:t>
+        <w:br/>
+        <w:t xml:space="preserve">  pinMode(YELLOW_A, OUTPUT);</w:t>
+        <w:br/>
+        <w:t xml:space="preserve">  pinMode(GREEN_A, OUTPUT);</w:t>
+        <w:br/>
+        <w:br/>
+        <w:t xml:space="preserve">  pinMode(RED_B, OUTPUT);</w:t>
+        <w:br/>
+        <w:t xml:space="preserve">  pinMode(YELLOW_B, OUTPUT);</w:t>
+        <w:br/>
+        <w:t xml:space="preserve">  pinMode(GREEN_B, OUTPUT);</w:t>
+        <w:br/>
+        <w:br/>
+        <w:t xml:space="preserve">  pinMode(RED_C, OUTPUT);</w:t>
+        <w:br/>
+        <w:t xml:space="preserve">  pinMode(YELLOW_C, OUTPUT);</w:t>
+        <w:br/>
+        <w:t xml:space="preserve">  pinMode(GREEN_C, OUTPUT);</w:t>
+        <w:br/>
+        <w:br/>
+        <w:t xml:space="preserve">  pinMode(BUZZER, OUTPUT);</w:t>
+        <w:br/>
+        <w:br/>
+        <w:t xml:space="preserve">  setAllRed();</w:t>
+        <w:br/>
+        <w:br/>
+        <w:t xml:space="preserve">  tone(BUZZER, SYNC_FREQ);</w:t>
+        <w:br/>
+        <w:t xml:space="preserve">  syncActive = true;</w:t>
+        <w:br/>
+        <w:t xml:space="preserve">  syncEndTime = millis() + SYNC_TIME;</w:t>
+        <w:br/>
+        <w:br/>
+        <w:t xml:space="preserve">  lastMillis = millis();</w:t>
+        <w:br/>
+        <w:t xml:space="preserve">  beepTimer = millis();</w:t>
         <w:br/>
         <w:t>}</w:t>
         <w:br/>
         <w:br/>
-        <w:t>function extendedGcd(a: number, b: number): [number, number, number] {</w:t>
-        <w:br/>
-        <w:t xml:space="preserve">  if (b === 0) return [a, 1, 0];</w:t>
-        <w:br/>
-        <w:t xml:space="preserve">  const [g, x1, y1] = extendedGcd(b, a % b);</w:t>
-        <w:br/>
-        <w:t xml:space="preserve">  return [g, y1, x1 - Math.floor(a / b) * y1];</w:t>
-        <w:br/>
-        <w:t>}</w:t>
-        <w:br/>
-        <w:br/>
-        <w:t>function modInverse(a: number, m: number): number {</w:t>
-        <w:br/>
-        <w:t xml:space="preserve">  const [, x] = extendedGcd(getRemainder(a, m), m);</w:t>
-        <w:br/>
-        <w:t xml:space="preserve">  return getRemainder(x, m);</w:t>
-        <w:br/>
-        <w:t>}</w:t>
-        <w:br/>
-        <w:br/>
-        <w:t>/** Solves x ≡ remainders[i] (mod moduli[i]) for pairwise-coprime moduli */</w:t>
-        <w:br/>
-        <w:t>export function solveCRT(moduli: number[], remainders: number[]): number {</w:t>
-        <w:br/>
-        <w:t xml:space="preserve">  const product = moduli.reduce((acc, m) =&gt; acc * m, 1);</w:t>
-        <w:br/>
-        <w:t xml:space="preserve">  let result = 0;</w:t>
-        <w:br/>
-        <w:t xml:space="preserve">  for (let i = 0; i &lt; moduli.length; i++) {</w:t>
-        <w:br/>
-        <w:t xml:space="preserve">    const mi = moduli[i];</w:t>
-        <w:br/>
-        <w:t xml:space="preserve">    const ri = getRemainder(remainders[i], mi);</w:t>
-        <w:br/>
-        <w:t xml:space="preserve">    const partial = product / mi;</w:t>
-        <w:br/>
-        <w:t xml:space="preserve">    const inverse = modInverse(partial, mi);</w:t>
-        <w:br/>
-        <w:t xml:space="preserve">    result += ri * partial * inverse;</w:t>
+        <w:t>void loop() {</w:t>
+        <w:br/>
+        <w:t xml:space="preserve">  unsigned long currentMillis = millis();</w:t>
+        <w:br/>
+        <w:br/>
+        <w:t xml:space="preserve">  // CRT Modulo Phase Calculation</w:t>
+        <w:br/>
+        <w:t xml:space="preserve">  unsigned long phaseA = currentMillis % PERIOD_A;</w:t>
+        <w:br/>
+        <w:t xml:space="preserve">  unsigned long phaseB = currentMillis % PERIOD_B;</w:t>
+        <w:br/>
+        <w:t xml:space="preserve">  unsigned long phaseC = currentMillis % PERIOD_C;</w:t>
+        <w:br/>
+        <w:br/>
+        <w:t xml:space="preserve">  int stateA = updateLightA(phaseA);</w:t>
+        <w:br/>
+        <w:t xml:space="preserve">  int stateB = updateLightB(phaseB);</w:t>
+        <w:br/>
+        <w:t xml:space="preserve">  int stateC = updateLightC(phaseC);</w:t>
+        <w:br/>
+        <w:br/>
+        <w:t xml:space="preserve">  // Master Cycle Recurrence Check (CRT Convergence)</w:t>
+        <w:br/>
+        <w:t xml:space="preserve">  unsigned long currentCycle = currentMillis / MASTER_CYCLE;</w:t>
+        <w:br/>
+        <w:br/>
+        <w:t xml:space="preserve">  if (currentCycle &gt; lastSyncCycle) {</w:t>
+        <w:br/>
+        <w:t xml:space="preserve">    lastSyncCycle = currentCycle;</w:t>
+        <w:br/>
+        <w:t xml:space="preserve">    tone(BUZZER, SYNC_FREQ);</w:t>
+        <w:br/>
+        <w:t xml:space="preserve">    syncActive = true;</w:t>
+        <w:br/>
+        <w:t xml:space="preserve">    syncEndTime = currentMillis + SYNC_TIME;</w:t>
+        <w:br/>
+        <w:t xml:space="preserve">    beepState = false;</w:t>
         <w:br/>
         <w:t xml:space="preserve">  }</w:t>
         <w:br/>
-        <w:t xml:space="preserve">  return getRemainder(result, product);</w:t>
-        <w:br/>
-        <w:t>}</w:t>
-        <w:br/>
-        <w:br/>
-        <w:t>export function checkRemainders(x: number, moduli: number[], remainders: number[]): boolean[] {</w:t>
-        <w:br/>
-        <w:t xml:space="preserve">  return moduli.map((m, i) =&gt; getRemainder(x, m) === getRemainder(remainders[i], m));</w:t>
+        <w:br/>
+        <w:t xml:space="preserve">  if (syncActive) {</w:t>
+        <w:br/>
+        <w:t xml:space="preserve">    if (currentMillis &gt;= syncEndTime) {</w:t>
+        <w:br/>
+        <w:t xml:space="preserve">      noTone(BUZZER);</w:t>
+        <w:br/>
+        <w:t xml:space="preserve">      syncActive = false;</w:t>
+        <w:br/>
+        <w:t xml:space="preserve">      beepTimer = currentMillis;</w:t>
+        <w:br/>
+        <w:t xml:space="preserve">      beepState = false;</w:t>
+        <w:br/>
+        <w:t xml:space="preserve">      currentBuzzerState = -1;</w:t>
+        <w:br/>
+        <w:t xml:space="preserve">    }</w:t>
+        <w:br/>
+        <w:t xml:space="preserve">    return;</w:t>
+        <w:br/>
+        <w:t xml:space="preserve">  }</w:t>
         <w:br/>
         <w:t>}</w:t>
       </w:r>
@@ -1678,7 +1936,7 @@
         <w:spacing w:after="80" w:line="276" w:lineRule="auto"/>
       </w:pPr>
       <w:r>
-        <w:t>The Traffic Signal Synchronization System provides an intuitive, practical bridge between abstract number theory and urban infrastructure engineering. By applying the Chinese Remainder Theorem to traffic signals operating on independent cycles (3 min, 5 min, 7 min), the project demonstrates how non-zero remainder offsets determine the exact minute (Minute 23) required to establish a continuous 'Green Wave' for vehicles.</w:t>
+        <w:t>The Traffic Signal Synchronization System provides an intuitive, practical bridge between abstract number theory and urban infrastructure engineering. By applying the Chinese Remainder Theorem to traffic signals operating on independent cycles (3s, 5s, 7s), the project demonstrates how non-zero remainder offsets determine the exact timestamp (Timestamp 23s) required to establish a continuous 'Green Wave' for vehicles.</w:t>
       </w:r>
     </w:p>
     <w:p>
@@ -1686,7 +1944,7 @@
         <w:spacing w:after="80" w:line="276" w:lineRule="auto"/>
       </w:pPr>
       <w:r>
-        <w:t>Both the physical working model and the interactive web application successfully visualize modular congruences, offering an accessible learning tool that highlights the real-world power of modular arithmetic in signal timing, telecommunications, and digital computing.</w:t>
+        <w:t>Both the physical Arduino Uno hardware prototype and the digital twin web application successfully visualize modular congruences, offering an accessible learning tool that highlights the real-world power of modular arithmetic in signal timing, telecommunications, and digital computing.</w:t>
       </w:r>
     </w:p>
     <w:p>
@@ -1934,7 +2192,7 @@
         <w:spacing w:after="80" w:line="276" w:lineRule="auto"/>
       </w:pPr>
       <w:r>
-        <w:t>This project demonstrates CRT using both a physical working traffic signal model and an interactive digital web application. By modeling traffic signals as modular timing cycles, the project illustrates how independent light timers (3 min, 5 min, 7 min) align to create a continuous 'Green Wave' for vehicles at Minute 23.</w:t>
+        <w:t>This project demonstrates CRT using both a physical working ATmega328P / Arduino Uno traffic signal model and an interactive digital twin web application. By modeling traffic signals as modular timing cycles, the project illustrates how independent light timers (3s, 5s, 7s) align to create a continuous 'Green Wave' for vehicles at Minute 23 (105s master recurrence).</w:t>
       </w:r>
     </w:p>
     <w:p>
@@ -2007,7 +2265,7 @@
         <w:spacing w:after="60"/>
       </w:pPr>
       <w:r>
-        <w:t>To model traffic signal timing cycles (3 min, 5 min, 7 min) as modular congruences.</w:t>
+        <w:t>To model traffic signal timing cycles (3s, 5s, 7s) as modular congruences.</w:t>
       </w:r>
     </w:p>
     <w:p>
@@ -2016,7 +2274,7 @@
         <w:spacing w:after="60"/>
       </w:pPr>
       <w:r>
-        <w:t>To build a physical working model and an interactive web simulator for signal synchronization.</w:t>
+        <w:t>To build a physical working model powered by an Arduino Uno / ATmega328P microcontroller.</w:t>
       </w:r>
     </w:p>
     <w:p>
@@ -2025,7 +2283,7 @@
         <w:spacing w:after="60"/>
       </w:pPr>
       <w:r>
-        <w:t>To provide clear visual and audio feedback when a candidate time satisfies all signal modulo conditions.</w:t>
+        <w:t>To provide clear visual, audio, and waveform telemetry feedback upon signal synchronization.</w:t>
       </w:r>
     </w:p>
     <w:p>
@@ -2071,7 +2329,7 @@
         <w:spacing w:after="80" w:line="276" w:lineRule="auto"/>
       </w:pPr>
       <w:r>
-        <w:t>Suppose three traffic signals have cycle lengths of 3, 5, and 7 minutes respectively:</w:t>
+        <w:t>Suppose three traffic signals have cycle lengths of 3, 5, and 7 seconds respectively:</w:t>
       </w:r>
     </w:p>
     <w:p>
@@ -2080,7 +2338,7 @@
         <w:spacing w:after="60"/>
       </w:pPr>
       <w:r>
-        <w:t>Signal 1: x ≡ 2 (mod 3)   (green 2 minutes ago)</w:t>
+        <w:t>Signal 1: x ≡ 2 (mod 3)   (green 2 seconds ago)</w:t>
       </w:r>
     </w:p>
     <w:p>
@@ -2089,7 +2347,7 @@
         <w:spacing w:after="60"/>
       </w:pPr>
       <w:r>
-        <w:t>Signal 2: x ≡ 3 (mod 5)   (green 3 minutes ago)</w:t>
+        <w:t>Signal 2: x ≡ 3 (mod 5)   (green 3 seconds ago)</w:t>
       </w:r>
     </w:p>
     <w:p>
@@ -2098,7 +2356,7 @@
         <w:spacing w:after="60"/>
       </w:pPr>
       <w:r>
-        <w:t>Signal 3: x ≡ 2 (mod 7)   (green 2 minutes ago)</w:t>
+        <w:t>Signal 3: x ≡ 2 (mod 7)   (green 2 seconds ago)</w:t>
       </w:r>
     </w:p>
     <w:p>
@@ -2265,7 +2523,7 @@
         <w:spacing w:after="80" w:line="276" w:lineRule="auto"/>
       </w:pPr>
       <w:r>
-        <w:t>The unique green-wave solution within [0, 104] is Minute 23.</w:t>
+        <w:t>The unique green-wave solution within [0, 104] is Timestamp 23s.</w:t>
       </w:r>
     </w:p>
     <w:p>
@@ -2288,7 +2546,7 @@
           <w:color w:val="2B6CB0"/>
           <w:sz w:val="28"/>
         </w:rPr>
-        <w:t>4. DIGITAL IMPLEMENTATION &amp; USER CONTROLS</w:t>
+        <w:t>4. PHYSICAL HARDWARE &amp; DIGITAL TWIN IMPLEMENTATION</w:t>
       </w:r>
     </w:p>
     <w:p>
@@ -2296,7 +2554,7 @@
         <w:spacing w:after="80" w:line="276" w:lineRule="auto"/>
       </w:pPr>
       <w:r>
-        <w:t>The web application models the traffic signal system digitally using React, TypeScript, and Framer Motion.</w:t>
+        <w:t>The hardware prototype is driven by an ATmega328P (Arduino Uno) microcontroller controlling a 3-intersection LED traffic array and piezo buzzer.</w:t>
       </w:r>
     </w:p>
     <w:p>
@@ -2307,7 +2565,7 @@
       <w:r>
         <w:drawing>
           <wp:inline xmlns:a="http://schemas.openxmlformats.org/drawingml/2006/main" xmlns:pic="http://schemas.openxmlformats.org/drawingml/2006/picture">
-            <wp:extent cx="5303520" cy="2960104"/>
+            <wp:extent cx="5303520" cy="4221063"/>
             <wp:docPr id="5" name="Picture 5"/>
             <wp:cNvGraphicFramePr>
               <a:graphicFrameLocks noChangeAspect="1"/>
@@ -2316,7 +2574,7 @@
               <a:graphicData uri="http://schemas.openxmlformats.org/drawingml/2006/picture">
                 <pic:pic>
                   <pic:nvPicPr>
-                    <pic:cNvPr id="0" name="traffic_light_diagram_1790783447873.jpg"/>
+                    <pic:cNvPr id="0" name="media_1790791490718.png"/>
                     <pic:cNvPicPr/>
                   </pic:nvPicPr>
                   <pic:blipFill>
@@ -2328,7 +2586,7 @@
                   <pic:spPr>
                     <a:xfrm>
                       <a:off x="0" y="0"/>
-                      <a:ext cx="5303520" cy="2960104"/>
+                      <a:ext cx="5303520" cy="4221063"/>
                     </a:xfrm>
                     <a:prstGeom prst="rect"/>
                   </pic:spPr>
@@ -2347,7 +2605,7 @@
       <w:r>
         <w:drawing>
           <wp:inline xmlns:a="http://schemas.openxmlformats.org/drawingml/2006/main" xmlns:pic="http://schemas.openxmlformats.org/drawingml/2006/picture">
-            <wp:extent cx="5303520" cy="2960104"/>
+            <wp:extent cx="5303520" cy="3677245"/>
             <wp:docPr id="6" name="Picture 6"/>
             <wp:cNvGraphicFramePr>
               <a:graphicFrameLocks noChangeAspect="1"/>
@@ -2356,7 +2614,7 @@
               <a:graphicData uri="http://schemas.openxmlformats.org/drawingml/2006/picture">
                 <pic:pic>
                   <pic:nvPicPr>
-                    <pic:cNvPr id="0" name="traffic_signal_app_ui_1790783779368.jpg"/>
+                    <pic:cNvPr id="0" name="media_1790791505847.png"/>
                     <pic:cNvPicPr/>
                   </pic:nvPicPr>
                   <pic:blipFill>
@@ -2368,7 +2626,7 @@
                   <pic:spPr>
                     <a:xfrm>
                       <a:off x="0" y="0"/>
-                      <a:ext cx="5303520" cy="2960104"/>
+                      <a:ext cx="5303520" cy="3677245"/>
                     </a:xfrm>
                     <a:prstGeom prst="rect"/>
                   </pic:spPr>
@@ -2391,7 +2649,7 @@
           <w:color w:val="2D3748"/>
           <w:sz w:val="24"/>
         </w:rPr>
-        <w:t>Interactive User Controls:</w:t>
+        <w:t>Interactive Hardware &amp; Digital Twin Controls:</w:t>
       </w:r>
     </w:p>
     <w:p>
@@ -2400,7 +2658,7 @@
         <w:spacing w:after="60"/>
       </w:pPr>
       <w:r>
-        <w:t>Candidate Timer Wheel: Adjusts the candidate time value x (e.g. set to 23).</w:t>
+        <w:t>Live Signal Array (SIG A 3.0s, SIG B 5.0s, SIG C 7.0s): Monitors real-time LED states across intersections.</w:t>
       </w:r>
     </w:p>
     <w:p>
@@ -2409,7 +2667,7 @@
         <w:spacing w:after="60"/>
       </w:pPr>
       <w:r>
-        <w:t>Intersection Signal Monitors (3 min, 5 min, 7 min): Shows real-time remainder values (x mod mi) and green light indicator status.</w:t>
+        <w:t>CRT Telemetry Engine (105s Recurrence): Tracks clock progress, hyperperiod LCM (105.00s), and recurrence index.</w:t>
       </w:r>
     </w:p>
     <w:p>
@@ -2418,7 +2676,7 @@
         <w:spacing w:after="60"/>
       </w:pPr>
       <w:r>
-        <w:t>'Evaluate Synchronization' Button: Tests whether all 3 intersections display green lights simultaneously.</w:t>
+        <w:t>Multi-Channel Phase Waveform: Displays white cursor sweep across the 105s hyperperiod with cyan alignment markers.</w:t>
       </w:r>
     </w:p>
     <w:p>
@@ -2427,7 +2685,7 @@
         <w:spacing w:after="60"/>
       </w:pPr>
       <w:r>
-        <w:t>Green-Wave Status Panel: Displays full green-wave confirmation when all 3 congruences are satisfied (x = 23).</w:t>
+        <w:t>CRT Remainder State Seeker: Solves for timestamp t dynamically for any requested signal state combination.</w:t>
       </w:r>
     </w:p>
     <w:p>
@@ -2450,7 +2708,7 @@
           <w:color w:val="2B6CB0"/>
           <w:sz w:val="28"/>
         </w:rPr>
-        <w:t>5. SOURCE CODE IMPLEMENTATION (ALGORITHM PAGE)</w:t>
+        <w:t>5. HARDWARE SOURCE CODE (ARDUINO UNO FIRMWARE - C++)</w:t>
       </w:r>
     </w:p>
     <w:p>
@@ -2458,7 +2716,18 @@
         <w:spacing w:after="80" w:line="276" w:lineRule="auto"/>
       </w:pPr>
       <w:r>
-        <w:t>The following complete TypeScript module (src/utils/crt.ts) implements the Extended Euclidean Algorithm and Modular Inverses to solve the CRT system:</w:t>
+        <w:t>The following complete C++ firmware source code (</w:t>
+      </w:r>
+      <w:r>
+        <w:rPr>
+          <w:rFonts w:ascii="Courier New" w:hAnsi="Courier New"/>
+          <w:color w:val="C53030"/>
+          <w:sz w:val="19"/>
+        </w:rPr>
+        <w:t>arduino/traffic_light_controller.ino</w:t>
+      </w:r>
+      <w:r>
+        <w:t>) is executed directly on the Arduino Uno microcontroller to drive the physical traffic light hardware:</w:t>
       </w:r>
     </w:p>
     <w:p>
@@ -2472,63 +2741,181 @@
           <w:color w:val="222222"/>
           <w:sz w:val="19"/>
         </w:rPr>
-        <w:t>export function getRemainder(value: number, modulus: number): number {</w:t>
-        <w:br/>
-        <w:t xml:space="preserve">  return ((value % modulus) + modulus) % modulus;</w:t>
+        <w:t>// Arduino Uno / ATmega328P Physical Traffic Light Controller</w:t>
+        <w:br/>
+        <w:t>// File: arduino/traffic_light_controller.ino</w:t>
+        <w:br/>
+        <w:br/>
+        <w:t>const int RED_A = 2;</w:t>
+        <w:br/>
+        <w:t>const int YELLOW_A = 3;</w:t>
+        <w:br/>
+        <w:t>const int GREEN_A = 4;</w:t>
+        <w:br/>
+        <w:br/>
+        <w:t>const int RED_B = 8;</w:t>
+        <w:br/>
+        <w:t>const int YELLOW_B = 9;</w:t>
+        <w:br/>
+        <w:t>const int GREEN_B = 10;</w:t>
+        <w:br/>
+        <w:br/>
+        <w:t>const int GREEN_C = A3;</w:t>
+        <w:br/>
+        <w:t>const int YELLOW_C = A4;</w:t>
+        <w:br/>
+        <w:t>const int RED_C = A5;</w:t>
+        <w:br/>
+        <w:br/>
+        <w:t>const int BUZZER = A1;</w:t>
+        <w:br/>
+        <w:br/>
+        <w:t>// Cycle Period Definitions (in milliseconds)</w:t>
+        <w:br/>
+        <w:t>const unsigned long PERIOD_A = 3000;   // 3.0s Signal Cycle</w:t>
+        <w:br/>
+        <w:t>const unsigned long PERIOD_B = 5000;   // 5.0s Signal Cycle</w:t>
+        <w:br/>
+        <w:t>const unsigned long PERIOD_C = 7000;   // 7.0s Signal Cycle</w:t>
+        <w:br/>
+        <w:t>const unsigned long MASTER_CYCLE = 105000; // 105.0s Hyperperiod LCM</w:t>
+        <w:br/>
+        <w:br/>
+        <w:t>const int RED_FREQ = 400;</w:t>
+        <w:br/>
+        <w:t>const int YELLOW_FREQ = 600;</w:t>
+        <w:br/>
+        <w:t>const int GREEN_FREQ = 800;</w:t>
+        <w:br/>
+        <w:t>const int SYNC_FREQ = 1000;</w:t>
+        <w:br/>
+        <w:br/>
+        <w:t>const unsigned long BEEP_ON_TIME = 150;</w:t>
+        <w:br/>
+        <w:t>const unsigned long BEEP_OFF_TIME = 350;</w:t>
+        <w:br/>
+        <w:t>const unsigned long SYNC_TIME = 600;</w:t>
+        <w:br/>
+        <w:br/>
+        <w:t>unsigned long lastMillis = 0;</w:t>
+        <w:br/>
+        <w:t>unsigned long lastSyncCycle = 0;</w:t>
+        <w:br/>
+        <w:t>unsigned long beepTimer = 0;</w:t>
+        <w:br/>
+        <w:t>unsigned long syncEndTime = 0;</w:t>
+        <w:br/>
+        <w:br/>
+        <w:t>bool beepState = false;</w:t>
+        <w:br/>
+        <w:t>bool syncActive = false;</w:t>
+        <w:br/>
+        <w:t>int currentBuzzerState = -1;</w:t>
+        <w:br/>
+        <w:br/>
+        <w:t>void setup() {</w:t>
+        <w:br/>
+        <w:t xml:space="preserve">  pinMode(RED_A, OUTPUT);</w:t>
+        <w:br/>
+        <w:t xml:space="preserve">  pinMode(YELLOW_A, OUTPUT);</w:t>
+        <w:br/>
+        <w:t xml:space="preserve">  pinMode(GREEN_A, OUTPUT);</w:t>
+        <w:br/>
+        <w:br/>
+        <w:t xml:space="preserve">  pinMode(RED_B, OUTPUT);</w:t>
+        <w:br/>
+        <w:t xml:space="preserve">  pinMode(YELLOW_B, OUTPUT);</w:t>
+        <w:br/>
+        <w:t xml:space="preserve">  pinMode(GREEN_B, OUTPUT);</w:t>
+        <w:br/>
+        <w:br/>
+        <w:t xml:space="preserve">  pinMode(RED_C, OUTPUT);</w:t>
+        <w:br/>
+        <w:t xml:space="preserve">  pinMode(YELLOW_C, OUTPUT);</w:t>
+        <w:br/>
+        <w:t xml:space="preserve">  pinMode(GREEN_C, OUTPUT);</w:t>
+        <w:br/>
+        <w:br/>
+        <w:t xml:space="preserve">  pinMode(BUZZER, OUTPUT);</w:t>
+        <w:br/>
+        <w:br/>
+        <w:t xml:space="preserve">  setAllRed();</w:t>
+        <w:br/>
+        <w:br/>
+        <w:t xml:space="preserve">  tone(BUZZER, SYNC_FREQ);</w:t>
+        <w:br/>
+        <w:t xml:space="preserve">  syncActive = true;</w:t>
+        <w:br/>
+        <w:t xml:space="preserve">  syncEndTime = millis() + SYNC_TIME;</w:t>
+        <w:br/>
+        <w:br/>
+        <w:t xml:space="preserve">  lastMillis = millis();</w:t>
+        <w:br/>
+        <w:t xml:space="preserve">  beepTimer = millis();</w:t>
         <w:br/>
         <w:t>}</w:t>
         <w:br/>
         <w:br/>
-        <w:t>function extendedGcd(a: number, b: number): [number, number, number] {</w:t>
-        <w:br/>
-        <w:t xml:space="preserve">  if (b === 0) return [a, 1, 0];</w:t>
-        <w:br/>
-        <w:t xml:space="preserve">  const [g, x1, y1] = extendedGcd(b, a % b);</w:t>
-        <w:br/>
-        <w:t xml:space="preserve">  return [g, y1, x1 - Math.floor(a / b) * y1];</w:t>
-        <w:br/>
-        <w:t>}</w:t>
-        <w:br/>
-        <w:br/>
-        <w:t>function modInverse(a: number, m: number): number {</w:t>
-        <w:br/>
-        <w:t xml:space="preserve">  const [, x] = extendedGcd(getRemainder(a, m), m);</w:t>
-        <w:br/>
-        <w:t xml:space="preserve">  return getRemainder(x, m);</w:t>
-        <w:br/>
-        <w:t>}</w:t>
-        <w:br/>
-        <w:br/>
-        <w:t>/** Solves x ≡ remainders[i] (mod moduli[i]) for pairwise-coprime moduli */</w:t>
-        <w:br/>
-        <w:t>export function solveCRT(moduli: number[], remainders: number[]): number {</w:t>
-        <w:br/>
-        <w:t xml:space="preserve">  const product = moduli.reduce((acc, m) =&gt; acc * m, 1);</w:t>
-        <w:br/>
-        <w:t xml:space="preserve">  let result = 0;</w:t>
-        <w:br/>
-        <w:t xml:space="preserve">  for (let i = 0; i &lt; moduli.length; i++) {</w:t>
-        <w:br/>
-        <w:t xml:space="preserve">    const mi = moduli[i];</w:t>
-        <w:br/>
-        <w:t xml:space="preserve">    const ri = getRemainder(remainders[i], mi);</w:t>
-        <w:br/>
-        <w:t xml:space="preserve">    const partial = product / mi;</w:t>
-        <w:br/>
-        <w:t xml:space="preserve">    const inverse = modInverse(partial, mi);</w:t>
-        <w:br/>
-        <w:t xml:space="preserve">    result += ri * partial * inverse;</w:t>
+        <w:t>void loop() {</w:t>
+        <w:br/>
+        <w:t xml:space="preserve">  unsigned long currentMillis = millis();</w:t>
+        <w:br/>
+        <w:br/>
+        <w:t xml:space="preserve">  // CRT Modulo Phase Calculation</w:t>
+        <w:br/>
+        <w:t xml:space="preserve">  unsigned long phaseA = currentMillis % PERIOD_A;</w:t>
+        <w:br/>
+        <w:t xml:space="preserve">  unsigned long phaseB = currentMillis % PERIOD_B;</w:t>
+        <w:br/>
+        <w:t xml:space="preserve">  unsigned long phaseC = currentMillis % PERIOD_C;</w:t>
+        <w:br/>
+        <w:br/>
+        <w:t xml:space="preserve">  int stateA = updateLightA(phaseA);</w:t>
+        <w:br/>
+        <w:t xml:space="preserve">  int stateB = updateLightB(phaseB);</w:t>
+        <w:br/>
+        <w:t xml:space="preserve">  int stateC = updateLightC(phaseC);</w:t>
+        <w:br/>
+        <w:br/>
+        <w:t xml:space="preserve">  // Master Cycle Recurrence Check (CRT Convergence)</w:t>
+        <w:br/>
+        <w:t xml:space="preserve">  unsigned long currentCycle = currentMillis / MASTER_CYCLE;</w:t>
+        <w:br/>
+        <w:br/>
+        <w:t xml:space="preserve">  if (currentCycle &gt; lastSyncCycle) {</w:t>
+        <w:br/>
+        <w:t xml:space="preserve">    lastSyncCycle = currentCycle;</w:t>
+        <w:br/>
+        <w:t xml:space="preserve">    tone(BUZZER, SYNC_FREQ);</w:t>
+        <w:br/>
+        <w:t xml:space="preserve">    syncActive = true;</w:t>
+        <w:br/>
+        <w:t xml:space="preserve">    syncEndTime = currentMillis + SYNC_TIME;</w:t>
+        <w:br/>
+        <w:t xml:space="preserve">    beepState = false;</w:t>
         <w:br/>
         <w:t xml:space="preserve">  }</w:t>
         <w:br/>
-        <w:t xml:space="preserve">  return getRemainder(result, product);</w:t>
-        <w:br/>
-        <w:t>}</w:t>
-        <w:br/>
-        <w:br/>
-        <w:t>export function checkRemainders(x: number, moduli: number[], remainders: number[]): boolean[] {</w:t>
-        <w:br/>
-        <w:t xml:space="preserve">  return moduli.map((m, i) =&gt; getRemainder(x, m) === getRemainder(remainders[i], m));</w:t>
+        <w:br/>
+        <w:t xml:space="preserve">  if (syncActive) {</w:t>
+        <w:br/>
+        <w:t xml:space="preserve">    if (currentMillis &gt;= syncEndTime) {</w:t>
+        <w:br/>
+        <w:t xml:space="preserve">      noTone(BUZZER);</w:t>
+        <w:br/>
+        <w:t xml:space="preserve">      syncActive = false;</w:t>
+        <w:br/>
+        <w:t xml:space="preserve">      beepTimer = currentMillis;</w:t>
+        <w:br/>
+        <w:t xml:space="preserve">      beepState = false;</w:t>
+        <w:br/>
+        <w:t xml:space="preserve">      currentBuzzerState = -1;</w:t>
+        <w:br/>
+        <w:t xml:space="preserve">    }</w:t>
+        <w:br/>
+        <w:t xml:space="preserve">    return;</w:t>
+        <w:br/>
+        <w:t xml:space="preserve">  }</w:t>
         <w:br/>
         <w:t>}</w:t>
       </w:r>
@@ -2561,7 +2948,7 @@
         <w:spacing w:after="80" w:line="276" w:lineRule="auto"/>
       </w:pPr>
       <w:r>
-        <w:t>The Traffic Signal Synchronization System provides an intuitive, practical bridge between abstract number theory and urban infrastructure engineering. By applying the Chinese Remainder Theorem to traffic signals operating on independent cycles (3 min, 5 min, 7 min), the project demonstrates how non-zero remainder offsets determine the exact minute (Minute 23) required to establish a continuous 'Green Wave' for vehicles.</w:t>
+        <w:t>The Traffic Signal Synchronization System provides an intuitive, practical bridge between abstract number theory and urban infrastructure engineering. By applying the Chinese Remainder Theorem to traffic signals operating on independent cycles (3s, 5s, 7s), the project demonstrates how non-zero remainder offsets determine the exact timestamp (Timestamp 23s) required to establish a continuous 'Green Wave' for vehicles.</w:t>
       </w:r>
     </w:p>
     <w:p>
@@ -2569,7 +2956,7 @@
         <w:spacing w:after="80" w:line="276" w:lineRule="auto"/>
       </w:pPr>
       <w:r>
-        <w:t>Both the physical working model and the interactive web application successfully visualize modular congruences, offering an accessible learning tool that highlights the real-world power of modular arithmetic in signal timing, telecommunications, and digital computing.</w:t>
+        <w:t>Both the physical Arduino Uno hardware prototype and the digital twin web application successfully visualize modular congruences, offering an accessible learning tool that highlights the real-world power of modular arithmetic in signal timing, telecommunications, and digital computing.</w:t>
       </w:r>
     </w:p>
     <w:p>
@@ -2817,7 +3204,7 @@
         <w:spacing w:after="80" w:line="276" w:lineRule="auto"/>
       </w:pPr>
       <w:r>
-        <w:t>This project demonstrates CRT using both a physical working traffic signal model and an interactive digital web application. By modeling traffic signals as modular timing cycles, the project illustrates how independent light timers (3 min, 5 min, 7 min) align to create a continuous 'Green Wave' for vehicles at Minute 23.</w:t>
+        <w:t>This project demonstrates CRT using both a physical working ATmega328P / Arduino Uno traffic signal model and an interactive digital twin web application. By modeling traffic signals as modular timing cycles, the project illustrates how independent light timers (3s, 5s, 7s) align to create a continuous 'Green Wave' for vehicles at Minute 23 (105s master recurrence).</w:t>
       </w:r>
     </w:p>
     <w:p>
@@ -2890,7 +3277,7 @@
         <w:spacing w:after="60"/>
       </w:pPr>
       <w:r>
-        <w:t>To model traffic signal timing cycles (3 min, 5 min, 7 min) as modular congruences.</w:t>
+        <w:t>To model traffic signal timing cycles (3s, 5s, 7s) as modular congruences.</w:t>
       </w:r>
     </w:p>
     <w:p>
@@ -2899,7 +3286,7 @@
         <w:spacing w:after="60"/>
       </w:pPr>
       <w:r>
-        <w:t>To build a physical working model and an interactive web simulator for signal synchronization.</w:t>
+        <w:t>To build a physical working model powered by an Arduino Uno / ATmega328P microcontroller.</w:t>
       </w:r>
     </w:p>
     <w:p>
@@ -2908,7 +3295,7 @@
         <w:spacing w:after="60"/>
       </w:pPr>
       <w:r>
-        <w:t>To provide clear visual and audio feedback when a candidate time satisfies all signal modulo conditions.</w:t>
+        <w:t>To provide clear visual, audio, and waveform telemetry feedback upon signal synchronization.</w:t>
       </w:r>
     </w:p>
     <w:p>
@@ -2954,7 +3341,7 @@
         <w:spacing w:after="80" w:line="276" w:lineRule="auto"/>
       </w:pPr>
       <w:r>
-        <w:t>Suppose three traffic signals have cycle lengths of 3, 5, and 7 minutes respectively:</w:t>
+        <w:t>Suppose three traffic signals have cycle lengths of 3, 5, and 7 seconds respectively:</w:t>
       </w:r>
     </w:p>
     <w:p>
@@ -2963,7 +3350,7 @@
         <w:spacing w:after="60"/>
       </w:pPr>
       <w:r>
-        <w:t>Signal 1: x ≡ 2 (mod 3)   (green 2 minutes ago)</w:t>
+        <w:t>Signal 1: x ≡ 2 (mod 3)   (green 2 seconds ago)</w:t>
       </w:r>
     </w:p>
     <w:p>
@@ -2972,7 +3359,7 @@
         <w:spacing w:after="60"/>
       </w:pPr>
       <w:r>
-        <w:t>Signal 2: x ≡ 3 (mod 5)   (green 3 minutes ago)</w:t>
+        <w:t>Signal 2: x ≡ 3 (mod 5)   (green 3 seconds ago)</w:t>
       </w:r>
     </w:p>
     <w:p>
@@ -2981,7 +3368,7 @@
         <w:spacing w:after="60"/>
       </w:pPr>
       <w:r>
-        <w:t>Signal 3: x ≡ 2 (mod 7)   (green 2 minutes ago)</w:t>
+        <w:t>Signal 3: x ≡ 2 (mod 7)   (green 2 seconds ago)</w:t>
       </w:r>
     </w:p>
     <w:p>
@@ -3148,7 +3535,7 @@
         <w:spacing w:after="80" w:line="276" w:lineRule="auto"/>
       </w:pPr>
       <w:r>
-        <w:t>The unique green-wave solution within [0, 104] is Minute 23.</w:t>
+        <w:t>The unique green-wave solution within [0, 104] is Timestamp 23s.</w:t>
       </w:r>
     </w:p>
     <w:p>
@@ -3171,7 +3558,7 @@
           <w:color w:val="2B6CB0"/>
           <w:sz w:val="28"/>
         </w:rPr>
-        <w:t>4. DIGITAL IMPLEMENTATION &amp; USER CONTROLS</w:t>
+        <w:t>4. PHYSICAL HARDWARE &amp; DIGITAL TWIN IMPLEMENTATION</w:t>
       </w:r>
     </w:p>
     <w:p>
@@ -3179,7 +3566,7 @@
         <w:spacing w:after="80" w:line="276" w:lineRule="auto"/>
       </w:pPr>
       <w:r>
-        <w:t>The web application models the traffic signal system digitally using React, TypeScript, and Framer Motion.</w:t>
+        <w:t>The hardware prototype is driven by an ATmega328P (Arduino Uno) microcontroller controlling a 3-intersection LED traffic array and piezo buzzer.</w:t>
       </w:r>
     </w:p>
     <w:p>
@@ -3190,7 +3577,7 @@
       <w:r>
         <w:drawing>
           <wp:inline xmlns:a="http://schemas.openxmlformats.org/drawingml/2006/main" xmlns:pic="http://schemas.openxmlformats.org/drawingml/2006/picture">
-            <wp:extent cx="5303520" cy="2960104"/>
+            <wp:extent cx="5303520" cy="4221063"/>
             <wp:docPr id="7" name="Picture 7"/>
             <wp:cNvGraphicFramePr>
               <a:graphicFrameLocks noChangeAspect="1"/>
@@ -3199,7 +3586,7 @@
               <a:graphicData uri="http://schemas.openxmlformats.org/drawingml/2006/picture">
                 <pic:pic>
                   <pic:nvPicPr>
-                    <pic:cNvPr id="0" name="traffic_light_diagram_1790783447873.jpg"/>
+                    <pic:cNvPr id="0" name="media_1790791490718.png"/>
                     <pic:cNvPicPr/>
                   </pic:nvPicPr>
                   <pic:blipFill>
@@ -3211,7 +3598,7 @@
                   <pic:spPr>
                     <a:xfrm>
                       <a:off x="0" y="0"/>
-                      <a:ext cx="5303520" cy="2960104"/>
+                      <a:ext cx="5303520" cy="4221063"/>
                     </a:xfrm>
                     <a:prstGeom prst="rect"/>
                   </pic:spPr>
@@ -3230,7 +3617,7 @@
       <w:r>
         <w:drawing>
           <wp:inline xmlns:a="http://schemas.openxmlformats.org/drawingml/2006/main" xmlns:pic="http://schemas.openxmlformats.org/drawingml/2006/picture">
-            <wp:extent cx="5303520" cy="2960104"/>
+            <wp:extent cx="5303520" cy="3677245"/>
             <wp:docPr id="8" name="Picture 8"/>
             <wp:cNvGraphicFramePr>
               <a:graphicFrameLocks noChangeAspect="1"/>
@@ -3239,7 +3626,7 @@
               <a:graphicData uri="http://schemas.openxmlformats.org/drawingml/2006/picture">
                 <pic:pic>
                   <pic:nvPicPr>
-                    <pic:cNvPr id="0" name="traffic_signal_app_ui_1790783779368.jpg"/>
+                    <pic:cNvPr id="0" name="media_1790791505847.png"/>
                     <pic:cNvPicPr/>
                   </pic:nvPicPr>
                   <pic:blipFill>
@@ -3251,7 +3638,7 @@
                   <pic:spPr>
                     <a:xfrm>
                       <a:off x="0" y="0"/>
-                      <a:ext cx="5303520" cy="2960104"/>
+                      <a:ext cx="5303520" cy="3677245"/>
                     </a:xfrm>
                     <a:prstGeom prst="rect"/>
                   </pic:spPr>
@@ -3274,7 +3661,7 @@
           <w:color w:val="2D3748"/>
           <w:sz w:val="24"/>
         </w:rPr>
-        <w:t>Interactive User Controls:</w:t>
+        <w:t>Interactive Hardware &amp; Digital Twin Controls:</w:t>
       </w:r>
     </w:p>
     <w:p>
@@ -3283,7 +3670,7 @@
         <w:spacing w:after="60"/>
       </w:pPr>
       <w:r>
-        <w:t>Candidate Timer Wheel: Adjusts the candidate time value x (e.g. set to 23).</w:t>
+        <w:t>Live Signal Array (SIG A 3.0s, SIG B 5.0s, SIG C 7.0s): Monitors real-time LED states across intersections.</w:t>
       </w:r>
     </w:p>
     <w:p>
@@ -3292,7 +3679,7 @@
         <w:spacing w:after="60"/>
       </w:pPr>
       <w:r>
-        <w:t>Intersection Signal Monitors (3 min, 5 min, 7 min): Shows real-time remainder values (x mod mi) and green light indicator status.</w:t>
+        <w:t>CRT Telemetry Engine (105s Recurrence): Tracks clock progress, hyperperiod LCM (105.00s), and recurrence index.</w:t>
       </w:r>
     </w:p>
     <w:p>
@@ -3301,7 +3688,7 @@
         <w:spacing w:after="60"/>
       </w:pPr>
       <w:r>
-        <w:t>'Evaluate Synchronization' Button: Tests whether all 3 intersections display green lights simultaneously.</w:t>
+        <w:t>Multi-Channel Phase Waveform: Displays white cursor sweep across the 105s hyperperiod with cyan alignment markers.</w:t>
       </w:r>
     </w:p>
     <w:p>
@@ -3310,7 +3697,7 @@
         <w:spacing w:after="60"/>
       </w:pPr>
       <w:r>
-        <w:t>Green-Wave Status Panel: Displays full green-wave confirmation when all 3 congruences are satisfied (x = 23).</w:t>
+        <w:t>CRT Remainder State Seeker: Solves for timestamp t dynamically for any requested signal state combination.</w:t>
       </w:r>
     </w:p>
     <w:p>
@@ -3333,7 +3720,7 @@
           <w:color w:val="2B6CB0"/>
           <w:sz w:val="28"/>
         </w:rPr>
-        <w:t>5. SOURCE CODE IMPLEMENTATION (ALGORITHM PAGE)</w:t>
+        <w:t>5. HARDWARE SOURCE CODE (ARDUINO UNO FIRMWARE - C++)</w:t>
       </w:r>
     </w:p>
     <w:p>
@@ -3341,7 +3728,18 @@
         <w:spacing w:after="80" w:line="276" w:lineRule="auto"/>
       </w:pPr>
       <w:r>
-        <w:t>The following complete TypeScript module (src/utils/crt.ts) implements the Extended Euclidean Algorithm and Modular Inverses to solve the CRT system:</w:t>
+        <w:t>The following complete C++ firmware source code (</w:t>
+      </w:r>
+      <w:r>
+        <w:rPr>
+          <w:rFonts w:ascii="Courier New" w:hAnsi="Courier New"/>
+          <w:color w:val="C53030"/>
+          <w:sz w:val="19"/>
+        </w:rPr>
+        <w:t>arduino/traffic_light_controller.ino</w:t>
+      </w:r>
+      <w:r>
+        <w:t>) is executed directly on the Arduino Uno microcontroller to drive the physical traffic light hardware:</w:t>
       </w:r>
     </w:p>
     <w:p>
@@ -3355,63 +3753,181 @@
           <w:color w:val="222222"/>
           <w:sz w:val="19"/>
         </w:rPr>
-        <w:t>export function getRemainder(value: number, modulus: number): number {</w:t>
-        <w:br/>
-        <w:t xml:space="preserve">  return ((value % modulus) + modulus) % modulus;</w:t>
+        <w:t>// Arduino Uno / ATmega328P Physical Traffic Light Controller</w:t>
+        <w:br/>
+        <w:t>// File: arduino/traffic_light_controller.ino</w:t>
+        <w:br/>
+        <w:br/>
+        <w:t>const int RED_A = 2;</w:t>
+        <w:br/>
+        <w:t>const int YELLOW_A = 3;</w:t>
+        <w:br/>
+        <w:t>const int GREEN_A = 4;</w:t>
+        <w:br/>
+        <w:br/>
+        <w:t>const int RED_B = 8;</w:t>
+        <w:br/>
+        <w:t>const int YELLOW_B = 9;</w:t>
+        <w:br/>
+        <w:t>const int GREEN_B = 10;</w:t>
+        <w:br/>
+        <w:br/>
+        <w:t>const int GREEN_C = A3;</w:t>
+        <w:br/>
+        <w:t>const int YELLOW_C = A4;</w:t>
+        <w:br/>
+        <w:t>const int RED_C = A5;</w:t>
+        <w:br/>
+        <w:br/>
+        <w:t>const int BUZZER = A1;</w:t>
+        <w:br/>
+        <w:br/>
+        <w:t>// Cycle Period Definitions (in milliseconds)</w:t>
+        <w:br/>
+        <w:t>const unsigned long PERIOD_A = 3000;   // 3.0s Signal Cycle</w:t>
+        <w:br/>
+        <w:t>const unsigned long PERIOD_B = 5000;   // 5.0s Signal Cycle</w:t>
+        <w:br/>
+        <w:t>const unsigned long PERIOD_C = 7000;   // 7.0s Signal Cycle</w:t>
+        <w:br/>
+        <w:t>const unsigned long MASTER_CYCLE = 105000; // 105.0s Hyperperiod LCM</w:t>
+        <w:br/>
+        <w:br/>
+        <w:t>const int RED_FREQ = 400;</w:t>
+        <w:br/>
+        <w:t>const int YELLOW_FREQ = 600;</w:t>
+        <w:br/>
+        <w:t>const int GREEN_FREQ = 800;</w:t>
+        <w:br/>
+        <w:t>const int SYNC_FREQ = 1000;</w:t>
+        <w:br/>
+        <w:br/>
+        <w:t>const unsigned long BEEP_ON_TIME = 150;</w:t>
+        <w:br/>
+        <w:t>const unsigned long BEEP_OFF_TIME = 350;</w:t>
+        <w:br/>
+        <w:t>const unsigned long SYNC_TIME = 600;</w:t>
+        <w:br/>
+        <w:br/>
+        <w:t>unsigned long lastMillis = 0;</w:t>
+        <w:br/>
+        <w:t>unsigned long lastSyncCycle = 0;</w:t>
+        <w:br/>
+        <w:t>unsigned long beepTimer = 0;</w:t>
+        <w:br/>
+        <w:t>unsigned long syncEndTime = 0;</w:t>
+        <w:br/>
+        <w:br/>
+        <w:t>bool beepState = false;</w:t>
+        <w:br/>
+        <w:t>bool syncActive = false;</w:t>
+        <w:br/>
+        <w:t>int currentBuzzerState = -1;</w:t>
+        <w:br/>
+        <w:br/>
+        <w:t>void setup() {</w:t>
+        <w:br/>
+        <w:t xml:space="preserve">  pinMode(RED_A, OUTPUT);</w:t>
+        <w:br/>
+        <w:t xml:space="preserve">  pinMode(YELLOW_A, OUTPUT);</w:t>
+        <w:br/>
+        <w:t xml:space="preserve">  pinMode(GREEN_A, OUTPUT);</w:t>
+        <w:br/>
+        <w:br/>
+        <w:t xml:space="preserve">  pinMode(RED_B, OUTPUT);</w:t>
+        <w:br/>
+        <w:t xml:space="preserve">  pinMode(YELLOW_B, OUTPUT);</w:t>
+        <w:br/>
+        <w:t xml:space="preserve">  pinMode(GREEN_B, OUTPUT);</w:t>
+        <w:br/>
+        <w:br/>
+        <w:t xml:space="preserve">  pinMode(RED_C, OUTPUT);</w:t>
+        <w:br/>
+        <w:t xml:space="preserve">  pinMode(YELLOW_C, OUTPUT);</w:t>
+        <w:br/>
+        <w:t xml:space="preserve">  pinMode(GREEN_C, OUTPUT);</w:t>
+        <w:br/>
+        <w:br/>
+        <w:t xml:space="preserve">  pinMode(BUZZER, OUTPUT);</w:t>
+        <w:br/>
+        <w:br/>
+        <w:t xml:space="preserve">  setAllRed();</w:t>
+        <w:br/>
+        <w:br/>
+        <w:t xml:space="preserve">  tone(BUZZER, SYNC_FREQ);</w:t>
+        <w:br/>
+        <w:t xml:space="preserve">  syncActive = true;</w:t>
+        <w:br/>
+        <w:t xml:space="preserve">  syncEndTime = millis() + SYNC_TIME;</w:t>
+        <w:br/>
+        <w:br/>
+        <w:t xml:space="preserve">  lastMillis = millis();</w:t>
+        <w:br/>
+        <w:t xml:space="preserve">  beepTimer = millis();</w:t>
         <w:br/>
         <w:t>}</w:t>
         <w:br/>
         <w:br/>
-        <w:t>function extendedGcd(a: number, b: number): [number, number, number] {</w:t>
-        <w:br/>
-        <w:t xml:space="preserve">  if (b === 0) return [a, 1, 0];</w:t>
-        <w:br/>
-        <w:t xml:space="preserve">  const [g, x1, y1] = extendedGcd(b, a % b);</w:t>
-        <w:br/>
-        <w:t xml:space="preserve">  return [g, y1, x1 - Math.floor(a / b) * y1];</w:t>
-        <w:br/>
-        <w:t>}</w:t>
-        <w:br/>
-        <w:br/>
-        <w:t>function modInverse(a: number, m: number): number {</w:t>
-        <w:br/>
-        <w:t xml:space="preserve">  const [, x] = extendedGcd(getRemainder(a, m), m);</w:t>
-        <w:br/>
-        <w:t xml:space="preserve">  return getRemainder(x, m);</w:t>
-        <w:br/>
-        <w:t>}</w:t>
-        <w:br/>
-        <w:br/>
-        <w:t>/** Solves x ≡ remainders[i] (mod moduli[i]) for pairwise-coprime moduli */</w:t>
-        <w:br/>
-        <w:t>export function solveCRT(moduli: number[], remainders: number[]): number {</w:t>
-        <w:br/>
-        <w:t xml:space="preserve">  const product = moduli.reduce((acc, m) =&gt; acc * m, 1);</w:t>
-        <w:br/>
-        <w:t xml:space="preserve">  let result = 0;</w:t>
-        <w:br/>
-        <w:t xml:space="preserve">  for (let i = 0; i &lt; moduli.length; i++) {</w:t>
-        <w:br/>
-        <w:t xml:space="preserve">    const mi = moduli[i];</w:t>
-        <w:br/>
-        <w:t xml:space="preserve">    const ri = getRemainder(remainders[i], mi);</w:t>
-        <w:br/>
-        <w:t xml:space="preserve">    const partial = product / mi;</w:t>
-        <w:br/>
-        <w:t xml:space="preserve">    const inverse = modInverse(partial, mi);</w:t>
-        <w:br/>
-        <w:t xml:space="preserve">    result += ri * partial * inverse;</w:t>
+        <w:t>void loop() {</w:t>
+        <w:br/>
+        <w:t xml:space="preserve">  unsigned long currentMillis = millis();</w:t>
+        <w:br/>
+        <w:br/>
+        <w:t xml:space="preserve">  // CRT Modulo Phase Calculation</w:t>
+        <w:br/>
+        <w:t xml:space="preserve">  unsigned long phaseA = currentMillis % PERIOD_A;</w:t>
+        <w:br/>
+        <w:t xml:space="preserve">  unsigned long phaseB = currentMillis % PERIOD_B;</w:t>
+        <w:br/>
+        <w:t xml:space="preserve">  unsigned long phaseC = currentMillis % PERIOD_C;</w:t>
+        <w:br/>
+        <w:br/>
+        <w:t xml:space="preserve">  int stateA = updateLightA(phaseA);</w:t>
+        <w:br/>
+        <w:t xml:space="preserve">  int stateB = updateLightB(phaseB);</w:t>
+        <w:br/>
+        <w:t xml:space="preserve">  int stateC = updateLightC(phaseC);</w:t>
+        <w:br/>
+        <w:br/>
+        <w:t xml:space="preserve">  // Master Cycle Recurrence Check (CRT Convergence)</w:t>
+        <w:br/>
+        <w:t xml:space="preserve">  unsigned long currentCycle = currentMillis / MASTER_CYCLE;</w:t>
+        <w:br/>
+        <w:br/>
+        <w:t xml:space="preserve">  if (currentCycle &gt; lastSyncCycle) {</w:t>
+        <w:br/>
+        <w:t xml:space="preserve">    lastSyncCycle = currentCycle;</w:t>
+        <w:br/>
+        <w:t xml:space="preserve">    tone(BUZZER, SYNC_FREQ);</w:t>
+        <w:br/>
+        <w:t xml:space="preserve">    syncActive = true;</w:t>
+        <w:br/>
+        <w:t xml:space="preserve">    syncEndTime = currentMillis + SYNC_TIME;</w:t>
+        <w:br/>
+        <w:t xml:space="preserve">    beepState = false;</w:t>
         <w:br/>
         <w:t xml:space="preserve">  }</w:t>
         <w:br/>
-        <w:t xml:space="preserve">  return getRemainder(result, product);</w:t>
-        <w:br/>
-        <w:t>}</w:t>
-        <w:br/>
-        <w:br/>
-        <w:t>export function checkRemainders(x: number, moduli: number[], remainders: number[]): boolean[] {</w:t>
-        <w:br/>
-        <w:t xml:space="preserve">  return moduli.map((m, i) =&gt; getRemainder(x, m) === getRemainder(remainders[i], m));</w:t>
+        <w:br/>
+        <w:t xml:space="preserve">  if (syncActive) {</w:t>
+        <w:br/>
+        <w:t xml:space="preserve">    if (currentMillis &gt;= syncEndTime) {</w:t>
+        <w:br/>
+        <w:t xml:space="preserve">      noTone(BUZZER);</w:t>
+        <w:br/>
+        <w:t xml:space="preserve">      syncActive = false;</w:t>
+        <w:br/>
+        <w:t xml:space="preserve">      beepTimer = currentMillis;</w:t>
+        <w:br/>
+        <w:t xml:space="preserve">      beepState = false;</w:t>
+        <w:br/>
+        <w:t xml:space="preserve">      currentBuzzerState = -1;</w:t>
+        <w:br/>
+        <w:t xml:space="preserve">    }</w:t>
+        <w:br/>
+        <w:t xml:space="preserve">    return;</w:t>
+        <w:br/>
+        <w:t xml:space="preserve">  }</w:t>
         <w:br/>
         <w:t>}</w:t>
       </w:r>
@@ -3444,7 +3960,7 @@
         <w:spacing w:after="80" w:line="276" w:lineRule="auto"/>
       </w:pPr>
       <w:r>
-        <w:t>The Traffic Signal Synchronization System provides an intuitive, practical bridge between abstract number theory and urban infrastructure engineering. By applying the Chinese Remainder Theorem to traffic signals operating on independent cycles (3 min, 5 min, 7 min), the project demonstrates how non-zero remainder offsets determine the exact minute (Minute 23) required to establish a continuous 'Green Wave' for vehicles.</w:t>
+        <w:t>The Traffic Signal Synchronization System provides an intuitive, practical bridge between abstract number theory and urban infrastructure engineering. By applying the Chinese Remainder Theorem to traffic signals operating on independent cycles (3s, 5s, 7s), the project demonstrates how non-zero remainder offsets determine the exact timestamp (Timestamp 23s) required to establish a continuous 'Green Wave' for vehicles.</w:t>
       </w:r>
     </w:p>
     <w:p>
@@ -3452,7 +3968,7 @@
         <w:spacing w:after="80" w:line="276" w:lineRule="auto"/>
       </w:pPr>
       <w:r>
-        <w:t>Both the physical working model and the interactive web application successfully visualize modular congruences, offering an accessible learning tool that highlights the real-world power of modular arithmetic in signal timing, telecommunications, and digital computing.</w:t>
+        <w:t>Both the physical Arduino Uno hardware prototype and the digital twin web application successfully visualize modular congruences, offering an accessible learning tool that highlights the real-world power of modular arithmetic in signal timing, telecommunications, and digital computing.</w:t>
       </w:r>
     </w:p>
     <w:p>
@@ -3700,7 +4216,7 @@
         <w:spacing w:after="80" w:line="276" w:lineRule="auto"/>
       </w:pPr>
       <w:r>
-        <w:t>This project demonstrates CRT using both a physical working traffic signal model and an interactive digital web application. By modeling traffic signals as modular timing cycles, the project illustrates how independent light timers (3 min, 5 min, 7 min) align to create a continuous 'Green Wave' for vehicles at Minute 23.</w:t>
+        <w:t>This project demonstrates CRT using both a physical working ATmega328P / Arduino Uno traffic signal model and an interactive digital twin web application. By modeling traffic signals as modular timing cycles, the project illustrates how independent light timers (3s, 5s, 7s) align to create a continuous 'Green Wave' for vehicles at Minute 23 (105s master recurrence).</w:t>
       </w:r>
     </w:p>
     <w:p>
@@ -3773,7 +4289,7 @@
         <w:spacing w:after="60"/>
       </w:pPr>
       <w:r>
-        <w:t>To model traffic signal timing cycles (3 min, 5 min, 7 min) as modular congruences.</w:t>
+        <w:t>To model traffic signal timing cycles (3s, 5s, 7s) as modular congruences.</w:t>
       </w:r>
     </w:p>
     <w:p>
@@ -3782,7 +4298,7 @@
         <w:spacing w:after="60"/>
       </w:pPr>
       <w:r>
-        <w:t>To build a physical working model and an interactive web simulator for signal synchronization.</w:t>
+        <w:t>To build a physical working model powered by an Arduino Uno / ATmega328P microcontroller.</w:t>
       </w:r>
     </w:p>
     <w:p>
@@ -3791,7 +4307,7 @@
         <w:spacing w:after="60"/>
       </w:pPr>
       <w:r>
-        <w:t>To provide clear visual and audio feedback when a candidate time satisfies all signal modulo conditions.</w:t>
+        <w:t>To provide clear visual, audio, and waveform telemetry feedback upon signal synchronization.</w:t>
       </w:r>
     </w:p>
     <w:p>
@@ -3837,7 +4353,7 @@
         <w:spacing w:after="80" w:line="276" w:lineRule="auto"/>
       </w:pPr>
       <w:r>
-        <w:t>Suppose three traffic signals have cycle lengths of 3, 5, and 7 minutes respectively:</w:t>
+        <w:t>Suppose three traffic signals have cycle lengths of 3, 5, and 7 seconds respectively:</w:t>
       </w:r>
     </w:p>
     <w:p>
@@ -3846,7 +4362,7 @@
         <w:spacing w:after="60"/>
       </w:pPr>
       <w:r>
-        <w:t>Signal 1: x ≡ 2 (mod 3)   (green 2 minutes ago)</w:t>
+        <w:t>Signal 1: x ≡ 2 (mod 3)   (green 2 seconds ago)</w:t>
       </w:r>
     </w:p>
     <w:p>
@@ -3855,7 +4371,7 @@
         <w:spacing w:after="60"/>
       </w:pPr>
       <w:r>
-        <w:t>Signal 2: x ≡ 3 (mod 5)   (green 3 minutes ago)</w:t>
+        <w:t>Signal 2: x ≡ 3 (mod 5)   (green 3 seconds ago)</w:t>
       </w:r>
     </w:p>
     <w:p>
@@ -3864,7 +4380,7 @@
         <w:spacing w:after="60"/>
       </w:pPr>
       <w:r>
-        <w:t>Signal 3: x ≡ 2 (mod 7)   (green 2 minutes ago)</w:t>
+        <w:t>Signal 3: x ≡ 2 (mod 7)   (green 2 seconds ago)</w:t>
       </w:r>
     </w:p>
     <w:p>
@@ -4031,7 +4547,7 @@
         <w:spacing w:after="80" w:line="276" w:lineRule="auto"/>
       </w:pPr>
       <w:r>
-        <w:t>The unique green-wave solution within [0, 104] is Minute 23.</w:t>
+        <w:t>The unique green-wave solution within [0, 104] is Timestamp 23s.</w:t>
       </w:r>
     </w:p>
     <w:p>
@@ -4054,7 +4570,7 @@
           <w:color w:val="2B6CB0"/>
           <w:sz w:val="28"/>
         </w:rPr>
-        <w:t>4. DIGITAL IMPLEMENTATION &amp; USER CONTROLS</w:t>
+        <w:t>4. PHYSICAL HARDWARE &amp; DIGITAL TWIN IMPLEMENTATION</w:t>
       </w:r>
     </w:p>
     <w:p>
@@ -4062,7 +4578,7 @@
         <w:spacing w:after="80" w:line="276" w:lineRule="auto"/>
       </w:pPr>
       <w:r>
-        <w:t>The web application models the traffic signal system digitally using React, TypeScript, and Framer Motion.</w:t>
+        <w:t>The hardware prototype is driven by an ATmega328P (Arduino Uno) microcontroller controlling a 3-intersection LED traffic array and piezo buzzer.</w:t>
       </w:r>
     </w:p>
     <w:p>
@@ -4073,7 +4589,7 @@
       <w:r>
         <w:drawing>
           <wp:inline xmlns:a="http://schemas.openxmlformats.org/drawingml/2006/main" xmlns:pic="http://schemas.openxmlformats.org/drawingml/2006/picture">
-            <wp:extent cx="5303520" cy="2960104"/>
+            <wp:extent cx="5303520" cy="4221063"/>
             <wp:docPr id="9" name="Picture 9"/>
             <wp:cNvGraphicFramePr>
               <a:graphicFrameLocks noChangeAspect="1"/>
@@ -4082,7 +4598,7 @@
               <a:graphicData uri="http://schemas.openxmlformats.org/drawingml/2006/picture">
                 <pic:pic>
                   <pic:nvPicPr>
-                    <pic:cNvPr id="0" name="traffic_light_diagram_1790783447873.jpg"/>
+                    <pic:cNvPr id="0" name="media_1790791490718.png"/>
                     <pic:cNvPicPr/>
                   </pic:nvPicPr>
                   <pic:blipFill>
@@ -4094,7 +4610,7 @@
                   <pic:spPr>
                     <a:xfrm>
                       <a:off x="0" y="0"/>
-                      <a:ext cx="5303520" cy="2960104"/>
+                      <a:ext cx="5303520" cy="4221063"/>
                     </a:xfrm>
                     <a:prstGeom prst="rect"/>
                   </pic:spPr>
@@ -4113,7 +4629,7 @@
       <w:r>
         <w:drawing>
           <wp:inline xmlns:a="http://schemas.openxmlformats.org/drawingml/2006/main" xmlns:pic="http://schemas.openxmlformats.org/drawingml/2006/picture">
-            <wp:extent cx="5303520" cy="2960104"/>
+            <wp:extent cx="5303520" cy="3677245"/>
             <wp:docPr id="10" name="Picture 10"/>
             <wp:cNvGraphicFramePr>
               <a:graphicFrameLocks noChangeAspect="1"/>
@@ -4122,7 +4638,7 @@
               <a:graphicData uri="http://schemas.openxmlformats.org/drawingml/2006/picture">
                 <pic:pic>
                   <pic:nvPicPr>
-                    <pic:cNvPr id="0" name="traffic_signal_app_ui_1790783779368.jpg"/>
+                    <pic:cNvPr id="0" name="media_1790791505847.png"/>
                     <pic:cNvPicPr/>
                   </pic:nvPicPr>
                   <pic:blipFill>
@@ -4134,7 +4650,7 @@
                   <pic:spPr>
                     <a:xfrm>
                       <a:off x="0" y="0"/>
-                      <a:ext cx="5303520" cy="2960104"/>
+                      <a:ext cx="5303520" cy="3677245"/>
                     </a:xfrm>
                     <a:prstGeom prst="rect"/>
                   </pic:spPr>
@@ -4157,7 +4673,7 @@
           <w:color w:val="2D3748"/>
           <w:sz w:val="24"/>
         </w:rPr>
-        <w:t>Interactive User Controls:</w:t>
+        <w:t>Interactive Hardware &amp; Digital Twin Controls:</w:t>
       </w:r>
     </w:p>
     <w:p>
@@ -4166,7 +4682,7 @@
         <w:spacing w:after="60"/>
       </w:pPr>
       <w:r>
-        <w:t>Candidate Timer Wheel: Adjusts the candidate time value x (e.g. set to 23).</w:t>
+        <w:t>Live Signal Array (SIG A 3.0s, SIG B 5.0s, SIG C 7.0s): Monitors real-time LED states across intersections.</w:t>
       </w:r>
     </w:p>
     <w:p>
@@ -4175,7 +4691,7 @@
         <w:spacing w:after="60"/>
       </w:pPr>
       <w:r>
-        <w:t>Intersection Signal Monitors (3 min, 5 min, 7 min): Shows real-time remainder values (x mod mi) and green light indicator status.</w:t>
+        <w:t>CRT Telemetry Engine (105s Recurrence): Tracks clock progress, hyperperiod LCM (105.00s), and recurrence index.</w:t>
       </w:r>
     </w:p>
     <w:p>
@@ -4184,7 +4700,7 @@
         <w:spacing w:after="60"/>
       </w:pPr>
       <w:r>
-        <w:t>'Evaluate Synchronization' Button: Tests whether all 3 intersections display green lights simultaneously.</w:t>
+        <w:t>Multi-Channel Phase Waveform: Displays white cursor sweep across the 105s hyperperiod with cyan alignment markers.</w:t>
       </w:r>
     </w:p>
     <w:p>
@@ -4193,7 +4709,7 @@
         <w:spacing w:after="60"/>
       </w:pPr>
       <w:r>
-        <w:t>Green-Wave Status Panel: Displays full green-wave confirmation when all 3 congruences are satisfied (x = 23).</w:t>
+        <w:t>CRT Remainder State Seeker: Solves for timestamp t dynamically for any requested signal state combination.</w:t>
       </w:r>
     </w:p>
     <w:p>
@@ -4216,7 +4732,7 @@
           <w:color w:val="2B6CB0"/>
           <w:sz w:val="28"/>
         </w:rPr>
-        <w:t>5. SOURCE CODE IMPLEMENTATION (ALGORITHM PAGE)</w:t>
+        <w:t>5. HARDWARE SOURCE CODE (ARDUINO UNO FIRMWARE - C++)</w:t>
       </w:r>
     </w:p>
     <w:p>
@@ -4224,7 +4740,18 @@
         <w:spacing w:after="80" w:line="276" w:lineRule="auto"/>
       </w:pPr>
       <w:r>
-        <w:t>The following complete TypeScript module (src/utils/crt.ts) implements the Extended Euclidean Algorithm and Modular Inverses to solve the CRT system:</w:t>
+        <w:t>The following complete C++ firmware source code (</w:t>
+      </w:r>
+      <w:r>
+        <w:rPr>
+          <w:rFonts w:ascii="Courier New" w:hAnsi="Courier New"/>
+          <w:color w:val="C53030"/>
+          <w:sz w:val="19"/>
+        </w:rPr>
+        <w:t>arduino/traffic_light_controller.ino</w:t>
+      </w:r>
+      <w:r>
+        <w:t>) is executed directly on the Arduino Uno microcontroller to drive the physical traffic light hardware:</w:t>
       </w:r>
     </w:p>
     <w:p>
@@ -4238,63 +4765,181 @@
           <w:color w:val="222222"/>
           <w:sz w:val="19"/>
         </w:rPr>
-        <w:t>export function getRemainder(value: number, modulus: number): number {</w:t>
-        <w:br/>
-        <w:t xml:space="preserve">  return ((value % modulus) + modulus) % modulus;</w:t>
+        <w:t>// Arduino Uno / ATmega328P Physical Traffic Light Controller</w:t>
+        <w:br/>
+        <w:t>// File: arduino/traffic_light_controller.ino</w:t>
+        <w:br/>
+        <w:br/>
+        <w:t>const int RED_A = 2;</w:t>
+        <w:br/>
+        <w:t>const int YELLOW_A = 3;</w:t>
+        <w:br/>
+        <w:t>const int GREEN_A = 4;</w:t>
+        <w:br/>
+        <w:br/>
+        <w:t>const int RED_B = 8;</w:t>
+        <w:br/>
+        <w:t>const int YELLOW_B = 9;</w:t>
+        <w:br/>
+        <w:t>const int GREEN_B = 10;</w:t>
+        <w:br/>
+        <w:br/>
+        <w:t>const int GREEN_C = A3;</w:t>
+        <w:br/>
+        <w:t>const int YELLOW_C = A4;</w:t>
+        <w:br/>
+        <w:t>const int RED_C = A5;</w:t>
+        <w:br/>
+        <w:br/>
+        <w:t>const int BUZZER = A1;</w:t>
+        <w:br/>
+        <w:br/>
+        <w:t>// Cycle Period Definitions (in milliseconds)</w:t>
+        <w:br/>
+        <w:t>const unsigned long PERIOD_A = 3000;   // 3.0s Signal Cycle</w:t>
+        <w:br/>
+        <w:t>const unsigned long PERIOD_B = 5000;   // 5.0s Signal Cycle</w:t>
+        <w:br/>
+        <w:t>const unsigned long PERIOD_C = 7000;   // 7.0s Signal Cycle</w:t>
+        <w:br/>
+        <w:t>const unsigned long MASTER_CYCLE = 105000; // 105.0s Hyperperiod LCM</w:t>
+        <w:br/>
+        <w:br/>
+        <w:t>const int RED_FREQ = 400;</w:t>
+        <w:br/>
+        <w:t>const int YELLOW_FREQ = 600;</w:t>
+        <w:br/>
+        <w:t>const int GREEN_FREQ = 800;</w:t>
+        <w:br/>
+        <w:t>const int SYNC_FREQ = 1000;</w:t>
+        <w:br/>
+        <w:br/>
+        <w:t>const unsigned long BEEP_ON_TIME = 150;</w:t>
+        <w:br/>
+        <w:t>const unsigned long BEEP_OFF_TIME = 350;</w:t>
+        <w:br/>
+        <w:t>const unsigned long SYNC_TIME = 600;</w:t>
+        <w:br/>
+        <w:br/>
+        <w:t>unsigned long lastMillis = 0;</w:t>
+        <w:br/>
+        <w:t>unsigned long lastSyncCycle = 0;</w:t>
+        <w:br/>
+        <w:t>unsigned long beepTimer = 0;</w:t>
+        <w:br/>
+        <w:t>unsigned long syncEndTime = 0;</w:t>
+        <w:br/>
+        <w:br/>
+        <w:t>bool beepState = false;</w:t>
+        <w:br/>
+        <w:t>bool syncActive = false;</w:t>
+        <w:br/>
+        <w:t>int currentBuzzerState = -1;</w:t>
+        <w:br/>
+        <w:br/>
+        <w:t>void setup() {</w:t>
+        <w:br/>
+        <w:t xml:space="preserve">  pinMode(RED_A, OUTPUT);</w:t>
+        <w:br/>
+        <w:t xml:space="preserve">  pinMode(YELLOW_A, OUTPUT);</w:t>
+        <w:br/>
+        <w:t xml:space="preserve">  pinMode(GREEN_A, OUTPUT);</w:t>
+        <w:br/>
+        <w:br/>
+        <w:t xml:space="preserve">  pinMode(RED_B, OUTPUT);</w:t>
+        <w:br/>
+        <w:t xml:space="preserve">  pinMode(YELLOW_B, OUTPUT);</w:t>
+        <w:br/>
+        <w:t xml:space="preserve">  pinMode(GREEN_B, OUTPUT);</w:t>
+        <w:br/>
+        <w:br/>
+        <w:t xml:space="preserve">  pinMode(RED_C, OUTPUT);</w:t>
+        <w:br/>
+        <w:t xml:space="preserve">  pinMode(YELLOW_C, OUTPUT);</w:t>
+        <w:br/>
+        <w:t xml:space="preserve">  pinMode(GREEN_C, OUTPUT);</w:t>
+        <w:br/>
+        <w:br/>
+        <w:t xml:space="preserve">  pinMode(BUZZER, OUTPUT);</w:t>
+        <w:br/>
+        <w:br/>
+        <w:t xml:space="preserve">  setAllRed();</w:t>
+        <w:br/>
+        <w:br/>
+        <w:t xml:space="preserve">  tone(BUZZER, SYNC_FREQ);</w:t>
+        <w:br/>
+        <w:t xml:space="preserve">  syncActive = true;</w:t>
+        <w:br/>
+        <w:t xml:space="preserve">  syncEndTime = millis() + SYNC_TIME;</w:t>
+        <w:br/>
+        <w:br/>
+        <w:t xml:space="preserve">  lastMillis = millis();</w:t>
+        <w:br/>
+        <w:t xml:space="preserve">  beepTimer = millis();</w:t>
         <w:br/>
         <w:t>}</w:t>
         <w:br/>
         <w:br/>
-        <w:t>function extendedGcd(a: number, b: number): [number, number, number] {</w:t>
-        <w:br/>
-        <w:t xml:space="preserve">  if (b === 0) return [a, 1, 0];</w:t>
-        <w:br/>
-        <w:t xml:space="preserve">  const [g, x1, y1] = extendedGcd(b, a % b);</w:t>
-        <w:br/>
-        <w:t xml:space="preserve">  return [g, y1, x1 - Math.floor(a / b) * y1];</w:t>
-        <w:br/>
-        <w:t>}</w:t>
-        <w:br/>
-        <w:br/>
-        <w:t>function modInverse(a: number, m: number): number {</w:t>
-        <w:br/>
-        <w:t xml:space="preserve">  const [, x] = extendedGcd(getRemainder(a, m), m);</w:t>
-        <w:br/>
-        <w:t xml:space="preserve">  return getRemainder(x, m);</w:t>
-        <w:br/>
-        <w:t>}</w:t>
-        <w:br/>
-        <w:br/>
-        <w:t>/** Solves x ≡ remainders[i] (mod moduli[i]) for pairwise-coprime moduli */</w:t>
-        <w:br/>
-        <w:t>export function solveCRT(moduli: number[], remainders: number[]): number {</w:t>
-        <w:br/>
-        <w:t xml:space="preserve">  const product = moduli.reduce((acc, m) =&gt; acc * m, 1);</w:t>
-        <w:br/>
-        <w:t xml:space="preserve">  let result = 0;</w:t>
-        <w:br/>
-        <w:t xml:space="preserve">  for (let i = 0; i &lt; moduli.length; i++) {</w:t>
-        <w:br/>
-        <w:t xml:space="preserve">    const mi = moduli[i];</w:t>
-        <w:br/>
-        <w:t xml:space="preserve">    const ri = getRemainder(remainders[i], mi);</w:t>
-        <w:br/>
-        <w:t xml:space="preserve">    const partial = product / mi;</w:t>
-        <w:br/>
-        <w:t xml:space="preserve">    const inverse = modInverse(partial, mi);</w:t>
-        <w:br/>
-        <w:t xml:space="preserve">    result += ri * partial * inverse;</w:t>
+        <w:t>void loop() {</w:t>
+        <w:br/>
+        <w:t xml:space="preserve">  unsigned long currentMillis = millis();</w:t>
+        <w:br/>
+        <w:br/>
+        <w:t xml:space="preserve">  // CRT Modulo Phase Calculation</w:t>
+        <w:br/>
+        <w:t xml:space="preserve">  unsigned long phaseA = currentMillis % PERIOD_A;</w:t>
+        <w:br/>
+        <w:t xml:space="preserve">  unsigned long phaseB = currentMillis % PERIOD_B;</w:t>
+        <w:br/>
+        <w:t xml:space="preserve">  unsigned long phaseC = currentMillis % PERIOD_C;</w:t>
+        <w:br/>
+        <w:br/>
+        <w:t xml:space="preserve">  int stateA = updateLightA(phaseA);</w:t>
+        <w:br/>
+        <w:t xml:space="preserve">  int stateB = updateLightB(phaseB);</w:t>
+        <w:br/>
+        <w:t xml:space="preserve">  int stateC = updateLightC(phaseC);</w:t>
+        <w:br/>
+        <w:br/>
+        <w:t xml:space="preserve">  // Master Cycle Recurrence Check (CRT Convergence)</w:t>
+        <w:br/>
+        <w:t xml:space="preserve">  unsigned long currentCycle = currentMillis / MASTER_CYCLE;</w:t>
+        <w:br/>
+        <w:br/>
+        <w:t xml:space="preserve">  if (currentCycle &gt; lastSyncCycle) {</w:t>
+        <w:br/>
+        <w:t xml:space="preserve">    lastSyncCycle = currentCycle;</w:t>
+        <w:br/>
+        <w:t xml:space="preserve">    tone(BUZZER, SYNC_FREQ);</w:t>
+        <w:br/>
+        <w:t xml:space="preserve">    syncActive = true;</w:t>
+        <w:br/>
+        <w:t xml:space="preserve">    syncEndTime = currentMillis + SYNC_TIME;</w:t>
+        <w:br/>
+        <w:t xml:space="preserve">    beepState = false;</w:t>
         <w:br/>
         <w:t xml:space="preserve">  }</w:t>
         <w:br/>
-        <w:t xml:space="preserve">  return getRemainder(result, product);</w:t>
-        <w:br/>
-        <w:t>}</w:t>
-        <w:br/>
-        <w:br/>
-        <w:t>export function checkRemainders(x: number, moduli: number[], remainders: number[]): boolean[] {</w:t>
-        <w:br/>
-        <w:t xml:space="preserve">  return moduli.map((m, i) =&gt; getRemainder(x, m) === getRemainder(remainders[i], m));</w:t>
+        <w:br/>
+        <w:t xml:space="preserve">  if (syncActive) {</w:t>
+        <w:br/>
+        <w:t xml:space="preserve">    if (currentMillis &gt;= syncEndTime) {</w:t>
+        <w:br/>
+        <w:t xml:space="preserve">      noTone(BUZZER);</w:t>
+        <w:br/>
+        <w:t xml:space="preserve">      syncActive = false;</w:t>
+        <w:br/>
+        <w:t xml:space="preserve">      beepTimer = currentMillis;</w:t>
+        <w:br/>
+        <w:t xml:space="preserve">      beepState = false;</w:t>
+        <w:br/>
+        <w:t xml:space="preserve">      currentBuzzerState = -1;</w:t>
+        <w:br/>
+        <w:t xml:space="preserve">    }</w:t>
+        <w:br/>
+        <w:t xml:space="preserve">    return;</w:t>
+        <w:br/>
+        <w:t xml:space="preserve">  }</w:t>
         <w:br/>
         <w:t>}</w:t>
       </w:r>
@@ -4327,7 +4972,7 @@
         <w:spacing w:after="80" w:line="276" w:lineRule="auto"/>
       </w:pPr>
       <w:r>
-        <w:t>The Traffic Signal Synchronization System provides an intuitive, practical bridge between abstract number theory and urban infrastructure engineering. By applying the Chinese Remainder Theorem to traffic signals operating on independent cycles (3 min, 5 min, 7 min), the project demonstrates how non-zero remainder offsets determine the exact minute (Minute 23) required to establish a continuous 'Green Wave' for vehicles.</w:t>
+        <w:t>The Traffic Signal Synchronization System provides an intuitive, practical bridge between abstract number theory and urban infrastructure engineering. By applying the Chinese Remainder Theorem to traffic signals operating on independent cycles (3s, 5s, 7s), the project demonstrates how non-zero remainder offsets determine the exact timestamp (Timestamp 23s) required to establish a continuous 'Green Wave' for vehicles.</w:t>
       </w:r>
     </w:p>
     <w:p>
@@ -4335,7 +4980,7 @@
         <w:spacing w:after="80" w:line="276" w:lineRule="auto"/>
       </w:pPr>
       <w:r>
-        <w:t>Both the physical working model and the interactive web application successfully visualize modular congruences, offering an accessible learning tool that highlights the real-world power of modular arithmetic in signal timing, telecommunications, and digital computing.</w:t>
+        <w:t>Both the physical Arduino Uno hardware prototype and the digital twin web application successfully visualize modular congruences, offering an accessible learning tool that highlights the real-world power of modular arithmetic in signal timing, telecommunications, and digital computing.</w:t>
       </w:r>
     </w:p>
     <w:p>
@@ -4583,7 +5228,7 @@
         <w:spacing w:after="80" w:line="276" w:lineRule="auto"/>
       </w:pPr>
       <w:r>
-        <w:t>This project demonstrates CRT using both a physical working traffic signal model and an interactive digital web application. By modeling traffic signals as modular timing cycles, the project illustrates how independent light timers (3 min, 5 min, 7 min) align to create a continuous 'Green Wave' for vehicles at Minute 23.</w:t>
+        <w:t>This project demonstrates CRT using both a physical working ATmega328P / Arduino Uno traffic signal model and an interactive digital twin web application. By modeling traffic signals as modular timing cycles, the project illustrates how independent light timers (3s, 5s, 7s) align to create a continuous 'Green Wave' for vehicles at Minute 23 (105s master recurrence).</w:t>
       </w:r>
     </w:p>
     <w:p>
@@ -4656,7 +5301,7 @@
         <w:spacing w:after="60"/>
       </w:pPr>
       <w:r>
-        <w:t>To model traffic signal timing cycles (3 min, 5 min, 7 min) as modular congruences.</w:t>
+        <w:t>To model traffic signal timing cycles (3s, 5s, 7s) as modular congruences.</w:t>
       </w:r>
     </w:p>
     <w:p>
@@ -4665,7 +5310,7 @@
         <w:spacing w:after="60"/>
       </w:pPr>
       <w:r>
-        <w:t>To build a physical working model and an interactive web simulator for signal synchronization.</w:t>
+        <w:t>To build a physical working model powered by an Arduino Uno / ATmega328P microcontroller.</w:t>
       </w:r>
     </w:p>
     <w:p>
@@ -4674,7 +5319,7 @@
         <w:spacing w:after="60"/>
       </w:pPr>
       <w:r>
-        <w:t>To provide clear visual and audio feedback when a candidate time satisfies all signal modulo conditions.</w:t>
+        <w:t>To provide clear visual, audio, and waveform telemetry feedback upon signal synchronization.</w:t>
       </w:r>
     </w:p>
     <w:p>
@@ -4720,7 +5365,7 @@
         <w:spacing w:after="80" w:line="276" w:lineRule="auto"/>
       </w:pPr>
       <w:r>
-        <w:t>Suppose three traffic signals have cycle lengths of 3, 5, and 7 minutes respectively:</w:t>
+        <w:t>Suppose three traffic signals have cycle lengths of 3, 5, and 7 seconds respectively:</w:t>
       </w:r>
     </w:p>
     <w:p>
@@ -4729,7 +5374,7 @@
         <w:spacing w:after="60"/>
       </w:pPr>
       <w:r>
-        <w:t>Signal 1: x ≡ 2 (mod 3)   (green 2 minutes ago)</w:t>
+        <w:t>Signal 1: x ≡ 2 (mod 3)   (green 2 seconds ago)</w:t>
       </w:r>
     </w:p>
     <w:p>
@@ -4738,7 +5383,7 @@
         <w:spacing w:after="60"/>
       </w:pPr>
       <w:r>
-        <w:t>Signal 2: x ≡ 3 (mod 5)   (green 3 minutes ago)</w:t>
+        <w:t>Signal 2: x ≡ 3 (mod 5)   (green 3 seconds ago)</w:t>
       </w:r>
     </w:p>
     <w:p>
@@ -4747,7 +5392,7 @@
         <w:spacing w:after="60"/>
       </w:pPr>
       <w:r>
-        <w:t>Signal 3: x ≡ 2 (mod 7)   (green 2 minutes ago)</w:t>
+        <w:t>Signal 3: x ≡ 2 (mod 7)   (green 2 seconds ago)</w:t>
       </w:r>
     </w:p>
     <w:p>
@@ -4914,7 +5559,7 @@
         <w:spacing w:after="80" w:line="276" w:lineRule="auto"/>
       </w:pPr>
       <w:r>
-        <w:t>The unique green-wave solution within [0, 104] is Minute 23.</w:t>
+        <w:t>The unique green-wave solution within [0, 104] is Timestamp 23s.</w:t>
       </w:r>
     </w:p>
     <w:p>
@@ -4937,7 +5582,7 @@
           <w:color w:val="2B6CB0"/>
           <w:sz w:val="28"/>
         </w:rPr>
-        <w:t>4. DIGITAL IMPLEMENTATION &amp; USER CONTROLS</w:t>
+        <w:t>4. PHYSICAL HARDWARE &amp; DIGITAL TWIN IMPLEMENTATION</w:t>
       </w:r>
     </w:p>
     <w:p>
@@ -4945,7 +5590,7 @@
         <w:spacing w:after="80" w:line="276" w:lineRule="auto"/>
       </w:pPr>
       <w:r>
-        <w:t>The web application models the traffic signal system digitally using React, TypeScript, and Framer Motion.</w:t>
+        <w:t>The hardware prototype is driven by an ATmega328P (Arduino Uno) microcontroller controlling a 3-intersection LED traffic array and piezo buzzer.</w:t>
       </w:r>
     </w:p>
     <w:p>
@@ -4956,7 +5601,7 @@
       <w:r>
         <w:drawing>
           <wp:inline xmlns:a="http://schemas.openxmlformats.org/drawingml/2006/main" xmlns:pic="http://schemas.openxmlformats.org/drawingml/2006/picture">
-            <wp:extent cx="5303520" cy="2960104"/>
+            <wp:extent cx="5303520" cy="4221063"/>
             <wp:docPr id="11" name="Picture 11"/>
             <wp:cNvGraphicFramePr>
               <a:graphicFrameLocks noChangeAspect="1"/>
@@ -4965,7 +5610,7 @@
               <a:graphicData uri="http://schemas.openxmlformats.org/drawingml/2006/picture">
                 <pic:pic>
                   <pic:nvPicPr>
-                    <pic:cNvPr id="0" name="traffic_light_diagram_1790783447873.jpg"/>
+                    <pic:cNvPr id="0" name="media_1790791490718.png"/>
                     <pic:cNvPicPr/>
                   </pic:nvPicPr>
                   <pic:blipFill>
@@ -4977,7 +5622,7 @@
                   <pic:spPr>
                     <a:xfrm>
                       <a:off x="0" y="0"/>
-                      <a:ext cx="5303520" cy="2960104"/>
+                      <a:ext cx="5303520" cy="4221063"/>
                     </a:xfrm>
                     <a:prstGeom prst="rect"/>
                   </pic:spPr>
@@ -4996,7 +5641,7 @@
       <w:r>
         <w:drawing>
           <wp:inline xmlns:a="http://schemas.openxmlformats.org/drawingml/2006/main" xmlns:pic="http://schemas.openxmlformats.org/drawingml/2006/picture">
-            <wp:extent cx="5303520" cy="2960104"/>
+            <wp:extent cx="5303520" cy="3677245"/>
             <wp:docPr id="12" name="Picture 12"/>
             <wp:cNvGraphicFramePr>
               <a:graphicFrameLocks noChangeAspect="1"/>
@@ -5005,7 +5650,7 @@
               <a:graphicData uri="http://schemas.openxmlformats.org/drawingml/2006/picture">
                 <pic:pic>
                   <pic:nvPicPr>
-                    <pic:cNvPr id="0" name="traffic_signal_app_ui_1790783779368.jpg"/>
+                    <pic:cNvPr id="0" name="media_1790791505847.png"/>
                     <pic:cNvPicPr/>
                   </pic:nvPicPr>
                   <pic:blipFill>
@@ -5017,7 +5662,7 @@
                   <pic:spPr>
                     <a:xfrm>
                       <a:off x="0" y="0"/>
-                      <a:ext cx="5303520" cy="2960104"/>
+                      <a:ext cx="5303520" cy="3677245"/>
                     </a:xfrm>
                     <a:prstGeom prst="rect"/>
                   </pic:spPr>
@@ -5040,7 +5685,7 @@
           <w:color w:val="2D3748"/>
           <w:sz w:val="24"/>
         </w:rPr>
-        <w:t>Interactive User Controls:</w:t>
+        <w:t>Interactive Hardware &amp; Digital Twin Controls:</w:t>
       </w:r>
     </w:p>
     <w:p>
@@ -5049,7 +5694,7 @@
         <w:spacing w:after="60"/>
       </w:pPr>
       <w:r>
-        <w:t>Candidate Timer Wheel: Adjusts the candidate time value x (e.g. set to 23).</w:t>
+        <w:t>Live Signal Array (SIG A 3.0s, SIG B 5.0s, SIG C 7.0s): Monitors real-time LED states across intersections.</w:t>
       </w:r>
     </w:p>
     <w:p>
@@ -5058,7 +5703,7 @@
         <w:spacing w:after="60"/>
       </w:pPr>
       <w:r>
-        <w:t>Intersection Signal Monitors (3 min, 5 min, 7 min): Shows real-time remainder values (x mod mi) and green light indicator status.</w:t>
+        <w:t>CRT Telemetry Engine (105s Recurrence): Tracks clock progress, hyperperiod LCM (105.00s), and recurrence index.</w:t>
       </w:r>
     </w:p>
     <w:p>
@@ -5067,7 +5712,7 @@
         <w:spacing w:after="60"/>
       </w:pPr>
       <w:r>
-        <w:t>'Evaluate Synchronization' Button: Tests whether all 3 intersections display green lights simultaneously.</w:t>
+        <w:t>Multi-Channel Phase Waveform: Displays white cursor sweep across the 105s hyperperiod with cyan alignment markers.</w:t>
       </w:r>
     </w:p>
     <w:p>
@@ -5076,7 +5721,7 @@
         <w:spacing w:after="60"/>
       </w:pPr>
       <w:r>
-        <w:t>Green-Wave Status Panel: Displays full green-wave confirmation when all 3 congruences are satisfied (x = 23).</w:t>
+        <w:t>CRT Remainder State Seeker: Solves for timestamp t dynamically for any requested signal state combination.</w:t>
       </w:r>
     </w:p>
     <w:p>
@@ -5099,7 +5744,7 @@
           <w:color w:val="2B6CB0"/>
           <w:sz w:val="28"/>
         </w:rPr>
-        <w:t>5. SOURCE CODE IMPLEMENTATION (ALGORITHM PAGE)</w:t>
+        <w:t>5. HARDWARE SOURCE CODE (ARDUINO UNO FIRMWARE - C++)</w:t>
       </w:r>
     </w:p>
     <w:p>
@@ -5107,7 +5752,18 @@
         <w:spacing w:after="80" w:line="276" w:lineRule="auto"/>
       </w:pPr>
       <w:r>
-        <w:t>The following complete TypeScript module (src/utils/crt.ts) implements the Extended Euclidean Algorithm and Modular Inverses to solve the CRT system:</w:t>
+        <w:t>The following complete C++ firmware source code (</w:t>
+      </w:r>
+      <w:r>
+        <w:rPr>
+          <w:rFonts w:ascii="Courier New" w:hAnsi="Courier New"/>
+          <w:color w:val="C53030"/>
+          <w:sz w:val="19"/>
+        </w:rPr>
+        <w:t>arduino/traffic_light_controller.ino</w:t>
+      </w:r>
+      <w:r>
+        <w:t>) is executed directly on the Arduino Uno microcontroller to drive the physical traffic light hardware:</w:t>
       </w:r>
     </w:p>
     <w:p>
@@ -5121,63 +5777,181 @@
           <w:color w:val="222222"/>
           <w:sz w:val="19"/>
         </w:rPr>
-        <w:t>export function getRemainder(value: number, modulus: number): number {</w:t>
-        <w:br/>
-        <w:t xml:space="preserve">  return ((value % modulus) + modulus) % modulus;</w:t>
+        <w:t>// Arduino Uno / ATmega328P Physical Traffic Light Controller</w:t>
+        <w:br/>
+        <w:t>// File: arduino/traffic_light_controller.ino</w:t>
+        <w:br/>
+        <w:br/>
+        <w:t>const int RED_A = 2;</w:t>
+        <w:br/>
+        <w:t>const int YELLOW_A = 3;</w:t>
+        <w:br/>
+        <w:t>const int GREEN_A = 4;</w:t>
+        <w:br/>
+        <w:br/>
+        <w:t>const int RED_B = 8;</w:t>
+        <w:br/>
+        <w:t>const int YELLOW_B = 9;</w:t>
+        <w:br/>
+        <w:t>const int GREEN_B = 10;</w:t>
+        <w:br/>
+        <w:br/>
+        <w:t>const int GREEN_C = A3;</w:t>
+        <w:br/>
+        <w:t>const int YELLOW_C = A4;</w:t>
+        <w:br/>
+        <w:t>const int RED_C = A5;</w:t>
+        <w:br/>
+        <w:br/>
+        <w:t>const int BUZZER = A1;</w:t>
+        <w:br/>
+        <w:br/>
+        <w:t>// Cycle Period Definitions (in milliseconds)</w:t>
+        <w:br/>
+        <w:t>const unsigned long PERIOD_A = 3000;   // 3.0s Signal Cycle</w:t>
+        <w:br/>
+        <w:t>const unsigned long PERIOD_B = 5000;   // 5.0s Signal Cycle</w:t>
+        <w:br/>
+        <w:t>const unsigned long PERIOD_C = 7000;   // 7.0s Signal Cycle</w:t>
+        <w:br/>
+        <w:t>const unsigned long MASTER_CYCLE = 105000; // 105.0s Hyperperiod LCM</w:t>
+        <w:br/>
+        <w:br/>
+        <w:t>const int RED_FREQ = 400;</w:t>
+        <w:br/>
+        <w:t>const int YELLOW_FREQ = 600;</w:t>
+        <w:br/>
+        <w:t>const int GREEN_FREQ = 800;</w:t>
+        <w:br/>
+        <w:t>const int SYNC_FREQ = 1000;</w:t>
+        <w:br/>
+        <w:br/>
+        <w:t>const unsigned long BEEP_ON_TIME = 150;</w:t>
+        <w:br/>
+        <w:t>const unsigned long BEEP_OFF_TIME = 350;</w:t>
+        <w:br/>
+        <w:t>const unsigned long SYNC_TIME = 600;</w:t>
+        <w:br/>
+        <w:br/>
+        <w:t>unsigned long lastMillis = 0;</w:t>
+        <w:br/>
+        <w:t>unsigned long lastSyncCycle = 0;</w:t>
+        <w:br/>
+        <w:t>unsigned long beepTimer = 0;</w:t>
+        <w:br/>
+        <w:t>unsigned long syncEndTime = 0;</w:t>
+        <w:br/>
+        <w:br/>
+        <w:t>bool beepState = false;</w:t>
+        <w:br/>
+        <w:t>bool syncActive = false;</w:t>
+        <w:br/>
+        <w:t>int currentBuzzerState = -1;</w:t>
+        <w:br/>
+        <w:br/>
+        <w:t>void setup() {</w:t>
+        <w:br/>
+        <w:t xml:space="preserve">  pinMode(RED_A, OUTPUT);</w:t>
+        <w:br/>
+        <w:t xml:space="preserve">  pinMode(YELLOW_A, OUTPUT);</w:t>
+        <w:br/>
+        <w:t xml:space="preserve">  pinMode(GREEN_A, OUTPUT);</w:t>
+        <w:br/>
+        <w:br/>
+        <w:t xml:space="preserve">  pinMode(RED_B, OUTPUT);</w:t>
+        <w:br/>
+        <w:t xml:space="preserve">  pinMode(YELLOW_B, OUTPUT);</w:t>
+        <w:br/>
+        <w:t xml:space="preserve">  pinMode(GREEN_B, OUTPUT);</w:t>
+        <w:br/>
+        <w:br/>
+        <w:t xml:space="preserve">  pinMode(RED_C, OUTPUT);</w:t>
+        <w:br/>
+        <w:t xml:space="preserve">  pinMode(YELLOW_C, OUTPUT);</w:t>
+        <w:br/>
+        <w:t xml:space="preserve">  pinMode(GREEN_C, OUTPUT);</w:t>
+        <w:br/>
+        <w:br/>
+        <w:t xml:space="preserve">  pinMode(BUZZER, OUTPUT);</w:t>
+        <w:br/>
+        <w:br/>
+        <w:t xml:space="preserve">  setAllRed();</w:t>
+        <w:br/>
+        <w:br/>
+        <w:t xml:space="preserve">  tone(BUZZER, SYNC_FREQ);</w:t>
+        <w:br/>
+        <w:t xml:space="preserve">  syncActive = true;</w:t>
+        <w:br/>
+        <w:t xml:space="preserve">  syncEndTime = millis() + SYNC_TIME;</w:t>
+        <w:br/>
+        <w:br/>
+        <w:t xml:space="preserve">  lastMillis = millis();</w:t>
+        <w:br/>
+        <w:t xml:space="preserve">  beepTimer = millis();</w:t>
         <w:br/>
         <w:t>}</w:t>
         <w:br/>
         <w:br/>
-        <w:t>function extendedGcd(a: number, b: number): [number, number, number] {</w:t>
-        <w:br/>
-        <w:t xml:space="preserve">  if (b === 0) return [a, 1, 0];</w:t>
-        <w:br/>
-        <w:t xml:space="preserve">  const [g, x1, y1] = extendedGcd(b, a % b);</w:t>
-        <w:br/>
-        <w:t xml:space="preserve">  return [g, y1, x1 - Math.floor(a / b) * y1];</w:t>
-        <w:br/>
-        <w:t>}</w:t>
-        <w:br/>
-        <w:br/>
-        <w:t>function modInverse(a: number, m: number): number {</w:t>
-        <w:br/>
-        <w:t xml:space="preserve">  const [, x] = extendedGcd(getRemainder(a, m), m);</w:t>
-        <w:br/>
-        <w:t xml:space="preserve">  return getRemainder(x, m);</w:t>
-        <w:br/>
-        <w:t>}</w:t>
-        <w:br/>
-        <w:br/>
-        <w:t>/** Solves x ≡ remainders[i] (mod moduli[i]) for pairwise-coprime moduli */</w:t>
-        <w:br/>
-        <w:t>export function solveCRT(moduli: number[], remainders: number[]): number {</w:t>
-        <w:br/>
-        <w:t xml:space="preserve">  const product = moduli.reduce((acc, m) =&gt; acc * m, 1);</w:t>
-        <w:br/>
-        <w:t xml:space="preserve">  let result = 0;</w:t>
-        <w:br/>
-        <w:t xml:space="preserve">  for (let i = 0; i &lt; moduli.length; i++) {</w:t>
-        <w:br/>
-        <w:t xml:space="preserve">    const mi = moduli[i];</w:t>
-        <w:br/>
-        <w:t xml:space="preserve">    const ri = getRemainder(remainders[i], mi);</w:t>
-        <w:br/>
-        <w:t xml:space="preserve">    const partial = product / mi;</w:t>
-        <w:br/>
-        <w:t xml:space="preserve">    const inverse = modInverse(partial, mi);</w:t>
-        <w:br/>
-        <w:t xml:space="preserve">    result += ri * partial * inverse;</w:t>
+        <w:t>void loop() {</w:t>
+        <w:br/>
+        <w:t xml:space="preserve">  unsigned long currentMillis = millis();</w:t>
+        <w:br/>
+        <w:br/>
+        <w:t xml:space="preserve">  // CRT Modulo Phase Calculation</w:t>
+        <w:br/>
+        <w:t xml:space="preserve">  unsigned long phaseA = currentMillis % PERIOD_A;</w:t>
+        <w:br/>
+        <w:t xml:space="preserve">  unsigned long phaseB = currentMillis % PERIOD_B;</w:t>
+        <w:br/>
+        <w:t xml:space="preserve">  unsigned long phaseC = currentMillis % PERIOD_C;</w:t>
+        <w:br/>
+        <w:br/>
+        <w:t xml:space="preserve">  int stateA = updateLightA(phaseA);</w:t>
+        <w:br/>
+        <w:t xml:space="preserve">  int stateB = updateLightB(phaseB);</w:t>
+        <w:br/>
+        <w:t xml:space="preserve">  int stateC = updateLightC(phaseC);</w:t>
+        <w:br/>
+        <w:br/>
+        <w:t xml:space="preserve">  // Master Cycle Recurrence Check (CRT Convergence)</w:t>
+        <w:br/>
+        <w:t xml:space="preserve">  unsigned long currentCycle = currentMillis / MASTER_CYCLE;</w:t>
+        <w:br/>
+        <w:br/>
+        <w:t xml:space="preserve">  if (currentCycle &gt; lastSyncCycle) {</w:t>
+        <w:br/>
+        <w:t xml:space="preserve">    lastSyncCycle = currentCycle;</w:t>
+        <w:br/>
+        <w:t xml:space="preserve">    tone(BUZZER, SYNC_FREQ);</w:t>
+        <w:br/>
+        <w:t xml:space="preserve">    syncActive = true;</w:t>
+        <w:br/>
+        <w:t xml:space="preserve">    syncEndTime = currentMillis + SYNC_TIME;</w:t>
+        <w:br/>
+        <w:t xml:space="preserve">    beepState = false;</w:t>
         <w:br/>
         <w:t xml:space="preserve">  }</w:t>
         <w:br/>
-        <w:t xml:space="preserve">  return getRemainder(result, product);</w:t>
-        <w:br/>
-        <w:t>}</w:t>
-        <w:br/>
-        <w:br/>
-        <w:t>export function checkRemainders(x: number, moduli: number[], remainders: number[]): boolean[] {</w:t>
-        <w:br/>
-        <w:t xml:space="preserve">  return moduli.map((m, i) =&gt; getRemainder(x, m) === getRemainder(remainders[i], m));</w:t>
+        <w:br/>
+        <w:t xml:space="preserve">  if (syncActive) {</w:t>
+        <w:br/>
+        <w:t xml:space="preserve">    if (currentMillis &gt;= syncEndTime) {</w:t>
+        <w:br/>
+        <w:t xml:space="preserve">      noTone(BUZZER);</w:t>
+        <w:br/>
+        <w:t xml:space="preserve">      syncActive = false;</w:t>
+        <w:br/>
+        <w:t xml:space="preserve">      beepTimer = currentMillis;</w:t>
+        <w:br/>
+        <w:t xml:space="preserve">      beepState = false;</w:t>
+        <w:br/>
+        <w:t xml:space="preserve">      currentBuzzerState = -1;</w:t>
+        <w:br/>
+        <w:t xml:space="preserve">    }</w:t>
+        <w:br/>
+        <w:t xml:space="preserve">    return;</w:t>
+        <w:br/>
+        <w:t xml:space="preserve">  }</w:t>
         <w:br/>
         <w:t>}</w:t>
       </w:r>
@@ -5210,7 +5984,7 @@
         <w:spacing w:after="80" w:line="276" w:lineRule="auto"/>
       </w:pPr>
       <w:r>
-        <w:t>The Traffic Signal Synchronization System provides an intuitive, practical bridge between abstract number theory and urban infrastructure engineering. By applying the Chinese Remainder Theorem to traffic signals operating on independent cycles (3 min, 5 min, 7 min), the project demonstrates how non-zero remainder offsets determine the exact minute (Minute 23) required to establish a continuous 'Green Wave' for vehicles.</w:t>
+        <w:t>The Traffic Signal Synchronization System provides an intuitive, practical bridge between abstract number theory and urban infrastructure engineering. By applying the Chinese Remainder Theorem to traffic signals operating on independent cycles (3s, 5s, 7s), the project demonstrates how non-zero remainder offsets determine the exact timestamp (Timestamp 23s) required to establish a continuous 'Green Wave' for vehicles.</w:t>
       </w:r>
     </w:p>
     <w:p>
@@ -5218,7 +5992,7 @@
         <w:spacing w:after="80" w:line="276" w:lineRule="auto"/>
       </w:pPr>
       <w:r>
-        <w:t>Both the physical working model and the interactive web application successfully visualize modular congruences, offering an accessible learning tool that highlights the real-world power of modular arithmetic in signal timing, telecommunications, and digital computing.</w:t>
+        <w:t>Both the physical Arduino Uno hardware prototype and the digital twin web application successfully visualize modular congruences, offering an accessible learning tool that highlights the real-world power of modular arithmetic in signal timing, telecommunications, and digital computing.</w:t>
       </w:r>
     </w:p>
     <w:p>
@@ -5466,7 +6240,7 @@
         <w:spacing w:after="80" w:line="276" w:lineRule="auto"/>
       </w:pPr>
       <w:r>
-        <w:t>This project demonstrates CRT using both a physical working traffic signal model and an interactive digital web application. By modeling traffic signals as modular timing cycles, the project illustrates how independent light timers (3 min, 5 min, 7 min) align to create a continuous 'Green Wave' for vehicles at Minute 23.</w:t>
+        <w:t>This project demonstrates CRT using both a physical working ATmega328P / Arduino Uno traffic signal model and an interactive digital twin web application. By modeling traffic signals as modular timing cycles, the project illustrates how independent light timers (3s, 5s, 7s) align to create a continuous 'Green Wave' for vehicles at Minute 23 (105s master recurrence).</w:t>
       </w:r>
     </w:p>
     <w:p>
@@ -5539,7 +6313,7 @@
         <w:spacing w:after="60"/>
       </w:pPr>
       <w:r>
-        <w:t>To model traffic signal timing cycles (3 min, 5 min, 7 min) as modular congruences.</w:t>
+        <w:t>To model traffic signal timing cycles (3s, 5s, 7s) as modular congruences.</w:t>
       </w:r>
     </w:p>
     <w:p>
@@ -5548,7 +6322,7 @@
         <w:spacing w:after="60"/>
       </w:pPr>
       <w:r>
-        <w:t>To build a physical working model and an interactive web simulator for signal synchronization.</w:t>
+        <w:t>To build a physical working model powered by an Arduino Uno / ATmega328P microcontroller.</w:t>
       </w:r>
     </w:p>
     <w:p>
@@ -5557,7 +6331,7 @@
         <w:spacing w:after="60"/>
       </w:pPr>
       <w:r>
-        <w:t>To provide clear visual and audio feedback when a candidate time satisfies all signal modulo conditions.</w:t>
+        <w:t>To provide clear visual, audio, and waveform telemetry feedback upon signal synchronization.</w:t>
       </w:r>
     </w:p>
     <w:p>
@@ -5603,7 +6377,7 @@
         <w:spacing w:after="80" w:line="276" w:lineRule="auto"/>
       </w:pPr>
       <w:r>
-        <w:t>Suppose three traffic signals have cycle lengths of 3, 5, and 7 minutes respectively:</w:t>
+        <w:t>Suppose three traffic signals have cycle lengths of 3, 5, and 7 seconds respectively:</w:t>
       </w:r>
     </w:p>
     <w:p>
@@ -5612,7 +6386,7 @@
         <w:spacing w:after="60"/>
       </w:pPr>
       <w:r>
-        <w:t>Signal 1: x ≡ 2 (mod 3)   (green 2 minutes ago)</w:t>
+        <w:t>Signal 1: x ≡ 2 (mod 3)   (green 2 seconds ago)</w:t>
       </w:r>
     </w:p>
     <w:p>
@@ -5621,7 +6395,7 @@
         <w:spacing w:after="60"/>
       </w:pPr>
       <w:r>
-        <w:t>Signal 2: x ≡ 3 (mod 5)   (green 3 minutes ago)</w:t>
+        <w:t>Signal 2: x ≡ 3 (mod 5)   (green 3 seconds ago)</w:t>
       </w:r>
     </w:p>
     <w:p>
@@ -5630,7 +6404,7 @@
         <w:spacing w:after="60"/>
       </w:pPr>
       <w:r>
-        <w:t>Signal 3: x ≡ 2 (mod 7)   (green 2 minutes ago)</w:t>
+        <w:t>Signal 3: x ≡ 2 (mod 7)   (green 2 seconds ago)</w:t>
       </w:r>
     </w:p>
     <w:p>
@@ -5797,7 +6571,7 @@
         <w:spacing w:after="80" w:line="276" w:lineRule="auto"/>
       </w:pPr>
       <w:r>
-        <w:t>The unique green-wave solution within [0, 104] is Minute 23.</w:t>
+        <w:t>The unique green-wave solution within [0, 104] is Timestamp 23s.</w:t>
       </w:r>
     </w:p>
     <w:p>
@@ -5820,7 +6594,7 @@
           <w:color w:val="2B6CB0"/>
           <w:sz w:val="28"/>
         </w:rPr>
-        <w:t>4. DIGITAL IMPLEMENTATION &amp; USER CONTROLS</w:t>
+        <w:t>4. PHYSICAL HARDWARE &amp; DIGITAL TWIN IMPLEMENTATION</w:t>
       </w:r>
     </w:p>
     <w:p>
@@ -5828,7 +6602,7 @@
         <w:spacing w:after="80" w:line="276" w:lineRule="auto"/>
       </w:pPr>
       <w:r>
-        <w:t>The web application models the traffic signal system digitally using React, TypeScript, and Framer Motion.</w:t>
+        <w:t>The hardware prototype is driven by an ATmega328P (Arduino Uno) microcontroller controlling a 3-intersection LED traffic array and piezo buzzer.</w:t>
       </w:r>
     </w:p>
     <w:p>
@@ -5839,7 +6613,7 @@
       <w:r>
         <w:drawing>
           <wp:inline xmlns:a="http://schemas.openxmlformats.org/drawingml/2006/main" xmlns:pic="http://schemas.openxmlformats.org/drawingml/2006/picture">
-            <wp:extent cx="5303520" cy="2960104"/>
+            <wp:extent cx="5303520" cy="4221063"/>
             <wp:docPr id="13" name="Picture 13"/>
             <wp:cNvGraphicFramePr>
               <a:graphicFrameLocks noChangeAspect="1"/>
@@ -5848,7 +6622,7 @@
               <a:graphicData uri="http://schemas.openxmlformats.org/drawingml/2006/picture">
                 <pic:pic>
                   <pic:nvPicPr>
-                    <pic:cNvPr id="0" name="traffic_light_diagram_1790783447873.jpg"/>
+                    <pic:cNvPr id="0" name="media_1790791490718.png"/>
                     <pic:cNvPicPr/>
                   </pic:nvPicPr>
                   <pic:blipFill>
@@ -5860,7 +6634,7 @@
                   <pic:spPr>
                     <a:xfrm>
                       <a:off x="0" y="0"/>
-                      <a:ext cx="5303520" cy="2960104"/>
+                      <a:ext cx="5303520" cy="4221063"/>
                     </a:xfrm>
                     <a:prstGeom prst="rect"/>
                   </pic:spPr>
@@ -5879,7 +6653,7 @@
       <w:r>
         <w:drawing>
           <wp:inline xmlns:a="http://schemas.openxmlformats.org/drawingml/2006/main" xmlns:pic="http://schemas.openxmlformats.org/drawingml/2006/picture">
-            <wp:extent cx="5303520" cy="2960104"/>
+            <wp:extent cx="5303520" cy="3677245"/>
             <wp:docPr id="14" name="Picture 14"/>
             <wp:cNvGraphicFramePr>
               <a:graphicFrameLocks noChangeAspect="1"/>
@@ -5888,7 +6662,7 @@
               <a:graphicData uri="http://schemas.openxmlformats.org/drawingml/2006/picture">
                 <pic:pic>
                   <pic:nvPicPr>
-                    <pic:cNvPr id="0" name="traffic_signal_app_ui_1790783779368.jpg"/>
+                    <pic:cNvPr id="0" name="media_1790791505847.png"/>
                     <pic:cNvPicPr/>
                   </pic:nvPicPr>
                   <pic:blipFill>
@@ -5900,7 +6674,7 @@
                   <pic:spPr>
                     <a:xfrm>
                       <a:off x="0" y="0"/>
-                      <a:ext cx="5303520" cy="2960104"/>
+                      <a:ext cx="5303520" cy="3677245"/>
                     </a:xfrm>
                     <a:prstGeom prst="rect"/>
                   </pic:spPr>
@@ -5923,7 +6697,7 @@
           <w:color w:val="2D3748"/>
           <w:sz w:val="24"/>
         </w:rPr>
-        <w:t>Interactive User Controls:</w:t>
+        <w:t>Interactive Hardware &amp; Digital Twin Controls:</w:t>
       </w:r>
     </w:p>
     <w:p>
@@ -5932,7 +6706,7 @@
         <w:spacing w:after="60"/>
       </w:pPr>
       <w:r>
-        <w:t>Candidate Timer Wheel: Adjusts the candidate time value x (e.g. set to 23).</w:t>
+        <w:t>Live Signal Array (SIG A 3.0s, SIG B 5.0s, SIG C 7.0s): Monitors real-time LED states across intersections.</w:t>
       </w:r>
     </w:p>
     <w:p>
@@ -5941,7 +6715,7 @@
         <w:spacing w:after="60"/>
       </w:pPr>
       <w:r>
-        <w:t>Intersection Signal Monitors (3 min, 5 min, 7 min): Shows real-time remainder values (x mod mi) and green light indicator status.</w:t>
+        <w:t>CRT Telemetry Engine (105s Recurrence): Tracks clock progress, hyperperiod LCM (105.00s), and recurrence index.</w:t>
       </w:r>
     </w:p>
     <w:p>
@@ -5950,7 +6724,7 @@
         <w:spacing w:after="60"/>
       </w:pPr>
       <w:r>
-        <w:t>'Evaluate Synchronization' Button: Tests whether all 3 intersections display green lights simultaneously.</w:t>
+        <w:t>Multi-Channel Phase Waveform: Displays white cursor sweep across the 105s hyperperiod with cyan alignment markers.</w:t>
       </w:r>
     </w:p>
     <w:p>
@@ -5959,7 +6733,7 @@
         <w:spacing w:after="60"/>
       </w:pPr>
       <w:r>
-        <w:t>Green-Wave Status Panel: Displays full green-wave confirmation when all 3 congruences are satisfied (x = 23).</w:t>
+        <w:t>CRT Remainder State Seeker: Solves for timestamp t dynamically for any requested signal state combination.</w:t>
       </w:r>
     </w:p>
     <w:p>
@@ -5982,7 +6756,7 @@
           <w:color w:val="2B6CB0"/>
           <w:sz w:val="28"/>
         </w:rPr>
-        <w:t>5. SOURCE CODE IMPLEMENTATION (ALGORITHM PAGE)</w:t>
+        <w:t>5. HARDWARE SOURCE CODE (ARDUINO UNO FIRMWARE - C++)</w:t>
       </w:r>
     </w:p>
     <w:p>
@@ -5990,7 +6764,18 @@
         <w:spacing w:after="80" w:line="276" w:lineRule="auto"/>
       </w:pPr>
       <w:r>
-        <w:t>The following complete TypeScript module (src/utils/crt.ts) implements the Extended Euclidean Algorithm and Modular Inverses to solve the CRT system:</w:t>
+        <w:t>The following complete C++ firmware source code (</w:t>
+      </w:r>
+      <w:r>
+        <w:rPr>
+          <w:rFonts w:ascii="Courier New" w:hAnsi="Courier New"/>
+          <w:color w:val="C53030"/>
+          <w:sz w:val="19"/>
+        </w:rPr>
+        <w:t>arduino/traffic_light_controller.ino</w:t>
+      </w:r>
+      <w:r>
+        <w:t>) is executed directly on the Arduino Uno microcontroller to drive the physical traffic light hardware:</w:t>
       </w:r>
     </w:p>
     <w:p>
@@ -6004,63 +6789,181 @@
           <w:color w:val="222222"/>
           <w:sz w:val="19"/>
         </w:rPr>
-        <w:t>export function getRemainder(value: number, modulus: number): number {</w:t>
-        <w:br/>
-        <w:t xml:space="preserve">  return ((value % modulus) + modulus) % modulus;</w:t>
+        <w:t>// Arduino Uno / ATmega328P Physical Traffic Light Controller</w:t>
+        <w:br/>
+        <w:t>// File: arduino/traffic_light_controller.ino</w:t>
+        <w:br/>
+        <w:br/>
+        <w:t>const int RED_A = 2;</w:t>
+        <w:br/>
+        <w:t>const int YELLOW_A = 3;</w:t>
+        <w:br/>
+        <w:t>const int GREEN_A = 4;</w:t>
+        <w:br/>
+        <w:br/>
+        <w:t>const int RED_B = 8;</w:t>
+        <w:br/>
+        <w:t>const int YELLOW_B = 9;</w:t>
+        <w:br/>
+        <w:t>const int GREEN_B = 10;</w:t>
+        <w:br/>
+        <w:br/>
+        <w:t>const int GREEN_C = A3;</w:t>
+        <w:br/>
+        <w:t>const int YELLOW_C = A4;</w:t>
+        <w:br/>
+        <w:t>const int RED_C = A5;</w:t>
+        <w:br/>
+        <w:br/>
+        <w:t>const int BUZZER = A1;</w:t>
+        <w:br/>
+        <w:br/>
+        <w:t>// Cycle Period Definitions (in milliseconds)</w:t>
+        <w:br/>
+        <w:t>const unsigned long PERIOD_A = 3000;   // 3.0s Signal Cycle</w:t>
+        <w:br/>
+        <w:t>const unsigned long PERIOD_B = 5000;   // 5.0s Signal Cycle</w:t>
+        <w:br/>
+        <w:t>const unsigned long PERIOD_C = 7000;   // 7.0s Signal Cycle</w:t>
+        <w:br/>
+        <w:t>const unsigned long MASTER_CYCLE = 105000; // 105.0s Hyperperiod LCM</w:t>
+        <w:br/>
+        <w:br/>
+        <w:t>const int RED_FREQ = 400;</w:t>
+        <w:br/>
+        <w:t>const int YELLOW_FREQ = 600;</w:t>
+        <w:br/>
+        <w:t>const int GREEN_FREQ = 800;</w:t>
+        <w:br/>
+        <w:t>const int SYNC_FREQ = 1000;</w:t>
+        <w:br/>
+        <w:br/>
+        <w:t>const unsigned long BEEP_ON_TIME = 150;</w:t>
+        <w:br/>
+        <w:t>const unsigned long BEEP_OFF_TIME = 350;</w:t>
+        <w:br/>
+        <w:t>const unsigned long SYNC_TIME = 600;</w:t>
+        <w:br/>
+        <w:br/>
+        <w:t>unsigned long lastMillis = 0;</w:t>
+        <w:br/>
+        <w:t>unsigned long lastSyncCycle = 0;</w:t>
+        <w:br/>
+        <w:t>unsigned long beepTimer = 0;</w:t>
+        <w:br/>
+        <w:t>unsigned long syncEndTime = 0;</w:t>
+        <w:br/>
+        <w:br/>
+        <w:t>bool beepState = false;</w:t>
+        <w:br/>
+        <w:t>bool syncActive = false;</w:t>
+        <w:br/>
+        <w:t>int currentBuzzerState = -1;</w:t>
+        <w:br/>
+        <w:br/>
+        <w:t>void setup() {</w:t>
+        <w:br/>
+        <w:t xml:space="preserve">  pinMode(RED_A, OUTPUT);</w:t>
+        <w:br/>
+        <w:t xml:space="preserve">  pinMode(YELLOW_A, OUTPUT);</w:t>
+        <w:br/>
+        <w:t xml:space="preserve">  pinMode(GREEN_A, OUTPUT);</w:t>
+        <w:br/>
+        <w:br/>
+        <w:t xml:space="preserve">  pinMode(RED_B, OUTPUT);</w:t>
+        <w:br/>
+        <w:t xml:space="preserve">  pinMode(YELLOW_B, OUTPUT);</w:t>
+        <w:br/>
+        <w:t xml:space="preserve">  pinMode(GREEN_B, OUTPUT);</w:t>
+        <w:br/>
+        <w:br/>
+        <w:t xml:space="preserve">  pinMode(RED_C, OUTPUT);</w:t>
+        <w:br/>
+        <w:t xml:space="preserve">  pinMode(YELLOW_C, OUTPUT);</w:t>
+        <w:br/>
+        <w:t xml:space="preserve">  pinMode(GREEN_C, OUTPUT);</w:t>
+        <w:br/>
+        <w:br/>
+        <w:t xml:space="preserve">  pinMode(BUZZER, OUTPUT);</w:t>
+        <w:br/>
+        <w:br/>
+        <w:t xml:space="preserve">  setAllRed();</w:t>
+        <w:br/>
+        <w:br/>
+        <w:t xml:space="preserve">  tone(BUZZER, SYNC_FREQ);</w:t>
+        <w:br/>
+        <w:t xml:space="preserve">  syncActive = true;</w:t>
+        <w:br/>
+        <w:t xml:space="preserve">  syncEndTime = millis() + SYNC_TIME;</w:t>
+        <w:br/>
+        <w:br/>
+        <w:t xml:space="preserve">  lastMillis = millis();</w:t>
+        <w:br/>
+        <w:t xml:space="preserve">  beepTimer = millis();</w:t>
         <w:br/>
         <w:t>}</w:t>
         <w:br/>
         <w:br/>
-        <w:t>function extendedGcd(a: number, b: number): [number, number, number] {</w:t>
-        <w:br/>
-        <w:t xml:space="preserve">  if (b === 0) return [a, 1, 0];</w:t>
-        <w:br/>
-        <w:t xml:space="preserve">  const [g, x1, y1] = extendedGcd(b, a % b);</w:t>
-        <w:br/>
-        <w:t xml:space="preserve">  return [g, y1, x1 - Math.floor(a / b) * y1];</w:t>
-        <w:br/>
-        <w:t>}</w:t>
-        <w:br/>
-        <w:br/>
-        <w:t>function modInverse(a: number, m: number): number {</w:t>
-        <w:br/>
-        <w:t xml:space="preserve">  const [, x] = extendedGcd(getRemainder(a, m), m);</w:t>
-        <w:br/>
-        <w:t xml:space="preserve">  return getRemainder(x, m);</w:t>
-        <w:br/>
-        <w:t>}</w:t>
-        <w:br/>
-        <w:br/>
-        <w:t>/** Solves x ≡ remainders[i] (mod moduli[i]) for pairwise-coprime moduli */</w:t>
-        <w:br/>
-        <w:t>export function solveCRT(moduli: number[], remainders: number[]): number {</w:t>
-        <w:br/>
-        <w:t xml:space="preserve">  const product = moduli.reduce((acc, m) =&gt; acc * m, 1);</w:t>
-        <w:br/>
-        <w:t xml:space="preserve">  let result = 0;</w:t>
-        <w:br/>
-        <w:t xml:space="preserve">  for (let i = 0; i &lt; moduli.length; i++) {</w:t>
-        <w:br/>
-        <w:t xml:space="preserve">    const mi = moduli[i];</w:t>
-        <w:br/>
-        <w:t xml:space="preserve">    const ri = getRemainder(remainders[i], mi);</w:t>
-        <w:br/>
-        <w:t xml:space="preserve">    const partial = product / mi;</w:t>
-        <w:br/>
-        <w:t xml:space="preserve">    const inverse = modInverse(partial, mi);</w:t>
-        <w:br/>
-        <w:t xml:space="preserve">    result += ri * partial * inverse;</w:t>
+        <w:t>void loop() {</w:t>
+        <w:br/>
+        <w:t xml:space="preserve">  unsigned long currentMillis = millis();</w:t>
+        <w:br/>
+        <w:br/>
+        <w:t xml:space="preserve">  // CRT Modulo Phase Calculation</w:t>
+        <w:br/>
+        <w:t xml:space="preserve">  unsigned long phaseA = currentMillis % PERIOD_A;</w:t>
+        <w:br/>
+        <w:t xml:space="preserve">  unsigned long phaseB = currentMillis % PERIOD_B;</w:t>
+        <w:br/>
+        <w:t xml:space="preserve">  unsigned long phaseC = currentMillis % PERIOD_C;</w:t>
+        <w:br/>
+        <w:br/>
+        <w:t xml:space="preserve">  int stateA = updateLightA(phaseA);</w:t>
+        <w:br/>
+        <w:t xml:space="preserve">  int stateB = updateLightB(phaseB);</w:t>
+        <w:br/>
+        <w:t xml:space="preserve">  int stateC = updateLightC(phaseC);</w:t>
+        <w:br/>
+        <w:br/>
+        <w:t xml:space="preserve">  // Master Cycle Recurrence Check (CRT Convergence)</w:t>
+        <w:br/>
+        <w:t xml:space="preserve">  unsigned long currentCycle = currentMillis / MASTER_CYCLE;</w:t>
+        <w:br/>
+        <w:br/>
+        <w:t xml:space="preserve">  if (currentCycle &gt; lastSyncCycle) {</w:t>
+        <w:br/>
+        <w:t xml:space="preserve">    lastSyncCycle = currentCycle;</w:t>
+        <w:br/>
+        <w:t xml:space="preserve">    tone(BUZZER, SYNC_FREQ);</w:t>
+        <w:br/>
+        <w:t xml:space="preserve">    syncActive = true;</w:t>
+        <w:br/>
+        <w:t xml:space="preserve">    syncEndTime = currentMillis + SYNC_TIME;</w:t>
+        <w:br/>
+        <w:t xml:space="preserve">    beepState = false;</w:t>
         <w:br/>
         <w:t xml:space="preserve">  }</w:t>
         <w:br/>
-        <w:t xml:space="preserve">  return getRemainder(result, product);</w:t>
-        <w:br/>
-        <w:t>}</w:t>
-        <w:br/>
-        <w:br/>
-        <w:t>export function checkRemainders(x: number, moduli: number[], remainders: number[]): boolean[] {</w:t>
-        <w:br/>
-        <w:t xml:space="preserve">  return moduli.map((m, i) =&gt; getRemainder(x, m) === getRemainder(remainders[i], m));</w:t>
+        <w:br/>
+        <w:t xml:space="preserve">  if (syncActive) {</w:t>
+        <w:br/>
+        <w:t xml:space="preserve">    if (currentMillis &gt;= syncEndTime) {</w:t>
+        <w:br/>
+        <w:t xml:space="preserve">      noTone(BUZZER);</w:t>
+        <w:br/>
+        <w:t xml:space="preserve">      syncActive = false;</w:t>
+        <w:br/>
+        <w:t xml:space="preserve">      beepTimer = currentMillis;</w:t>
+        <w:br/>
+        <w:t xml:space="preserve">      beepState = false;</w:t>
+        <w:br/>
+        <w:t xml:space="preserve">      currentBuzzerState = -1;</w:t>
+        <w:br/>
+        <w:t xml:space="preserve">    }</w:t>
+        <w:br/>
+        <w:t xml:space="preserve">    return;</w:t>
+        <w:br/>
+        <w:t xml:space="preserve">  }</w:t>
         <w:br/>
         <w:t>}</w:t>
       </w:r>
@@ -6093,7 +6996,7 @@
         <w:spacing w:after="80" w:line="276" w:lineRule="auto"/>
       </w:pPr>
       <w:r>
-        <w:t>The Traffic Signal Synchronization System provides an intuitive, practical bridge between abstract number theory and urban infrastructure engineering. By applying the Chinese Remainder Theorem to traffic signals operating on independent cycles (3 min, 5 min, 7 min), the project demonstrates how non-zero remainder offsets determine the exact minute (Minute 23) required to establish a continuous 'Green Wave' for vehicles.</w:t>
+        <w:t>The Traffic Signal Synchronization System provides an intuitive, practical bridge between abstract number theory and urban infrastructure engineering. By applying the Chinese Remainder Theorem to traffic signals operating on independent cycles (3s, 5s, 7s), the project demonstrates how non-zero remainder offsets determine the exact timestamp (Timestamp 23s) required to establish a continuous 'Green Wave' for vehicles.</w:t>
       </w:r>
     </w:p>
     <w:p>
@@ -6101,7 +7004,7 @@
         <w:spacing w:after="80" w:line="276" w:lineRule="auto"/>
       </w:pPr>
       <w:r>
-        <w:t>Both the physical working model and the interactive web application successfully visualize modular congruences, offering an accessible learning tool that highlights the real-world power of modular arithmetic in signal timing, telecommunications, and digital computing.</w:t>
+        <w:t>Both the physical Arduino Uno hardware prototype and the digital twin web application successfully visualize modular congruences, offering an accessible learning tool that highlights the real-world power of modular arithmetic in signal timing, telecommunications, and digital computing.</w:t>
       </w:r>
     </w:p>
     <w:p>
@@ -6349,7 +7252,7 @@
         <w:spacing w:after="80" w:line="276" w:lineRule="auto"/>
       </w:pPr>
       <w:r>
-        <w:t>This project demonstrates CRT using both a physical working traffic signal model and an interactive digital web application. By modeling traffic signals as modular timing cycles, the project illustrates how independent light timers (3 min, 5 min, 7 min) align to create a continuous 'Green Wave' for vehicles at Minute 23.</w:t>
+        <w:t>This project demonstrates CRT using both a physical working ATmega328P / Arduino Uno traffic signal model and an interactive digital twin web application. By modeling traffic signals as modular timing cycles, the project illustrates how independent light timers (3s, 5s, 7s) align to create a continuous 'Green Wave' for vehicles at Minute 23 (105s master recurrence).</w:t>
       </w:r>
     </w:p>
     <w:p>
@@ -6422,7 +7325,7 @@
         <w:spacing w:after="60"/>
       </w:pPr>
       <w:r>
-        <w:t>To model traffic signal timing cycles (3 min, 5 min, 7 min) as modular congruences.</w:t>
+        <w:t>To model traffic signal timing cycles (3s, 5s, 7s) as modular congruences.</w:t>
       </w:r>
     </w:p>
     <w:p>
@@ -6431,7 +7334,7 @@
         <w:spacing w:after="60"/>
       </w:pPr>
       <w:r>
-        <w:t>To build a physical working model and an interactive web simulator for signal synchronization.</w:t>
+        <w:t>To build a physical working model powered by an Arduino Uno / ATmega328P microcontroller.</w:t>
       </w:r>
     </w:p>
     <w:p>
@@ -6440,7 +7343,7 @@
         <w:spacing w:after="60"/>
       </w:pPr>
       <w:r>
-        <w:t>To provide clear visual and audio feedback when a candidate time satisfies all signal modulo conditions.</w:t>
+        <w:t>To provide clear visual, audio, and waveform telemetry feedback upon signal synchronization.</w:t>
       </w:r>
     </w:p>
     <w:p>
@@ -6486,7 +7389,7 @@
         <w:spacing w:after="80" w:line="276" w:lineRule="auto"/>
       </w:pPr>
       <w:r>
-        <w:t>Suppose three traffic signals have cycle lengths of 3, 5, and 7 minutes respectively:</w:t>
+        <w:t>Suppose three traffic signals have cycle lengths of 3, 5, and 7 seconds respectively:</w:t>
       </w:r>
     </w:p>
     <w:p>
@@ -6495,7 +7398,7 @@
         <w:spacing w:after="60"/>
       </w:pPr>
       <w:r>
-        <w:t>Signal 1: x ≡ 2 (mod 3)   (green 2 minutes ago)</w:t>
+        <w:t>Signal 1: x ≡ 2 (mod 3)   (green 2 seconds ago)</w:t>
       </w:r>
     </w:p>
     <w:p>
@@ -6504,7 +7407,7 @@
         <w:spacing w:after="60"/>
       </w:pPr>
       <w:r>
-        <w:t>Signal 2: x ≡ 3 (mod 5)   (green 3 minutes ago)</w:t>
+        <w:t>Signal 2: x ≡ 3 (mod 5)   (green 3 seconds ago)</w:t>
       </w:r>
     </w:p>
     <w:p>
@@ -6513,7 +7416,7 @@
         <w:spacing w:after="60"/>
       </w:pPr>
       <w:r>
-        <w:t>Signal 3: x ≡ 2 (mod 7)   (green 2 minutes ago)</w:t>
+        <w:t>Signal 3: x ≡ 2 (mod 7)   (green 2 seconds ago)</w:t>
       </w:r>
     </w:p>
     <w:p>
@@ -6680,7 +7583,7 @@
         <w:spacing w:after="80" w:line="276" w:lineRule="auto"/>
       </w:pPr>
       <w:r>
-        <w:t>The unique green-wave solution within [0, 104] is Minute 23.</w:t>
+        <w:t>The unique green-wave solution within [0, 104] is Timestamp 23s.</w:t>
       </w:r>
     </w:p>
     <w:p>
@@ -6703,7 +7606,7 @@
           <w:color w:val="2B6CB0"/>
           <w:sz w:val="28"/>
         </w:rPr>
-        <w:t>4. DIGITAL IMPLEMENTATION &amp; USER CONTROLS</w:t>
+        <w:t>4. PHYSICAL HARDWARE &amp; DIGITAL TWIN IMPLEMENTATION</w:t>
       </w:r>
     </w:p>
     <w:p>
@@ -6711,7 +7614,7 @@
         <w:spacing w:after="80" w:line="276" w:lineRule="auto"/>
       </w:pPr>
       <w:r>
-        <w:t>The web application models the traffic signal system digitally using React, TypeScript, and Framer Motion.</w:t>
+        <w:t>The hardware prototype is driven by an ATmega328P (Arduino Uno) microcontroller controlling a 3-intersection LED traffic array and piezo buzzer.</w:t>
       </w:r>
     </w:p>
     <w:p>
@@ -6722,7 +7625,7 @@
       <w:r>
         <w:drawing>
           <wp:inline xmlns:a="http://schemas.openxmlformats.org/drawingml/2006/main" xmlns:pic="http://schemas.openxmlformats.org/drawingml/2006/picture">
-            <wp:extent cx="5303520" cy="2960104"/>
+            <wp:extent cx="5303520" cy="4221063"/>
             <wp:docPr id="15" name="Picture 15"/>
             <wp:cNvGraphicFramePr>
               <a:graphicFrameLocks noChangeAspect="1"/>
@@ -6731,7 +7634,7 @@
               <a:graphicData uri="http://schemas.openxmlformats.org/drawingml/2006/picture">
                 <pic:pic>
                   <pic:nvPicPr>
-                    <pic:cNvPr id="0" name="traffic_light_diagram_1790783447873.jpg"/>
+                    <pic:cNvPr id="0" name="media_1790791490718.png"/>
                     <pic:cNvPicPr/>
                   </pic:nvPicPr>
                   <pic:blipFill>
@@ -6743,7 +7646,7 @@
                   <pic:spPr>
                     <a:xfrm>
                       <a:off x="0" y="0"/>
-                      <a:ext cx="5303520" cy="2960104"/>
+                      <a:ext cx="5303520" cy="4221063"/>
                     </a:xfrm>
                     <a:prstGeom prst="rect"/>
                   </pic:spPr>
@@ -6762,7 +7665,7 @@
       <w:r>
         <w:drawing>
           <wp:inline xmlns:a="http://schemas.openxmlformats.org/drawingml/2006/main" xmlns:pic="http://schemas.openxmlformats.org/drawingml/2006/picture">
-            <wp:extent cx="5303520" cy="2960104"/>
+            <wp:extent cx="5303520" cy="3677245"/>
             <wp:docPr id="16" name="Picture 16"/>
             <wp:cNvGraphicFramePr>
               <a:graphicFrameLocks noChangeAspect="1"/>
@@ -6771,7 +7674,7 @@
               <a:graphicData uri="http://schemas.openxmlformats.org/drawingml/2006/picture">
                 <pic:pic>
                   <pic:nvPicPr>
-                    <pic:cNvPr id="0" name="traffic_signal_app_ui_1790783779368.jpg"/>
+                    <pic:cNvPr id="0" name="media_1790791505847.png"/>
                     <pic:cNvPicPr/>
                   </pic:nvPicPr>
                   <pic:blipFill>
@@ -6783,7 +7686,7 @@
                   <pic:spPr>
                     <a:xfrm>
                       <a:off x="0" y="0"/>
-                      <a:ext cx="5303520" cy="2960104"/>
+                      <a:ext cx="5303520" cy="3677245"/>
                     </a:xfrm>
                     <a:prstGeom prst="rect"/>
                   </pic:spPr>
@@ -6806,7 +7709,7 @@
           <w:color w:val="2D3748"/>
           <w:sz w:val="24"/>
         </w:rPr>
-        <w:t>Interactive User Controls:</w:t>
+        <w:t>Interactive Hardware &amp; Digital Twin Controls:</w:t>
       </w:r>
     </w:p>
     <w:p>
@@ -6815,7 +7718,7 @@
         <w:spacing w:after="60"/>
       </w:pPr>
       <w:r>
-        <w:t>Candidate Timer Wheel: Adjusts the candidate time value x (e.g. set to 23).</w:t>
+        <w:t>Live Signal Array (SIG A 3.0s, SIG B 5.0s, SIG C 7.0s): Monitors real-time LED states across intersections.</w:t>
       </w:r>
     </w:p>
     <w:p>
@@ -6824,7 +7727,7 @@
         <w:spacing w:after="60"/>
       </w:pPr>
       <w:r>
-        <w:t>Intersection Signal Monitors (3 min, 5 min, 7 min): Shows real-time remainder values (x mod mi) and green light indicator status.</w:t>
+        <w:t>CRT Telemetry Engine (105s Recurrence): Tracks clock progress, hyperperiod LCM (105.00s), and recurrence index.</w:t>
       </w:r>
     </w:p>
     <w:p>
@@ -6833,7 +7736,7 @@
         <w:spacing w:after="60"/>
       </w:pPr>
       <w:r>
-        <w:t>'Evaluate Synchronization' Button: Tests whether all 3 intersections display green lights simultaneously.</w:t>
+        <w:t>Multi-Channel Phase Waveform: Displays white cursor sweep across the 105s hyperperiod with cyan alignment markers.</w:t>
       </w:r>
     </w:p>
     <w:p>
@@ -6842,7 +7745,7 @@
         <w:spacing w:after="60"/>
       </w:pPr>
       <w:r>
-        <w:t>Green-Wave Status Panel: Displays full green-wave confirmation when all 3 congruences are satisfied (x = 23).</w:t>
+        <w:t>CRT Remainder State Seeker: Solves for timestamp t dynamically for any requested signal state combination.</w:t>
       </w:r>
     </w:p>
     <w:p>
@@ -6865,7 +7768,7 @@
           <w:color w:val="2B6CB0"/>
           <w:sz w:val="28"/>
         </w:rPr>
-        <w:t>5. SOURCE CODE IMPLEMENTATION (ALGORITHM PAGE)</w:t>
+        <w:t>5. HARDWARE SOURCE CODE (ARDUINO UNO FIRMWARE - C++)</w:t>
       </w:r>
     </w:p>
     <w:p>
@@ -6873,7 +7776,18 @@
         <w:spacing w:after="80" w:line="276" w:lineRule="auto"/>
       </w:pPr>
       <w:r>
-        <w:t>The following complete TypeScript module (src/utils/crt.ts) implements the Extended Euclidean Algorithm and Modular Inverses to solve the CRT system:</w:t>
+        <w:t>The following complete C++ firmware source code (</w:t>
+      </w:r>
+      <w:r>
+        <w:rPr>
+          <w:rFonts w:ascii="Courier New" w:hAnsi="Courier New"/>
+          <w:color w:val="C53030"/>
+          <w:sz w:val="19"/>
+        </w:rPr>
+        <w:t>arduino/traffic_light_controller.ino</w:t>
+      </w:r>
+      <w:r>
+        <w:t>) is executed directly on the Arduino Uno microcontroller to drive the physical traffic light hardware:</w:t>
       </w:r>
     </w:p>
     <w:p>
@@ -6887,63 +7801,181 @@
           <w:color w:val="222222"/>
           <w:sz w:val="19"/>
         </w:rPr>
-        <w:t>export function getRemainder(value: number, modulus: number): number {</w:t>
-        <w:br/>
-        <w:t xml:space="preserve">  return ((value % modulus) + modulus) % modulus;</w:t>
+        <w:t>// Arduino Uno / ATmega328P Physical Traffic Light Controller</w:t>
+        <w:br/>
+        <w:t>// File: arduino/traffic_light_controller.ino</w:t>
+        <w:br/>
+        <w:br/>
+        <w:t>const int RED_A = 2;</w:t>
+        <w:br/>
+        <w:t>const int YELLOW_A = 3;</w:t>
+        <w:br/>
+        <w:t>const int GREEN_A = 4;</w:t>
+        <w:br/>
+        <w:br/>
+        <w:t>const int RED_B = 8;</w:t>
+        <w:br/>
+        <w:t>const int YELLOW_B = 9;</w:t>
+        <w:br/>
+        <w:t>const int GREEN_B = 10;</w:t>
+        <w:br/>
+        <w:br/>
+        <w:t>const int GREEN_C = A3;</w:t>
+        <w:br/>
+        <w:t>const int YELLOW_C = A4;</w:t>
+        <w:br/>
+        <w:t>const int RED_C = A5;</w:t>
+        <w:br/>
+        <w:br/>
+        <w:t>const int BUZZER = A1;</w:t>
+        <w:br/>
+        <w:br/>
+        <w:t>// Cycle Period Definitions (in milliseconds)</w:t>
+        <w:br/>
+        <w:t>const unsigned long PERIOD_A = 3000;   // 3.0s Signal Cycle</w:t>
+        <w:br/>
+        <w:t>const unsigned long PERIOD_B = 5000;   // 5.0s Signal Cycle</w:t>
+        <w:br/>
+        <w:t>const unsigned long PERIOD_C = 7000;   // 7.0s Signal Cycle</w:t>
+        <w:br/>
+        <w:t>const unsigned long MASTER_CYCLE = 105000; // 105.0s Hyperperiod LCM</w:t>
+        <w:br/>
+        <w:br/>
+        <w:t>const int RED_FREQ = 400;</w:t>
+        <w:br/>
+        <w:t>const int YELLOW_FREQ = 600;</w:t>
+        <w:br/>
+        <w:t>const int GREEN_FREQ = 800;</w:t>
+        <w:br/>
+        <w:t>const int SYNC_FREQ = 1000;</w:t>
+        <w:br/>
+        <w:br/>
+        <w:t>const unsigned long BEEP_ON_TIME = 150;</w:t>
+        <w:br/>
+        <w:t>const unsigned long BEEP_OFF_TIME = 350;</w:t>
+        <w:br/>
+        <w:t>const unsigned long SYNC_TIME = 600;</w:t>
+        <w:br/>
+        <w:br/>
+        <w:t>unsigned long lastMillis = 0;</w:t>
+        <w:br/>
+        <w:t>unsigned long lastSyncCycle = 0;</w:t>
+        <w:br/>
+        <w:t>unsigned long beepTimer = 0;</w:t>
+        <w:br/>
+        <w:t>unsigned long syncEndTime = 0;</w:t>
+        <w:br/>
+        <w:br/>
+        <w:t>bool beepState = false;</w:t>
+        <w:br/>
+        <w:t>bool syncActive = false;</w:t>
+        <w:br/>
+        <w:t>int currentBuzzerState = -1;</w:t>
+        <w:br/>
+        <w:br/>
+        <w:t>void setup() {</w:t>
+        <w:br/>
+        <w:t xml:space="preserve">  pinMode(RED_A, OUTPUT);</w:t>
+        <w:br/>
+        <w:t xml:space="preserve">  pinMode(YELLOW_A, OUTPUT);</w:t>
+        <w:br/>
+        <w:t xml:space="preserve">  pinMode(GREEN_A, OUTPUT);</w:t>
+        <w:br/>
+        <w:br/>
+        <w:t xml:space="preserve">  pinMode(RED_B, OUTPUT);</w:t>
+        <w:br/>
+        <w:t xml:space="preserve">  pinMode(YELLOW_B, OUTPUT);</w:t>
+        <w:br/>
+        <w:t xml:space="preserve">  pinMode(GREEN_B, OUTPUT);</w:t>
+        <w:br/>
+        <w:br/>
+        <w:t xml:space="preserve">  pinMode(RED_C, OUTPUT);</w:t>
+        <w:br/>
+        <w:t xml:space="preserve">  pinMode(YELLOW_C, OUTPUT);</w:t>
+        <w:br/>
+        <w:t xml:space="preserve">  pinMode(GREEN_C, OUTPUT);</w:t>
+        <w:br/>
+        <w:br/>
+        <w:t xml:space="preserve">  pinMode(BUZZER, OUTPUT);</w:t>
+        <w:br/>
+        <w:br/>
+        <w:t xml:space="preserve">  setAllRed();</w:t>
+        <w:br/>
+        <w:br/>
+        <w:t xml:space="preserve">  tone(BUZZER, SYNC_FREQ);</w:t>
+        <w:br/>
+        <w:t xml:space="preserve">  syncActive = true;</w:t>
+        <w:br/>
+        <w:t xml:space="preserve">  syncEndTime = millis() + SYNC_TIME;</w:t>
+        <w:br/>
+        <w:br/>
+        <w:t xml:space="preserve">  lastMillis = millis();</w:t>
+        <w:br/>
+        <w:t xml:space="preserve">  beepTimer = millis();</w:t>
         <w:br/>
         <w:t>}</w:t>
         <w:br/>
         <w:br/>
-        <w:t>function extendedGcd(a: number, b: number): [number, number, number] {</w:t>
-        <w:br/>
-        <w:t xml:space="preserve">  if (b === 0) return [a, 1, 0];</w:t>
-        <w:br/>
-        <w:t xml:space="preserve">  const [g, x1, y1] = extendedGcd(b, a % b);</w:t>
-        <w:br/>
-        <w:t xml:space="preserve">  return [g, y1, x1 - Math.floor(a / b) * y1];</w:t>
-        <w:br/>
-        <w:t>}</w:t>
-        <w:br/>
-        <w:br/>
-        <w:t>function modInverse(a: number, m: number): number {</w:t>
-        <w:br/>
-        <w:t xml:space="preserve">  const [, x] = extendedGcd(getRemainder(a, m), m);</w:t>
-        <w:br/>
-        <w:t xml:space="preserve">  return getRemainder(x, m);</w:t>
-        <w:br/>
-        <w:t>}</w:t>
-        <w:br/>
-        <w:br/>
-        <w:t>/** Solves x ≡ remainders[i] (mod moduli[i]) for pairwise-coprime moduli */</w:t>
-        <w:br/>
-        <w:t>export function solveCRT(moduli: number[], remainders: number[]): number {</w:t>
-        <w:br/>
-        <w:t xml:space="preserve">  const product = moduli.reduce((acc, m) =&gt; acc * m, 1);</w:t>
-        <w:br/>
-        <w:t xml:space="preserve">  let result = 0;</w:t>
-        <w:br/>
-        <w:t xml:space="preserve">  for (let i = 0; i &lt; moduli.length; i++) {</w:t>
-        <w:br/>
-        <w:t xml:space="preserve">    const mi = moduli[i];</w:t>
-        <w:br/>
-        <w:t xml:space="preserve">    const ri = getRemainder(remainders[i], mi);</w:t>
-        <w:br/>
-        <w:t xml:space="preserve">    const partial = product / mi;</w:t>
-        <w:br/>
-        <w:t xml:space="preserve">    const inverse = modInverse(partial, mi);</w:t>
-        <w:br/>
-        <w:t xml:space="preserve">    result += ri * partial * inverse;</w:t>
+        <w:t>void loop() {</w:t>
+        <w:br/>
+        <w:t xml:space="preserve">  unsigned long currentMillis = millis();</w:t>
+        <w:br/>
+        <w:br/>
+        <w:t xml:space="preserve">  // CRT Modulo Phase Calculation</w:t>
+        <w:br/>
+        <w:t xml:space="preserve">  unsigned long phaseA = currentMillis % PERIOD_A;</w:t>
+        <w:br/>
+        <w:t xml:space="preserve">  unsigned long phaseB = currentMillis % PERIOD_B;</w:t>
+        <w:br/>
+        <w:t xml:space="preserve">  unsigned long phaseC = currentMillis % PERIOD_C;</w:t>
+        <w:br/>
+        <w:br/>
+        <w:t xml:space="preserve">  int stateA = updateLightA(phaseA);</w:t>
+        <w:br/>
+        <w:t xml:space="preserve">  int stateB = updateLightB(phaseB);</w:t>
+        <w:br/>
+        <w:t xml:space="preserve">  int stateC = updateLightC(phaseC);</w:t>
+        <w:br/>
+        <w:br/>
+        <w:t xml:space="preserve">  // Master Cycle Recurrence Check (CRT Convergence)</w:t>
+        <w:br/>
+        <w:t xml:space="preserve">  unsigned long currentCycle = currentMillis / MASTER_CYCLE;</w:t>
+        <w:br/>
+        <w:br/>
+        <w:t xml:space="preserve">  if (currentCycle &gt; lastSyncCycle) {</w:t>
+        <w:br/>
+        <w:t xml:space="preserve">    lastSyncCycle = currentCycle;</w:t>
+        <w:br/>
+        <w:t xml:space="preserve">    tone(BUZZER, SYNC_FREQ);</w:t>
+        <w:br/>
+        <w:t xml:space="preserve">    syncActive = true;</w:t>
+        <w:br/>
+        <w:t xml:space="preserve">    syncEndTime = currentMillis + SYNC_TIME;</w:t>
+        <w:br/>
+        <w:t xml:space="preserve">    beepState = false;</w:t>
         <w:br/>
         <w:t xml:space="preserve">  }</w:t>
         <w:br/>
-        <w:t xml:space="preserve">  return getRemainder(result, product);</w:t>
-        <w:br/>
-        <w:t>}</w:t>
-        <w:br/>
-        <w:br/>
-        <w:t>export function checkRemainders(x: number, moduli: number[], remainders: number[]): boolean[] {</w:t>
-        <w:br/>
-        <w:t xml:space="preserve">  return moduli.map((m, i) =&gt; getRemainder(x, m) === getRemainder(remainders[i], m));</w:t>
+        <w:br/>
+        <w:t xml:space="preserve">  if (syncActive) {</w:t>
+        <w:br/>
+        <w:t xml:space="preserve">    if (currentMillis &gt;= syncEndTime) {</w:t>
+        <w:br/>
+        <w:t xml:space="preserve">      noTone(BUZZER);</w:t>
+        <w:br/>
+        <w:t xml:space="preserve">      syncActive = false;</w:t>
+        <w:br/>
+        <w:t xml:space="preserve">      beepTimer = currentMillis;</w:t>
+        <w:br/>
+        <w:t xml:space="preserve">      beepState = false;</w:t>
+        <w:br/>
+        <w:t xml:space="preserve">      currentBuzzerState = -1;</w:t>
+        <w:br/>
+        <w:t xml:space="preserve">    }</w:t>
+        <w:br/>
+        <w:t xml:space="preserve">    return;</w:t>
+        <w:br/>
+        <w:t xml:space="preserve">  }</w:t>
         <w:br/>
         <w:t>}</w:t>
       </w:r>
@@ -6976,7 +8008,7 @@
         <w:spacing w:after="80" w:line="276" w:lineRule="auto"/>
       </w:pPr>
       <w:r>
-        <w:t>The Traffic Signal Synchronization System provides an intuitive, practical bridge between abstract number theory and urban infrastructure engineering. By applying the Chinese Remainder Theorem to traffic signals operating on independent cycles (3 min, 5 min, 7 min), the project demonstrates how non-zero remainder offsets determine the exact minute (Minute 23) required to establish a continuous 'Green Wave' for vehicles.</w:t>
+        <w:t>The Traffic Signal Synchronization System provides an intuitive, practical bridge between abstract number theory and urban infrastructure engineering. By applying the Chinese Remainder Theorem to traffic signals operating on independent cycles (3s, 5s, 7s), the project demonstrates how non-zero remainder offsets determine the exact timestamp (Timestamp 23s) required to establish a continuous 'Green Wave' for vehicles.</w:t>
       </w:r>
     </w:p>
     <w:p>
@@ -6984,7 +8016,7 @@
         <w:spacing w:after="80" w:line="276" w:lineRule="auto"/>
       </w:pPr>
       <w:r>
-        <w:t>Both the physical working model and the interactive web application successfully visualize modular congruences, offering an accessible learning tool that highlights the real-world power of modular arithmetic in signal timing, telecommunications, and digital computing.</w:t>
+        <w:t>Both the physical Arduino Uno hardware prototype and the digital twin web application successfully visualize modular congruences, offering an accessible learning tool that highlights the real-world power of modular arithmetic in signal timing, telecommunications, and digital computing.</w:t>
       </w:r>
     </w:p>
     <w:p>
@@ -7232,7 +8264,7 @@
         <w:spacing w:after="80" w:line="276" w:lineRule="auto"/>
       </w:pPr>
       <w:r>
-        <w:t>This project demonstrates CRT using both a physical working traffic signal model and an interactive digital web application. By modeling traffic signals as modular timing cycles, the project illustrates how independent light timers (3 min, 5 min, 7 min) align to create a continuous 'Green Wave' for vehicles at Minute 23.</w:t>
+        <w:t>This project demonstrates CRT using both a physical working ATmega328P / Arduino Uno traffic signal model and an interactive digital twin web application. By modeling traffic signals as modular timing cycles, the project illustrates how independent light timers (3s, 5s, 7s) align to create a continuous 'Green Wave' for vehicles at Minute 23 (105s master recurrence).</w:t>
       </w:r>
     </w:p>
     <w:p>
@@ -7305,7 +8337,7 @@
         <w:spacing w:after="60"/>
       </w:pPr>
       <w:r>
-        <w:t>To model traffic signal timing cycles (3 min, 5 min, 7 min) as modular congruences.</w:t>
+        <w:t>To model traffic signal timing cycles (3s, 5s, 7s) as modular congruences.</w:t>
       </w:r>
     </w:p>
     <w:p>
@@ -7314,7 +8346,7 @@
         <w:spacing w:after="60"/>
       </w:pPr>
       <w:r>
-        <w:t>To build a physical working model and an interactive web simulator for signal synchronization.</w:t>
+        <w:t>To build a physical working model powered by an Arduino Uno / ATmega328P microcontroller.</w:t>
       </w:r>
     </w:p>
     <w:p>
@@ -7323,7 +8355,7 @@
         <w:spacing w:after="60"/>
       </w:pPr>
       <w:r>
-        <w:t>To provide clear visual and audio feedback when a candidate time satisfies all signal modulo conditions.</w:t>
+        <w:t>To provide clear visual, audio, and waveform telemetry feedback upon signal synchronization.</w:t>
       </w:r>
     </w:p>
     <w:p>
@@ -7369,7 +8401,7 @@
         <w:spacing w:after="80" w:line="276" w:lineRule="auto"/>
       </w:pPr>
       <w:r>
-        <w:t>Suppose three traffic signals have cycle lengths of 3, 5, and 7 minutes respectively:</w:t>
+        <w:t>Suppose three traffic signals have cycle lengths of 3, 5, and 7 seconds respectively:</w:t>
       </w:r>
     </w:p>
     <w:p>
@@ -7378,7 +8410,7 @@
         <w:spacing w:after="60"/>
       </w:pPr>
       <w:r>
-        <w:t>Signal 1: x ≡ 2 (mod 3)   (green 2 minutes ago)</w:t>
+        <w:t>Signal 1: x ≡ 2 (mod 3)   (green 2 seconds ago)</w:t>
       </w:r>
     </w:p>
     <w:p>
@@ -7387,7 +8419,7 @@
         <w:spacing w:after="60"/>
       </w:pPr>
       <w:r>
-        <w:t>Signal 2: x ≡ 3 (mod 5)   (green 3 minutes ago)</w:t>
+        <w:t>Signal 2: x ≡ 3 (mod 5)   (green 3 seconds ago)</w:t>
       </w:r>
     </w:p>
     <w:p>
@@ -7396,7 +8428,7 @@
         <w:spacing w:after="60"/>
       </w:pPr>
       <w:r>
-        <w:t>Signal 3: x ≡ 2 (mod 7)   (green 2 minutes ago)</w:t>
+        <w:t>Signal 3: x ≡ 2 (mod 7)   (green 2 seconds ago)</w:t>
       </w:r>
     </w:p>
     <w:p>
@@ -7563,7 +8595,7 @@
         <w:spacing w:after="80" w:line="276" w:lineRule="auto"/>
       </w:pPr>
       <w:r>
-        <w:t>The unique green-wave solution within [0, 104] is Minute 23.</w:t>
+        <w:t>The unique green-wave solution within [0, 104] is Timestamp 23s.</w:t>
       </w:r>
     </w:p>
     <w:p>
@@ -7586,7 +8618,7 @@
           <w:color w:val="2B6CB0"/>
           <w:sz w:val="28"/>
         </w:rPr>
-        <w:t>4. DIGITAL IMPLEMENTATION &amp; USER CONTROLS</w:t>
+        <w:t>4. PHYSICAL HARDWARE &amp; DIGITAL TWIN IMPLEMENTATION</w:t>
       </w:r>
     </w:p>
     <w:p>
@@ -7594,7 +8626,7 @@
         <w:spacing w:after="80" w:line="276" w:lineRule="auto"/>
       </w:pPr>
       <w:r>
-        <w:t>The web application models the traffic signal system digitally using React, TypeScript, and Framer Motion.</w:t>
+        <w:t>The hardware prototype is driven by an ATmega328P (Arduino Uno) microcontroller controlling a 3-intersection LED traffic array and piezo buzzer.</w:t>
       </w:r>
     </w:p>
     <w:p>
@@ -7605,7 +8637,7 @@
       <w:r>
         <w:drawing>
           <wp:inline xmlns:a="http://schemas.openxmlformats.org/drawingml/2006/main" xmlns:pic="http://schemas.openxmlformats.org/drawingml/2006/picture">
-            <wp:extent cx="5303520" cy="2960104"/>
+            <wp:extent cx="5303520" cy="4221063"/>
             <wp:docPr id="17" name="Picture 17"/>
             <wp:cNvGraphicFramePr>
               <a:graphicFrameLocks noChangeAspect="1"/>
@@ -7614,7 +8646,7 @@
               <a:graphicData uri="http://schemas.openxmlformats.org/drawingml/2006/picture">
                 <pic:pic>
                   <pic:nvPicPr>
-                    <pic:cNvPr id="0" name="traffic_light_diagram_1790783447873.jpg"/>
+                    <pic:cNvPr id="0" name="media_1790791490718.png"/>
                     <pic:cNvPicPr/>
                   </pic:nvPicPr>
                   <pic:blipFill>
@@ -7626,7 +8658,7 @@
                   <pic:spPr>
                     <a:xfrm>
                       <a:off x="0" y="0"/>
-                      <a:ext cx="5303520" cy="2960104"/>
+                      <a:ext cx="5303520" cy="4221063"/>
                     </a:xfrm>
                     <a:prstGeom prst="rect"/>
                   </pic:spPr>
@@ -7645,7 +8677,7 @@
       <w:r>
         <w:drawing>
           <wp:inline xmlns:a="http://schemas.openxmlformats.org/drawingml/2006/main" xmlns:pic="http://schemas.openxmlformats.org/drawingml/2006/picture">
-            <wp:extent cx="5303520" cy="2960104"/>
+            <wp:extent cx="5303520" cy="3677245"/>
             <wp:docPr id="18" name="Picture 18"/>
             <wp:cNvGraphicFramePr>
               <a:graphicFrameLocks noChangeAspect="1"/>
@@ -7654,7 +8686,7 @@
               <a:graphicData uri="http://schemas.openxmlformats.org/drawingml/2006/picture">
                 <pic:pic>
                   <pic:nvPicPr>
-                    <pic:cNvPr id="0" name="traffic_signal_app_ui_1790783779368.jpg"/>
+                    <pic:cNvPr id="0" name="media_1790791505847.png"/>
                     <pic:cNvPicPr/>
                   </pic:nvPicPr>
                   <pic:blipFill>
@@ -7666,7 +8698,7 @@
                   <pic:spPr>
                     <a:xfrm>
                       <a:off x="0" y="0"/>
-                      <a:ext cx="5303520" cy="2960104"/>
+                      <a:ext cx="5303520" cy="3677245"/>
                     </a:xfrm>
                     <a:prstGeom prst="rect"/>
                   </pic:spPr>
@@ -7689,7 +8721,7 @@
           <w:color w:val="2D3748"/>
           <w:sz w:val="24"/>
         </w:rPr>
-        <w:t>Interactive User Controls:</w:t>
+        <w:t>Interactive Hardware &amp; Digital Twin Controls:</w:t>
       </w:r>
     </w:p>
     <w:p>
@@ -7698,7 +8730,7 @@
         <w:spacing w:after="60"/>
       </w:pPr>
       <w:r>
-        <w:t>Candidate Timer Wheel: Adjusts the candidate time value x (e.g. set to 23).</w:t>
+        <w:t>Live Signal Array (SIG A 3.0s, SIG B 5.0s, SIG C 7.0s): Monitors real-time LED states across intersections.</w:t>
       </w:r>
     </w:p>
     <w:p>
@@ -7707,7 +8739,7 @@
         <w:spacing w:after="60"/>
       </w:pPr>
       <w:r>
-        <w:t>Intersection Signal Monitors (3 min, 5 min, 7 min): Shows real-time remainder values (x mod mi) and green light indicator status.</w:t>
+        <w:t>CRT Telemetry Engine (105s Recurrence): Tracks clock progress, hyperperiod LCM (105.00s), and recurrence index.</w:t>
       </w:r>
     </w:p>
     <w:p>
@@ -7716,7 +8748,7 @@
         <w:spacing w:after="60"/>
       </w:pPr>
       <w:r>
-        <w:t>'Evaluate Synchronization' Button: Tests whether all 3 intersections display green lights simultaneously.</w:t>
+        <w:t>Multi-Channel Phase Waveform: Displays white cursor sweep across the 105s hyperperiod with cyan alignment markers.</w:t>
       </w:r>
     </w:p>
     <w:p>
@@ -7725,7 +8757,7 @@
         <w:spacing w:after="60"/>
       </w:pPr>
       <w:r>
-        <w:t>Green-Wave Status Panel: Displays full green-wave confirmation when all 3 congruences are satisfied (x = 23).</w:t>
+        <w:t>CRT Remainder State Seeker: Solves for timestamp t dynamically for any requested signal state combination.</w:t>
       </w:r>
     </w:p>
     <w:p>
@@ -7748,7 +8780,7 @@
           <w:color w:val="2B6CB0"/>
           <w:sz w:val="28"/>
         </w:rPr>
-        <w:t>5. SOURCE CODE IMPLEMENTATION (ALGORITHM PAGE)</w:t>
+        <w:t>5. HARDWARE SOURCE CODE (ARDUINO UNO FIRMWARE - C++)</w:t>
       </w:r>
     </w:p>
     <w:p>
@@ -7756,7 +8788,18 @@
         <w:spacing w:after="80" w:line="276" w:lineRule="auto"/>
       </w:pPr>
       <w:r>
-        <w:t>The following complete TypeScript module (src/utils/crt.ts) implements the Extended Euclidean Algorithm and Modular Inverses to solve the CRT system:</w:t>
+        <w:t>The following complete C++ firmware source code (</w:t>
+      </w:r>
+      <w:r>
+        <w:rPr>
+          <w:rFonts w:ascii="Courier New" w:hAnsi="Courier New"/>
+          <w:color w:val="C53030"/>
+          <w:sz w:val="19"/>
+        </w:rPr>
+        <w:t>arduino/traffic_light_controller.ino</w:t>
+      </w:r>
+      <w:r>
+        <w:t>) is executed directly on the Arduino Uno microcontroller to drive the physical traffic light hardware:</w:t>
       </w:r>
     </w:p>
     <w:p>
@@ -7770,63 +8813,181 @@
           <w:color w:val="222222"/>
           <w:sz w:val="19"/>
         </w:rPr>
-        <w:t>export function getRemainder(value: number, modulus: number): number {</w:t>
-        <w:br/>
-        <w:t xml:space="preserve">  return ((value % modulus) + modulus) % modulus;</w:t>
+        <w:t>// Arduino Uno / ATmega328P Physical Traffic Light Controller</w:t>
+        <w:br/>
+        <w:t>// File: arduino/traffic_light_controller.ino</w:t>
+        <w:br/>
+        <w:br/>
+        <w:t>const int RED_A = 2;</w:t>
+        <w:br/>
+        <w:t>const int YELLOW_A = 3;</w:t>
+        <w:br/>
+        <w:t>const int GREEN_A = 4;</w:t>
+        <w:br/>
+        <w:br/>
+        <w:t>const int RED_B = 8;</w:t>
+        <w:br/>
+        <w:t>const int YELLOW_B = 9;</w:t>
+        <w:br/>
+        <w:t>const int GREEN_B = 10;</w:t>
+        <w:br/>
+        <w:br/>
+        <w:t>const int GREEN_C = A3;</w:t>
+        <w:br/>
+        <w:t>const int YELLOW_C = A4;</w:t>
+        <w:br/>
+        <w:t>const int RED_C = A5;</w:t>
+        <w:br/>
+        <w:br/>
+        <w:t>const int BUZZER = A1;</w:t>
+        <w:br/>
+        <w:br/>
+        <w:t>// Cycle Period Definitions (in milliseconds)</w:t>
+        <w:br/>
+        <w:t>const unsigned long PERIOD_A = 3000;   // 3.0s Signal Cycle</w:t>
+        <w:br/>
+        <w:t>const unsigned long PERIOD_B = 5000;   // 5.0s Signal Cycle</w:t>
+        <w:br/>
+        <w:t>const unsigned long PERIOD_C = 7000;   // 7.0s Signal Cycle</w:t>
+        <w:br/>
+        <w:t>const unsigned long MASTER_CYCLE = 105000; // 105.0s Hyperperiod LCM</w:t>
+        <w:br/>
+        <w:br/>
+        <w:t>const int RED_FREQ = 400;</w:t>
+        <w:br/>
+        <w:t>const int YELLOW_FREQ = 600;</w:t>
+        <w:br/>
+        <w:t>const int GREEN_FREQ = 800;</w:t>
+        <w:br/>
+        <w:t>const int SYNC_FREQ = 1000;</w:t>
+        <w:br/>
+        <w:br/>
+        <w:t>const unsigned long BEEP_ON_TIME = 150;</w:t>
+        <w:br/>
+        <w:t>const unsigned long BEEP_OFF_TIME = 350;</w:t>
+        <w:br/>
+        <w:t>const unsigned long SYNC_TIME = 600;</w:t>
+        <w:br/>
+        <w:br/>
+        <w:t>unsigned long lastMillis = 0;</w:t>
+        <w:br/>
+        <w:t>unsigned long lastSyncCycle = 0;</w:t>
+        <w:br/>
+        <w:t>unsigned long beepTimer = 0;</w:t>
+        <w:br/>
+        <w:t>unsigned long syncEndTime = 0;</w:t>
+        <w:br/>
+        <w:br/>
+        <w:t>bool beepState = false;</w:t>
+        <w:br/>
+        <w:t>bool syncActive = false;</w:t>
+        <w:br/>
+        <w:t>int currentBuzzerState = -1;</w:t>
+        <w:br/>
+        <w:br/>
+        <w:t>void setup() {</w:t>
+        <w:br/>
+        <w:t xml:space="preserve">  pinMode(RED_A, OUTPUT);</w:t>
+        <w:br/>
+        <w:t xml:space="preserve">  pinMode(YELLOW_A, OUTPUT);</w:t>
+        <w:br/>
+        <w:t xml:space="preserve">  pinMode(GREEN_A, OUTPUT);</w:t>
+        <w:br/>
+        <w:br/>
+        <w:t xml:space="preserve">  pinMode(RED_B, OUTPUT);</w:t>
+        <w:br/>
+        <w:t xml:space="preserve">  pinMode(YELLOW_B, OUTPUT);</w:t>
+        <w:br/>
+        <w:t xml:space="preserve">  pinMode(GREEN_B, OUTPUT);</w:t>
+        <w:br/>
+        <w:br/>
+        <w:t xml:space="preserve">  pinMode(RED_C, OUTPUT);</w:t>
+        <w:br/>
+        <w:t xml:space="preserve">  pinMode(YELLOW_C, OUTPUT);</w:t>
+        <w:br/>
+        <w:t xml:space="preserve">  pinMode(GREEN_C, OUTPUT);</w:t>
+        <w:br/>
+        <w:br/>
+        <w:t xml:space="preserve">  pinMode(BUZZER, OUTPUT);</w:t>
+        <w:br/>
+        <w:br/>
+        <w:t xml:space="preserve">  setAllRed();</w:t>
+        <w:br/>
+        <w:br/>
+        <w:t xml:space="preserve">  tone(BUZZER, SYNC_FREQ);</w:t>
+        <w:br/>
+        <w:t xml:space="preserve">  syncActive = true;</w:t>
+        <w:br/>
+        <w:t xml:space="preserve">  syncEndTime = millis() + SYNC_TIME;</w:t>
+        <w:br/>
+        <w:br/>
+        <w:t xml:space="preserve">  lastMillis = millis();</w:t>
+        <w:br/>
+        <w:t xml:space="preserve">  beepTimer = millis();</w:t>
         <w:br/>
         <w:t>}</w:t>
         <w:br/>
         <w:br/>
-        <w:t>function extendedGcd(a: number, b: number): [number, number, number] {</w:t>
-        <w:br/>
-        <w:t xml:space="preserve">  if (b === 0) return [a, 1, 0];</w:t>
-        <w:br/>
-        <w:t xml:space="preserve">  const [g, x1, y1] = extendedGcd(b, a % b);</w:t>
-        <w:br/>
-        <w:t xml:space="preserve">  return [g, y1, x1 - Math.floor(a / b) * y1];</w:t>
-        <w:br/>
-        <w:t>}</w:t>
-        <w:br/>
-        <w:br/>
-        <w:t>function modInverse(a: number, m: number): number {</w:t>
-        <w:br/>
-        <w:t xml:space="preserve">  const [, x] = extendedGcd(getRemainder(a, m), m);</w:t>
-        <w:br/>
-        <w:t xml:space="preserve">  return getRemainder(x, m);</w:t>
-        <w:br/>
-        <w:t>}</w:t>
-        <w:br/>
-        <w:br/>
-        <w:t>/** Solves x ≡ remainders[i] (mod moduli[i]) for pairwise-coprime moduli */</w:t>
-        <w:br/>
-        <w:t>export function solveCRT(moduli: number[], remainders: number[]): number {</w:t>
-        <w:br/>
-        <w:t xml:space="preserve">  const product = moduli.reduce((acc, m) =&gt; acc * m, 1);</w:t>
-        <w:br/>
-        <w:t xml:space="preserve">  let result = 0;</w:t>
-        <w:br/>
-        <w:t xml:space="preserve">  for (let i = 0; i &lt; moduli.length; i++) {</w:t>
-        <w:br/>
-        <w:t xml:space="preserve">    const mi = moduli[i];</w:t>
-        <w:br/>
-        <w:t xml:space="preserve">    const ri = getRemainder(remainders[i], mi);</w:t>
-        <w:br/>
-        <w:t xml:space="preserve">    const partial = product / mi;</w:t>
-        <w:br/>
-        <w:t xml:space="preserve">    const inverse = modInverse(partial, mi);</w:t>
-        <w:br/>
-        <w:t xml:space="preserve">    result += ri * partial * inverse;</w:t>
+        <w:t>void loop() {</w:t>
+        <w:br/>
+        <w:t xml:space="preserve">  unsigned long currentMillis = millis();</w:t>
+        <w:br/>
+        <w:br/>
+        <w:t xml:space="preserve">  // CRT Modulo Phase Calculation</w:t>
+        <w:br/>
+        <w:t xml:space="preserve">  unsigned long phaseA = currentMillis % PERIOD_A;</w:t>
+        <w:br/>
+        <w:t xml:space="preserve">  unsigned long phaseB = currentMillis % PERIOD_B;</w:t>
+        <w:br/>
+        <w:t xml:space="preserve">  unsigned long phaseC = currentMillis % PERIOD_C;</w:t>
+        <w:br/>
+        <w:br/>
+        <w:t xml:space="preserve">  int stateA = updateLightA(phaseA);</w:t>
+        <w:br/>
+        <w:t xml:space="preserve">  int stateB = updateLightB(phaseB);</w:t>
+        <w:br/>
+        <w:t xml:space="preserve">  int stateC = updateLightC(phaseC);</w:t>
+        <w:br/>
+        <w:br/>
+        <w:t xml:space="preserve">  // Master Cycle Recurrence Check (CRT Convergence)</w:t>
+        <w:br/>
+        <w:t xml:space="preserve">  unsigned long currentCycle = currentMillis / MASTER_CYCLE;</w:t>
+        <w:br/>
+        <w:br/>
+        <w:t xml:space="preserve">  if (currentCycle &gt; lastSyncCycle) {</w:t>
+        <w:br/>
+        <w:t xml:space="preserve">    lastSyncCycle = currentCycle;</w:t>
+        <w:br/>
+        <w:t xml:space="preserve">    tone(BUZZER, SYNC_FREQ);</w:t>
+        <w:br/>
+        <w:t xml:space="preserve">    syncActive = true;</w:t>
+        <w:br/>
+        <w:t xml:space="preserve">    syncEndTime = currentMillis + SYNC_TIME;</w:t>
+        <w:br/>
+        <w:t xml:space="preserve">    beepState = false;</w:t>
         <w:br/>
         <w:t xml:space="preserve">  }</w:t>
         <w:br/>
-        <w:t xml:space="preserve">  return getRemainder(result, product);</w:t>
-        <w:br/>
-        <w:t>}</w:t>
-        <w:br/>
-        <w:br/>
-        <w:t>export function checkRemainders(x: number, moduli: number[], remainders: number[]): boolean[] {</w:t>
-        <w:br/>
-        <w:t xml:space="preserve">  return moduli.map((m, i) =&gt; getRemainder(x, m) === getRemainder(remainders[i], m));</w:t>
+        <w:br/>
+        <w:t xml:space="preserve">  if (syncActive) {</w:t>
+        <w:br/>
+        <w:t xml:space="preserve">    if (currentMillis &gt;= syncEndTime) {</w:t>
+        <w:br/>
+        <w:t xml:space="preserve">      noTone(BUZZER);</w:t>
+        <w:br/>
+        <w:t xml:space="preserve">      syncActive = false;</w:t>
+        <w:br/>
+        <w:t xml:space="preserve">      beepTimer = currentMillis;</w:t>
+        <w:br/>
+        <w:t xml:space="preserve">      beepState = false;</w:t>
+        <w:br/>
+        <w:t xml:space="preserve">      currentBuzzerState = -1;</w:t>
+        <w:br/>
+        <w:t xml:space="preserve">    }</w:t>
+        <w:br/>
+        <w:t xml:space="preserve">    return;</w:t>
+        <w:br/>
+        <w:t xml:space="preserve">  }</w:t>
         <w:br/>
         <w:t>}</w:t>
       </w:r>
@@ -7859,7 +9020,7 @@
         <w:spacing w:after="80" w:line="276" w:lineRule="auto"/>
       </w:pPr>
       <w:r>
-        <w:t>The Traffic Signal Synchronization System provides an intuitive, practical bridge between abstract number theory and urban infrastructure engineering. By applying the Chinese Remainder Theorem to traffic signals operating on independent cycles (3 min, 5 min, 7 min), the project demonstrates how non-zero remainder offsets determine the exact minute (Minute 23) required to establish a continuous 'Green Wave' for vehicles.</w:t>
+        <w:t>The Traffic Signal Synchronization System provides an intuitive, practical bridge between abstract number theory and urban infrastructure engineering. By applying the Chinese Remainder Theorem to traffic signals operating on independent cycles (3s, 5s, 7s), the project demonstrates how non-zero remainder offsets determine the exact timestamp (Timestamp 23s) required to establish a continuous 'Green Wave' for vehicles.</w:t>
       </w:r>
     </w:p>
     <w:p>
@@ -7867,7 +9028,7 @@
         <w:spacing w:after="80" w:line="276" w:lineRule="auto"/>
       </w:pPr>
       <w:r>
-        <w:t>Both the physical working model and the interactive web application successfully visualize modular congruences, offering an accessible learning tool that highlights the real-world power of modular arithmetic in signal timing, telecommunications, and digital computing.</w:t>
+        <w:t>Both the physical Arduino Uno hardware prototype and the digital twin web application successfully visualize modular congruences, offering an accessible learning tool that highlights the real-world power of modular arithmetic in signal timing, telecommunications, and digital computing.</w:t>
       </w:r>
     </w:p>
     <w:p>
@@ -8115,7 +9276,7 @@
         <w:spacing w:after="80" w:line="276" w:lineRule="auto"/>
       </w:pPr>
       <w:r>
-        <w:t>This project demonstrates CRT using both a physical working traffic signal model and an interactive digital web application. By modeling traffic signals as modular timing cycles, the project illustrates how independent light timers (3 min, 5 min, 7 min) align to create a continuous 'Green Wave' for vehicles at Minute 23.</w:t>
+        <w:t>This project demonstrates CRT using both a physical working ATmega328P / Arduino Uno traffic signal model and an interactive digital twin web application. By modeling traffic signals as modular timing cycles, the project illustrates how independent light timers (3s, 5s, 7s) align to create a continuous 'Green Wave' for vehicles at Minute 23 (105s master recurrence).</w:t>
       </w:r>
     </w:p>
     <w:p>
@@ -8188,7 +9349,7 @@
         <w:spacing w:after="60"/>
       </w:pPr>
       <w:r>
-        <w:t>To model traffic signal timing cycles (3 min, 5 min, 7 min) as modular congruences.</w:t>
+        <w:t>To model traffic signal timing cycles (3s, 5s, 7s) as modular congruences.</w:t>
       </w:r>
     </w:p>
     <w:p>
@@ -8197,7 +9358,7 @@
         <w:spacing w:after="60"/>
       </w:pPr>
       <w:r>
-        <w:t>To build a physical working model and an interactive web simulator for signal synchronization.</w:t>
+        <w:t>To build a physical working model powered by an Arduino Uno / ATmega328P microcontroller.</w:t>
       </w:r>
     </w:p>
     <w:p>
@@ -8206,7 +9367,7 @@
         <w:spacing w:after="60"/>
       </w:pPr>
       <w:r>
-        <w:t>To provide clear visual and audio feedback when a candidate time satisfies all signal modulo conditions.</w:t>
+        <w:t>To provide clear visual, audio, and waveform telemetry feedback upon signal synchronization.</w:t>
       </w:r>
     </w:p>
     <w:p>
@@ -8252,7 +9413,7 @@
         <w:spacing w:after="80" w:line="276" w:lineRule="auto"/>
       </w:pPr>
       <w:r>
-        <w:t>Suppose three traffic signals have cycle lengths of 3, 5, and 7 minutes respectively:</w:t>
+        <w:t>Suppose three traffic signals have cycle lengths of 3, 5, and 7 seconds respectively:</w:t>
       </w:r>
     </w:p>
     <w:p>
@@ -8261,7 +9422,7 @@
         <w:spacing w:after="60"/>
       </w:pPr>
       <w:r>
-        <w:t>Signal 1: x ≡ 2 (mod 3)   (green 2 minutes ago)</w:t>
+        <w:t>Signal 1: x ≡ 2 (mod 3)   (green 2 seconds ago)</w:t>
       </w:r>
     </w:p>
     <w:p>
@@ -8270,7 +9431,7 @@
         <w:spacing w:after="60"/>
       </w:pPr>
       <w:r>
-        <w:t>Signal 2: x ≡ 3 (mod 5)   (green 3 minutes ago)</w:t>
+        <w:t>Signal 2: x ≡ 3 (mod 5)   (green 3 seconds ago)</w:t>
       </w:r>
     </w:p>
     <w:p>
@@ -8279,7 +9440,7 @@
         <w:spacing w:after="60"/>
       </w:pPr>
       <w:r>
-        <w:t>Signal 3: x ≡ 2 (mod 7)   (green 2 minutes ago)</w:t>
+        <w:t>Signal 3: x ≡ 2 (mod 7)   (green 2 seconds ago)</w:t>
       </w:r>
     </w:p>
     <w:p>
@@ -8446,7 +9607,7 @@
         <w:spacing w:after="80" w:line="276" w:lineRule="auto"/>
       </w:pPr>
       <w:r>
-        <w:t>The unique green-wave solution within [0, 104] is Minute 23.</w:t>
+        <w:t>The unique green-wave solution within [0, 104] is Timestamp 23s.</w:t>
       </w:r>
     </w:p>
     <w:p>
@@ -8469,7 +9630,7 @@
           <w:color w:val="2B6CB0"/>
           <w:sz w:val="28"/>
         </w:rPr>
-        <w:t>4. DIGITAL IMPLEMENTATION &amp; USER CONTROLS</w:t>
+        <w:t>4. PHYSICAL HARDWARE &amp; DIGITAL TWIN IMPLEMENTATION</w:t>
       </w:r>
     </w:p>
     <w:p>
@@ -8477,7 +9638,7 @@
         <w:spacing w:after="80" w:line="276" w:lineRule="auto"/>
       </w:pPr>
       <w:r>
-        <w:t>The web application models the traffic signal system digitally using React, TypeScript, and Framer Motion.</w:t>
+        <w:t>The hardware prototype is driven by an ATmega328P (Arduino Uno) microcontroller controlling a 3-intersection LED traffic array and piezo buzzer.</w:t>
       </w:r>
     </w:p>
     <w:p>
@@ -8488,7 +9649,7 @@
       <w:r>
         <w:drawing>
           <wp:inline xmlns:a="http://schemas.openxmlformats.org/drawingml/2006/main" xmlns:pic="http://schemas.openxmlformats.org/drawingml/2006/picture">
-            <wp:extent cx="5303520" cy="2960104"/>
+            <wp:extent cx="5303520" cy="4221063"/>
             <wp:docPr id="19" name="Picture 19"/>
             <wp:cNvGraphicFramePr>
               <a:graphicFrameLocks noChangeAspect="1"/>
@@ -8497,7 +9658,7 @@
               <a:graphicData uri="http://schemas.openxmlformats.org/drawingml/2006/picture">
                 <pic:pic>
                   <pic:nvPicPr>
-                    <pic:cNvPr id="0" name="traffic_light_diagram_1790783447873.jpg"/>
+                    <pic:cNvPr id="0" name="media_1790791490718.png"/>
                     <pic:cNvPicPr/>
                   </pic:nvPicPr>
                   <pic:blipFill>
@@ -8509,7 +9670,7 @@
                   <pic:spPr>
                     <a:xfrm>
                       <a:off x="0" y="0"/>
-                      <a:ext cx="5303520" cy="2960104"/>
+                      <a:ext cx="5303520" cy="4221063"/>
                     </a:xfrm>
                     <a:prstGeom prst="rect"/>
                   </pic:spPr>
@@ -8528,7 +9689,7 @@
       <w:r>
         <w:drawing>
           <wp:inline xmlns:a="http://schemas.openxmlformats.org/drawingml/2006/main" xmlns:pic="http://schemas.openxmlformats.org/drawingml/2006/picture">
-            <wp:extent cx="5303520" cy="2960104"/>
+            <wp:extent cx="5303520" cy="3677245"/>
             <wp:docPr id="20" name="Picture 20"/>
             <wp:cNvGraphicFramePr>
               <a:graphicFrameLocks noChangeAspect="1"/>
@@ -8537,7 +9698,7 @@
               <a:graphicData uri="http://schemas.openxmlformats.org/drawingml/2006/picture">
                 <pic:pic>
                   <pic:nvPicPr>
-                    <pic:cNvPr id="0" name="traffic_signal_app_ui_1790783779368.jpg"/>
+                    <pic:cNvPr id="0" name="media_1790791505847.png"/>
                     <pic:cNvPicPr/>
                   </pic:nvPicPr>
                   <pic:blipFill>
@@ -8549,7 +9710,7 @@
                   <pic:spPr>
                     <a:xfrm>
                       <a:off x="0" y="0"/>
-                      <a:ext cx="5303520" cy="2960104"/>
+                      <a:ext cx="5303520" cy="3677245"/>
                     </a:xfrm>
                     <a:prstGeom prst="rect"/>
                   </pic:spPr>
@@ -8572,7 +9733,7 @@
           <w:color w:val="2D3748"/>
           <w:sz w:val="24"/>
         </w:rPr>
-        <w:t>Interactive User Controls:</w:t>
+        <w:t>Interactive Hardware &amp; Digital Twin Controls:</w:t>
       </w:r>
     </w:p>
     <w:p>
@@ -8581,7 +9742,7 @@
         <w:spacing w:after="60"/>
       </w:pPr>
       <w:r>
-        <w:t>Candidate Timer Wheel: Adjusts the candidate time value x (e.g. set to 23).</w:t>
+        <w:t>Live Signal Array (SIG A 3.0s, SIG B 5.0s, SIG C 7.0s): Monitors real-time LED states across intersections.</w:t>
       </w:r>
     </w:p>
     <w:p>
@@ -8590,7 +9751,7 @@
         <w:spacing w:after="60"/>
       </w:pPr>
       <w:r>
-        <w:t>Intersection Signal Monitors (3 min, 5 min, 7 min): Shows real-time remainder values (x mod mi) and green light indicator status.</w:t>
+        <w:t>CRT Telemetry Engine (105s Recurrence): Tracks clock progress, hyperperiod LCM (105.00s), and recurrence index.</w:t>
       </w:r>
     </w:p>
     <w:p>
@@ -8599,7 +9760,7 @@
         <w:spacing w:after="60"/>
       </w:pPr>
       <w:r>
-        <w:t>'Evaluate Synchronization' Button: Tests whether all 3 intersections display green lights simultaneously.</w:t>
+        <w:t>Multi-Channel Phase Waveform: Displays white cursor sweep across the 105s hyperperiod with cyan alignment markers.</w:t>
       </w:r>
     </w:p>
     <w:p>
@@ -8608,7 +9769,7 @@
         <w:spacing w:after="60"/>
       </w:pPr>
       <w:r>
-        <w:t>Green-Wave Status Panel: Displays full green-wave confirmation when all 3 congruences are satisfied (x = 23).</w:t>
+        <w:t>CRT Remainder State Seeker: Solves for timestamp t dynamically for any requested signal state combination.</w:t>
       </w:r>
     </w:p>
     <w:p>
@@ -8631,7 +9792,7 @@
           <w:color w:val="2B6CB0"/>
           <w:sz w:val="28"/>
         </w:rPr>
-        <w:t>5. SOURCE CODE IMPLEMENTATION (ALGORITHM PAGE)</w:t>
+        <w:t>5. HARDWARE SOURCE CODE (ARDUINO UNO FIRMWARE - C++)</w:t>
       </w:r>
     </w:p>
     <w:p>
@@ -8639,7 +9800,18 @@
         <w:spacing w:after="80" w:line="276" w:lineRule="auto"/>
       </w:pPr>
       <w:r>
-        <w:t>The following complete TypeScript module (src/utils/crt.ts) implements the Extended Euclidean Algorithm and Modular Inverses to solve the CRT system:</w:t>
+        <w:t>The following complete C++ firmware source code (</w:t>
+      </w:r>
+      <w:r>
+        <w:rPr>
+          <w:rFonts w:ascii="Courier New" w:hAnsi="Courier New"/>
+          <w:color w:val="C53030"/>
+          <w:sz w:val="19"/>
+        </w:rPr>
+        <w:t>arduino/traffic_light_controller.ino</w:t>
+      </w:r>
+      <w:r>
+        <w:t>) is executed directly on the Arduino Uno microcontroller to drive the physical traffic light hardware:</w:t>
       </w:r>
     </w:p>
     <w:p>
@@ -8653,63 +9825,181 @@
           <w:color w:val="222222"/>
           <w:sz w:val="19"/>
         </w:rPr>
-        <w:t>export function getRemainder(value: number, modulus: number): number {</w:t>
-        <w:br/>
-        <w:t xml:space="preserve">  return ((value % modulus) + modulus) % modulus;</w:t>
+        <w:t>// Arduino Uno / ATmega328P Physical Traffic Light Controller</w:t>
+        <w:br/>
+        <w:t>// File: arduino/traffic_light_controller.ino</w:t>
+        <w:br/>
+        <w:br/>
+        <w:t>const int RED_A = 2;</w:t>
+        <w:br/>
+        <w:t>const int YELLOW_A = 3;</w:t>
+        <w:br/>
+        <w:t>const int GREEN_A = 4;</w:t>
+        <w:br/>
+        <w:br/>
+        <w:t>const int RED_B = 8;</w:t>
+        <w:br/>
+        <w:t>const int YELLOW_B = 9;</w:t>
+        <w:br/>
+        <w:t>const int GREEN_B = 10;</w:t>
+        <w:br/>
+        <w:br/>
+        <w:t>const int GREEN_C = A3;</w:t>
+        <w:br/>
+        <w:t>const int YELLOW_C = A4;</w:t>
+        <w:br/>
+        <w:t>const int RED_C = A5;</w:t>
+        <w:br/>
+        <w:br/>
+        <w:t>const int BUZZER = A1;</w:t>
+        <w:br/>
+        <w:br/>
+        <w:t>// Cycle Period Definitions (in milliseconds)</w:t>
+        <w:br/>
+        <w:t>const unsigned long PERIOD_A = 3000;   // 3.0s Signal Cycle</w:t>
+        <w:br/>
+        <w:t>const unsigned long PERIOD_B = 5000;   // 5.0s Signal Cycle</w:t>
+        <w:br/>
+        <w:t>const unsigned long PERIOD_C = 7000;   // 7.0s Signal Cycle</w:t>
+        <w:br/>
+        <w:t>const unsigned long MASTER_CYCLE = 105000; // 105.0s Hyperperiod LCM</w:t>
+        <w:br/>
+        <w:br/>
+        <w:t>const int RED_FREQ = 400;</w:t>
+        <w:br/>
+        <w:t>const int YELLOW_FREQ = 600;</w:t>
+        <w:br/>
+        <w:t>const int GREEN_FREQ = 800;</w:t>
+        <w:br/>
+        <w:t>const int SYNC_FREQ = 1000;</w:t>
+        <w:br/>
+        <w:br/>
+        <w:t>const unsigned long BEEP_ON_TIME = 150;</w:t>
+        <w:br/>
+        <w:t>const unsigned long BEEP_OFF_TIME = 350;</w:t>
+        <w:br/>
+        <w:t>const unsigned long SYNC_TIME = 600;</w:t>
+        <w:br/>
+        <w:br/>
+        <w:t>unsigned long lastMillis = 0;</w:t>
+        <w:br/>
+        <w:t>unsigned long lastSyncCycle = 0;</w:t>
+        <w:br/>
+        <w:t>unsigned long beepTimer = 0;</w:t>
+        <w:br/>
+        <w:t>unsigned long syncEndTime = 0;</w:t>
+        <w:br/>
+        <w:br/>
+        <w:t>bool beepState = false;</w:t>
+        <w:br/>
+        <w:t>bool syncActive = false;</w:t>
+        <w:br/>
+        <w:t>int currentBuzzerState = -1;</w:t>
+        <w:br/>
+        <w:br/>
+        <w:t>void setup() {</w:t>
+        <w:br/>
+        <w:t xml:space="preserve">  pinMode(RED_A, OUTPUT);</w:t>
+        <w:br/>
+        <w:t xml:space="preserve">  pinMode(YELLOW_A, OUTPUT);</w:t>
+        <w:br/>
+        <w:t xml:space="preserve">  pinMode(GREEN_A, OUTPUT);</w:t>
+        <w:br/>
+        <w:br/>
+        <w:t xml:space="preserve">  pinMode(RED_B, OUTPUT);</w:t>
+        <w:br/>
+        <w:t xml:space="preserve">  pinMode(YELLOW_B, OUTPUT);</w:t>
+        <w:br/>
+        <w:t xml:space="preserve">  pinMode(GREEN_B, OUTPUT);</w:t>
+        <w:br/>
+        <w:br/>
+        <w:t xml:space="preserve">  pinMode(RED_C, OUTPUT);</w:t>
+        <w:br/>
+        <w:t xml:space="preserve">  pinMode(YELLOW_C, OUTPUT);</w:t>
+        <w:br/>
+        <w:t xml:space="preserve">  pinMode(GREEN_C, OUTPUT);</w:t>
+        <w:br/>
+        <w:br/>
+        <w:t xml:space="preserve">  pinMode(BUZZER, OUTPUT);</w:t>
+        <w:br/>
+        <w:br/>
+        <w:t xml:space="preserve">  setAllRed();</w:t>
+        <w:br/>
+        <w:br/>
+        <w:t xml:space="preserve">  tone(BUZZER, SYNC_FREQ);</w:t>
+        <w:br/>
+        <w:t xml:space="preserve">  syncActive = true;</w:t>
+        <w:br/>
+        <w:t xml:space="preserve">  syncEndTime = millis() + SYNC_TIME;</w:t>
+        <w:br/>
+        <w:br/>
+        <w:t xml:space="preserve">  lastMillis = millis();</w:t>
+        <w:br/>
+        <w:t xml:space="preserve">  beepTimer = millis();</w:t>
         <w:br/>
         <w:t>}</w:t>
         <w:br/>
         <w:br/>
-        <w:t>function extendedGcd(a: number, b: number): [number, number, number] {</w:t>
-        <w:br/>
-        <w:t xml:space="preserve">  if (b === 0) return [a, 1, 0];</w:t>
-        <w:br/>
-        <w:t xml:space="preserve">  const [g, x1, y1] = extendedGcd(b, a % b);</w:t>
-        <w:br/>
-        <w:t xml:space="preserve">  return [g, y1, x1 - Math.floor(a / b) * y1];</w:t>
-        <w:br/>
-        <w:t>}</w:t>
-        <w:br/>
-        <w:br/>
-        <w:t>function modInverse(a: number, m: number): number {</w:t>
-        <w:br/>
-        <w:t xml:space="preserve">  const [, x] = extendedGcd(getRemainder(a, m), m);</w:t>
-        <w:br/>
-        <w:t xml:space="preserve">  return getRemainder(x, m);</w:t>
-        <w:br/>
-        <w:t>}</w:t>
-        <w:br/>
-        <w:br/>
-        <w:t>/** Solves x ≡ remainders[i] (mod moduli[i]) for pairwise-coprime moduli */</w:t>
-        <w:br/>
-        <w:t>export function solveCRT(moduli: number[], remainders: number[]): number {</w:t>
-        <w:br/>
-        <w:t xml:space="preserve">  const product = moduli.reduce((acc, m) =&gt; acc * m, 1);</w:t>
-        <w:br/>
-        <w:t xml:space="preserve">  let result = 0;</w:t>
-        <w:br/>
-        <w:t xml:space="preserve">  for (let i = 0; i &lt; moduli.length; i++) {</w:t>
-        <w:br/>
-        <w:t xml:space="preserve">    const mi = moduli[i];</w:t>
-        <w:br/>
-        <w:t xml:space="preserve">    const ri = getRemainder(remainders[i], mi);</w:t>
-        <w:br/>
-        <w:t xml:space="preserve">    const partial = product / mi;</w:t>
-        <w:br/>
-        <w:t xml:space="preserve">    const inverse = modInverse(partial, mi);</w:t>
-        <w:br/>
-        <w:t xml:space="preserve">    result += ri * partial * inverse;</w:t>
+        <w:t>void loop() {</w:t>
+        <w:br/>
+        <w:t xml:space="preserve">  unsigned long currentMillis = millis();</w:t>
+        <w:br/>
+        <w:br/>
+        <w:t xml:space="preserve">  // CRT Modulo Phase Calculation</w:t>
+        <w:br/>
+        <w:t xml:space="preserve">  unsigned long phaseA = currentMillis % PERIOD_A;</w:t>
+        <w:br/>
+        <w:t xml:space="preserve">  unsigned long phaseB = currentMillis % PERIOD_B;</w:t>
+        <w:br/>
+        <w:t xml:space="preserve">  unsigned long phaseC = currentMillis % PERIOD_C;</w:t>
+        <w:br/>
+        <w:br/>
+        <w:t xml:space="preserve">  int stateA = updateLightA(phaseA);</w:t>
+        <w:br/>
+        <w:t xml:space="preserve">  int stateB = updateLightB(phaseB);</w:t>
+        <w:br/>
+        <w:t xml:space="preserve">  int stateC = updateLightC(phaseC);</w:t>
+        <w:br/>
+        <w:br/>
+        <w:t xml:space="preserve">  // Master Cycle Recurrence Check (CRT Convergence)</w:t>
+        <w:br/>
+        <w:t xml:space="preserve">  unsigned long currentCycle = currentMillis / MASTER_CYCLE;</w:t>
+        <w:br/>
+        <w:br/>
+        <w:t xml:space="preserve">  if (currentCycle &gt; lastSyncCycle) {</w:t>
+        <w:br/>
+        <w:t xml:space="preserve">    lastSyncCycle = currentCycle;</w:t>
+        <w:br/>
+        <w:t xml:space="preserve">    tone(BUZZER, SYNC_FREQ);</w:t>
+        <w:br/>
+        <w:t xml:space="preserve">    syncActive = true;</w:t>
+        <w:br/>
+        <w:t xml:space="preserve">    syncEndTime = currentMillis + SYNC_TIME;</w:t>
+        <w:br/>
+        <w:t xml:space="preserve">    beepState = false;</w:t>
         <w:br/>
         <w:t xml:space="preserve">  }</w:t>
         <w:br/>
-        <w:t xml:space="preserve">  return getRemainder(result, product);</w:t>
-        <w:br/>
-        <w:t>}</w:t>
-        <w:br/>
-        <w:br/>
-        <w:t>export function checkRemainders(x: number, moduli: number[], remainders: number[]): boolean[] {</w:t>
-        <w:br/>
-        <w:t xml:space="preserve">  return moduli.map((m, i) =&gt; getRemainder(x, m) === getRemainder(remainders[i], m));</w:t>
+        <w:br/>
+        <w:t xml:space="preserve">  if (syncActive) {</w:t>
+        <w:br/>
+        <w:t xml:space="preserve">    if (currentMillis &gt;= syncEndTime) {</w:t>
+        <w:br/>
+        <w:t xml:space="preserve">      noTone(BUZZER);</w:t>
+        <w:br/>
+        <w:t xml:space="preserve">      syncActive = false;</w:t>
+        <w:br/>
+        <w:t xml:space="preserve">      beepTimer = currentMillis;</w:t>
+        <w:br/>
+        <w:t xml:space="preserve">      beepState = false;</w:t>
+        <w:br/>
+        <w:t xml:space="preserve">      currentBuzzerState = -1;</w:t>
+        <w:br/>
+        <w:t xml:space="preserve">    }</w:t>
+        <w:br/>
+        <w:t xml:space="preserve">    return;</w:t>
+        <w:br/>
+        <w:t xml:space="preserve">  }</w:t>
         <w:br/>
         <w:t>}</w:t>
       </w:r>
@@ -8742,7 +10032,7 @@
         <w:spacing w:after="80" w:line="276" w:lineRule="auto"/>
       </w:pPr>
       <w:r>
-        <w:t>The Traffic Signal Synchronization System provides an intuitive, practical bridge between abstract number theory and urban infrastructure engineering. By applying the Chinese Remainder Theorem to traffic signals operating on independent cycles (3 min, 5 min, 7 min), the project demonstrates how non-zero remainder offsets determine the exact minute (Minute 23) required to establish a continuous 'Green Wave' for vehicles.</w:t>
+        <w:t>The Traffic Signal Synchronization System provides an intuitive, practical bridge between abstract number theory and urban infrastructure engineering. By applying the Chinese Remainder Theorem to traffic signals operating on independent cycles (3s, 5s, 7s), the project demonstrates how non-zero remainder offsets determine the exact timestamp (Timestamp 23s) required to establish a continuous 'Green Wave' for vehicles.</w:t>
       </w:r>
     </w:p>
     <w:p>
@@ -8750,7 +10040,7 @@
         <w:spacing w:after="80" w:line="276" w:lineRule="auto"/>
       </w:pPr>
       <w:r>
-        <w:t>Both the physical working model and the interactive web application successfully visualize modular congruences, offering an accessible learning tool that highlights the real-world power of modular arithmetic in signal timing, telecommunications, and digital computing.</w:t>
+        <w:t>Both the physical Arduino Uno hardware prototype and the digital twin web application successfully visualize modular congruences, offering an accessible learning tool that highlights the real-world power of modular arithmetic in signal timing, telecommunications, and digital computing.</w:t>
       </w:r>
     </w:p>
     <w:p>

</xml_diff>

<commit_message>
Fix image scaling and preserve natural aspect ratio across PDFs and Word documents
</commit_message>
<xml_diff>
--- a/docs/Master_CRT_Assignment_Reports.docx
+++ b/docs/Master_CRT_Assignment_Reports.docx
@@ -658,7 +658,7 @@
       <w:r>
         <w:drawing>
           <wp:inline xmlns:a="http://schemas.openxmlformats.org/drawingml/2006/main" xmlns:pic="http://schemas.openxmlformats.org/drawingml/2006/picture">
-            <wp:extent cx="5303520" cy="4221063"/>
+            <wp:extent cx="5486400" cy="4366617"/>
             <wp:docPr id="1" name="Picture 1"/>
             <wp:cNvGraphicFramePr>
               <a:graphicFrameLocks noChangeAspect="1"/>
@@ -679,7 +679,7 @@
                   <pic:spPr>
                     <a:xfrm>
                       <a:off x="0" y="0"/>
-                      <a:ext cx="5303520" cy="4221063"/>
+                      <a:ext cx="5486400" cy="4366617"/>
                     </a:xfrm>
                     <a:prstGeom prst="rect"/>
                   </pic:spPr>
@@ -698,7 +698,7 @@
       <w:r>
         <w:drawing>
           <wp:inline xmlns:a="http://schemas.openxmlformats.org/drawingml/2006/main" xmlns:pic="http://schemas.openxmlformats.org/drawingml/2006/picture">
-            <wp:extent cx="5303520" cy="3677245"/>
+            <wp:extent cx="5486400" cy="3804047"/>
             <wp:docPr id="2" name="Picture 2"/>
             <wp:cNvGraphicFramePr>
               <a:graphicFrameLocks noChangeAspect="1"/>
@@ -719,7 +719,7 @@
                   <pic:spPr>
                     <a:xfrm>
                       <a:off x="0" y="0"/>
-                      <a:ext cx="5303520" cy="3677245"/>
+                      <a:ext cx="5486400" cy="3804047"/>
                     </a:xfrm>
                     <a:prstGeom prst="rect"/>
                   </pic:spPr>
@@ -1830,7 +1830,7 @@
       <w:r>
         <w:drawing>
           <wp:inline xmlns:a="http://schemas.openxmlformats.org/drawingml/2006/main" xmlns:pic="http://schemas.openxmlformats.org/drawingml/2006/picture">
-            <wp:extent cx="5303520" cy="4221063"/>
+            <wp:extent cx="5486400" cy="4366617"/>
             <wp:docPr id="3" name="Picture 3"/>
             <wp:cNvGraphicFramePr>
               <a:graphicFrameLocks noChangeAspect="1"/>
@@ -1851,7 +1851,7 @@
                   <pic:spPr>
                     <a:xfrm>
                       <a:off x="0" y="0"/>
-                      <a:ext cx="5303520" cy="4221063"/>
+                      <a:ext cx="5486400" cy="4366617"/>
                     </a:xfrm>
                     <a:prstGeom prst="rect"/>
                   </pic:spPr>
@@ -1870,7 +1870,7 @@
       <w:r>
         <w:drawing>
           <wp:inline xmlns:a="http://schemas.openxmlformats.org/drawingml/2006/main" xmlns:pic="http://schemas.openxmlformats.org/drawingml/2006/picture">
-            <wp:extent cx="5303520" cy="3677245"/>
+            <wp:extent cx="5486400" cy="3804047"/>
             <wp:docPr id="4" name="Picture 4"/>
             <wp:cNvGraphicFramePr>
               <a:graphicFrameLocks noChangeAspect="1"/>
@@ -1891,7 +1891,7 @@
                   <pic:spPr>
                     <a:xfrm>
                       <a:off x="0" y="0"/>
-                      <a:ext cx="5303520" cy="3677245"/>
+                      <a:ext cx="5486400" cy="3804047"/>
                     </a:xfrm>
                     <a:prstGeom prst="rect"/>
                   </pic:spPr>
@@ -3002,7 +3002,7 @@
       <w:r>
         <w:drawing>
           <wp:inline xmlns:a="http://schemas.openxmlformats.org/drawingml/2006/main" xmlns:pic="http://schemas.openxmlformats.org/drawingml/2006/picture">
-            <wp:extent cx="5303520" cy="4221063"/>
+            <wp:extent cx="5486400" cy="4366617"/>
             <wp:docPr id="5" name="Picture 5"/>
             <wp:cNvGraphicFramePr>
               <a:graphicFrameLocks noChangeAspect="1"/>
@@ -3023,7 +3023,7 @@
                   <pic:spPr>
                     <a:xfrm>
                       <a:off x="0" y="0"/>
-                      <a:ext cx="5303520" cy="4221063"/>
+                      <a:ext cx="5486400" cy="4366617"/>
                     </a:xfrm>
                     <a:prstGeom prst="rect"/>
                   </pic:spPr>
@@ -3042,7 +3042,7 @@
       <w:r>
         <w:drawing>
           <wp:inline xmlns:a="http://schemas.openxmlformats.org/drawingml/2006/main" xmlns:pic="http://schemas.openxmlformats.org/drawingml/2006/picture">
-            <wp:extent cx="5303520" cy="3677245"/>
+            <wp:extent cx="5486400" cy="3804047"/>
             <wp:docPr id="6" name="Picture 6"/>
             <wp:cNvGraphicFramePr>
               <a:graphicFrameLocks noChangeAspect="1"/>
@@ -3063,7 +3063,7 @@
                   <pic:spPr>
                     <a:xfrm>
                       <a:off x="0" y="0"/>
-                      <a:ext cx="5303520" cy="3677245"/>
+                      <a:ext cx="5486400" cy="3804047"/>
                     </a:xfrm>
                     <a:prstGeom prst="rect"/>
                   </pic:spPr>
@@ -4174,7 +4174,7 @@
       <w:r>
         <w:drawing>
           <wp:inline xmlns:a="http://schemas.openxmlformats.org/drawingml/2006/main" xmlns:pic="http://schemas.openxmlformats.org/drawingml/2006/picture">
-            <wp:extent cx="5303520" cy="4221063"/>
+            <wp:extent cx="5486400" cy="4366617"/>
             <wp:docPr id="7" name="Picture 7"/>
             <wp:cNvGraphicFramePr>
               <a:graphicFrameLocks noChangeAspect="1"/>
@@ -4195,7 +4195,7 @@
                   <pic:spPr>
                     <a:xfrm>
                       <a:off x="0" y="0"/>
-                      <a:ext cx="5303520" cy="4221063"/>
+                      <a:ext cx="5486400" cy="4366617"/>
                     </a:xfrm>
                     <a:prstGeom prst="rect"/>
                   </pic:spPr>
@@ -4214,7 +4214,7 @@
       <w:r>
         <w:drawing>
           <wp:inline xmlns:a="http://schemas.openxmlformats.org/drawingml/2006/main" xmlns:pic="http://schemas.openxmlformats.org/drawingml/2006/picture">
-            <wp:extent cx="5303520" cy="3677245"/>
+            <wp:extent cx="5486400" cy="3804047"/>
             <wp:docPr id="8" name="Picture 8"/>
             <wp:cNvGraphicFramePr>
               <a:graphicFrameLocks noChangeAspect="1"/>
@@ -4235,7 +4235,7 @@
                   <pic:spPr>
                     <a:xfrm>
                       <a:off x="0" y="0"/>
-                      <a:ext cx="5303520" cy="3677245"/>
+                      <a:ext cx="5486400" cy="3804047"/>
                     </a:xfrm>
                     <a:prstGeom prst="rect"/>
                   </pic:spPr>
@@ -5346,7 +5346,7 @@
       <w:r>
         <w:drawing>
           <wp:inline xmlns:a="http://schemas.openxmlformats.org/drawingml/2006/main" xmlns:pic="http://schemas.openxmlformats.org/drawingml/2006/picture">
-            <wp:extent cx="5303520" cy="4221063"/>
+            <wp:extent cx="5486400" cy="4366617"/>
             <wp:docPr id="9" name="Picture 9"/>
             <wp:cNvGraphicFramePr>
               <a:graphicFrameLocks noChangeAspect="1"/>
@@ -5367,7 +5367,7 @@
                   <pic:spPr>
                     <a:xfrm>
                       <a:off x="0" y="0"/>
-                      <a:ext cx="5303520" cy="4221063"/>
+                      <a:ext cx="5486400" cy="4366617"/>
                     </a:xfrm>
                     <a:prstGeom prst="rect"/>
                   </pic:spPr>
@@ -5386,7 +5386,7 @@
       <w:r>
         <w:drawing>
           <wp:inline xmlns:a="http://schemas.openxmlformats.org/drawingml/2006/main" xmlns:pic="http://schemas.openxmlformats.org/drawingml/2006/picture">
-            <wp:extent cx="5303520" cy="3677245"/>
+            <wp:extent cx="5486400" cy="3804047"/>
             <wp:docPr id="10" name="Picture 10"/>
             <wp:cNvGraphicFramePr>
               <a:graphicFrameLocks noChangeAspect="1"/>
@@ -5407,7 +5407,7 @@
                   <pic:spPr>
                     <a:xfrm>
                       <a:off x="0" y="0"/>
-                      <a:ext cx="5303520" cy="3677245"/>
+                      <a:ext cx="5486400" cy="3804047"/>
                     </a:xfrm>
                     <a:prstGeom prst="rect"/>
                   </pic:spPr>
@@ -6518,7 +6518,7 @@
       <w:r>
         <w:drawing>
           <wp:inline xmlns:a="http://schemas.openxmlformats.org/drawingml/2006/main" xmlns:pic="http://schemas.openxmlformats.org/drawingml/2006/picture">
-            <wp:extent cx="5303520" cy="4221063"/>
+            <wp:extent cx="5486400" cy="4366617"/>
             <wp:docPr id="11" name="Picture 11"/>
             <wp:cNvGraphicFramePr>
               <a:graphicFrameLocks noChangeAspect="1"/>
@@ -6539,7 +6539,7 @@
                   <pic:spPr>
                     <a:xfrm>
                       <a:off x="0" y="0"/>
-                      <a:ext cx="5303520" cy="4221063"/>
+                      <a:ext cx="5486400" cy="4366617"/>
                     </a:xfrm>
                     <a:prstGeom prst="rect"/>
                   </pic:spPr>
@@ -6558,7 +6558,7 @@
       <w:r>
         <w:drawing>
           <wp:inline xmlns:a="http://schemas.openxmlformats.org/drawingml/2006/main" xmlns:pic="http://schemas.openxmlformats.org/drawingml/2006/picture">
-            <wp:extent cx="5303520" cy="3677245"/>
+            <wp:extent cx="5486400" cy="3804047"/>
             <wp:docPr id="12" name="Picture 12"/>
             <wp:cNvGraphicFramePr>
               <a:graphicFrameLocks noChangeAspect="1"/>
@@ -6579,7 +6579,7 @@
                   <pic:spPr>
                     <a:xfrm>
                       <a:off x="0" y="0"/>
-                      <a:ext cx="5303520" cy="3677245"/>
+                      <a:ext cx="5486400" cy="3804047"/>
                     </a:xfrm>
                     <a:prstGeom prst="rect"/>
                   </pic:spPr>
@@ -7690,7 +7690,7 @@
       <w:r>
         <w:drawing>
           <wp:inline xmlns:a="http://schemas.openxmlformats.org/drawingml/2006/main" xmlns:pic="http://schemas.openxmlformats.org/drawingml/2006/picture">
-            <wp:extent cx="5303520" cy="4221063"/>
+            <wp:extent cx="5486400" cy="4366617"/>
             <wp:docPr id="13" name="Picture 13"/>
             <wp:cNvGraphicFramePr>
               <a:graphicFrameLocks noChangeAspect="1"/>
@@ -7711,7 +7711,7 @@
                   <pic:spPr>
                     <a:xfrm>
                       <a:off x="0" y="0"/>
-                      <a:ext cx="5303520" cy="4221063"/>
+                      <a:ext cx="5486400" cy="4366617"/>
                     </a:xfrm>
                     <a:prstGeom prst="rect"/>
                   </pic:spPr>
@@ -7730,7 +7730,7 @@
       <w:r>
         <w:drawing>
           <wp:inline xmlns:a="http://schemas.openxmlformats.org/drawingml/2006/main" xmlns:pic="http://schemas.openxmlformats.org/drawingml/2006/picture">
-            <wp:extent cx="5303520" cy="3677245"/>
+            <wp:extent cx="5486400" cy="3804047"/>
             <wp:docPr id="14" name="Picture 14"/>
             <wp:cNvGraphicFramePr>
               <a:graphicFrameLocks noChangeAspect="1"/>
@@ -7751,7 +7751,7 @@
                   <pic:spPr>
                     <a:xfrm>
                       <a:off x="0" y="0"/>
-                      <a:ext cx="5303520" cy="3677245"/>
+                      <a:ext cx="5486400" cy="3804047"/>
                     </a:xfrm>
                     <a:prstGeom prst="rect"/>
                   </pic:spPr>
@@ -8862,7 +8862,7 @@
       <w:r>
         <w:drawing>
           <wp:inline xmlns:a="http://schemas.openxmlformats.org/drawingml/2006/main" xmlns:pic="http://schemas.openxmlformats.org/drawingml/2006/picture">
-            <wp:extent cx="5303520" cy="4221063"/>
+            <wp:extent cx="5486400" cy="4366617"/>
             <wp:docPr id="15" name="Picture 15"/>
             <wp:cNvGraphicFramePr>
               <a:graphicFrameLocks noChangeAspect="1"/>
@@ -8883,7 +8883,7 @@
                   <pic:spPr>
                     <a:xfrm>
                       <a:off x="0" y="0"/>
-                      <a:ext cx="5303520" cy="4221063"/>
+                      <a:ext cx="5486400" cy="4366617"/>
                     </a:xfrm>
                     <a:prstGeom prst="rect"/>
                   </pic:spPr>
@@ -8902,7 +8902,7 @@
       <w:r>
         <w:drawing>
           <wp:inline xmlns:a="http://schemas.openxmlformats.org/drawingml/2006/main" xmlns:pic="http://schemas.openxmlformats.org/drawingml/2006/picture">
-            <wp:extent cx="5303520" cy="3677245"/>
+            <wp:extent cx="5486400" cy="3804047"/>
             <wp:docPr id="16" name="Picture 16"/>
             <wp:cNvGraphicFramePr>
               <a:graphicFrameLocks noChangeAspect="1"/>
@@ -8923,7 +8923,7 @@
                   <pic:spPr>
                     <a:xfrm>
                       <a:off x="0" y="0"/>
-                      <a:ext cx="5303520" cy="3677245"/>
+                      <a:ext cx="5486400" cy="3804047"/>
                     </a:xfrm>
                     <a:prstGeom prst="rect"/>
                   </pic:spPr>
@@ -10034,7 +10034,7 @@
       <w:r>
         <w:drawing>
           <wp:inline xmlns:a="http://schemas.openxmlformats.org/drawingml/2006/main" xmlns:pic="http://schemas.openxmlformats.org/drawingml/2006/picture">
-            <wp:extent cx="5303520" cy="4221063"/>
+            <wp:extent cx="5486400" cy="4366617"/>
             <wp:docPr id="17" name="Picture 17"/>
             <wp:cNvGraphicFramePr>
               <a:graphicFrameLocks noChangeAspect="1"/>
@@ -10055,7 +10055,7 @@
                   <pic:spPr>
                     <a:xfrm>
                       <a:off x="0" y="0"/>
-                      <a:ext cx="5303520" cy="4221063"/>
+                      <a:ext cx="5486400" cy="4366617"/>
                     </a:xfrm>
                     <a:prstGeom prst="rect"/>
                   </pic:spPr>
@@ -10074,7 +10074,7 @@
       <w:r>
         <w:drawing>
           <wp:inline xmlns:a="http://schemas.openxmlformats.org/drawingml/2006/main" xmlns:pic="http://schemas.openxmlformats.org/drawingml/2006/picture">
-            <wp:extent cx="5303520" cy="3677245"/>
+            <wp:extent cx="5486400" cy="3804047"/>
             <wp:docPr id="18" name="Picture 18"/>
             <wp:cNvGraphicFramePr>
               <a:graphicFrameLocks noChangeAspect="1"/>
@@ -10095,7 +10095,7 @@
                   <pic:spPr>
                     <a:xfrm>
                       <a:off x="0" y="0"/>
-                      <a:ext cx="5303520" cy="3677245"/>
+                      <a:ext cx="5486400" cy="3804047"/>
                     </a:xfrm>
                     <a:prstGeom prst="rect"/>
                   </pic:spPr>
@@ -11206,7 +11206,7 @@
       <w:r>
         <w:drawing>
           <wp:inline xmlns:a="http://schemas.openxmlformats.org/drawingml/2006/main" xmlns:pic="http://schemas.openxmlformats.org/drawingml/2006/picture">
-            <wp:extent cx="5303520" cy="4221063"/>
+            <wp:extent cx="5486400" cy="4366617"/>
             <wp:docPr id="19" name="Picture 19"/>
             <wp:cNvGraphicFramePr>
               <a:graphicFrameLocks noChangeAspect="1"/>
@@ -11227,7 +11227,7 @@
                   <pic:spPr>
                     <a:xfrm>
                       <a:off x="0" y="0"/>
-                      <a:ext cx="5303520" cy="4221063"/>
+                      <a:ext cx="5486400" cy="4366617"/>
                     </a:xfrm>
                     <a:prstGeom prst="rect"/>
                   </pic:spPr>
@@ -11246,7 +11246,7 @@
       <w:r>
         <w:drawing>
           <wp:inline xmlns:a="http://schemas.openxmlformats.org/drawingml/2006/main" xmlns:pic="http://schemas.openxmlformats.org/drawingml/2006/picture">
-            <wp:extent cx="5303520" cy="3677245"/>
+            <wp:extent cx="5486400" cy="3804047"/>
             <wp:docPr id="20" name="Picture 20"/>
             <wp:cNvGraphicFramePr>
               <a:graphicFrameLocks noChangeAspect="1"/>
@@ -11267,7 +11267,7 @@
                   <pic:spPr>
                     <a:xfrm>
                       <a:off x="0" y="0"/>
-                      <a:ext cx="5303520" cy="3677245"/>
+                      <a:ext cx="5486400" cy="3804047"/>
                     </a:xfrm>
                     <a:prstGeom prst="rect"/>
                   </pic:spPr>

</xml_diff>

<commit_message>
Fix page breaks and orphan headings with keepWithNext rules in PDFs and Word docs
</commit_message>
<xml_diff>
--- a/docs/Master_CRT_Assignment_Reports.docx
+++ b/docs/Master_CRT_Assignment_Reports.docx
@@ -5,14 +5,15 @@
     <w:p>
       <w:pPr>
         <w:pStyle w:val="Heading1"/>
-        <w:spacing w:before="280" w:after="120"/>
+        <w:keepNext/>
+        <w:spacing w:before="240" w:after="120"/>
       </w:pPr>
       <w:r>
         <w:rPr>
           <w:rFonts w:ascii="Times New Roman" w:hAnsi="Times New Roman"/>
           <w:b/>
           <w:color w:val="0F172A"/>
-          <w:sz w:val="40"/>
+          <w:sz w:val="38"/>
         </w:rPr>
         <w:t>MASTER ASSIGNMENT REPORTS COLLECTION — TRAFFIC SIGNAL SYNCHRONIZATION</w:t>
       </w:r>
@@ -39,14 +40,15 @@
     <w:p>
       <w:pPr>
         <w:pStyle w:val="Heading1"/>
-        <w:spacing w:before="280" w:after="120"/>
+        <w:keepNext/>
+        <w:spacing w:before="240" w:after="120"/>
       </w:pPr>
       <w:r>
         <w:rPr>
           <w:rFonts w:ascii="Times New Roman" w:hAnsi="Times New Roman"/>
           <w:b/>
           <w:color w:val="0F172A"/>
-          <w:sz w:val="40"/>
+          <w:sz w:val="38"/>
         </w:rPr>
         <w:t>MATHEMATICS PROJECT ASSIGNMENT REPORT</w:t>
       </w:r>
@@ -170,14 +172,15 @@
     <w:p>
       <w:pPr>
         <w:pStyle w:val="Heading2"/>
-        <w:spacing w:before="240" w:after="80"/>
+        <w:keepNext/>
+        <w:spacing w:before="200" w:after="80"/>
       </w:pPr>
       <w:r>
         <w:rPr>
           <w:rFonts w:ascii="Times New Roman" w:hAnsi="Times New Roman"/>
           <w:b/>
           <w:color w:val="1E3A8A"/>
-          <w:sz w:val="28"/>
+          <w:sz w:val="27"/>
         </w:rPr>
         <w:t>1. ABSTRACT</w:t>
       </w:r>
@@ -215,14 +218,15 @@
     <w:p>
       <w:pPr>
         <w:pStyle w:val="Heading2"/>
-        <w:spacing w:before="240" w:after="80"/>
+        <w:keepNext/>
+        <w:spacing w:before="200" w:after="80"/>
       </w:pPr>
       <w:r>
         <w:rPr>
           <w:rFonts w:ascii="Times New Roman" w:hAnsi="Times New Roman"/>
           <w:b/>
           <w:color w:val="1E3A8A"/>
-          <w:sz w:val="28"/>
+          <w:sz w:val="27"/>
         </w:rPr>
         <w:t>2. INTRODUCTION &amp; OBJECTIVES</w:t>
       </w:r>
@@ -241,14 +245,15 @@
     <w:p>
       <w:pPr>
         <w:pStyle w:val="Heading3"/>
-        <w:spacing w:before="200" w:after="60"/>
+        <w:keepNext/>
+        <w:spacing w:before="160" w:after="60"/>
       </w:pPr>
       <w:r>
         <w:rPr>
           <w:rFonts w:ascii="Times New Roman" w:hAnsi="Times New Roman"/>
           <w:b/>
           <w:color w:val="334155"/>
-          <w:sz w:val="24"/>
+          <w:sz w:val="23"/>
         </w:rPr>
         <w:t>Project Objectives:</w:t>
       </w:r>
@@ -324,14 +329,15 @@
     <w:p>
       <w:pPr>
         <w:pStyle w:val="Heading2"/>
-        <w:spacing w:before="240" w:after="80"/>
+        <w:keepNext/>
+        <w:spacing w:before="200" w:after="80"/>
       </w:pPr>
       <w:r>
         <w:rPr>
           <w:rFonts w:ascii="Times New Roman" w:hAnsi="Times New Roman"/>
           <w:b/>
           <w:color w:val="1E3A8A"/>
-          <w:sz w:val="28"/>
+          <w:sz w:val="27"/>
         </w:rPr>
         <w:t>3. MATHEMATICAL FORMULATION (CRT vs. LCM)</w:t>
       </w:r>
@@ -339,14 +345,15 @@
     <w:p>
       <w:pPr>
         <w:pStyle w:val="Heading3"/>
-        <w:spacing w:before="200" w:after="60"/>
+        <w:keepNext/>
+        <w:spacing w:before="160" w:after="60"/>
       </w:pPr>
       <w:r>
         <w:rPr>
           <w:rFonts w:ascii="Times New Roman" w:hAnsi="Times New Roman"/>
           <w:b/>
           <w:color w:val="334155"/>
-          <w:sz w:val="24"/>
+          <w:sz w:val="23"/>
         </w:rPr>
         <w:t>3.1 The Traffic Signal Equations</w:t>
       </w:r>
@@ -401,14 +408,15 @@
     <w:p>
       <w:pPr>
         <w:pStyle w:val="Heading3"/>
-        <w:spacing w:before="200" w:after="60"/>
+        <w:keepNext/>
+        <w:spacing w:before="160" w:after="60"/>
       </w:pPr>
       <w:r>
         <w:rPr>
           <w:rFonts w:ascii="Times New Roman" w:hAnsi="Times New Roman"/>
           <w:b/>
           <w:color w:val="334155"/>
-          <w:sz w:val="24"/>
+          <w:sz w:val="23"/>
         </w:rPr>
         <w:t>3.2 Why Simple LCM Cannot Solve This Problem</w:t>
       </w:r>
@@ -440,14 +448,15 @@
     <w:p>
       <w:pPr>
         <w:pStyle w:val="Heading3"/>
-        <w:spacing w:before="200" w:after="60"/>
+        <w:keepNext/>
+        <w:spacing w:before="160" w:after="60"/>
       </w:pPr>
       <w:r>
         <w:rPr>
           <w:rFonts w:ascii="Times New Roman" w:hAnsi="Times New Roman"/>
           <w:b/>
           <w:color w:val="334155"/>
-          <w:sz w:val="24"/>
+          <w:sz w:val="23"/>
         </w:rPr>
         <w:t>3.3 CRT Solution Procedure</w:t>
       </w:r>
@@ -627,14 +636,15 @@
     <w:p>
       <w:pPr>
         <w:pStyle w:val="Heading2"/>
-        <w:spacing w:before="240" w:after="80"/>
+        <w:keepNext/>
+        <w:spacing w:before="200" w:after="80"/>
       </w:pPr>
       <w:r>
         <w:rPr>
           <w:rFonts w:ascii="Times New Roman" w:hAnsi="Times New Roman"/>
           <w:b/>
           <w:color w:val="1E3A8A"/>
-          <w:sz w:val="28"/>
+          <w:sz w:val="27"/>
         </w:rPr>
         <w:t>4. PHYSICAL HARDWARE &amp; DIGITAL TWIN IMPLEMENTATION</w:t>
       </w:r>
@@ -652,13 +662,14 @@
     </w:p>
     <w:p>
       <w:pPr>
-        <w:spacing w:before="120" w:after="120"/>
+        <w:keepNext/>
+        <w:spacing w:before="80" w:after="80"/>
         <w:jc w:val="center"/>
       </w:pPr>
       <w:r>
         <w:drawing>
           <wp:inline xmlns:a="http://schemas.openxmlformats.org/drawingml/2006/main" xmlns:pic="http://schemas.openxmlformats.org/drawingml/2006/picture">
-            <wp:extent cx="5486400" cy="4366617"/>
+            <wp:extent cx="5029200" cy="4002732"/>
             <wp:docPr id="1" name="Picture 1"/>
             <wp:cNvGraphicFramePr>
               <a:graphicFrameLocks noChangeAspect="1"/>
@@ -679,7 +690,7 @@
                   <pic:spPr>
                     <a:xfrm>
                       <a:off x="0" y="0"/>
-                      <a:ext cx="5486400" cy="4366617"/>
+                      <a:ext cx="5029200" cy="4002732"/>
                     </a:xfrm>
                     <a:prstGeom prst="rect"/>
                   </pic:spPr>
@@ -692,13 +703,14 @@
     </w:p>
     <w:p>
       <w:pPr>
-        <w:spacing w:before="120" w:after="120"/>
+        <w:keepNext/>
+        <w:spacing w:before="80" w:after="80"/>
         <w:jc w:val="center"/>
       </w:pPr>
       <w:r>
         <w:drawing>
           <wp:inline xmlns:a="http://schemas.openxmlformats.org/drawingml/2006/main" xmlns:pic="http://schemas.openxmlformats.org/drawingml/2006/picture">
-            <wp:extent cx="5486400" cy="3804047"/>
+            <wp:extent cx="5029200" cy="3487043"/>
             <wp:docPr id="2" name="Picture 2"/>
             <wp:cNvGraphicFramePr>
               <a:graphicFrameLocks noChangeAspect="1"/>
@@ -719,7 +731,7 @@
                   <pic:spPr>
                     <a:xfrm>
                       <a:off x="0" y="0"/>
-                      <a:ext cx="5486400" cy="3804047"/>
+                      <a:ext cx="5029200" cy="3487043"/>
                     </a:xfrm>
                     <a:prstGeom prst="rect"/>
                   </pic:spPr>
@@ -733,14 +745,15 @@
     <w:p>
       <w:pPr>
         <w:pStyle w:val="Heading3"/>
-        <w:spacing w:before="200" w:after="60"/>
+        <w:keepNext/>
+        <w:spacing w:before="160" w:after="60"/>
       </w:pPr>
       <w:r>
         <w:rPr>
           <w:rFonts w:ascii="Times New Roman" w:hAnsi="Times New Roman"/>
           <w:b/>
           <w:color w:val="334155"/>
-          <w:sz w:val="24"/>
+          <w:sz w:val="23"/>
         </w:rPr>
         <w:t>Interactive Hardware &amp; Digital Twin Controls:</w:t>
       </w:r>
@@ -804,14 +817,15 @@
     <w:p>
       <w:pPr>
         <w:pStyle w:val="Heading2"/>
-        <w:spacing w:before="240" w:after="80"/>
+        <w:keepNext/>
+        <w:spacing w:before="200" w:after="80"/>
       </w:pPr>
       <w:r>
         <w:rPr>
           <w:rFonts w:ascii="Times New Roman" w:hAnsi="Times New Roman"/>
           <w:b/>
           <w:color w:val="1E3A8A"/>
-          <w:sz w:val="28"/>
+          <w:sz w:val="27"/>
         </w:rPr>
         <w:t>5. HARDWARE SOURCE CODE (ARDUINO UNO FIRMWARE - C++)</w:t>
       </w:r>
@@ -830,7 +844,7 @@
         <w:rPr>
           <w:rFonts w:ascii="Consolas" w:hAnsi="Consolas"/>
           <w:color w:val="B91C1C"/>
-          <w:sz w:val="19"/>
+          <w:sz w:val="18"/>
         </w:rPr>
         <w:t>arduino/traffic_light_controller.ino</w:t>
       </w:r>
@@ -843,6 +857,7 @@
     </w:p>
     <w:p>
       <w:pPr>
+        <w:keepNext/>
         <w:spacing w:before="80" w:after="120"/>
         <w:ind w:left="288"/>
       </w:pPr>
@@ -850,7 +865,7 @@
         <w:rPr>
           <w:rFonts w:ascii="Consolas" w:hAnsi="Consolas"/>
           <w:color w:val="1E293B"/>
-          <w:sz w:val="19"/>
+          <w:sz w:val="18"/>
         </w:rPr>
         <w:t>// Arduino Uno / ATmega328P Physical Traffic Light Controller</w:t>
         <w:br/>
@@ -1042,14 +1057,15 @@
     <w:p>
       <w:pPr>
         <w:pStyle w:val="Heading2"/>
-        <w:spacing w:before="240" w:after="80"/>
+        <w:keepNext/>
+        <w:spacing w:before="200" w:after="80"/>
       </w:pPr>
       <w:r>
         <w:rPr>
           <w:rFonts w:ascii="Times New Roman" w:hAnsi="Times New Roman"/>
           <w:b/>
           <w:color w:val="1E3A8A"/>
-          <w:sz w:val="28"/>
+          <w:sz w:val="27"/>
         </w:rPr>
         <w:t>6. CONCLUSION</w:t>
       </w:r>
@@ -1087,14 +1103,15 @@
     <w:p>
       <w:pPr>
         <w:pStyle w:val="Heading2"/>
-        <w:spacing w:before="240" w:after="80"/>
+        <w:keepNext/>
+        <w:spacing w:before="200" w:after="80"/>
       </w:pPr>
       <w:r>
         <w:rPr>
           <w:rFonts w:ascii="Times New Roman" w:hAnsi="Times New Roman"/>
           <w:b/>
           <w:color w:val="1E3A8A"/>
-          <w:sz w:val="28"/>
+          <w:sz w:val="27"/>
         </w:rPr>
         <w:t>7. INDIVIDUAL CONTRIBUTION</w:t>
       </w:r>
@@ -1174,14 +1191,15 @@
     <w:p>
       <w:pPr>
         <w:pStyle w:val="Heading3"/>
-        <w:spacing w:before="200" w:after="60"/>
+        <w:keepNext/>
+        <w:spacing w:before="160" w:after="60"/>
       </w:pPr>
       <w:r>
         <w:rPr>
           <w:rFonts w:ascii="Times New Roman" w:hAnsi="Times New Roman"/>
           <w:b/>
           <w:color w:val="334155"/>
-          <w:sz w:val="24"/>
+          <w:sz w:val="23"/>
         </w:rPr>
         <w:t>Contribution Summary:</w:t>
       </w:r>
@@ -1198,27 +1216,22 @@
       </w:r>
     </w:p>
     <w:p>
-      <w:pPr>
-        <w:spacing w:after="80" w:line="276" w:lineRule="auto"/>
-      </w:pPr>
-      <w:r>
-        <w:rPr>
-          <w:rFonts w:ascii="Times New Roman" w:hAnsi="Times New Roman"/>
-        </w:rPr>
-        <w:t>=========================================================================</w:t>
+      <w:r>
+        <w:br w:type="page"/>
       </w:r>
     </w:p>
     <w:p>
       <w:pPr>
         <w:pStyle w:val="Heading1"/>
-        <w:spacing w:before="280" w:after="120"/>
+        <w:keepNext/>
+        <w:spacing w:before="240" w:after="120"/>
       </w:pPr>
       <w:r>
         <w:rPr>
           <w:rFonts w:ascii="Times New Roman" w:hAnsi="Times New Roman"/>
           <w:b/>
           <w:color w:val="0F172A"/>
-          <w:sz w:val="40"/>
+          <w:sz w:val="38"/>
         </w:rPr>
         <w:t>MATHEMATICS PROJECT ASSIGNMENT REPORT</w:t>
       </w:r>
@@ -1342,14 +1355,15 @@
     <w:p>
       <w:pPr>
         <w:pStyle w:val="Heading2"/>
-        <w:spacing w:before="240" w:after="80"/>
+        <w:keepNext/>
+        <w:spacing w:before="200" w:after="80"/>
       </w:pPr>
       <w:r>
         <w:rPr>
           <w:rFonts w:ascii="Times New Roman" w:hAnsi="Times New Roman"/>
           <w:b/>
           <w:color w:val="1E3A8A"/>
-          <w:sz w:val="28"/>
+          <w:sz w:val="27"/>
         </w:rPr>
         <w:t>1. ABSTRACT</w:t>
       </w:r>
@@ -1387,14 +1401,15 @@
     <w:p>
       <w:pPr>
         <w:pStyle w:val="Heading2"/>
-        <w:spacing w:before="240" w:after="80"/>
+        <w:keepNext/>
+        <w:spacing w:before="200" w:after="80"/>
       </w:pPr>
       <w:r>
         <w:rPr>
           <w:rFonts w:ascii="Times New Roman" w:hAnsi="Times New Roman"/>
           <w:b/>
           <w:color w:val="1E3A8A"/>
-          <w:sz w:val="28"/>
+          <w:sz w:val="27"/>
         </w:rPr>
         <w:t>2. INTRODUCTION &amp; OBJECTIVES</w:t>
       </w:r>
@@ -1413,14 +1428,15 @@
     <w:p>
       <w:pPr>
         <w:pStyle w:val="Heading3"/>
-        <w:spacing w:before="200" w:after="60"/>
+        <w:keepNext/>
+        <w:spacing w:before="160" w:after="60"/>
       </w:pPr>
       <w:r>
         <w:rPr>
           <w:rFonts w:ascii="Times New Roman" w:hAnsi="Times New Roman"/>
           <w:b/>
           <w:color w:val="334155"/>
-          <w:sz w:val="24"/>
+          <w:sz w:val="23"/>
         </w:rPr>
         <w:t>Project Objectives:</w:t>
       </w:r>
@@ -1496,14 +1512,15 @@
     <w:p>
       <w:pPr>
         <w:pStyle w:val="Heading2"/>
-        <w:spacing w:before="240" w:after="80"/>
+        <w:keepNext/>
+        <w:spacing w:before="200" w:after="80"/>
       </w:pPr>
       <w:r>
         <w:rPr>
           <w:rFonts w:ascii="Times New Roman" w:hAnsi="Times New Roman"/>
           <w:b/>
           <w:color w:val="1E3A8A"/>
-          <w:sz w:val="28"/>
+          <w:sz w:val="27"/>
         </w:rPr>
         <w:t>3. MATHEMATICAL FORMULATION (CRT vs. LCM)</w:t>
       </w:r>
@@ -1511,14 +1528,15 @@
     <w:p>
       <w:pPr>
         <w:pStyle w:val="Heading3"/>
-        <w:spacing w:before="200" w:after="60"/>
+        <w:keepNext/>
+        <w:spacing w:before="160" w:after="60"/>
       </w:pPr>
       <w:r>
         <w:rPr>
           <w:rFonts w:ascii="Times New Roman" w:hAnsi="Times New Roman"/>
           <w:b/>
           <w:color w:val="334155"/>
-          <w:sz w:val="24"/>
+          <w:sz w:val="23"/>
         </w:rPr>
         <w:t>3.1 The Traffic Signal Equations</w:t>
       </w:r>
@@ -1573,14 +1591,15 @@
     <w:p>
       <w:pPr>
         <w:pStyle w:val="Heading3"/>
-        <w:spacing w:before="200" w:after="60"/>
+        <w:keepNext/>
+        <w:spacing w:before="160" w:after="60"/>
       </w:pPr>
       <w:r>
         <w:rPr>
           <w:rFonts w:ascii="Times New Roman" w:hAnsi="Times New Roman"/>
           <w:b/>
           <w:color w:val="334155"/>
-          <w:sz w:val="24"/>
+          <w:sz w:val="23"/>
         </w:rPr>
         <w:t>3.2 Why Simple LCM Cannot Solve This Problem</w:t>
       </w:r>
@@ -1612,14 +1631,15 @@
     <w:p>
       <w:pPr>
         <w:pStyle w:val="Heading3"/>
-        <w:spacing w:before="200" w:after="60"/>
+        <w:keepNext/>
+        <w:spacing w:before="160" w:after="60"/>
       </w:pPr>
       <w:r>
         <w:rPr>
           <w:rFonts w:ascii="Times New Roman" w:hAnsi="Times New Roman"/>
           <w:b/>
           <w:color w:val="334155"/>
-          <w:sz w:val="24"/>
+          <w:sz w:val="23"/>
         </w:rPr>
         <w:t>3.3 CRT Solution Procedure</w:t>
       </w:r>
@@ -1799,14 +1819,15 @@
     <w:p>
       <w:pPr>
         <w:pStyle w:val="Heading2"/>
-        <w:spacing w:before="240" w:after="80"/>
+        <w:keepNext/>
+        <w:spacing w:before="200" w:after="80"/>
       </w:pPr>
       <w:r>
         <w:rPr>
           <w:rFonts w:ascii="Times New Roman" w:hAnsi="Times New Roman"/>
           <w:b/>
           <w:color w:val="1E3A8A"/>
-          <w:sz w:val="28"/>
+          <w:sz w:val="27"/>
         </w:rPr>
         <w:t>4. PHYSICAL HARDWARE &amp; DIGITAL TWIN IMPLEMENTATION</w:t>
       </w:r>
@@ -1824,13 +1845,14 @@
     </w:p>
     <w:p>
       <w:pPr>
-        <w:spacing w:before="120" w:after="120"/>
+        <w:keepNext/>
+        <w:spacing w:before="80" w:after="80"/>
         <w:jc w:val="center"/>
       </w:pPr>
       <w:r>
         <w:drawing>
           <wp:inline xmlns:a="http://schemas.openxmlformats.org/drawingml/2006/main" xmlns:pic="http://schemas.openxmlformats.org/drawingml/2006/picture">
-            <wp:extent cx="5486400" cy="4366617"/>
+            <wp:extent cx="5029200" cy="4002732"/>
             <wp:docPr id="3" name="Picture 3"/>
             <wp:cNvGraphicFramePr>
               <a:graphicFrameLocks noChangeAspect="1"/>
@@ -1851,7 +1873,7 @@
                   <pic:spPr>
                     <a:xfrm>
                       <a:off x="0" y="0"/>
-                      <a:ext cx="5486400" cy="4366617"/>
+                      <a:ext cx="5029200" cy="4002732"/>
                     </a:xfrm>
                     <a:prstGeom prst="rect"/>
                   </pic:spPr>
@@ -1864,13 +1886,14 @@
     </w:p>
     <w:p>
       <w:pPr>
-        <w:spacing w:before="120" w:after="120"/>
+        <w:keepNext/>
+        <w:spacing w:before="80" w:after="80"/>
         <w:jc w:val="center"/>
       </w:pPr>
       <w:r>
         <w:drawing>
           <wp:inline xmlns:a="http://schemas.openxmlformats.org/drawingml/2006/main" xmlns:pic="http://schemas.openxmlformats.org/drawingml/2006/picture">
-            <wp:extent cx="5486400" cy="3804047"/>
+            <wp:extent cx="5029200" cy="3487043"/>
             <wp:docPr id="4" name="Picture 4"/>
             <wp:cNvGraphicFramePr>
               <a:graphicFrameLocks noChangeAspect="1"/>
@@ -1891,7 +1914,7 @@
                   <pic:spPr>
                     <a:xfrm>
                       <a:off x="0" y="0"/>
-                      <a:ext cx="5486400" cy="3804047"/>
+                      <a:ext cx="5029200" cy="3487043"/>
                     </a:xfrm>
                     <a:prstGeom prst="rect"/>
                   </pic:spPr>
@@ -1905,14 +1928,15 @@
     <w:p>
       <w:pPr>
         <w:pStyle w:val="Heading3"/>
-        <w:spacing w:before="200" w:after="60"/>
+        <w:keepNext/>
+        <w:spacing w:before="160" w:after="60"/>
       </w:pPr>
       <w:r>
         <w:rPr>
           <w:rFonts w:ascii="Times New Roman" w:hAnsi="Times New Roman"/>
           <w:b/>
           <w:color w:val="334155"/>
-          <w:sz w:val="24"/>
+          <w:sz w:val="23"/>
         </w:rPr>
         <w:t>Interactive Hardware &amp; Digital Twin Controls:</w:t>
       </w:r>
@@ -1976,14 +2000,15 @@
     <w:p>
       <w:pPr>
         <w:pStyle w:val="Heading2"/>
-        <w:spacing w:before="240" w:after="80"/>
+        <w:keepNext/>
+        <w:spacing w:before="200" w:after="80"/>
       </w:pPr>
       <w:r>
         <w:rPr>
           <w:rFonts w:ascii="Times New Roman" w:hAnsi="Times New Roman"/>
           <w:b/>
           <w:color w:val="1E3A8A"/>
-          <w:sz w:val="28"/>
+          <w:sz w:val="27"/>
         </w:rPr>
         <w:t>5. HARDWARE SOURCE CODE (ARDUINO UNO FIRMWARE - C++)</w:t>
       </w:r>
@@ -2002,7 +2027,7 @@
         <w:rPr>
           <w:rFonts w:ascii="Consolas" w:hAnsi="Consolas"/>
           <w:color w:val="B91C1C"/>
-          <w:sz w:val="19"/>
+          <w:sz w:val="18"/>
         </w:rPr>
         <w:t>arduino/traffic_light_controller.ino</w:t>
       </w:r>
@@ -2015,6 +2040,7 @@
     </w:p>
     <w:p>
       <w:pPr>
+        <w:keepNext/>
         <w:spacing w:before="80" w:after="120"/>
         <w:ind w:left="288"/>
       </w:pPr>
@@ -2022,7 +2048,7 @@
         <w:rPr>
           <w:rFonts w:ascii="Consolas" w:hAnsi="Consolas"/>
           <w:color w:val="1E293B"/>
-          <w:sz w:val="19"/>
+          <w:sz w:val="18"/>
         </w:rPr>
         <w:t>// Arduino Uno / ATmega328P Physical Traffic Light Controller</w:t>
         <w:br/>
@@ -2214,14 +2240,15 @@
     <w:p>
       <w:pPr>
         <w:pStyle w:val="Heading2"/>
-        <w:spacing w:before="240" w:after="80"/>
+        <w:keepNext/>
+        <w:spacing w:before="200" w:after="80"/>
       </w:pPr>
       <w:r>
         <w:rPr>
           <w:rFonts w:ascii="Times New Roman" w:hAnsi="Times New Roman"/>
           <w:b/>
           <w:color w:val="1E3A8A"/>
-          <w:sz w:val="28"/>
+          <w:sz w:val="27"/>
         </w:rPr>
         <w:t>6. CONCLUSION</w:t>
       </w:r>
@@ -2259,14 +2286,15 @@
     <w:p>
       <w:pPr>
         <w:pStyle w:val="Heading2"/>
-        <w:spacing w:before="240" w:after="80"/>
+        <w:keepNext/>
+        <w:spacing w:before="200" w:after="80"/>
       </w:pPr>
       <w:r>
         <w:rPr>
           <w:rFonts w:ascii="Times New Roman" w:hAnsi="Times New Roman"/>
           <w:b/>
           <w:color w:val="1E3A8A"/>
-          <w:sz w:val="28"/>
+          <w:sz w:val="27"/>
         </w:rPr>
         <w:t>7. INDIVIDUAL CONTRIBUTION</w:t>
       </w:r>
@@ -2346,14 +2374,15 @@
     <w:p>
       <w:pPr>
         <w:pStyle w:val="Heading3"/>
-        <w:spacing w:before="200" w:after="60"/>
+        <w:keepNext/>
+        <w:spacing w:before="160" w:after="60"/>
       </w:pPr>
       <w:r>
         <w:rPr>
           <w:rFonts w:ascii="Times New Roman" w:hAnsi="Times New Roman"/>
           <w:b/>
           <w:color w:val="334155"/>
-          <w:sz w:val="24"/>
+          <w:sz w:val="23"/>
         </w:rPr>
         <w:t>Contribution Summary:</w:t>
       </w:r>
@@ -2370,27 +2399,22 @@
       </w:r>
     </w:p>
     <w:p>
-      <w:pPr>
-        <w:spacing w:after="80" w:line="276" w:lineRule="auto"/>
-      </w:pPr>
-      <w:r>
-        <w:rPr>
-          <w:rFonts w:ascii="Times New Roman" w:hAnsi="Times New Roman"/>
-        </w:rPr>
-        <w:t>=========================================================================</w:t>
+      <w:r>
+        <w:br w:type="page"/>
       </w:r>
     </w:p>
     <w:p>
       <w:pPr>
         <w:pStyle w:val="Heading1"/>
-        <w:spacing w:before="280" w:after="120"/>
+        <w:keepNext/>
+        <w:spacing w:before="240" w:after="120"/>
       </w:pPr>
       <w:r>
         <w:rPr>
           <w:rFonts w:ascii="Times New Roman" w:hAnsi="Times New Roman"/>
           <w:b/>
           <w:color w:val="0F172A"/>
-          <w:sz w:val="40"/>
+          <w:sz w:val="38"/>
         </w:rPr>
         <w:t>MATHEMATICS PROJECT ASSIGNMENT REPORT</w:t>
       </w:r>
@@ -2514,14 +2538,15 @@
     <w:p>
       <w:pPr>
         <w:pStyle w:val="Heading2"/>
-        <w:spacing w:before="240" w:after="80"/>
+        <w:keepNext/>
+        <w:spacing w:before="200" w:after="80"/>
       </w:pPr>
       <w:r>
         <w:rPr>
           <w:rFonts w:ascii="Times New Roman" w:hAnsi="Times New Roman"/>
           <w:b/>
           <w:color w:val="1E3A8A"/>
-          <w:sz w:val="28"/>
+          <w:sz w:val="27"/>
         </w:rPr>
         <w:t>1. ABSTRACT</w:t>
       </w:r>
@@ -2559,14 +2584,15 @@
     <w:p>
       <w:pPr>
         <w:pStyle w:val="Heading2"/>
-        <w:spacing w:before="240" w:after="80"/>
+        <w:keepNext/>
+        <w:spacing w:before="200" w:after="80"/>
       </w:pPr>
       <w:r>
         <w:rPr>
           <w:rFonts w:ascii="Times New Roman" w:hAnsi="Times New Roman"/>
           <w:b/>
           <w:color w:val="1E3A8A"/>
-          <w:sz w:val="28"/>
+          <w:sz w:val="27"/>
         </w:rPr>
         <w:t>2. INTRODUCTION &amp; OBJECTIVES</w:t>
       </w:r>
@@ -2585,14 +2611,15 @@
     <w:p>
       <w:pPr>
         <w:pStyle w:val="Heading3"/>
-        <w:spacing w:before="200" w:after="60"/>
+        <w:keepNext/>
+        <w:spacing w:before="160" w:after="60"/>
       </w:pPr>
       <w:r>
         <w:rPr>
           <w:rFonts w:ascii="Times New Roman" w:hAnsi="Times New Roman"/>
           <w:b/>
           <w:color w:val="334155"/>
-          <w:sz w:val="24"/>
+          <w:sz w:val="23"/>
         </w:rPr>
         <w:t>Project Objectives:</w:t>
       </w:r>
@@ -2668,14 +2695,15 @@
     <w:p>
       <w:pPr>
         <w:pStyle w:val="Heading2"/>
-        <w:spacing w:before="240" w:after="80"/>
+        <w:keepNext/>
+        <w:spacing w:before="200" w:after="80"/>
       </w:pPr>
       <w:r>
         <w:rPr>
           <w:rFonts w:ascii="Times New Roman" w:hAnsi="Times New Roman"/>
           <w:b/>
           <w:color w:val="1E3A8A"/>
-          <w:sz w:val="28"/>
+          <w:sz w:val="27"/>
         </w:rPr>
         <w:t>3. MATHEMATICAL FORMULATION (CRT vs. LCM)</w:t>
       </w:r>
@@ -2683,14 +2711,15 @@
     <w:p>
       <w:pPr>
         <w:pStyle w:val="Heading3"/>
-        <w:spacing w:before="200" w:after="60"/>
+        <w:keepNext/>
+        <w:spacing w:before="160" w:after="60"/>
       </w:pPr>
       <w:r>
         <w:rPr>
           <w:rFonts w:ascii="Times New Roman" w:hAnsi="Times New Roman"/>
           <w:b/>
           <w:color w:val="334155"/>
-          <w:sz w:val="24"/>
+          <w:sz w:val="23"/>
         </w:rPr>
         <w:t>3.1 The Traffic Signal Equations</w:t>
       </w:r>
@@ -2745,14 +2774,15 @@
     <w:p>
       <w:pPr>
         <w:pStyle w:val="Heading3"/>
-        <w:spacing w:before="200" w:after="60"/>
+        <w:keepNext/>
+        <w:spacing w:before="160" w:after="60"/>
       </w:pPr>
       <w:r>
         <w:rPr>
           <w:rFonts w:ascii="Times New Roman" w:hAnsi="Times New Roman"/>
           <w:b/>
           <w:color w:val="334155"/>
-          <w:sz w:val="24"/>
+          <w:sz w:val="23"/>
         </w:rPr>
         <w:t>3.2 Why Simple LCM Cannot Solve This Problem</w:t>
       </w:r>
@@ -2784,14 +2814,15 @@
     <w:p>
       <w:pPr>
         <w:pStyle w:val="Heading3"/>
-        <w:spacing w:before="200" w:after="60"/>
+        <w:keepNext/>
+        <w:spacing w:before="160" w:after="60"/>
       </w:pPr>
       <w:r>
         <w:rPr>
           <w:rFonts w:ascii="Times New Roman" w:hAnsi="Times New Roman"/>
           <w:b/>
           <w:color w:val="334155"/>
-          <w:sz w:val="24"/>
+          <w:sz w:val="23"/>
         </w:rPr>
         <w:t>3.3 CRT Solution Procedure</w:t>
       </w:r>
@@ -2971,14 +3002,15 @@
     <w:p>
       <w:pPr>
         <w:pStyle w:val="Heading2"/>
-        <w:spacing w:before="240" w:after="80"/>
+        <w:keepNext/>
+        <w:spacing w:before="200" w:after="80"/>
       </w:pPr>
       <w:r>
         <w:rPr>
           <w:rFonts w:ascii="Times New Roman" w:hAnsi="Times New Roman"/>
           <w:b/>
           <w:color w:val="1E3A8A"/>
-          <w:sz w:val="28"/>
+          <w:sz w:val="27"/>
         </w:rPr>
         <w:t>4. PHYSICAL HARDWARE &amp; DIGITAL TWIN IMPLEMENTATION</w:t>
       </w:r>
@@ -2996,13 +3028,14 @@
     </w:p>
     <w:p>
       <w:pPr>
-        <w:spacing w:before="120" w:after="120"/>
+        <w:keepNext/>
+        <w:spacing w:before="80" w:after="80"/>
         <w:jc w:val="center"/>
       </w:pPr>
       <w:r>
         <w:drawing>
           <wp:inline xmlns:a="http://schemas.openxmlformats.org/drawingml/2006/main" xmlns:pic="http://schemas.openxmlformats.org/drawingml/2006/picture">
-            <wp:extent cx="5486400" cy="4366617"/>
+            <wp:extent cx="5029200" cy="4002732"/>
             <wp:docPr id="5" name="Picture 5"/>
             <wp:cNvGraphicFramePr>
               <a:graphicFrameLocks noChangeAspect="1"/>
@@ -3023,7 +3056,7 @@
                   <pic:spPr>
                     <a:xfrm>
                       <a:off x="0" y="0"/>
-                      <a:ext cx="5486400" cy="4366617"/>
+                      <a:ext cx="5029200" cy="4002732"/>
                     </a:xfrm>
                     <a:prstGeom prst="rect"/>
                   </pic:spPr>
@@ -3036,13 +3069,14 @@
     </w:p>
     <w:p>
       <w:pPr>
-        <w:spacing w:before="120" w:after="120"/>
+        <w:keepNext/>
+        <w:spacing w:before="80" w:after="80"/>
         <w:jc w:val="center"/>
       </w:pPr>
       <w:r>
         <w:drawing>
           <wp:inline xmlns:a="http://schemas.openxmlformats.org/drawingml/2006/main" xmlns:pic="http://schemas.openxmlformats.org/drawingml/2006/picture">
-            <wp:extent cx="5486400" cy="3804047"/>
+            <wp:extent cx="5029200" cy="3487043"/>
             <wp:docPr id="6" name="Picture 6"/>
             <wp:cNvGraphicFramePr>
               <a:graphicFrameLocks noChangeAspect="1"/>
@@ -3063,7 +3097,7 @@
                   <pic:spPr>
                     <a:xfrm>
                       <a:off x="0" y="0"/>
-                      <a:ext cx="5486400" cy="3804047"/>
+                      <a:ext cx="5029200" cy="3487043"/>
                     </a:xfrm>
                     <a:prstGeom prst="rect"/>
                   </pic:spPr>
@@ -3077,14 +3111,15 @@
     <w:p>
       <w:pPr>
         <w:pStyle w:val="Heading3"/>
-        <w:spacing w:before="200" w:after="60"/>
+        <w:keepNext/>
+        <w:spacing w:before="160" w:after="60"/>
       </w:pPr>
       <w:r>
         <w:rPr>
           <w:rFonts w:ascii="Times New Roman" w:hAnsi="Times New Roman"/>
           <w:b/>
           <w:color w:val="334155"/>
-          <w:sz w:val="24"/>
+          <w:sz w:val="23"/>
         </w:rPr>
         <w:t>Interactive Hardware &amp; Digital Twin Controls:</w:t>
       </w:r>
@@ -3148,14 +3183,15 @@
     <w:p>
       <w:pPr>
         <w:pStyle w:val="Heading2"/>
-        <w:spacing w:before="240" w:after="80"/>
+        <w:keepNext/>
+        <w:spacing w:before="200" w:after="80"/>
       </w:pPr>
       <w:r>
         <w:rPr>
           <w:rFonts w:ascii="Times New Roman" w:hAnsi="Times New Roman"/>
           <w:b/>
           <w:color w:val="1E3A8A"/>
-          <w:sz w:val="28"/>
+          <w:sz w:val="27"/>
         </w:rPr>
         <w:t>5. HARDWARE SOURCE CODE (ARDUINO UNO FIRMWARE - C++)</w:t>
       </w:r>
@@ -3174,7 +3210,7 @@
         <w:rPr>
           <w:rFonts w:ascii="Consolas" w:hAnsi="Consolas"/>
           <w:color w:val="B91C1C"/>
-          <w:sz w:val="19"/>
+          <w:sz w:val="18"/>
         </w:rPr>
         <w:t>arduino/traffic_light_controller.ino</w:t>
       </w:r>
@@ -3187,6 +3223,7 @@
     </w:p>
     <w:p>
       <w:pPr>
+        <w:keepNext/>
         <w:spacing w:before="80" w:after="120"/>
         <w:ind w:left="288"/>
       </w:pPr>
@@ -3194,7 +3231,7 @@
         <w:rPr>
           <w:rFonts w:ascii="Consolas" w:hAnsi="Consolas"/>
           <w:color w:val="1E293B"/>
-          <w:sz w:val="19"/>
+          <w:sz w:val="18"/>
         </w:rPr>
         <w:t>// Arduino Uno / ATmega328P Physical Traffic Light Controller</w:t>
         <w:br/>
@@ -3386,14 +3423,15 @@
     <w:p>
       <w:pPr>
         <w:pStyle w:val="Heading2"/>
-        <w:spacing w:before="240" w:after="80"/>
+        <w:keepNext/>
+        <w:spacing w:before="200" w:after="80"/>
       </w:pPr>
       <w:r>
         <w:rPr>
           <w:rFonts w:ascii="Times New Roman" w:hAnsi="Times New Roman"/>
           <w:b/>
           <w:color w:val="1E3A8A"/>
-          <w:sz w:val="28"/>
+          <w:sz w:val="27"/>
         </w:rPr>
         <w:t>6. CONCLUSION</w:t>
       </w:r>
@@ -3431,14 +3469,15 @@
     <w:p>
       <w:pPr>
         <w:pStyle w:val="Heading2"/>
-        <w:spacing w:before="240" w:after="80"/>
+        <w:keepNext/>
+        <w:spacing w:before="200" w:after="80"/>
       </w:pPr>
       <w:r>
         <w:rPr>
           <w:rFonts w:ascii="Times New Roman" w:hAnsi="Times New Roman"/>
           <w:b/>
           <w:color w:val="1E3A8A"/>
-          <w:sz w:val="28"/>
+          <w:sz w:val="27"/>
         </w:rPr>
         <w:t>7. INDIVIDUAL CONTRIBUTION</w:t>
       </w:r>
@@ -3518,14 +3557,15 @@
     <w:p>
       <w:pPr>
         <w:pStyle w:val="Heading3"/>
-        <w:spacing w:before="200" w:after="60"/>
+        <w:keepNext/>
+        <w:spacing w:before="160" w:after="60"/>
       </w:pPr>
       <w:r>
         <w:rPr>
           <w:rFonts w:ascii="Times New Roman" w:hAnsi="Times New Roman"/>
           <w:b/>
           <w:color w:val="334155"/>
-          <w:sz w:val="24"/>
+          <w:sz w:val="23"/>
         </w:rPr>
         <w:t>Contribution Summary:</w:t>
       </w:r>
@@ -3542,27 +3582,22 @@
       </w:r>
     </w:p>
     <w:p>
-      <w:pPr>
-        <w:spacing w:after="80" w:line="276" w:lineRule="auto"/>
-      </w:pPr>
-      <w:r>
-        <w:rPr>
-          <w:rFonts w:ascii="Times New Roman" w:hAnsi="Times New Roman"/>
-        </w:rPr>
-        <w:t>=========================================================================</w:t>
+      <w:r>
+        <w:br w:type="page"/>
       </w:r>
     </w:p>
     <w:p>
       <w:pPr>
         <w:pStyle w:val="Heading1"/>
-        <w:spacing w:before="280" w:after="120"/>
+        <w:keepNext/>
+        <w:spacing w:before="240" w:after="120"/>
       </w:pPr>
       <w:r>
         <w:rPr>
           <w:rFonts w:ascii="Times New Roman" w:hAnsi="Times New Roman"/>
           <w:b/>
           <w:color w:val="0F172A"/>
-          <w:sz w:val="40"/>
+          <w:sz w:val="38"/>
         </w:rPr>
         <w:t>MATHEMATICS PROJECT ASSIGNMENT REPORT</w:t>
       </w:r>
@@ -3686,14 +3721,15 @@
     <w:p>
       <w:pPr>
         <w:pStyle w:val="Heading2"/>
-        <w:spacing w:before="240" w:after="80"/>
+        <w:keepNext/>
+        <w:spacing w:before="200" w:after="80"/>
       </w:pPr>
       <w:r>
         <w:rPr>
           <w:rFonts w:ascii="Times New Roman" w:hAnsi="Times New Roman"/>
           <w:b/>
           <w:color w:val="1E3A8A"/>
-          <w:sz w:val="28"/>
+          <w:sz w:val="27"/>
         </w:rPr>
         <w:t>1. ABSTRACT</w:t>
       </w:r>
@@ -3731,14 +3767,15 @@
     <w:p>
       <w:pPr>
         <w:pStyle w:val="Heading2"/>
-        <w:spacing w:before="240" w:after="80"/>
+        <w:keepNext/>
+        <w:spacing w:before="200" w:after="80"/>
       </w:pPr>
       <w:r>
         <w:rPr>
           <w:rFonts w:ascii="Times New Roman" w:hAnsi="Times New Roman"/>
           <w:b/>
           <w:color w:val="1E3A8A"/>
-          <w:sz w:val="28"/>
+          <w:sz w:val="27"/>
         </w:rPr>
         <w:t>2. INTRODUCTION &amp; OBJECTIVES</w:t>
       </w:r>
@@ -3757,14 +3794,15 @@
     <w:p>
       <w:pPr>
         <w:pStyle w:val="Heading3"/>
-        <w:spacing w:before="200" w:after="60"/>
+        <w:keepNext/>
+        <w:spacing w:before="160" w:after="60"/>
       </w:pPr>
       <w:r>
         <w:rPr>
           <w:rFonts w:ascii="Times New Roman" w:hAnsi="Times New Roman"/>
           <w:b/>
           <w:color w:val="334155"/>
-          <w:sz w:val="24"/>
+          <w:sz w:val="23"/>
         </w:rPr>
         <w:t>Project Objectives:</w:t>
       </w:r>
@@ -3840,14 +3878,15 @@
     <w:p>
       <w:pPr>
         <w:pStyle w:val="Heading2"/>
-        <w:spacing w:before="240" w:after="80"/>
+        <w:keepNext/>
+        <w:spacing w:before="200" w:after="80"/>
       </w:pPr>
       <w:r>
         <w:rPr>
           <w:rFonts w:ascii="Times New Roman" w:hAnsi="Times New Roman"/>
           <w:b/>
           <w:color w:val="1E3A8A"/>
-          <w:sz w:val="28"/>
+          <w:sz w:val="27"/>
         </w:rPr>
         <w:t>3. MATHEMATICAL FORMULATION (CRT vs. LCM)</w:t>
       </w:r>
@@ -3855,14 +3894,15 @@
     <w:p>
       <w:pPr>
         <w:pStyle w:val="Heading3"/>
-        <w:spacing w:before="200" w:after="60"/>
+        <w:keepNext/>
+        <w:spacing w:before="160" w:after="60"/>
       </w:pPr>
       <w:r>
         <w:rPr>
           <w:rFonts w:ascii="Times New Roman" w:hAnsi="Times New Roman"/>
           <w:b/>
           <w:color w:val="334155"/>
-          <w:sz w:val="24"/>
+          <w:sz w:val="23"/>
         </w:rPr>
         <w:t>3.1 The Traffic Signal Equations</w:t>
       </w:r>
@@ -3917,14 +3957,15 @@
     <w:p>
       <w:pPr>
         <w:pStyle w:val="Heading3"/>
-        <w:spacing w:before="200" w:after="60"/>
+        <w:keepNext/>
+        <w:spacing w:before="160" w:after="60"/>
       </w:pPr>
       <w:r>
         <w:rPr>
           <w:rFonts w:ascii="Times New Roman" w:hAnsi="Times New Roman"/>
           <w:b/>
           <w:color w:val="334155"/>
-          <w:sz w:val="24"/>
+          <w:sz w:val="23"/>
         </w:rPr>
         <w:t>3.2 Why Simple LCM Cannot Solve This Problem</w:t>
       </w:r>
@@ -3956,14 +3997,15 @@
     <w:p>
       <w:pPr>
         <w:pStyle w:val="Heading3"/>
-        <w:spacing w:before="200" w:after="60"/>
+        <w:keepNext/>
+        <w:spacing w:before="160" w:after="60"/>
       </w:pPr>
       <w:r>
         <w:rPr>
           <w:rFonts w:ascii="Times New Roman" w:hAnsi="Times New Roman"/>
           <w:b/>
           <w:color w:val="334155"/>
-          <w:sz w:val="24"/>
+          <w:sz w:val="23"/>
         </w:rPr>
         <w:t>3.3 CRT Solution Procedure</w:t>
       </w:r>
@@ -4143,14 +4185,15 @@
     <w:p>
       <w:pPr>
         <w:pStyle w:val="Heading2"/>
-        <w:spacing w:before="240" w:after="80"/>
+        <w:keepNext/>
+        <w:spacing w:before="200" w:after="80"/>
       </w:pPr>
       <w:r>
         <w:rPr>
           <w:rFonts w:ascii="Times New Roman" w:hAnsi="Times New Roman"/>
           <w:b/>
           <w:color w:val="1E3A8A"/>
-          <w:sz w:val="28"/>
+          <w:sz w:val="27"/>
         </w:rPr>
         <w:t>4. PHYSICAL HARDWARE &amp; DIGITAL TWIN IMPLEMENTATION</w:t>
       </w:r>
@@ -4168,13 +4211,14 @@
     </w:p>
     <w:p>
       <w:pPr>
-        <w:spacing w:before="120" w:after="120"/>
+        <w:keepNext/>
+        <w:spacing w:before="80" w:after="80"/>
         <w:jc w:val="center"/>
       </w:pPr>
       <w:r>
         <w:drawing>
           <wp:inline xmlns:a="http://schemas.openxmlformats.org/drawingml/2006/main" xmlns:pic="http://schemas.openxmlformats.org/drawingml/2006/picture">
-            <wp:extent cx="5486400" cy="4366617"/>
+            <wp:extent cx="5029200" cy="4002732"/>
             <wp:docPr id="7" name="Picture 7"/>
             <wp:cNvGraphicFramePr>
               <a:graphicFrameLocks noChangeAspect="1"/>
@@ -4195,7 +4239,7 @@
                   <pic:spPr>
                     <a:xfrm>
                       <a:off x="0" y="0"/>
-                      <a:ext cx="5486400" cy="4366617"/>
+                      <a:ext cx="5029200" cy="4002732"/>
                     </a:xfrm>
                     <a:prstGeom prst="rect"/>
                   </pic:spPr>
@@ -4208,13 +4252,14 @@
     </w:p>
     <w:p>
       <w:pPr>
-        <w:spacing w:before="120" w:after="120"/>
+        <w:keepNext/>
+        <w:spacing w:before="80" w:after="80"/>
         <w:jc w:val="center"/>
       </w:pPr>
       <w:r>
         <w:drawing>
           <wp:inline xmlns:a="http://schemas.openxmlformats.org/drawingml/2006/main" xmlns:pic="http://schemas.openxmlformats.org/drawingml/2006/picture">
-            <wp:extent cx="5486400" cy="3804047"/>
+            <wp:extent cx="5029200" cy="3487043"/>
             <wp:docPr id="8" name="Picture 8"/>
             <wp:cNvGraphicFramePr>
               <a:graphicFrameLocks noChangeAspect="1"/>
@@ -4235,7 +4280,7 @@
                   <pic:spPr>
                     <a:xfrm>
                       <a:off x="0" y="0"/>
-                      <a:ext cx="5486400" cy="3804047"/>
+                      <a:ext cx="5029200" cy="3487043"/>
                     </a:xfrm>
                     <a:prstGeom prst="rect"/>
                   </pic:spPr>
@@ -4249,14 +4294,15 @@
     <w:p>
       <w:pPr>
         <w:pStyle w:val="Heading3"/>
-        <w:spacing w:before="200" w:after="60"/>
+        <w:keepNext/>
+        <w:spacing w:before="160" w:after="60"/>
       </w:pPr>
       <w:r>
         <w:rPr>
           <w:rFonts w:ascii="Times New Roman" w:hAnsi="Times New Roman"/>
           <w:b/>
           <w:color w:val="334155"/>
-          <w:sz w:val="24"/>
+          <w:sz w:val="23"/>
         </w:rPr>
         <w:t>Interactive Hardware &amp; Digital Twin Controls:</w:t>
       </w:r>
@@ -4320,14 +4366,15 @@
     <w:p>
       <w:pPr>
         <w:pStyle w:val="Heading2"/>
-        <w:spacing w:before="240" w:after="80"/>
+        <w:keepNext/>
+        <w:spacing w:before="200" w:after="80"/>
       </w:pPr>
       <w:r>
         <w:rPr>
           <w:rFonts w:ascii="Times New Roman" w:hAnsi="Times New Roman"/>
           <w:b/>
           <w:color w:val="1E3A8A"/>
-          <w:sz w:val="28"/>
+          <w:sz w:val="27"/>
         </w:rPr>
         <w:t>5. HARDWARE SOURCE CODE (ARDUINO UNO FIRMWARE - C++)</w:t>
       </w:r>
@@ -4346,7 +4393,7 @@
         <w:rPr>
           <w:rFonts w:ascii="Consolas" w:hAnsi="Consolas"/>
           <w:color w:val="B91C1C"/>
-          <w:sz w:val="19"/>
+          <w:sz w:val="18"/>
         </w:rPr>
         <w:t>arduino/traffic_light_controller.ino</w:t>
       </w:r>
@@ -4359,6 +4406,7 @@
     </w:p>
     <w:p>
       <w:pPr>
+        <w:keepNext/>
         <w:spacing w:before="80" w:after="120"/>
         <w:ind w:left="288"/>
       </w:pPr>
@@ -4366,7 +4414,7 @@
         <w:rPr>
           <w:rFonts w:ascii="Consolas" w:hAnsi="Consolas"/>
           <w:color w:val="1E293B"/>
-          <w:sz w:val="19"/>
+          <w:sz w:val="18"/>
         </w:rPr>
         <w:t>// Arduino Uno / ATmega328P Physical Traffic Light Controller</w:t>
         <w:br/>
@@ -4558,14 +4606,15 @@
     <w:p>
       <w:pPr>
         <w:pStyle w:val="Heading2"/>
-        <w:spacing w:before="240" w:after="80"/>
+        <w:keepNext/>
+        <w:spacing w:before="200" w:after="80"/>
       </w:pPr>
       <w:r>
         <w:rPr>
           <w:rFonts w:ascii="Times New Roman" w:hAnsi="Times New Roman"/>
           <w:b/>
           <w:color w:val="1E3A8A"/>
-          <w:sz w:val="28"/>
+          <w:sz w:val="27"/>
         </w:rPr>
         <w:t>6. CONCLUSION</w:t>
       </w:r>
@@ -4603,14 +4652,15 @@
     <w:p>
       <w:pPr>
         <w:pStyle w:val="Heading2"/>
-        <w:spacing w:before="240" w:after="80"/>
+        <w:keepNext/>
+        <w:spacing w:before="200" w:after="80"/>
       </w:pPr>
       <w:r>
         <w:rPr>
           <w:rFonts w:ascii="Times New Roman" w:hAnsi="Times New Roman"/>
           <w:b/>
           <w:color w:val="1E3A8A"/>
-          <w:sz w:val="28"/>
+          <w:sz w:val="27"/>
         </w:rPr>
         <w:t>7. INDIVIDUAL CONTRIBUTION</w:t>
       </w:r>
@@ -4690,14 +4740,15 @@
     <w:p>
       <w:pPr>
         <w:pStyle w:val="Heading3"/>
-        <w:spacing w:before="200" w:after="60"/>
+        <w:keepNext/>
+        <w:spacing w:before="160" w:after="60"/>
       </w:pPr>
       <w:r>
         <w:rPr>
           <w:rFonts w:ascii="Times New Roman" w:hAnsi="Times New Roman"/>
           <w:b/>
           <w:color w:val="334155"/>
-          <w:sz w:val="24"/>
+          <w:sz w:val="23"/>
         </w:rPr>
         <w:t>Contribution Summary:</w:t>
       </w:r>
@@ -4714,27 +4765,22 @@
       </w:r>
     </w:p>
     <w:p>
-      <w:pPr>
-        <w:spacing w:after="80" w:line="276" w:lineRule="auto"/>
-      </w:pPr>
-      <w:r>
-        <w:rPr>
-          <w:rFonts w:ascii="Times New Roman" w:hAnsi="Times New Roman"/>
-        </w:rPr>
-        <w:t>=========================================================================</w:t>
+      <w:r>
+        <w:br w:type="page"/>
       </w:r>
     </w:p>
     <w:p>
       <w:pPr>
         <w:pStyle w:val="Heading1"/>
-        <w:spacing w:before="280" w:after="120"/>
+        <w:keepNext/>
+        <w:spacing w:before="240" w:after="120"/>
       </w:pPr>
       <w:r>
         <w:rPr>
           <w:rFonts w:ascii="Times New Roman" w:hAnsi="Times New Roman"/>
           <w:b/>
           <w:color w:val="0F172A"/>
-          <w:sz w:val="40"/>
+          <w:sz w:val="38"/>
         </w:rPr>
         <w:t>MATHEMATICS PROJECT ASSIGNMENT REPORT</w:t>
       </w:r>
@@ -4858,14 +4904,15 @@
     <w:p>
       <w:pPr>
         <w:pStyle w:val="Heading2"/>
-        <w:spacing w:before="240" w:after="80"/>
+        <w:keepNext/>
+        <w:spacing w:before="200" w:after="80"/>
       </w:pPr>
       <w:r>
         <w:rPr>
           <w:rFonts w:ascii="Times New Roman" w:hAnsi="Times New Roman"/>
           <w:b/>
           <w:color w:val="1E3A8A"/>
-          <w:sz w:val="28"/>
+          <w:sz w:val="27"/>
         </w:rPr>
         <w:t>1. ABSTRACT</w:t>
       </w:r>
@@ -4903,14 +4950,15 @@
     <w:p>
       <w:pPr>
         <w:pStyle w:val="Heading2"/>
-        <w:spacing w:before="240" w:after="80"/>
+        <w:keepNext/>
+        <w:spacing w:before="200" w:after="80"/>
       </w:pPr>
       <w:r>
         <w:rPr>
           <w:rFonts w:ascii="Times New Roman" w:hAnsi="Times New Roman"/>
           <w:b/>
           <w:color w:val="1E3A8A"/>
-          <w:sz w:val="28"/>
+          <w:sz w:val="27"/>
         </w:rPr>
         <w:t>2. INTRODUCTION &amp; OBJECTIVES</w:t>
       </w:r>
@@ -4929,14 +4977,15 @@
     <w:p>
       <w:pPr>
         <w:pStyle w:val="Heading3"/>
-        <w:spacing w:before="200" w:after="60"/>
+        <w:keepNext/>
+        <w:spacing w:before="160" w:after="60"/>
       </w:pPr>
       <w:r>
         <w:rPr>
           <w:rFonts w:ascii="Times New Roman" w:hAnsi="Times New Roman"/>
           <w:b/>
           <w:color w:val="334155"/>
-          <w:sz w:val="24"/>
+          <w:sz w:val="23"/>
         </w:rPr>
         <w:t>Project Objectives:</w:t>
       </w:r>
@@ -5012,14 +5061,15 @@
     <w:p>
       <w:pPr>
         <w:pStyle w:val="Heading2"/>
-        <w:spacing w:before="240" w:after="80"/>
+        <w:keepNext/>
+        <w:spacing w:before="200" w:after="80"/>
       </w:pPr>
       <w:r>
         <w:rPr>
           <w:rFonts w:ascii="Times New Roman" w:hAnsi="Times New Roman"/>
           <w:b/>
           <w:color w:val="1E3A8A"/>
-          <w:sz w:val="28"/>
+          <w:sz w:val="27"/>
         </w:rPr>
         <w:t>3. MATHEMATICAL FORMULATION (CRT vs. LCM)</w:t>
       </w:r>
@@ -5027,14 +5077,15 @@
     <w:p>
       <w:pPr>
         <w:pStyle w:val="Heading3"/>
-        <w:spacing w:before="200" w:after="60"/>
+        <w:keepNext/>
+        <w:spacing w:before="160" w:after="60"/>
       </w:pPr>
       <w:r>
         <w:rPr>
           <w:rFonts w:ascii="Times New Roman" w:hAnsi="Times New Roman"/>
           <w:b/>
           <w:color w:val="334155"/>
-          <w:sz w:val="24"/>
+          <w:sz w:val="23"/>
         </w:rPr>
         <w:t>3.1 The Traffic Signal Equations</w:t>
       </w:r>
@@ -5089,14 +5140,15 @@
     <w:p>
       <w:pPr>
         <w:pStyle w:val="Heading3"/>
-        <w:spacing w:before="200" w:after="60"/>
+        <w:keepNext/>
+        <w:spacing w:before="160" w:after="60"/>
       </w:pPr>
       <w:r>
         <w:rPr>
           <w:rFonts w:ascii="Times New Roman" w:hAnsi="Times New Roman"/>
           <w:b/>
           <w:color w:val="334155"/>
-          <w:sz w:val="24"/>
+          <w:sz w:val="23"/>
         </w:rPr>
         <w:t>3.2 Why Simple LCM Cannot Solve This Problem</w:t>
       </w:r>
@@ -5128,14 +5180,15 @@
     <w:p>
       <w:pPr>
         <w:pStyle w:val="Heading3"/>
-        <w:spacing w:before="200" w:after="60"/>
+        <w:keepNext/>
+        <w:spacing w:before="160" w:after="60"/>
       </w:pPr>
       <w:r>
         <w:rPr>
           <w:rFonts w:ascii="Times New Roman" w:hAnsi="Times New Roman"/>
           <w:b/>
           <w:color w:val="334155"/>
-          <w:sz w:val="24"/>
+          <w:sz w:val="23"/>
         </w:rPr>
         <w:t>3.3 CRT Solution Procedure</w:t>
       </w:r>
@@ -5315,14 +5368,15 @@
     <w:p>
       <w:pPr>
         <w:pStyle w:val="Heading2"/>
-        <w:spacing w:before="240" w:after="80"/>
+        <w:keepNext/>
+        <w:spacing w:before="200" w:after="80"/>
       </w:pPr>
       <w:r>
         <w:rPr>
           <w:rFonts w:ascii="Times New Roman" w:hAnsi="Times New Roman"/>
           <w:b/>
           <w:color w:val="1E3A8A"/>
-          <w:sz w:val="28"/>
+          <w:sz w:val="27"/>
         </w:rPr>
         <w:t>4. PHYSICAL HARDWARE &amp; DIGITAL TWIN IMPLEMENTATION</w:t>
       </w:r>
@@ -5340,13 +5394,14 @@
     </w:p>
     <w:p>
       <w:pPr>
-        <w:spacing w:before="120" w:after="120"/>
+        <w:keepNext/>
+        <w:spacing w:before="80" w:after="80"/>
         <w:jc w:val="center"/>
       </w:pPr>
       <w:r>
         <w:drawing>
           <wp:inline xmlns:a="http://schemas.openxmlformats.org/drawingml/2006/main" xmlns:pic="http://schemas.openxmlformats.org/drawingml/2006/picture">
-            <wp:extent cx="5486400" cy="4366617"/>
+            <wp:extent cx="5029200" cy="4002732"/>
             <wp:docPr id="9" name="Picture 9"/>
             <wp:cNvGraphicFramePr>
               <a:graphicFrameLocks noChangeAspect="1"/>
@@ -5367,7 +5422,7 @@
                   <pic:spPr>
                     <a:xfrm>
                       <a:off x="0" y="0"/>
-                      <a:ext cx="5486400" cy="4366617"/>
+                      <a:ext cx="5029200" cy="4002732"/>
                     </a:xfrm>
                     <a:prstGeom prst="rect"/>
                   </pic:spPr>
@@ -5380,13 +5435,14 @@
     </w:p>
     <w:p>
       <w:pPr>
-        <w:spacing w:before="120" w:after="120"/>
+        <w:keepNext/>
+        <w:spacing w:before="80" w:after="80"/>
         <w:jc w:val="center"/>
       </w:pPr>
       <w:r>
         <w:drawing>
           <wp:inline xmlns:a="http://schemas.openxmlformats.org/drawingml/2006/main" xmlns:pic="http://schemas.openxmlformats.org/drawingml/2006/picture">
-            <wp:extent cx="5486400" cy="3804047"/>
+            <wp:extent cx="5029200" cy="3487043"/>
             <wp:docPr id="10" name="Picture 10"/>
             <wp:cNvGraphicFramePr>
               <a:graphicFrameLocks noChangeAspect="1"/>
@@ -5407,7 +5463,7 @@
                   <pic:spPr>
                     <a:xfrm>
                       <a:off x="0" y="0"/>
-                      <a:ext cx="5486400" cy="3804047"/>
+                      <a:ext cx="5029200" cy="3487043"/>
                     </a:xfrm>
                     <a:prstGeom prst="rect"/>
                   </pic:spPr>
@@ -5421,14 +5477,15 @@
     <w:p>
       <w:pPr>
         <w:pStyle w:val="Heading3"/>
-        <w:spacing w:before="200" w:after="60"/>
+        <w:keepNext/>
+        <w:spacing w:before="160" w:after="60"/>
       </w:pPr>
       <w:r>
         <w:rPr>
           <w:rFonts w:ascii="Times New Roman" w:hAnsi="Times New Roman"/>
           <w:b/>
           <w:color w:val="334155"/>
-          <w:sz w:val="24"/>
+          <w:sz w:val="23"/>
         </w:rPr>
         <w:t>Interactive Hardware &amp; Digital Twin Controls:</w:t>
       </w:r>
@@ -5492,14 +5549,15 @@
     <w:p>
       <w:pPr>
         <w:pStyle w:val="Heading2"/>
-        <w:spacing w:before="240" w:after="80"/>
+        <w:keepNext/>
+        <w:spacing w:before="200" w:after="80"/>
       </w:pPr>
       <w:r>
         <w:rPr>
           <w:rFonts w:ascii="Times New Roman" w:hAnsi="Times New Roman"/>
           <w:b/>
           <w:color w:val="1E3A8A"/>
-          <w:sz w:val="28"/>
+          <w:sz w:val="27"/>
         </w:rPr>
         <w:t>5. HARDWARE SOURCE CODE (ARDUINO UNO FIRMWARE - C++)</w:t>
       </w:r>
@@ -5518,7 +5576,7 @@
         <w:rPr>
           <w:rFonts w:ascii="Consolas" w:hAnsi="Consolas"/>
           <w:color w:val="B91C1C"/>
-          <w:sz w:val="19"/>
+          <w:sz w:val="18"/>
         </w:rPr>
         <w:t>arduino/traffic_light_controller.ino</w:t>
       </w:r>
@@ -5531,6 +5589,7 @@
     </w:p>
     <w:p>
       <w:pPr>
+        <w:keepNext/>
         <w:spacing w:before="80" w:after="120"/>
         <w:ind w:left="288"/>
       </w:pPr>
@@ -5538,7 +5597,7 @@
         <w:rPr>
           <w:rFonts w:ascii="Consolas" w:hAnsi="Consolas"/>
           <w:color w:val="1E293B"/>
-          <w:sz w:val="19"/>
+          <w:sz w:val="18"/>
         </w:rPr>
         <w:t>// Arduino Uno / ATmega328P Physical Traffic Light Controller</w:t>
         <w:br/>
@@ -5730,14 +5789,15 @@
     <w:p>
       <w:pPr>
         <w:pStyle w:val="Heading2"/>
-        <w:spacing w:before="240" w:after="80"/>
+        <w:keepNext/>
+        <w:spacing w:before="200" w:after="80"/>
       </w:pPr>
       <w:r>
         <w:rPr>
           <w:rFonts w:ascii="Times New Roman" w:hAnsi="Times New Roman"/>
           <w:b/>
           <w:color w:val="1E3A8A"/>
-          <w:sz w:val="28"/>
+          <w:sz w:val="27"/>
         </w:rPr>
         <w:t>6. CONCLUSION</w:t>
       </w:r>
@@ -5775,14 +5835,15 @@
     <w:p>
       <w:pPr>
         <w:pStyle w:val="Heading2"/>
-        <w:spacing w:before="240" w:after="80"/>
+        <w:keepNext/>
+        <w:spacing w:before="200" w:after="80"/>
       </w:pPr>
       <w:r>
         <w:rPr>
           <w:rFonts w:ascii="Times New Roman" w:hAnsi="Times New Roman"/>
           <w:b/>
           <w:color w:val="1E3A8A"/>
-          <w:sz w:val="28"/>
+          <w:sz w:val="27"/>
         </w:rPr>
         <w:t>7. INDIVIDUAL CONTRIBUTION</w:t>
       </w:r>
@@ -5862,14 +5923,15 @@
     <w:p>
       <w:pPr>
         <w:pStyle w:val="Heading3"/>
-        <w:spacing w:before="200" w:after="60"/>
+        <w:keepNext/>
+        <w:spacing w:before="160" w:after="60"/>
       </w:pPr>
       <w:r>
         <w:rPr>
           <w:rFonts w:ascii="Times New Roman" w:hAnsi="Times New Roman"/>
           <w:b/>
           <w:color w:val="334155"/>
-          <w:sz w:val="24"/>
+          <w:sz w:val="23"/>
         </w:rPr>
         <w:t>Contribution Summary:</w:t>
       </w:r>
@@ -5886,27 +5948,22 @@
       </w:r>
     </w:p>
     <w:p>
-      <w:pPr>
-        <w:spacing w:after="80" w:line="276" w:lineRule="auto"/>
-      </w:pPr>
-      <w:r>
-        <w:rPr>
-          <w:rFonts w:ascii="Times New Roman" w:hAnsi="Times New Roman"/>
-        </w:rPr>
-        <w:t>=========================================================================</w:t>
+      <w:r>
+        <w:br w:type="page"/>
       </w:r>
     </w:p>
     <w:p>
       <w:pPr>
         <w:pStyle w:val="Heading1"/>
-        <w:spacing w:before="280" w:after="120"/>
+        <w:keepNext/>
+        <w:spacing w:before="240" w:after="120"/>
       </w:pPr>
       <w:r>
         <w:rPr>
           <w:rFonts w:ascii="Times New Roman" w:hAnsi="Times New Roman"/>
           <w:b/>
           <w:color w:val="0F172A"/>
-          <w:sz w:val="40"/>
+          <w:sz w:val="38"/>
         </w:rPr>
         <w:t>MATHEMATICS PROJECT ASSIGNMENT REPORT</w:t>
       </w:r>
@@ -6030,14 +6087,15 @@
     <w:p>
       <w:pPr>
         <w:pStyle w:val="Heading2"/>
-        <w:spacing w:before="240" w:after="80"/>
+        <w:keepNext/>
+        <w:spacing w:before="200" w:after="80"/>
       </w:pPr>
       <w:r>
         <w:rPr>
           <w:rFonts w:ascii="Times New Roman" w:hAnsi="Times New Roman"/>
           <w:b/>
           <w:color w:val="1E3A8A"/>
-          <w:sz w:val="28"/>
+          <w:sz w:val="27"/>
         </w:rPr>
         <w:t>1. ABSTRACT</w:t>
       </w:r>
@@ -6075,14 +6133,15 @@
     <w:p>
       <w:pPr>
         <w:pStyle w:val="Heading2"/>
-        <w:spacing w:before="240" w:after="80"/>
+        <w:keepNext/>
+        <w:spacing w:before="200" w:after="80"/>
       </w:pPr>
       <w:r>
         <w:rPr>
           <w:rFonts w:ascii="Times New Roman" w:hAnsi="Times New Roman"/>
           <w:b/>
           <w:color w:val="1E3A8A"/>
-          <w:sz w:val="28"/>
+          <w:sz w:val="27"/>
         </w:rPr>
         <w:t>2. INTRODUCTION &amp; OBJECTIVES</w:t>
       </w:r>
@@ -6101,14 +6160,15 @@
     <w:p>
       <w:pPr>
         <w:pStyle w:val="Heading3"/>
-        <w:spacing w:before="200" w:after="60"/>
+        <w:keepNext/>
+        <w:spacing w:before="160" w:after="60"/>
       </w:pPr>
       <w:r>
         <w:rPr>
           <w:rFonts w:ascii="Times New Roman" w:hAnsi="Times New Roman"/>
           <w:b/>
           <w:color w:val="334155"/>
-          <w:sz w:val="24"/>
+          <w:sz w:val="23"/>
         </w:rPr>
         <w:t>Project Objectives:</w:t>
       </w:r>
@@ -6184,14 +6244,15 @@
     <w:p>
       <w:pPr>
         <w:pStyle w:val="Heading2"/>
-        <w:spacing w:before="240" w:after="80"/>
+        <w:keepNext/>
+        <w:spacing w:before="200" w:after="80"/>
       </w:pPr>
       <w:r>
         <w:rPr>
           <w:rFonts w:ascii="Times New Roman" w:hAnsi="Times New Roman"/>
           <w:b/>
           <w:color w:val="1E3A8A"/>
-          <w:sz w:val="28"/>
+          <w:sz w:val="27"/>
         </w:rPr>
         <w:t>3. MATHEMATICAL FORMULATION (CRT vs. LCM)</w:t>
       </w:r>
@@ -6199,14 +6260,15 @@
     <w:p>
       <w:pPr>
         <w:pStyle w:val="Heading3"/>
-        <w:spacing w:before="200" w:after="60"/>
+        <w:keepNext/>
+        <w:spacing w:before="160" w:after="60"/>
       </w:pPr>
       <w:r>
         <w:rPr>
           <w:rFonts w:ascii="Times New Roman" w:hAnsi="Times New Roman"/>
           <w:b/>
           <w:color w:val="334155"/>
-          <w:sz w:val="24"/>
+          <w:sz w:val="23"/>
         </w:rPr>
         <w:t>3.1 The Traffic Signal Equations</w:t>
       </w:r>
@@ -6261,14 +6323,15 @@
     <w:p>
       <w:pPr>
         <w:pStyle w:val="Heading3"/>
-        <w:spacing w:before="200" w:after="60"/>
+        <w:keepNext/>
+        <w:spacing w:before="160" w:after="60"/>
       </w:pPr>
       <w:r>
         <w:rPr>
           <w:rFonts w:ascii="Times New Roman" w:hAnsi="Times New Roman"/>
           <w:b/>
           <w:color w:val="334155"/>
-          <w:sz w:val="24"/>
+          <w:sz w:val="23"/>
         </w:rPr>
         <w:t>3.2 Why Simple LCM Cannot Solve This Problem</w:t>
       </w:r>
@@ -6300,14 +6363,15 @@
     <w:p>
       <w:pPr>
         <w:pStyle w:val="Heading3"/>
-        <w:spacing w:before="200" w:after="60"/>
+        <w:keepNext/>
+        <w:spacing w:before="160" w:after="60"/>
       </w:pPr>
       <w:r>
         <w:rPr>
           <w:rFonts w:ascii="Times New Roman" w:hAnsi="Times New Roman"/>
           <w:b/>
           <w:color w:val="334155"/>
-          <w:sz w:val="24"/>
+          <w:sz w:val="23"/>
         </w:rPr>
         <w:t>3.3 CRT Solution Procedure</w:t>
       </w:r>
@@ -6487,14 +6551,15 @@
     <w:p>
       <w:pPr>
         <w:pStyle w:val="Heading2"/>
-        <w:spacing w:before="240" w:after="80"/>
+        <w:keepNext/>
+        <w:spacing w:before="200" w:after="80"/>
       </w:pPr>
       <w:r>
         <w:rPr>
           <w:rFonts w:ascii="Times New Roman" w:hAnsi="Times New Roman"/>
           <w:b/>
           <w:color w:val="1E3A8A"/>
-          <w:sz w:val="28"/>
+          <w:sz w:val="27"/>
         </w:rPr>
         <w:t>4. PHYSICAL HARDWARE &amp; DIGITAL TWIN IMPLEMENTATION</w:t>
       </w:r>
@@ -6512,13 +6577,14 @@
     </w:p>
     <w:p>
       <w:pPr>
-        <w:spacing w:before="120" w:after="120"/>
+        <w:keepNext/>
+        <w:spacing w:before="80" w:after="80"/>
         <w:jc w:val="center"/>
       </w:pPr>
       <w:r>
         <w:drawing>
           <wp:inline xmlns:a="http://schemas.openxmlformats.org/drawingml/2006/main" xmlns:pic="http://schemas.openxmlformats.org/drawingml/2006/picture">
-            <wp:extent cx="5486400" cy="4366617"/>
+            <wp:extent cx="5029200" cy="4002732"/>
             <wp:docPr id="11" name="Picture 11"/>
             <wp:cNvGraphicFramePr>
               <a:graphicFrameLocks noChangeAspect="1"/>
@@ -6539,7 +6605,7 @@
                   <pic:spPr>
                     <a:xfrm>
                       <a:off x="0" y="0"/>
-                      <a:ext cx="5486400" cy="4366617"/>
+                      <a:ext cx="5029200" cy="4002732"/>
                     </a:xfrm>
                     <a:prstGeom prst="rect"/>
                   </pic:spPr>
@@ -6552,13 +6618,14 @@
     </w:p>
     <w:p>
       <w:pPr>
-        <w:spacing w:before="120" w:after="120"/>
+        <w:keepNext/>
+        <w:spacing w:before="80" w:after="80"/>
         <w:jc w:val="center"/>
       </w:pPr>
       <w:r>
         <w:drawing>
           <wp:inline xmlns:a="http://schemas.openxmlformats.org/drawingml/2006/main" xmlns:pic="http://schemas.openxmlformats.org/drawingml/2006/picture">
-            <wp:extent cx="5486400" cy="3804047"/>
+            <wp:extent cx="5029200" cy="3487043"/>
             <wp:docPr id="12" name="Picture 12"/>
             <wp:cNvGraphicFramePr>
               <a:graphicFrameLocks noChangeAspect="1"/>
@@ -6579,7 +6646,7 @@
                   <pic:spPr>
                     <a:xfrm>
                       <a:off x="0" y="0"/>
-                      <a:ext cx="5486400" cy="3804047"/>
+                      <a:ext cx="5029200" cy="3487043"/>
                     </a:xfrm>
                     <a:prstGeom prst="rect"/>
                   </pic:spPr>
@@ -6593,14 +6660,15 @@
     <w:p>
       <w:pPr>
         <w:pStyle w:val="Heading3"/>
-        <w:spacing w:before="200" w:after="60"/>
+        <w:keepNext/>
+        <w:spacing w:before="160" w:after="60"/>
       </w:pPr>
       <w:r>
         <w:rPr>
           <w:rFonts w:ascii="Times New Roman" w:hAnsi="Times New Roman"/>
           <w:b/>
           <w:color w:val="334155"/>
-          <w:sz w:val="24"/>
+          <w:sz w:val="23"/>
         </w:rPr>
         <w:t>Interactive Hardware &amp; Digital Twin Controls:</w:t>
       </w:r>
@@ -6664,14 +6732,15 @@
     <w:p>
       <w:pPr>
         <w:pStyle w:val="Heading2"/>
-        <w:spacing w:before="240" w:after="80"/>
+        <w:keepNext/>
+        <w:spacing w:before="200" w:after="80"/>
       </w:pPr>
       <w:r>
         <w:rPr>
           <w:rFonts w:ascii="Times New Roman" w:hAnsi="Times New Roman"/>
           <w:b/>
           <w:color w:val="1E3A8A"/>
-          <w:sz w:val="28"/>
+          <w:sz w:val="27"/>
         </w:rPr>
         <w:t>5. HARDWARE SOURCE CODE (ARDUINO UNO FIRMWARE - C++)</w:t>
       </w:r>
@@ -6690,7 +6759,7 @@
         <w:rPr>
           <w:rFonts w:ascii="Consolas" w:hAnsi="Consolas"/>
           <w:color w:val="B91C1C"/>
-          <w:sz w:val="19"/>
+          <w:sz w:val="18"/>
         </w:rPr>
         <w:t>arduino/traffic_light_controller.ino</w:t>
       </w:r>
@@ -6703,6 +6772,7 @@
     </w:p>
     <w:p>
       <w:pPr>
+        <w:keepNext/>
         <w:spacing w:before="80" w:after="120"/>
         <w:ind w:left="288"/>
       </w:pPr>
@@ -6710,7 +6780,7 @@
         <w:rPr>
           <w:rFonts w:ascii="Consolas" w:hAnsi="Consolas"/>
           <w:color w:val="1E293B"/>
-          <w:sz w:val="19"/>
+          <w:sz w:val="18"/>
         </w:rPr>
         <w:t>// Arduino Uno / ATmega328P Physical Traffic Light Controller</w:t>
         <w:br/>
@@ -6902,14 +6972,15 @@
     <w:p>
       <w:pPr>
         <w:pStyle w:val="Heading2"/>
-        <w:spacing w:before="240" w:after="80"/>
+        <w:keepNext/>
+        <w:spacing w:before="200" w:after="80"/>
       </w:pPr>
       <w:r>
         <w:rPr>
           <w:rFonts w:ascii="Times New Roman" w:hAnsi="Times New Roman"/>
           <w:b/>
           <w:color w:val="1E3A8A"/>
-          <w:sz w:val="28"/>
+          <w:sz w:val="27"/>
         </w:rPr>
         <w:t>6. CONCLUSION</w:t>
       </w:r>
@@ -6947,14 +7018,15 @@
     <w:p>
       <w:pPr>
         <w:pStyle w:val="Heading2"/>
-        <w:spacing w:before="240" w:after="80"/>
+        <w:keepNext/>
+        <w:spacing w:before="200" w:after="80"/>
       </w:pPr>
       <w:r>
         <w:rPr>
           <w:rFonts w:ascii="Times New Roman" w:hAnsi="Times New Roman"/>
           <w:b/>
           <w:color w:val="1E3A8A"/>
-          <w:sz w:val="28"/>
+          <w:sz w:val="27"/>
         </w:rPr>
         <w:t>7. INDIVIDUAL CONTRIBUTION</w:t>
       </w:r>
@@ -7034,14 +7106,15 @@
     <w:p>
       <w:pPr>
         <w:pStyle w:val="Heading3"/>
-        <w:spacing w:before="200" w:after="60"/>
+        <w:keepNext/>
+        <w:spacing w:before="160" w:after="60"/>
       </w:pPr>
       <w:r>
         <w:rPr>
           <w:rFonts w:ascii="Times New Roman" w:hAnsi="Times New Roman"/>
           <w:b/>
           <w:color w:val="334155"/>
-          <w:sz w:val="24"/>
+          <w:sz w:val="23"/>
         </w:rPr>
         <w:t>Contribution Summary:</w:t>
       </w:r>
@@ -7058,27 +7131,22 @@
       </w:r>
     </w:p>
     <w:p>
-      <w:pPr>
-        <w:spacing w:after="80" w:line="276" w:lineRule="auto"/>
-      </w:pPr>
-      <w:r>
-        <w:rPr>
-          <w:rFonts w:ascii="Times New Roman" w:hAnsi="Times New Roman"/>
-        </w:rPr>
-        <w:t>=========================================================================</w:t>
+      <w:r>
+        <w:br w:type="page"/>
       </w:r>
     </w:p>
     <w:p>
       <w:pPr>
         <w:pStyle w:val="Heading1"/>
-        <w:spacing w:before="280" w:after="120"/>
+        <w:keepNext/>
+        <w:spacing w:before="240" w:after="120"/>
       </w:pPr>
       <w:r>
         <w:rPr>
           <w:rFonts w:ascii="Times New Roman" w:hAnsi="Times New Roman"/>
           <w:b/>
           <w:color w:val="0F172A"/>
-          <w:sz w:val="40"/>
+          <w:sz w:val="38"/>
         </w:rPr>
         <w:t>MATHEMATICS PROJECT ASSIGNMENT REPORT</w:t>
       </w:r>
@@ -7202,14 +7270,15 @@
     <w:p>
       <w:pPr>
         <w:pStyle w:val="Heading2"/>
-        <w:spacing w:before="240" w:after="80"/>
+        <w:keepNext/>
+        <w:spacing w:before="200" w:after="80"/>
       </w:pPr>
       <w:r>
         <w:rPr>
           <w:rFonts w:ascii="Times New Roman" w:hAnsi="Times New Roman"/>
           <w:b/>
           <w:color w:val="1E3A8A"/>
-          <w:sz w:val="28"/>
+          <w:sz w:val="27"/>
         </w:rPr>
         <w:t>1. ABSTRACT</w:t>
       </w:r>
@@ -7247,14 +7316,15 @@
     <w:p>
       <w:pPr>
         <w:pStyle w:val="Heading2"/>
-        <w:spacing w:before="240" w:after="80"/>
+        <w:keepNext/>
+        <w:spacing w:before="200" w:after="80"/>
       </w:pPr>
       <w:r>
         <w:rPr>
           <w:rFonts w:ascii="Times New Roman" w:hAnsi="Times New Roman"/>
           <w:b/>
           <w:color w:val="1E3A8A"/>
-          <w:sz w:val="28"/>
+          <w:sz w:val="27"/>
         </w:rPr>
         <w:t>2. INTRODUCTION &amp; OBJECTIVES</w:t>
       </w:r>
@@ -7273,14 +7343,15 @@
     <w:p>
       <w:pPr>
         <w:pStyle w:val="Heading3"/>
-        <w:spacing w:before="200" w:after="60"/>
+        <w:keepNext/>
+        <w:spacing w:before="160" w:after="60"/>
       </w:pPr>
       <w:r>
         <w:rPr>
           <w:rFonts w:ascii="Times New Roman" w:hAnsi="Times New Roman"/>
           <w:b/>
           <w:color w:val="334155"/>
-          <w:sz w:val="24"/>
+          <w:sz w:val="23"/>
         </w:rPr>
         <w:t>Project Objectives:</w:t>
       </w:r>
@@ -7356,14 +7427,15 @@
     <w:p>
       <w:pPr>
         <w:pStyle w:val="Heading2"/>
-        <w:spacing w:before="240" w:after="80"/>
+        <w:keepNext/>
+        <w:spacing w:before="200" w:after="80"/>
       </w:pPr>
       <w:r>
         <w:rPr>
           <w:rFonts w:ascii="Times New Roman" w:hAnsi="Times New Roman"/>
           <w:b/>
           <w:color w:val="1E3A8A"/>
-          <w:sz w:val="28"/>
+          <w:sz w:val="27"/>
         </w:rPr>
         <w:t>3. MATHEMATICAL FORMULATION (CRT vs. LCM)</w:t>
       </w:r>
@@ -7371,14 +7443,15 @@
     <w:p>
       <w:pPr>
         <w:pStyle w:val="Heading3"/>
-        <w:spacing w:before="200" w:after="60"/>
+        <w:keepNext/>
+        <w:spacing w:before="160" w:after="60"/>
       </w:pPr>
       <w:r>
         <w:rPr>
           <w:rFonts w:ascii="Times New Roman" w:hAnsi="Times New Roman"/>
           <w:b/>
           <w:color w:val="334155"/>
-          <w:sz w:val="24"/>
+          <w:sz w:val="23"/>
         </w:rPr>
         <w:t>3.1 The Traffic Signal Equations</w:t>
       </w:r>
@@ -7433,14 +7506,15 @@
     <w:p>
       <w:pPr>
         <w:pStyle w:val="Heading3"/>
-        <w:spacing w:before="200" w:after="60"/>
+        <w:keepNext/>
+        <w:spacing w:before="160" w:after="60"/>
       </w:pPr>
       <w:r>
         <w:rPr>
           <w:rFonts w:ascii="Times New Roman" w:hAnsi="Times New Roman"/>
           <w:b/>
           <w:color w:val="334155"/>
-          <w:sz w:val="24"/>
+          <w:sz w:val="23"/>
         </w:rPr>
         <w:t>3.2 Why Simple LCM Cannot Solve This Problem</w:t>
       </w:r>
@@ -7472,14 +7546,15 @@
     <w:p>
       <w:pPr>
         <w:pStyle w:val="Heading3"/>
-        <w:spacing w:before="200" w:after="60"/>
+        <w:keepNext/>
+        <w:spacing w:before="160" w:after="60"/>
       </w:pPr>
       <w:r>
         <w:rPr>
           <w:rFonts w:ascii="Times New Roman" w:hAnsi="Times New Roman"/>
           <w:b/>
           <w:color w:val="334155"/>
-          <w:sz w:val="24"/>
+          <w:sz w:val="23"/>
         </w:rPr>
         <w:t>3.3 CRT Solution Procedure</w:t>
       </w:r>
@@ -7659,14 +7734,15 @@
     <w:p>
       <w:pPr>
         <w:pStyle w:val="Heading2"/>
-        <w:spacing w:before="240" w:after="80"/>
+        <w:keepNext/>
+        <w:spacing w:before="200" w:after="80"/>
       </w:pPr>
       <w:r>
         <w:rPr>
           <w:rFonts w:ascii="Times New Roman" w:hAnsi="Times New Roman"/>
           <w:b/>
           <w:color w:val="1E3A8A"/>
-          <w:sz w:val="28"/>
+          <w:sz w:val="27"/>
         </w:rPr>
         <w:t>4. PHYSICAL HARDWARE &amp; DIGITAL TWIN IMPLEMENTATION</w:t>
       </w:r>
@@ -7684,13 +7760,14 @@
     </w:p>
     <w:p>
       <w:pPr>
-        <w:spacing w:before="120" w:after="120"/>
+        <w:keepNext/>
+        <w:spacing w:before="80" w:after="80"/>
         <w:jc w:val="center"/>
       </w:pPr>
       <w:r>
         <w:drawing>
           <wp:inline xmlns:a="http://schemas.openxmlformats.org/drawingml/2006/main" xmlns:pic="http://schemas.openxmlformats.org/drawingml/2006/picture">
-            <wp:extent cx="5486400" cy="4366617"/>
+            <wp:extent cx="5029200" cy="4002732"/>
             <wp:docPr id="13" name="Picture 13"/>
             <wp:cNvGraphicFramePr>
               <a:graphicFrameLocks noChangeAspect="1"/>
@@ -7711,7 +7788,7 @@
                   <pic:spPr>
                     <a:xfrm>
                       <a:off x="0" y="0"/>
-                      <a:ext cx="5486400" cy="4366617"/>
+                      <a:ext cx="5029200" cy="4002732"/>
                     </a:xfrm>
                     <a:prstGeom prst="rect"/>
                   </pic:spPr>
@@ -7724,13 +7801,14 @@
     </w:p>
     <w:p>
       <w:pPr>
-        <w:spacing w:before="120" w:after="120"/>
+        <w:keepNext/>
+        <w:spacing w:before="80" w:after="80"/>
         <w:jc w:val="center"/>
       </w:pPr>
       <w:r>
         <w:drawing>
           <wp:inline xmlns:a="http://schemas.openxmlformats.org/drawingml/2006/main" xmlns:pic="http://schemas.openxmlformats.org/drawingml/2006/picture">
-            <wp:extent cx="5486400" cy="3804047"/>
+            <wp:extent cx="5029200" cy="3487043"/>
             <wp:docPr id="14" name="Picture 14"/>
             <wp:cNvGraphicFramePr>
               <a:graphicFrameLocks noChangeAspect="1"/>
@@ -7751,7 +7829,7 @@
                   <pic:spPr>
                     <a:xfrm>
                       <a:off x="0" y="0"/>
-                      <a:ext cx="5486400" cy="3804047"/>
+                      <a:ext cx="5029200" cy="3487043"/>
                     </a:xfrm>
                     <a:prstGeom prst="rect"/>
                   </pic:spPr>
@@ -7765,14 +7843,15 @@
     <w:p>
       <w:pPr>
         <w:pStyle w:val="Heading3"/>
-        <w:spacing w:before="200" w:after="60"/>
+        <w:keepNext/>
+        <w:spacing w:before="160" w:after="60"/>
       </w:pPr>
       <w:r>
         <w:rPr>
           <w:rFonts w:ascii="Times New Roman" w:hAnsi="Times New Roman"/>
           <w:b/>
           <w:color w:val="334155"/>
-          <w:sz w:val="24"/>
+          <w:sz w:val="23"/>
         </w:rPr>
         <w:t>Interactive Hardware &amp; Digital Twin Controls:</w:t>
       </w:r>
@@ -7836,14 +7915,15 @@
     <w:p>
       <w:pPr>
         <w:pStyle w:val="Heading2"/>
-        <w:spacing w:before="240" w:after="80"/>
+        <w:keepNext/>
+        <w:spacing w:before="200" w:after="80"/>
       </w:pPr>
       <w:r>
         <w:rPr>
           <w:rFonts w:ascii="Times New Roman" w:hAnsi="Times New Roman"/>
           <w:b/>
           <w:color w:val="1E3A8A"/>
-          <w:sz w:val="28"/>
+          <w:sz w:val="27"/>
         </w:rPr>
         <w:t>5. HARDWARE SOURCE CODE (ARDUINO UNO FIRMWARE - C++)</w:t>
       </w:r>
@@ -7862,7 +7942,7 @@
         <w:rPr>
           <w:rFonts w:ascii="Consolas" w:hAnsi="Consolas"/>
           <w:color w:val="B91C1C"/>
-          <w:sz w:val="19"/>
+          <w:sz w:val="18"/>
         </w:rPr>
         <w:t>arduino/traffic_light_controller.ino</w:t>
       </w:r>
@@ -7875,6 +7955,7 @@
     </w:p>
     <w:p>
       <w:pPr>
+        <w:keepNext/>
         <w:spacing w:before="80" w:after="120"/>
         <w:ind w:left="288"/>
       </w:pPr>
@@ -7882,7 +7963,7 @@
         <w:rPr>
           <w:rFonts w:ascii="Consolas" w:hAnsi="Consolas"/>
           <w:color w:val="1E293B"/>
-          <w:sz w:val="19"/>
+          <w:sz w:val="18"/>
         </w:rPr>
         <w:t>// Arduino Uno / ATmega328P Physical Traffic Light Controller</w:t>
         <w:br/>
@@ -8074,14 +8155,15 @@
     <w:p>
       <w:pPr>
         <w:pStyle w:val="Heading2"/>
-        <w:spacing w:before="240" w:after="80"/>
+        <w:keepNext/>
+        <w:spacing w:before="200" w:after="80"/>
       </w:pPr>
       <w:r>
         <w:rPr>
           <w:rFonts w:ascii="Times New Roman" w:hAnsi="Times New Roman"/>
           <w:b/>
           <w:color w:val="1E3A8A"/>
-          <w:sz w:val="28"/>
+          <w:sz w:val="27"/>
         </w:rPr>
         <w:t>6. CONCLUSION</w:t>
       </w:r>
@@ -8119,14 +8201,15 @@
     <w:p>
       <w:pPr>
         <w:pStyle w:val="Heading2"/>
-        <w:spacing w:before="240" w:after="80"/>
+        <w:keepNext/>
+        <w:spacing w:before="200" w:after="80"/>
       </w:pPr>
       <w:r>
         <w:rPr>
           <w:rFonts w:ascii="Times New Roman" w:hAnsi="Times New Roman"/>
           <w:b/>
           <w:color w:val="1E3A8A"/>
-          <w:sz w:val="28"/>
+          <w:sz w:val="27"/>
         </w:rPr>
         <w:t>7. INDIVIDUAL CONTRIBUTION</w:t>
       </w:r>
@@ -8206,14 +8289,15 @@
     <w:p>
       <w:pPr>
         <w:pStyle w:val="Heading3"/>
-        <w:spacing w:before="200" w:after="60"/>
+        <w:keepNext/>
+        <w:spacing w:before="160" w:after="60"/>
       </w:pPr>
       <w:r>
         <w:rPr>
           <w:rFonts w:ascii="Times New Roman" w:hAnsi="Times New Roman"/>
           <w:b/>
           <w:color w:val="334155"/>
-          <w:sz w:val="24"/>
+          <w:sz w:val="23"/>
         </w:rPr>
         <w:t>Contribution Summary:</w:t>
       </w:r>
@@ -8230,27 +8314,22 @@
       </w:r>
     </w:p>
     <w:p>
-      <w:pPr>
-        <w:spacing w:after="80" w:line="276" w:lineRule="auto"/>
-      </w:pPr>
-      <w:r>
-        <w:rPr>
-          <w:rFonts w:ascii="Times New Roman" w:hAnsi="Times New Roman"/>
-        </w:rPr>
-        <w:t>=========================================================================</w:t>
+      <w:r>
+        <w:br w:type="page"/>
       </w:r>
     </w:p>
     <w:p>
       <w:pPr>
         <w:pStyle w:val="Heading1"/>
-        <w:spacing w:before="280" w:after="120"/>
+        <w:keepNext/>
+        <w:spacing w:before="240" w:after="120"/>
       </w:pPr>
       <w:r>
         <w:rPr>
           <w:rFonts w:ascii="Times New Roman" w:hAnsi="Times New Roman"/>
           <w:b/>
           <w:color w:val="0F172A"/>
-          <w:sz w:val="40"/>
+          <w:sz w:val="38"/>
         </w:rPr>
         <w:t>MATHEMATICS PROJECT ASSIGNMENT REPORT</w:t>
       </w:r>
@@ -8374,14 +8453,15 @@
     <w:p>
       <w:pPr>
         <w:pStyle w:val="Heading2"/>
-        <w:spacing w:before="240" w:after="80"/>
+        <w:keepNext/>
+        <w:spacing w:before="200" w:after="80"/>
       </w:pPr>
       <w:r>
         <w:rPr>
           <w:rFonts w:ascii="Times New Roman" w:hAnsi="Times New Roman"/>
           <w:b/>
           <w:color w:val="1E3A8A"/>
-          <w:sz w:val="28"/>
+          <w:sz w:val="27"/>
         </w:rPr>
         <w:t>1. ABSTRACT</w:t>
       </w:r>
@@ -8419,14 +8499,15 @@
     <w:p>
       <w:pPr>
         <w:pStyle w:val="Heading2"/>
-        <w:spacing w:before="240" w:after="80"/>
+        <w:keepNext/>
+        <w:spacing w:before="200" w:after="80"/>
       </w:pPr>
       <w:r>
         <w:rPr>
           <w:rFonts w:ascii="Times New Roman" w:hAnsi="Times New Roman"/>
           <w:b/>
           <w:color w:val="1E3A8A"/>
-          <w:sz w:val="28"/>
+          <w:sz w:val="27"/>
         </w:rPr>
         <w:t>2. INTRODUCTION &amp; OBJECTIVES</w:t>
       </w:r>
@@ -8445,14 +8526,15 @@
     <w:p>
       <w:pPr>
         <w:pStyle w:val="Heading3"/>
-        <w:spacing w:before="200" w:after="60"/>
+        <w:keepNext/>
+        <w:spacing w:before="160" w:after="60"/>
       </w:pPr>
       <w:r>
         <w:rPr>
           <w:rFonts w:ascii="Times New Roman" w:hAnsi="Times New Roman"/>
           <w:b/>
           <w:color w:val="334155"/>
-          <w:sz w:val="24"/>
+          <w:sz w:val="23"/>
         </w:rPr>
         <w:t>Project Objectives:</w:t>
       </w:r>
@@ -8528,14 +8610,15 @@
     <w:p>
       <w:pPr>
         <w:pStyle w:val="Heading2"/>
-        <w:spacing w:before="240" w:after="80"/>
+        <w:keepNext/>
+        <w:spacing w:before="200" w:after="80"/>
       </w:pPr>
       <w:r>
         <w:rPr>
           <w:rFonts w:ascii="Times New Roman" w:hAnsi="Times New Roman"/>
           <w:b/>
           <w:color w:val="1E3A8A"/>
-          <w:sz w:val="28"/>
+          <w:sz w:val="27"/>
         </w:rPr>
         <w:t>3. MATHEMATICAL FORMULATION (CRT vs. LCM)</w:t>
       </w:r>
@@ -8543,14 +8626,15 @@
     <w:p>
       <w:pPr>
         <w:pStyle w:val="Heading3"/>
-        <w:spacing w:before="200" w:after="60"/>
+        <w:keepNext/>
+        <w:spacing w:before="160" w:after="60"/>
       </w:pPr>
       <w:r>
         <w:rPr>
           <w:rFonts w:ascii="Times New Roman" w:hAnsi="Times New Roman"/>
           <w:b/>
           <w:color w:val="334155"/>
-          <w:sz w:val="24"/>
+          <w:sz w:val="23"/>
         </w:rPr>
         <w:t>3.1 The Traffic Signal Equations</w:t>
       </w:r>
@@ -8605,14 +8689,15 @@
     <w:p>
       <w:pPr>
         <w:pStyle w:val="Heading3"/>
-        <w:spacing w:before="200" w:after="60"/>
+        <w:keepNext/>
+        <w:spacing w:before="160" w:after="60"/>
       </w:pPr>
       <w:r>
         <w:rPr>
           <w:rFonts w:ascii="Times New Roman" w:hAnsi="Times New Roman"/>
           <w:b/>
           <w:color w:val="334155"/>
-          <w:sz w:val="24"/>
+          <w:sz w:val="23"/>
         </w:rPr>
         <w:t>3.2 Why Simple LCM Cannot Solve This Problem</w:t>
       </w:r>
@@ -8644,14 +8729,15 @@
     <w:p>
       <w:pPr>
         <w:pStyle w:val="Heading3"/>
-        <w:spacing w:before="200" w:after="60"/>
+        <w:keepNext/>
+        <w:spacing w:before="160" w:after="60"/>
       </w:pPr>
       <w:r>
         <w:rPr>
           <w:rFonts w:ascii="Times New Roman" w:hAnsi="Times New Roman"/>
           <w:b/>
           <w:color w:val="334155"/>
-          <w:sz w:val="24"/>
+          <w:sz w:val="23"/>
         </w:rPr>
         <w:t>3.3 CRT Solution Procedure</w:t>
       </w:r>
@@ -8831,14 +8917,15 @@
     <w:p>
       <w:pPr>
         <w:pStyle w:val="Heading2"/>
-        <w:spacing w:before="240" w:after="80"/>
+        <w:keepNext/>
+        <w:spacing w:before="200" w:after="80"/>
       </w:pPr>
       <w:r>
         <w:rPr>
           <w:rFonts w:ascii="Times New Roman" w:hAnsi="Times New Roman"/>
           <w:b/>
           <w:color w:val="1E3A8A"/>
-          <w:sz w:val="28"/>
+          <w:sz w:val="27"/>
         </w:rPr>
         <w:t>4. PHYSICAL HARDWARE &amp; DIGITAL TWIN IMPLEMENTATION</w:t>
       </w:r>
@@ -8856,13 +8943,14 @@
     </w:p>
     <w:p>
       <w:pPr>
-        <w:spacing w:before="120" w:after="120"/>
+        <w:keepNext/>
+        <w:spacing w:before="80" w:after="80"/>
         <w:jc w:val="center"/>
       </w:pPr>
       <w:r>
         <w:drawing>
           <wp:inline xmlns:a="http://schemas.openxmlformats.org/drawingml/2006/main" xmlns:pic="http://schemas.openxmlformats.org/drawingml/2006/picture">
-            <wp:extent cx="5486400" cy="4366617"/>
+            <wp:extent cx="5029200" cy="4002732"/>
             <wp:docPr id="15" name="Picture 15"/>
             <wp:cNvGraphicFramePr>
               <a:graphicFrameLocks noChangeAspect="1"/>
@@ -8883,7 +8971,7 @@
                   <pic:spPr>
                     <a:xfrm>
                       <a:off x="0" y="0"/>
-                      <a:ext cx="5486400" cy="4366617"/>
+                      <a:ext cx="5029200" cy="4002732"/>
                     </a:xfrm>
                     <a:prstGeom prst="rect"/>
                   </pic:spPr>
@@ -8896,13 +8984,14 @@
     </w:p>
     <w:p>
       <w:pPr>
-        <w:spacing w:before="120" w:after="120"/>
+        <w:keepNext/>
+        <w:spacing w:before="80" w:after="80"/>
         <w:jc w:val="center"/>
       </w:pPr>
       <w:r>
         <w:drawing>
           <wp:inline xmlns:a="http://schemas.openxmlformats.org/drawingml/2006/main" xmlns:pic="http://schemas.openxmlformats.org/drawingml/2006/picture">
-            <wp:extent cx="5486400" cy="3804047"/>
+            <wp:extent cx="5029200" cy="3487043"/>
             <wp:docPr id="16" name="Picture 16"/>
             <wp:cNvGraphicFramePr>
               <a:graphicFrameLocks noChangeAspect="1"/>
@@ -8923,7 +9012,7 @@
                   <pic:spPr>
                     <a:xfrm>
                       <a:off x="0" y="0"/>
-                      <a:ext cx="5486400" cy="3804047"/>
+                      <a:ext cx="5029200" cy="3487043"/>
                     </a:xfrm>
                     <a:prstGeom prst="rect"/>
                   </pic:spPr>
@@ -8937,14 +9026,15 @@
     <w:p>
       <w:pPr>
         <w:pStyle w:val="Heading3"/>
-        <w:spacing w:before="200" w:after="60"/>
+        <w:keepNext/>
+        <w:spacing w:before="160" w:after="60"/>
       </w:pPr>
       <w:r>
         <w:rPr>
           <w:rFonts w:ascii="Times New Roman" w:hAnsi="Times New Roman"/>
           <w:b/>
           <w:color w:val="334155"/>
-          <w:sz w:val="24"/>
+          <w:sz w:val="23"/>
         </w:rPr>
         <w:t>Interactive Hardware &amp; Digital Twin Controls:</w:t>
       </w:r>
@@ -9008,14 +9098,15 @@
     <w:p>
       <w:pPr>
         <w:pStyle w:val="Heading2"/>
-        <w:spacing w:before="240" w:after="80"/>
+        <w:keepNext/>
+        <w:spacing w:before="200" w:after="80"/>
       </w:pPr>
       <w:r>
         <w:rPr>
           <w:rFonts w:ascii="Times New Roman" w:hAnsi="Times New Roman"/>
           <w:b/>
           <w:color w:val="1E3A8A"/>
-          <w:sz w:val="28"/>
+          <w:sz w:val="27"/>
         </w:rPr>
         <w:t>5. HARDWARE SOURCE CODE (ARDUINO UNO FIRMWARE - C++)</w:t>
       </w:r>
@@ -9034,7 +9125,7 @@
         <w:rPr>
           <w:rFonts w:ascii="Consolas" w:hAnsi="Consolas"/>
           <w:color w:val="B91C1C"/>
-          <w:sz w:val="19"/>
+          <w:sz w:val="18"/>
         </w:rPr>
         <w:t>arduino/traffic_light_controller.ino</w:t>
       </w:r>
@@ -9047,6 +9138,7 @@
     </w:p>
     <w:p>
       <w:pPr>
+        <w:keepNext/>
         <w:spacing w:before="80" w:after="120"/>
         <w:ind w:left="288"/>
       </w:pPr>
@@ -9054,7 +9146,7 @@
         <w:rPr>
           <w:rFonts w:ascii="Consolas" w:hAnsi="Consolas"/>
           <w:color w:val="1E293B"/>
-          <w:sz w:val="19"/>
+          <w:sz w:val="18"/>
         </w:rPr>
         <w:t>// Arduino Uno / ATmega328P Physical Traffic Light Controller</w:t>
         <w:br/>
@@ -9246,14 +9338,15 @@
     <w:p>
       <w:pPr>
         <w:pStyle w:val="Heading2"/>
-        <w:spacing w:before="240" w:after="80"/>
+        <w:keepNext/>
+        <w:spacing w:before="200" w:after="80"/>
       </w:pPr>
       <w:r>
         <w:rPr>
           <w:rFonts w:ascii="Times New Roman" w:hAnsi="Times New Roman"/>
           <w:b/>
           <w:color w:val="1E3A8A"/>
-          <w:sz w:val="28"/>
+          <w:sz w:val="27"/>
         </w:rPr>
         <w:t>6. CONCLUSION</w:t>
       </w:r>
@@ -9291,14 +9384,15 @@
     <w:p>
       <w:pPr>
         <w:pStyle w:val="Heading2"/>
-        <w:spacing w:before="240" w:after="80"/>
+        <w:keepNext/>
+        <w:spacing w:before="200" w:after="80"/>
       </w:pPr>
       <w:r>
         <w:rPr>
           <w:rFonts w:ascii="Times New Roman" w:hAnsi="Times New Roman"/>
           <w:b/>
           <w:color w:val="1E3A8A"/>
-          <w:sz w:val="28"/>
+          <w:sz w:val="27"/>
         </w:rPr>
         <w:t>7. INDIVIDUAL CONTRIBUTION</w:t>
       </w:r>
@@ -9378,14 +9472,15 @@
     <w:p>
       <w:pPr>
         <w:pStyle w:val="Heading3"/>
-        <w:spacing w:before="200" w:after="60"/>
+        <w:keepNext/>
+        <w:spacing w:before="160" w:after="60"/>
       </w:pPr>
       <w:r>
         <w:rPr>
           <w:rFonts w:ascii="Times New Roman" w:hAnsi="Times New Roman"/>
           <w:b/>
           <w:color w:val="334155"/>
-          <w:sz w:val="24"/>
+          <w:sz w:val="23"/>
         </w:rPr>
         <w:t>Contribution Summary:</w:t>
       </w:r>
@@ -9402,27 +9497,22 @@
       </w:r>
     </w:p>
     <w:p>
-      <w:pPr>
-        <w:spacing w:after="80" w:line="276" w:lineRule="auto"/>
-      </w:pPr>
-      <w:r>
-        <w:rPr>
-          <w:rFonts w:ascii="Times New Roman" w:hAnsi="Times New Roman"/>
-        </w:rPr>
-        <w:t>=========================================================================</w:t>
+      <w:r>
+        <w:br w:type="page"/>
       </w:r>
     </w:p>
     <w:p>
       <w:pPr>
         <w:pStyle w:val="Heading1"/>
-        <w:spacing w:before="280" w:after="120"/>
+        <w:keepNext/>
+        <w:spacing w:before="240" w:after="120"/>
       </w:pPr>
       <w:r>
         <w:rPr>
           <w:rFonts w:ascii="Times New Roman" w:hAnsi="Times New Roman"/>
           <w:b/>
           <w:color w:val="0F172A"/>
-          <w:sz w:val="40"/>
+          <w:sz w:val="38"/>
         </w:rPr>
         <w:t>MATHEMATICS PROJECT ASSIGNMENT REPORT</w:t>
       </w:r>
@@ -9546,14 +9636,15 @@
     <w:p>
       <w:pPr>
         <w:pStyle w:val="Heading2"/>
-        <w:spacing w:before="240" w:after="80"/>
+        <w:keepNext/>
+        <w:spacing w:before="200" w:after="80"/>
       </w:pPr>
       <w:r>
         <w:rPr>
           <w:rFonts w:ascii="Times New Roman" w:hAnsi="Times New Roman"/>
           <w:b/>
           <w:color w:val="1E3A8A"/>
-          <w:sz w:val="28"/>
+          <w:sz w:val="27"/>
         </w:rPr>
         <w:t>1. ABSTRACT</w:t>
       </w:r>
@@ -9591,14 +9682,15 @@
     <w:p>
       <w:pPr>
         <w:pStyle w:val="Heading2"/>
-        <w:spacing w:before="240" w:after="80"/>
+        <w:keepNext/>
+        <w:spacing w:before="200" w:after="80"/>
       </w:pPr>
       <w:r>
         <w:rPr>
           <w:rFonts w:ascii="Times New Roman" w:hAnsi="Times New Roman"/>
           <w:b/>
           <w:color w:val="1E3A8A"/>
-          <w:sz w:val="28"/>
+          <w:sz w:val="27"/>
         </w:rPr>
         <w:t>2. INTRODUCTION &amp; OBJECTIVES</w:t>
       </w:r>
@@ -9617,14 +9709,15 @@
     <w:p>
       <w:pPr>
         <w:pStyle w:val="Heading3"/>
-        <w:spacing w:before="200" w:after="60"/>
+        <w:keepNext/>
+        <w:spacing w:before="160" w:after="60"/>
       </w:pPr>
       <w:r>
         <w:rPr>
           <w:rFonts w:ascii="Times New Roman" w:hAnsi="Times New Roman"/>
           <w:b/>
           <w:color w:val="334155"/>
-          <w:sz w:val="24"/>
+          <w:sz w:val="23"/>
         </w:rPr>
         <w:t>Project Objectives:</w:t>
       </w:r>
@@ -9700,14 +9793,15 @@
     <w:p>
       <w:pPr>
         <w:pStyle w:val="Heading2"/>
-        <w:spacing w:before="240" w:after="80"/>
+        <w:keepNext/>
+        <w:spacing w:before="200" w:after="80"/>
       </w:pPr>
       <w:r>
         <w:rPr>
           <w:rFonts w:ascii="Times New Roman" w:hAnsi="Times New Roman"/>
           <w:b/>
           <w:color w:val="1E3A8A"/>
-          <w:sz w:val="28"/>
+          <w:sz w:val="27"/>
         </w:rPr>
         <w:t>3. MATHEMATICAL FORMULATION (CRT vs. LCM)</w:t>
       </w:r>
@@ -9715,14 +9809,15 @@
     <w:p>
       <w:pPr>
         <w:pStyle w:val="Heading3"/>
-        <w:spacing w:before="200" w:after="60"/>
+        <w:keepNext/>
+        <w:spacing w:before="160" w:after="60"/>
       </w:pPr>
       <w:r>
         <w:rPr>
           <w:rFonts w:ascii="Times New Roman" w:hAnsi="Times New Roman"/>
           <w:b/>
           <w:color w:val="334155"/>
-          <w:sz w:val="24"/>
+          <w:sz w:val="23"/>
         </w:rPr>
         <w:t>3.1 The Traffic Signal Equations</w:t>
       </w:r>
@@ -9777,14 +9872,15 @@
     <w:p>
       <w:pPr>
         <w:pStyle w:val="Heading3"/>
-        <w:spacing w:before="200" w:after="60"/>
+        <w:keepNext/>
+        <w:spacing w:before="160" w:after="60"/>
       </w:pPr>
       <w:r>
         <w:rPr>
           <w:rFonts w:ascii="Times New Roman" w:hAnsi="Times New Roman"/>
           <w:b/>
           <w:color w:val="334155"/>
-          <w:sz w:val="24"/>
+          <w:sz w:val="23"/>
         </w:rPr>
         <w:t>3.2 Why Simple LCM Cannot Solve This Problem</w:t>
       </w:r>
@@ -9816,14 +9912,15 @@
     <w:p>
       <w:pPr>
         <w:pStyle w:val="Heading3"/>
-        <w:spacing w:before="200" w:after="60"/>
+        <w:keepNext/>
+        <w:spacing w:before="160" w:after="60"/>
       </w:pPr>
       <w:r>
         <w:rPr>
           <w:rFonts w:ascii="Times New Roman" w:hAnsi="Times New Roman"/>
           <w:b/>
           <w:color w:val="334155"/>
-          <w:sz w:val="24"/>
+          <w:sz w:val="23"/>
         </w:rPr>
         <w:t>3.3 CRT Solution Procedure</w:t>
       </w:r>
@@ -10003,14 +10100,15 @@
     <w:p>
       <w:pPr>
         <w:pStyle w:val="Heading2"/>
-        <w:spacing w:before="240" w:after="80"/>
+        <w:keepNext/>
+        <w:spacing w:before="200" w:after="80"/>
       </w:pPr>
       <w:r>
         <w:rPr>
           <w:rFonts w:ascii="Times New Roman" w:hAnsi="Times New Roman"/>
           <w:b/>
           <w:color w:val="1E3A8A"/>
-          <w:sz w:val="28"/>
+          <w:sz w:val="27"/>
         </w:rPr>
         <w:t>4. PHYSICAL HARDWARE &amp; DIGITAL TWIN IMPLEMENTATION</w:t>
       </w:r>
@@ -10028,13 +10126,14 @@
     </w:p>
     <w:p>
       <w:pPr>
-        <w:spacing w:before="120" w:after="120"/>
+        <w:keepNext/>
+        <w:spacing w:before="80" w:after="80"/>
         <w:jc w:val="center"/>
       </w:pPr>
       <w:r>
         <w:drawing>
           <wp:inline xmlns:a="http://schemas.openxmlformats.org/drawingml/2006/main" xmlns:pic="http://schemas.openxmlformats.org/drawingml/2006/picture">
-            <wp:extent cx="5486400" cy="4366617"/>
+            <wp:extent cx="5029200" cy="4002732"/>
             <wp:docPr id="17" name="Picture 17"/>
             <wp:cNvGraphicFramePr>
               <a:graphicFrameLocks noChangeAspect="1"/>
@@ -10055,7 +10154,7 @@
                   <pic:spPr>
                     <a:xfrm>
                       <a:off x="0" y="0"/>
-                      <a:ext cx="5486400" cy="4366617"/>
+                      <a:ext cx="5029200" cy="4002732"/>
                     </a:xfrm>
                     <a:prstGeom prst="rect"/>
                   </pic:spPr>
@@ -10068,13 +10167,14 @@
     </w:p>
     <w:p>
       <w:pPr>
-        <w:spacing w:before="120" w:after="120"/>
+        <w:keepNext/>
+        <w:spacing w:before="80" w:after="80"/>
         <w:jc w:val="center"/>
       </w:pPr>
       <w:r>
         <w:drawing>
           <wp:inline xmlns:a="http://schemas.openxmlformats.org/drawingml/2006/main" xmlns:pic="http://schemas.openxmlformats.org/drawingml/2006/picture">
-            <wp:extent cx="5486400" cy="3804047"/>
+            <wp:extent cx="5029200" cy="3487043"/>
             <wp:docPr id="18" name="Picture 18"/>
             <wp:cNvGraphicFramePr>
               <a:graphicFrameLocks noChangeAspect="1"/>
@@ -10095,7 +10195,7 @@
                   <pic:spPr>
                     <a:xfrm>
                       <a:off x="0" y="0"/>
-                      <a:ext cx="5486400" cy="3804047"/>
+                      <a:ext cx="5029200" cy="3487043"/>
                     </a:xfrm>
                     <a:prstGeom prst="rect"/>
                   </pic:spPr>
@@ -10109,14 +10209,15 @@
     <w:p>
       <w:pPr>
         <w:pStyle w:val="Heading3"/>
-        <w:spacing w:before="200" w:after="60"/>
+        <w:keepNext/>
+        <w:spacing w:before="160" w:after="60"/>
       </w:pPr>
       <w:r>
         <w:rPr>
           <w:rFonts w:ascii="Times New Roman" w:hAnsi="Times New Roman"/>
           <w:b/>
           <w:color w:val="334155"/>
-          <w:sz w:val="24"/>
+          <w:sz w:val="23"/>
         </w:rPr>
         <w:t>Interactive Hardware &amp; Digital Twin Controls:</w:t>
       </w:r>
@@ -10180,14 +10281,15 @@
     <w:p>
       <w:pPr>
         <w:pStyle w:val="Heading2"/>
-        <w:spacing w:before="240" w:after="80"/>
+        <w:keepNext/>
+        <w:spacing w:before="200" w:after="80"/>
       </w:pPr>
       <w:r>
         <w:rPr>
           <w:rFonts w:ascii="Times New Roman" w:hAnsi="Times New Roman"/>
           <w:b/>
           <w:color w:val="1E3A8A"/>
-          <w:sz w:val="28"/>
+          <w:sz w:val="27"/>
         </w:rPr>
         <w:t>5. HARDWARE SOURCE CODE (ARDUINO UNO FIRMWARE - C++)</w:t>
       </w:r>
@@ -10206,7 +10308,7 @@
         <w:rPr>
           <w:rFonts w:ascii="Consolas" w:hAnsi="Consolas"/>
           <w:color w:val="B91C1C"/>
-          <w:sz w:val="19"/>
+          <w:sz w:val="18"/>
         </w:rPr>
         <w:t>arduino/traffic_light_controller.ino</w:t>
       </w:r>
@@ -10219,6 +10321,7 @@
     </w:p>
     <w:p>
       <w:pPr>
+        <w:keepNext/>
         <w:spacing w:before="80" w:after="120"/>
         <w:ind w:left="288"/>
       </w:pPr>
@@ -10226,7 +10329,7 @@
         <w:rPr>
           <w:rFonts w:ascii="Consolas" w:hAnsi="Consolas"/>
           <w:color w:val="1E293B"/>
-          <w:sz w:val="19"/>
+          <w:sz w:val="18"/>
         </w:rPr>
         <w:t>// Arduino Uno / ATmega328P Physical Traffic Light Controller</w:t>
         <w:br/>
@@ -10418,14 +10521,15 @@
     <w:p>
       <w:pPr>
         <w:pStyle w:val="Heading2"/>
-        <w:spacing w:before="240" w:after="80"/>
+        <w:keepNext/>
+        <w:spacing w:before="200" w:after="80"/>
       </w:pPr>
       <w:r>
         <w:rPr>
           <w:rFonts w:ascii="Times New Roman" w:hAnsi="Times New Roman"/>
           <w:b/>
           <w:color w:val="1E3A8A"/>
-          <w:sz w:val="28"/>
+          <w:sz w:val="27"/>
         </w:rPr>
         <w:t>6. CONCLUSION</w:t>
       </w:r>
@@ -10463,14 +10567,15 @@
     <w:p>
       <w:pPr>
         <w:pStyle w:val="Heading2"/>
-        <w:spacing w:before="240" w:after="80"/>
+        <w:keepNext/>
+        <w:spacing w:before="200" w:after="80"/>
       </w:pPr>
       <w:r>
         <w:rPr>
           <w:rFonts w:ascii="Times New Roman" w:hAnsi="Times New Roman"/>
           <w:b/>
           <w:color w:val="1E3A8A"/>
-          <w:sz w:val="28"/>
+          <w:sz w:val="27"/>
         </w:rPr>
         <w:t>7. INDIVIDUAL CONTRIBUTION</w:t>
       </w:r>
@@ -10550,14 +10655,15 @@
     <w:p>
       <w:pPr>
         <w:pStyle w:val="Heading3"/>
-        <w:spacing w:before="200" w:after="60"/>
+        <w:keepNext/>
+        <w:spacing w:before="160" w:after="60"/>
       </w:pPr>
       <w:r>
         <w:rPr>
           <w:rFonts w:ascii="Times New Roman" w:hAnsi="Times New Roman"/>
           <w:b/>
           <w:color w:val="334155"/>
-          <w:sz w:val="24"/>
+          <w:sz w:val="23"/>
         </w:rPr>
         <w:t>Contribution Summary:</w:t>
       </w:r>
@@ -10574,27 +10680,22 @@
       </w:r>
     </w:p>
     <w:p>
-      <w:pPr>
-        <w:spacing w:after="80" w:line="276" w:lineRule="auto"/>
-      </w:pPr>
-      <w:r>
-        <w:rPr>
-          <w:rFonts w:ascii="Times New Roman" w:hAnsi="Times New Roman"/>
-        </w:rPr>
-        <w:t>=========================================================================</w:t>
+      <w:r>
+        <w:br w:type="page"/>
       </w:r>
     </w:p>
     <w:p>
       <w:pPr>
         <w:pStyle w:val="Heading1"/>
-        <w:spacing w:before="280" w:after="120"/>
+        <w:keepNext/>
+        <w:spacing w:before="240" w:after="120"/>
       </w:pPr>
       <w:r>
         <w:rPr>
           <w:rFonts w:ascii="Times New Roman" w:hAnsi="Times New Roman"/>
           <w:b/>
           <w:color w:val="0F172A"/>
-          <w:sz w:val="40"/>
+          <w:sz w:val="38"/>
         </w:rPr>
         <w:t>MATHEMATICS PROJECT ASSIGNMENT REPORT</w:t>
       </w:r>
@@ -10718,14 +10819,15 @@
     <w:p>
       <w:pPr>
         <w:pStyle w:val="Heading2"/>
-        <w:spacing w:before="240" w:after="80"/>
+        <w:keepNext/>
+        <w:spacing w:before="200" w:after="80"/>
       </w:pPr>
       <w:r>
         <w:rPr>
           <w:rFonts w:ascii="Times New Roman" w:hAnsi="Times New Roman"/>
           <w:b/>
           <w:color w:val="1E3A8A"/>
-          <w:sz w:val="28"/>
+          <w:sz w:val="27"/>
         </w:rPr>
         <w:t>1. ABSTRACT</w:t>
       </w:r>
@@ -10763,14 +10865,15 @@
     <w:p>
       <w:pPr>
         <w:pStyle w:val="Heading2"/>
-        <w:spacing w:before="240" w:after="80"/>
+        <w:keepNext/>
+        <w:spacing w:before="200" w:after="80"/>
       </w:pPr>
       <w:r>
         <w:rPr>
           <w:rFonts w:ascii="Times New Roman" w:hAnsi="Times New Roman"/>
           <w:b/>
           <w:color w:val="1E3A8A"/>
-          <w:sz w:val="28"/>
+          <w:sz w:val="27"/>
         </w:rPr>
         <w:t>2. INTRODUCTION &amp; OBJECTIVES</w:t>
       </w:r>
@@ -10789,14 +10892,15 @@
     <w:p>
       <w:pPr>
         <w:pStyle w:val="Heading3"/>
-        <w:spacing w:before="200" w:after="60"/>
+        <w:keepNext/>
+        <w:spacing w:before="160" w:after="60"/>
       </w:pPr>
       <w:r>
         <w:rPr>
           <w:rFonts w:ascii="Times New Roman" w:hAnsi="Times New Roman"/>
           <w:b/>
           <w:color w:val="334155"/>
-          <w:sz w:val="24"/>
+          <w:sz w:val="23"/>
         </w:rPr>
         <w:t>Project Objectives:</w:t>
       </w:r>
@@ -10872,14 +10976,15 @@
     <w:p>
       <w:pPr>
         <w:pStyle w:val="Heading2"/>
-        <w:spacing w:before="240" w:after="80"/>
+        <w:keepNext/>
+        <w:spacing w:before="200" w:after="80"/>
       </w:pPr>
       <w:r>
         <w:rPr>
           <w:rFonts w:ascii="Times New Roman" w:hAnsi="Times New Roman"/>
           <w:b/>
           <w:color w:val="1E3A8A"/>
-          <w:sz w:val="28"/>
+          <w:sz w:val="27"/>
         </w:rPr>
         <w:t>3. MATHEMATICAL FORMULATION (CRT vs. LCM)</w:t>
       </w:r>
@@ -10887,14 +10992,15 @@
     <w:p>
       <w:pPr>
         <w:pStyle w:val="Heading3"/>
-        <w:spacing w:before="200" w:after="60"/>
+        <w:keepNext/>
+        <w:spacing w:before="160" w:after="60"/>
       </w:pPr>
       <w:r>
         <w:rPr>
           <w:rFonts w:ascii="Times New Roman" w:hAnsi="Times New Roman"/>
           <w:b/>
           <w:color w:val="334155"/>
-          <w:sz w:val="24"/>
+          <w:sz w:val="23"/>
         </w:rPr>
         <w:t>3.1 The Traffic Signal Equations</w:t>
       </w:r>
@@ -10949,14 +11055,15 @@
     <w:p>
       <w:pPr>
         <w:pStyle w:val="Heading3"/>
-        <w:spacing w:before="200" w:after="60"/>
+        <w:keepNext/>
+        <w:spacing w:before="160" w:after="60"/>
       </w:pPr>
       <w:r>
         <w:rPr>
           <w:rFonts w:ascii="Times New Roman" w:hAnsi="Times New Roman"/>
           <w:b/>
           <w:color w:val="334155"/>
-          <w:sz w:val="24"/>
+          <w:sz w:val="23"/>
         </w:rPr>
         <w:t>3.2 Why Simple LCM Cannot Solve This Problem</w:t>
       </w:r>
@@ -10988,14 +11095,15 @@
     <w:p>
       <w:pPr>
         <w:pStyle w:val="Heading3"/>
-        <w:spacing w:before="200" w:after="60"/>
+        <w:keepNext/>
+        <w:spacing w:before="160" w:after="60"/>
       </w:pPr>
       <w:r>
         <w:rPr>
           <w:rFonts w:ascii="Times New Roman" w:hAnsi="Times New Roman"/>
           <w:b/>
           <w:color w:val="334155"/>
-          <w:sz w:val="24"/>
+          <w:sz w:val="23"/>
         </w:rPr>
         <w:t>3.3 CRT Solution Procedure</w:t>
       </w:r>
@@ -11175,14 +11283,15 @@
     <w:p>
       <w:pPr>
         <w:pStyle w:val="Heading2"/>
-        <w:spacing w:before="240" w:after="80"/>
+        <w:keepNext/>
+        <w:spacing w:before="200" w:after="80"/>
       </w:pPr>
       <w:r>
         <w:rPr>
           <w:rFonts w:ascii="Times New Roman" w:hAnsi="Times New Roman"/>
           <w:b/>
           <w:color w:val="1E3A8A"/>
-          <w:sz w:val="28"/>
+          <w:sz w:val="27"/>
         </w:rPr>
         <w:t>4. PHYSICAL HARDWARE &amp; DIGITAL TWIN IMPLEMENTATION</w:t>
       </w:r>
@@ -11200,13 +11309,14 @@
     </w:p>
     <w:p>
       <w:pPr>
-        <w:spacing w:before="120" w:after="120"/>
+        <w:keepNext/>
+        <w:spacing w:before="80" w:after="80"/>
         <w:jc w:val="center"/>
       </w:pPr>
       <w:r>
         <w:drawing>
           <wp:inline xmlns:a="http://schemas.openxmlformats.org/drawingml/2006/main" xmlns:pic="http://schemas.openxmlformats.org/drawingml/2006/picture">
-            <wp:extent cx="5486400" cy="4366617"/>
+            <wp:extent cx="5029200" cy="4002732"/>
             <wp:docPr id="19" name="Picture 19"/>
             <wp:cNvGraphicFramePr>
               <a:graphicFrameLocks noChangeAspect="1"/>
@@ -11227,7 +11337,7 @@
                   <pic:spPr>
                     <a:xfrm>
                       <a:off x="0" y="0"/>
-                      <a:ext cx="5486400" cy="4366617"/>
+                      <a:ext cx="5029200" cy="4002732"/>
                     </a:xfrm>
                     <a:prstGeom prst="rect"/>
                   </pic:spPr>
@@ -11240,13 +11350,14 @@
     </w:p>
     <w:p>
       <w:pPr>
-        <w:spacing w:before="120" w:after="120"/>
+        <w:keepNext/>
+        <w:spacing w:before="80" w:after="80"/>
         <w:jc w:val="center"/>
       </w:pPr>
       <w:r>
         <w:drawing>
           <wp:inline xmlns:a="http://schemas.openxmlformats.org/drawingml/2006/main" xmlns:pic="http://schemas.openxmlformats.org/drawingml/2006/picture">
-            <wp:extent cx="5486400" cy="3804047"/>
+            <wp:extent cx="5029200" cy="3487043"/>
             <wp:docPr id="20" name="Picture 20"/>
             <wp:cNvGraphicFramePr>
               <a:graphicFrameLocks noChangeAspect="1"/>
@@ -11267,7 +11378,7 @@
                   <pic:spPr>
                     <a:xfrm>
                       <a:off x="0" y="0"/>
-                      <a:ext cx="5486400" cy="3804047"/>
+                      <a:ext cx="5029200" cy="3487043"/>
                     </a:xfrm>
                     <a:prstGeom prst="rect"/>
                   </pic:spPr>
@@ -11281,14 +11392,15 @@
     <w:p>
       <w:pPr>
         <w:pStyle w:val="Heading3"/>
-        <w:spacing w:before="200" w:after="60"/>
+        <w:keepNext/>
+        <w:spacing w:before="160" w:after="60"/>
       </w:pPr>
       <w:r>
         <w:rPr>
           <w:rFonts w:ascii="Times New Roman" w:hAnsi="Times New Roman"/>
           <w:b/>
           <w:color w:val="334155"/>
-          <w:sz w:val="24"/>
+          <w:sz w:val="23"/>
         </w:rPr>
         <w:t>Interactive Hardware &amp; Digital Twin Controls:</w:t>
       </w:r>
@@ -11352,14 +11464,15 @@
     <w:p>
       <w:pPr>
         <w:pStyle w:val="Heading2"/>
-        <w:spacing w:before="240" w:after="80"/>
+        <w:keepNext/>
+        <w:spacing w:before="200" w:after="80"/>
       </w:pPr>
       <w:r>
         <w:rPr>
           <w:rFonts w:ascii="Times New Roman" w:hAnsi="Times New Roman"/>
           <w:b/>
           <w:color w:val="1E3A8A"/>
-          <w:sz w:val="28"/>
+          <w:sz w:val="27"/>
         </w:rPr>
         <w:t>5. HARDWARE SOURCE CODE (ARDUINO UNO FIRMWARE - C++)</w:t>
       </w:r>
@@ -11378,7 +11491,7 @@
         <w:rPr>
           <w:rFonts w:ascii="Consolas" w:hAnsi="Consolas"/>
           <w:color w:val="B91C1C"/>
-          <w:sz w:val="19"/>
+          <w:sz w:val="18"/>
         </w:rPr>
         <w:t>arduino/traffic_light_controller.ino</w:t>
       </w:r>
@@ -11391,6 +11504,7 @@
     </w:p>
     <w:p>
       <w:pPr>
+        <w:keepNext/>
         <w:spacing w:before="80" w:after="120"/>
         <w:ind w:left="288"/>
       </w:pPr>
@@ -11398,7 +11512,7 @@
         <w:rPr>
           <w:rFonts w:ascii="Consolas" w:hAnsi="Consolas"/>
           <w:color w:val="1E293B"/>
-          <w:sz w:val="19"/>
+          <w:sz w:val="18"/>
         </w:rPr>
         <w:t>// Arduino Uno / ATmega328P Physical Traffic Light Controller</w:t>
         <w:br/>
@@ -11590,14 +11704,15 @@
     <w:p>
       <w:pPr>
         <w:pStyle w:val="Heading2"/>
-        <w:spacing w:before="240" w:after="80"/>
+        <w:keepNext/>
+        <w:spacing w:before="200" w:after="80"/>
       </w:pPr>
       <w:r>
         <w:rPr>
           <w:rFonts w:ascii="Times New Roman" w:hAnsi="Times New Roman"/>
           <w:b/>
           <w:color w:val="1E3A8A"/>
-          <w:sz w:val="28"/>
+          <w:sz w:val="27"/>
         </w:rPr>
         <w:t>6. CONCLUSION</w:t>
       </w:r>
@@ -11635,14 +11750,15 @@
     <w:p>
       <w:pPr>
         <w:pStyle w:val="Heading2"/>
-        <w:spacing w:before="240" w:after="80"/>
+        <w:keepNext/>
+        <w:spacing w:before="200" w:after="80"/>
       </w:pPr>
       <w:r>
         <w:rPr>
           <w:rFonts w:ascii="Times New Roman" w:hAnsi="Times New Roman"/>
           <w:b/>
           <w:color w:val="1E3A8A"/>
-          <w:sz w:val="28"/>
+          <w:sz w:val="27"/>
         </w:rPr>
         <w:t>7. INDIVIDUAL CONTRIBUTION</w:t>
       </w:r>
@@ -11722,14 +11838,15 @@
     <w:p>
       <w:pPr>
         <w:pStyle w:val="Heading3"/>
-        <w:spacing w:before="200" w:after="60"/>
+        <w:keepNext/>
+        <w:spacing w:before="160" w:after="60"/>
       </w:pPr>
       <w:r>
         <w:rPr>
           <w:rFonts w:ascii="Times New Roman" w:hAnsi="Times New Roman"/>
           <w:b/>
           <w:color w:val="334155"/>
-          <w:sz w:val="24"/>
+          <w:sz w:val="23"/>
         </w:rPr>
         <w:t>Contribution Summary:</w:t>
       </w:r>
@@ -11746,19 +11863,13 @@
       </w:r>
     </w:p>
     <w:p>
-      <w:pPr>
-        <w:spacing w:after="80" w:line="276" w:lineRule="auto"/>
-      </w:pPr>
-      <w:r>
-        <w:rPr>
-          <w:rFonts w:ascii="Times New Roman" w:hAnsi="Times New Roman"/>
-        </w:rPr>
-        <w:t>=========================================================================</w:t>
+      <w:r>
+        <w:br w:type="page"/>
       </w:r>
     </w:p>
     <w:sectPr>
       <w:pgSz w:w="12240" w:h="15840"/>
-      <w:pgMar w:top="1224" w:right="1224" w:bottom="1224" w:left="1224" w:header="720" w:footer="720" w:gutter="0"/>
+      <w:pgMar w:top="1152" w:right="1152" w:bottom="1152" w:left="1152" w:header="720" w:footer="720" w:gutter="0"/>
       <w:cols w:space="720"/>
       <w:docGrid w:linePitch="360"/>
     </w:sectPr>

</xml_diff>

<commit_message>
Replace ATmega references strictly with Arduino Nano across reports, app, and docs
</commit_message>
<xml_diff>
--- a/docs/Master_CRT_Assignment_Reports.docx
+++ b/docs/Master_CRT_Assignment_Reports.docx
@@ -204,7 +204,7 @@
         <w:rPr>
           <w:rFonts w:ascii="Times New Roman" w:hAnsi="Times New Roman"/>
         </w:rPr>
-        <w:t>This project demonstrates CRT using both a physical working ATmega328P / Arduino Uno traffic signal model and an interactive digital twin web application. By modeling traffic signals as modular timing cycles, the project illustrates how independent light timers (3s, 5s, 7s) align to create a continuous 'Green Wave' for vehicles at Minute 23 (105s master recurrence).</w:t>
+        <w:t>This project demonstrates CRT using both a physical working Arduino Nano traffic signal model and an interactive digital twin web application. By modeling traffic signals as modular timing cycles, the project illustrates how independent light timers (3s, 5s, 7s) align to create a continuous 'Green Wave' for vehicles at Minute 23 (105s master recurrence).</w:t>
       </w:r>
     </w:p>
     <w:p>
@@ -303,7 +303,7 @@
         <w:rPr>
           <w:rFonts w:ascii="Times New Roman" w:hAnsi="Times New Roman"/>
         </w:rPr>
-        <w:t>To build a physical working model powered by an Arduino Uno / ATmega328P microcontroller.</w:t>
+        <w:t>To build a physical working model powered by an Arduino Nano microcontroller.</w:t>
       </w:r>
     </w:p>
     <w:p>
@@ -657,7 +657,7 @@
         <w:rPr>
           <w:rFonts w:ascii="Times New Roman" w:hAnsi="Times New Roman"/>
         </w:rPr>
-        <w:t>The hardware prototype is driven by an ATmega328P (Arduino Uno) microcontroller controlling a 3-intersection LED traffic array and piezo buzzer.</w:t>
+        <w:t>The hardware prototype is driven by an Arduino Nano microcontroller controlling a 3-intersection LED traffic array and piezo buzzer.</w:t>
       </w:r>
     </w:p>
     <w:p>
@@ -909,7 +909,7 @@
           <w:color w:val="1E3A8A"/>
           <w:sz w:val="27"/>
         </w:rPr>
-        <w:t>5. HARDWARE SOURCE CODE (ARDUINO UNO FIRMWARE - C++)</w:t>
+        <w:t>5. HARDWARE SOURCE CODE (ARDUINO NANO FIRMWARE - C++)</w:t>
       </w:r>
     </w:p>
     <w:p>
@@ -934,7 +934,7 @@
         <w:rPr>
           <w:rFonts w:ascii="Times New Roman" w:hAnsi="Times New Roman"/>
         </w:rPr>
-        <w:t>) is executed directly on the Arduino Uno microcontroller to drive the physical traffic light hardware:</w:t>
+        <w:t>) is executed directly on the Arduino Nano microcontroller to drive the physical traffic light hardware:</w:t>
       </w:r>
     </w:p>
     <w:p>
@@ -949,7 +949,7 @@
           <w:color w:val="1E293B"/>
           <w:sz w:val="18"/>
         </w:rPr>
-        <w:t>// Arduino Uno / ATmega328P Physical Traffic Light Controller</w:t>
+        <w:t>// Arduino Nano Physical Traffic Light Controller</w:t>
         <w:br/>
         <w:t>// File: arduino/traffic_light_controller.ino</w:t>
         <w:br/>
@@ -1171,7 +1171,7 @@
         <w:rPr>
           <w:rFonts w:ascii="Times New Roman" w:hAnsi="Times New Roman"/>
         </w:rPr>
-        <w:t>Both the physical Arduino Uno hardware prototype and the digital twin web application successfully visualize modular congruences, offering an accessible learning tool that highlights the real-world power of modular arithmetic in signal timing, telecommunications, and digital computing.</w:t>
+        <w:t>Both the physical Arduino Nano hardware prototype and the digital twin web application successfully visualize modular congruences, offering an accessible learning tool that highlights the real-world power of modular arithmetic in signal timing, telecommunications, and digital computing.</w:t>
       </w:r>
     </w:p>
     <w:p>
@@ -1469,7 +1469,7 @@
         <w:rPr>
           <w:rFonts w:ascii="Times New Roman" w:hAnsi="Times New Roman"/>
         </w:rPr>
-        <w:t>This project demonstrates CRT using both a physical working ATmega328P / Arduino Uno traffic signal model and an interactive digital twin web application. By modeling traffic signals as modular timing cycles, the project illustrates how independent light timers (3s, 5s, 7s) align to create a continuous 'Green Wave' for vehicles at Minute 23 (105s master recurrence).</w:t>
+        <w:t>This project demonstrates CRT using both a physical working Arduino Nano traffic signal model and an interactive digital twin web application. By modeling traffic signals as modular timing cycles, the project illustrates how independent light timers (3s, 5s, 7s) align to create a continuous 'Green Wave' for vehicles at Minute 23 (105s master recurrence).</w:t>
       </w:r>
     </w:p>
     <w:p>
@@ -1568,7 +1568,7 @@
         <w:rPr>
           <w:rFonts w:ascii="Times New Roman" w:hAnsi="Times New Roman"/>
         </w:rPr>
-        <w:t>To build a physical working model powered by an Arduino Uno / ATmega328P microcontroller.</w:t>
+        <w:t>To build a physical working model powered by an Arduino Nano microcontroller.</w:t>
       </w:r>
     </w:p>
     <w:p>
@@ -1922,7 +1922,7 @@
         <w:rPr>
           <w:rFonts w:ascii="Times New Roman" w:hAnsi="Times New Roman"/>
         </w:rPr>
-        <w:t>The hardware prototype is driven by an ATmega328P (Arduino Uno) microcontroller controlling a 3-intersection LED traffic array and piezo buzzer.</w:t>
+        <w:t>The hardware prototype is driven by an Arduino Nano microcontroller controlling a 3-intersection LED traffic array and piezo buzzer.</w:t>
       </w:r>
     </w:p>
     <w:p>
@@ -2174,7 +2174,7 @@
           <w:color w:val="1E3A8A"/>
           <w:sz w:val="27"/>
         </w:rPr>
-        <w:t>5. HARDWARE SOURCE CODE (ARDUINO UNO FIRMWARE - C++)</w:t>
+        <w:t>5. HARDWARE SOURCE CODE (ARDUINO NANO FIRMWARE - C++)</w:t>
       </w:r>
     </w:p>
     <w:p>
@@ -2199,7 +2199,7 @@
         <w:rPr>
           <w:rFonts w:ascii="Times New Roman" w:hAnsi="Times New Roman"/>
         </w:rPr>
-        <w:t>) is executed directly on the Arduino Uno microcontroller to drive the physical traffic light hardware:</w:t>
+        <w:t>) is executed directly on the Arduino Nano microcontroller to drive the physical traffic light hardware:</w:t>
       </w:r>
     </w:p>
     <w:p>
@@ -2214,7 +2214,7 @@
           <w:color w:val="1E293B"/>
           <w:sz w:val="18"/>
         </w:rPr>
-        <w:t>// Arduino Uno / ATmega328P Physical Traffic Light Controller</w:t>
+        <w:t>// Arduino Nano Physical Traffic Light Controller</w:t>
         <w:br/>
         <w:t>// File: arduino/traffic_light_controller.ino</w:t>
         <w:br/>
@@ -2436,7 +2436,7 @@
         <w:rPr>
           <w:rFonts w:ascii="Times New Roman" w:hAnsi="Times New Roman"/>
         </w:rPr>
-        <w:t>Both the physical Arduino Uno hardware prototype and the digital twin web application successfully visualize modular congruences, offering an accessible learning tool that highlights the real-world power of modular arithmetic in signal timing, telecommunications, and digital computing.</w:t>
+        <w:t>Both the physical Arduino Nano hardware prototype and the digital twin web application successfully visualize modular congruences, offering an accessible learning tool that highlights the real-world power of modular arithmetic in signal timing, telecommunications, and digital computing.</w:t>
       </w:r>
     </w:p>
     <w:p>
@@ -2734,7 +2734,7 @@
         <w:rPr>
           <w:rFonts w:ascii="Times New Roman" w:hAnsi="Times New Roman"/>
         </w:rPr>
-        <w:t>This project demonstrates CRT using both a physical working ATmega328P / Arduino Uno traffic signal model and an interactive digital twin web application. By modeling traffic signals as modular timing cycles, the project illustrates how independent light timers (3s, 5s, 7s) align to create a continuous 'Green Wave' for vehicles at Minute 23 (105s master recurrence).</w:t>
+        <w:t>This project demonstrates CRT using both a physical working Arduino Nano traffic signal model and an interactive digital twin web application. By modeling traffic signals as modular timing cycles, the project illustrates how independent light timers (3s, 5s, 7s) align to create a continuous 'Green Wave' for vehicles at Minute 23 (105s master recurrence).</w:t>
       </w:r>
     </w:p>
     <w:p>
@@ -2833,7 +2833,7 @@
         <w:rPr>
           <w:rFonts w:ascii="Times New Roman" w:hAnsi="Times New Roman"/>
         </w:rPr>
-        <w:t>To build a physical working model powered by an Arduino Uno / ATmega328P microcontroller.</w:t>
+        <w:t>To build a physical working model powered by an Arduino Nano microcontroller.</w:t>
       </w:r>
     </w:p>
     <w:p>
@@ -3187,7 +3187,7 @@
         <w:rPr>
           <w:rFonts w:ascii="Times New Roman" w:hAnsi="Times New Roman"/>
         </w:rPr>
-        <w:t>The hardware prototype is driven by an ATmega328P (Arduino Uno) microcontroller controlling a 3-intersection LED traffic array and piezo buzzer.</w:t>
+        <w:t>The hardware prototype is driven by an Arduino Nano microcontroller controlling a 3-intersection LED traffic array and piezo buzzer.</w:t>
       </w:r>
     </w:p>
     <w:p>
@@ -3439,7 +3439,7 @@
           <w:color w:val="1E3A8A"/>
           <w:sz w:val="27"/>
         </w:rPr>
-        <w:t>5. HARDWARE SOURCE CODE (ARDUINO UNO FIRMWARE - C++)</w:t>
+        <w:t>5. HARDWARE SOURCE CODE (ARDUINO NANO FIRMWARE - C++)</w:t>
       </w:r>
     </w:p>
     <w:p>
@@ -3464,7 +3464,7 @@
         <w:rPr>
           <w:rFonts w:ascii="Times New Roman" w:hAnsi="Times New Roman"/>
         </w:rPr>
-        <w:t>) is executed directly on the Arduino Uno microcontroller to drive the physical traffic light hardware:</w:t>
+        <w:t>) is executed directly on the Arduino Nano microcontroller to drive the physical traffic light hardware:</w:t>
       </w:r>
     </w:p>
     <w:p>
@@ -3479,7 +3479,7 @@
           <w:color w:val="1E293B"/>
           <w:sz w:val="18"/>
         </w:rPr>
-        <w:t>// Arduino Uno / ATmega328P Physical Traffic Light Controller</w:t>
+        <w:t>// Arduino Nano Physical Traffic Light Controller</w:t>
         <w:br/>
         <w:t>// File: arduino/traffic_light_controller.ino</w:t>
         <w:br/>
@@ -3701,7 +3701,7 @@
         <w:rPr>
           <w:rFonts w:ascii="Times New Roman" w:hAnsi="Times New Roman"/>
         </w:rPr>
-        <w:t>Both the physical Arduino Uno hardware prototype and the digital twin web application successfully visualize modular congruences, offering an accessible learning tool that highlights the real-world power of modular arithmetic in signal timing, telecommunications, and digital computing.</w:t>
+        <w:t>Both the physical Arduino Nano hardware prototype and the digital twin web application successfully visualize modular congruences, offering an accessible learning tool that highlights the real-world power of modular arithmetic in signal timing, telecommunications, and digital computing.</w:t>
       </w:r>
     </w:p>
     <w:p>
@@ -3999,7 +3999,7 @@
         <w:rPr>
           <w:rFonts w:ascii="Times New Roman" w:hAnsi="Times New Roman"/>
         </w:rPr>
-        <w:t>This project demonstrates CRT using both a physical working ATmega328P / Arduino Uno traffic signal model and an interactive digital twin web application. By modeling traffic signals as modular timing cycles, the project illustrates how independent light timers (3s, 5s, 7s) align to create a continuous 'Green Wave' for vehicles at Minute 23 (105s master recurrence).</w:t>
+        <w:t>This project demonstrates CRT using both a physical working Arduino Nano traffic signal model and an interactive digital twin web application. By modeling traffic signals as modular timing cycles, the project illustrates how independent light timers (3s, 5s, 7s) align to create a continuous 'Green Wave' for vehicles at Minute 23 (105s master recurrence).</w:t>
       </w:r>
     </w:p>
     <w:p>
@@ -4098,7 +4098,7 @@
         <w:rPr>
           <w:rFonts w:ascii="Times New Roman" w:hAnsi="Times New Roman"/>
         </w:rPr>
-        <w:t>To build a physical working model powered by an Arduino Uno / ATmega328P microcontroller.</w:t>
+        <w:t>To build a physical working model powered by an Arduino Nano microcontroller.</w:t>
       </w:r>
     </w:p>
     <w:p>
@@ -4452,7 +4452,7 @@
         <w:rPr>
           <w:rFonts w:ascii="Times New Roman" w:hAnsi="Times New Roman"/>
         </w:rPr>
-        <w:t>The hardware prototype is driven by an ATmega328P (Arduino Uno) microcontroller controlling a 3-intersection LED traffic array and piezo buzzer.</w:t>
+        <w:t>The hardware prototype is driven by an Arduino Nano microcontroller controlling a 3-intersection LED traffic array and piezo buzzer.</w:t>
       </w:r>
     </w:p>
     <w:p>
@@ -4704,7 +4704,7 @@
           <w:color w:val="1E3A8A"/>
           <w:sz w:val="27"/>
         </w:rPr>
-        <w:t>5. HARDWARE SOURCE CODE (ARDUINO UNO FIRMWARE - C++)</w:t>
+        <w:t>5. HARDWARE SOURCE CODE (ARDUINO NANO FIRMWARE - C++)</w:t>
       </w:r>
     </w:p>
     <w:p>
@@ -4729,7 +4729,7 @@
         <w:rPr>
           <w:rFonts w:ascii="Times New Roman" w:hAnsi="Times New Roman"/>
         </w:rPr>
-        <w:t>) is executed directly on the Arduino Uno microcontroller to drive the physical traffic light hardware:</w:t>
+        <w:t>) is executed directly on the Arduino Nano microcontroller to drive the physical traffic light hardware:</w:t>
       </w:r>
     </w:p>
     <w:p>
@@ -4744,7 +4744,7 @@
           <w:color w:val="1E293B"/>
           <w:sz w:val="18"/>
         </w:rPr>
-        <w:t>// Arduino Uno / ATmega328P Physical Traffic Light Controller</w:t>
+        <w:t>// Arduino Nano Physical Traffic Light Controller</w:t>
         <w:br/>
         <w:t>// File: arduino/traffic_light_controller.ino</w:t>
         <w:br/>
@@ -4966,7 +4966,7 @@
         <w:rPr>
           <w:rFonts w:ascii="Times New Roman" w:hAnsi="Times New Roman"/>
         </w:rPr>
-        <w:t>Both the physical Arduino Uno hardware prototype and the digital twin web application successfully visualize modular congruences, offering an accessible learning tool that highlights the real-world power of modular arithmetic in signal timing, telecommunications, and digital computing.</w:t>
+        <w:t>Both the physical Arduino Nano hardware prototype and the digital twin web application successfully visualize modular congruences, offering an accessible learning tool that highlights the real-world power of modular arithmetic in signal timing, telecommunications, and digital computing.</w:t>
       </w:r>
     </w:p>
     <w:p>
@@ -5264,7 +5264,7 @@
         <w:rPr>
           <w:rFonts w:ascii="Times New Roman" w:hAnsi="Times New Roman"/>
         </w:rPr>
-        <w:t>This project demonstrates CRT using both a physical working ATmega328P / Arduino Uno traffic signal model and an interactive digital twin web application. By modeling traffic signals as modular timing cycles, the project illustrates how independent light timers (3s, 5s, 7s) align to create a continuous 'Green Wave' for vehicles at Minute 23 (105s master recurrence).</w:t>
+        <w:t>This project demonstrates CRT using both a physical working Arduino Nano traffic signal model and an interactive digital twin web application. By modeling traffic signals as modular timing cycles, the project illustrates how independent light timers (3s, 5s, 7s) align to create a continuous 'Green Wave' for vehicles at Minute 23 (105s master recurrence).</w:t>
       </w:r>
     </w:p>
     <w:p>
@@ -5363,7 +5363,7 @@
         <w:rPr>
           <w:rFonts w:ascii="Times New Roman" w:hAnsi="Times New Roman"/>
         </w:rPr>
-        <w:t>To build a physical working model powered by an Arduino Uno / ATmega328P microcontroller.</w:t>
+        <w:t>To build a physical working model powered by an Arduino Nano microcontroller.</w:t>
       </w:r>
     </w:p>
     <w:p>
@@ -5717,7 +5717,7 @@
         <w:rPr>
           <w:rFonts w:ascii="Times New Roman" w:hAnsi="Times New Roman"/>
         </w:rPr>
-        <w:t>The hardware prototype is driven by an ATmega328P (Arduino Uno) microcontroller controlling a 3-intersection LED traffic array and piezo buzzer.</w:t>
+        <w:t>The hardware prototype is driven by an Arduino Nano microcontroller controlling a 3-intersection LED traffic array and piezo buzzer.</w:t>
       </w:r>
     </w:p>
     <w:p>
@@ -5969,7 +5969,7 @@
           <w:color w:val="1E3A8A"/>
           <w:sz w:val="27"/>
         </w:rPr>
-        <w:t>5. HARDWARE SOURCE CODE (ARDUINO UNO FIRMWARE - C++)</w:t>
+        <w:t>5. HARDWARE SOURCE CODE (ARDUINO NANO FIRMWARE - C++)</w:t>
       </w:r>
     </w:p>
     <w:p>
@@ -5994,7 +5994,7 @@
         <w:rPr>
           <w:rFonts w:ascii="Times New Roman" w:hAnsi="Times New Roman"/>
         </w:rPr>
-        <w:t>) is executed directly on the Arduino Uno microcontroller to drive the physical traffic light hardware:</w:t>
+        <w:t>) is executed directly on the Arduino Nano microcontroller to drive the physical traffic light hardware:</w:t>
       </w:r>
     </w:p>
     <w:p>
@@ -6009,7 +6009,7 @@
           <w:color w:val="1E293B"/>
           <w:sz w:val="18"/>
         </w:rPr>
-        <w:t>// Arduino Uno / ATmega328P Physical Traffic Light Controller</w:t>
+        <w:t>// Arduino Nano Physical Traffic Light Controller</w:t>
         <w:br/>
         <w:t>// File: arduino/traffic_light_controller.ino</w:t>
         <w:br/>
@@ -6231,7 +6231,7 @@
         <w:rPr>
           <w:rFonts w:ascii="Times New Roman" w:hAnsi="Times New Roman"/>
         </w:rPr>
-        <w:t>Both the physical Arduino Uno hardware prototype and the digital twin web application successfully visualize modular congruences, offering an accessible learning tool that highlights the real-world power of modular arithmetic in signal timing, telecommunications, and digital computing.</w:t>
+        <w:t>Both the physical Arduino Nano hardware prototype and the digital twin web application successfully visualize modular congruences, offering an accessible learning tool that highlights the real-world power of modular arithmetic in signal timing, telecommunications, and digital computing.</w:t>
       </w:r>
     </w:p>
     <w:p>
@@ -6529,7 +6529,7 @@
         <w:rPr>
           <w:rFonts w:ascii="Times New Roman" w:hAnsi="Times New Roman"/>
         </w:rPr>
-        <w:t>This project demonstrates CRT using both a physical working ATmega328P / Arduino Uno traffic signal model and an interactive digital twin web application. By modeling traffic signals as modular timing cycles, the project illustrates how independent light timers (3s, 5s, 7s) align to create a continuous 'Green Wave' for vehicles at Minute 23 (105s master recurrence).</w:t>
+        <w:t>This project demonstrates CRT using both a physical working Arduino Nano traffic signal model and an interactive digital twin web application. By modeling traffic signals as modular timing cycles, the project illustrates how independent light timers (3s, 5s, 7s) align to create a continuous 'Green Wave' for vehicles at Minute 23 (105s master recurrence).</w:t>
       </w:r>
     </w:p>
     <w:p>
@@ -6628,7 +6628,7 @@
         <w:rPr>
           <w:rFonts w:ascii="Times New Roman" w:hAnsi="Times New Roman"/>
         </w:rPr>
-        <w:t>To build a physical working model powered by an Arduino Uno / ATmega328P microcontroller.</w:t>
+        <w:t>To build a physical working model powered by an Arduino Nano microcontroller.</w:t>
       </w:r>
     </w:p>
     <w:p>
@@ -6982,7 +6982,7 @@
         <w:rPr>
           <w:rFonts w:ascii="Times New Roman" w:hAnsi="Times New Roman"/>
         </w:rPr>
-        <w:t>The hardware prototype is driven by an ATmega328P (Arduino Uno) microcontroller controlling a 3-intersection LED traffic array and piezo buzzer.</w:t>
+        <w:t>The hardware prototype is driven by an Arduino Nano microcontroller controlling a 3-intersection LED traffic array and piezo buzzer.</w:t>
       </w:r>
     </w:p>
     <w:p>
@@ -7234,7 +7234,7 @@
           <w:color w:val="1E3A8A"/>
           <w:sz w:val="27"/>
         </w:rPr>
-        <w:t>5. HARDWARE SOURCE CODE (ARDUINO UNO FIRMWARE - C++)</w:t>
+        <w:t>5. HARDWARE SOURCE CODE (ARDUINO NANO FIRMWARE - C++)</w:t>
       </w:r>
     </w:p>
     <w:p>
@@ -7259,7 +7259,7 @@
         <w:rPr>
           <w:rFonts w:ascii="Times New Roman" w:hAnsi="Times New Roman"/>
         </w:rPr>
-        <w:t>) is executed directly on the Arduino Uno microcontroller to drive the physical traffic light hardware:</w:t>
+        <w:t>) is executed directly on the Arduino Nano microcontroller to drive the physical traffic light hardware:</w:t>
       </w:r>
     </w:p>
     <w:p>
@@ -7274,7 +7274,7 @@
           <w:color w:val="1E293B"/>
           <w:sz w:val="18"/>
         </w:rPr>
-        <w:t>// Arduino Uno / ATmega328P Physical Traffic Light Controller</w:t>
+        <w:t>// Arduino Nano Physical Traffic Light Controller</w:t>
         <w:br/>
         <w:t>// File: arduino/traffic_light_controller.ino</w:t>
         <w:br/>
@@ -7496,7 +7496,7 @@
         <w:rPr>
           <w:rFonts w:ascii="Times New Roman" w:hAnsi="Times New Roman"/>
         </w:rPr>
-        <w:t>Both the physical Arduino Uno hardware prototype and the digital twin web application successfully visualize modular congruences, offering an accessible learning tool that highlights the real-world power of modular arithmetic in signal timing, telecommunications, and digital computing.</w:t>
+        <w:t>Both the physical Arduino Nano hardware prototype and the digital twin web application successfully visualize modular congruences, offering an accessible learning tool that highlights the real-world power of modular arithmetic in signal timing, telecommunications, and digital computing.</w:t>
       </w:r>
     </w:p>
     <w:p>
@@ -7794,7 +7794,7 @@
         <w:rPr>
           <w:rFonts w:ascii="Times New Roman" w:hAnsi="Times New Roman"/>
         </w:rPr>
-        <w:t>This project demonstrates CRT using both a physical working ATmega328P / Arduino Uno traffic signal model and an interactive digital twin web application. By modeling traffic signals as modular timing cycles, the project illustrates how independent light timers (3s, 5s, 7s) align to create a continuous 'Green Wave' for vehicles at Minute 23 (105s master recurrence).</w:t>
+        <w:t>This project demonstrates CRT using both a physical working Arduino Nano traffic signal model and an interactive digital twin web application. By modeling traffic signals as modular timing cycles, the project illustrates how independent light timers (3s, 5s, 7s) align to create a continuous 'Green Wave' for vehicles at Minute 23 (105s master recurrence).</w:t>
       </w:r>
     </w:p>
     <w:p>
@@ -7893,7 +7893,7 @@
         <w:rPr>
           <w:rFonts w:ascii="Times New Roman" w:hAnsi="Times New Roman"/>
         </w:rPr>
-        <w:t>To build a physical working model powered by an Arduino Uno / ATmega328P microcontroller.</w:t>
+        <w:t>To build a physical working model powered by an Arduino Nano microcontroller.</w:t>
       </w:r>
     </w:p>
     <w:p>
@@ -8247,7 +8247,7 @@
         <w:rPr>
           <w:rFonts w:ascii="Times New Roman" w:hAnsi="Times New Roman"/>
         </w:rPr>
-        <w:t>The hardware prototype is driven by an ATmega328P (Arduino Uno) microcontroller controlling a 3-intersection LED traffic array and piezo buzzer.</w:t>
+        <w:t>The hardware prototype is driven by an Arduino Nano microcontroller controlling a 3-intersection LED traffic array and piezo buzzer.</w:t>
       </w:r>
     </w:p>
     <w:p>
@@ -8499,7 +8499,7 @@
           <w:color w:val="1E3A8A"/>
           <w:sz w:val="27"/>
         </w:rPr>
-        <w:t>5. HARDWARE SOURCE CODE (ARDUINO UNO FIRMWARE - C++)</w:t>
+        <w:t>5. HARDWARE SOURCE CODE (ARDUINO NANO FIRMWARE - C++)</w:t>
       </w:r>
     </w:p>
     <w:p>
@@ -8524,7 +8524,7 @@
         <w:rPr>
           <w:rFonts w:ascii="Times New Roman" w:hAnsi="Times New Roman"/>
         </w:rPr>
-        <w:t>) is executed directly on the Arduino Uno microcontroller to drive the physical traffic light hardware:</w:t>
+        <w:t>) is executed directly on the Arduino Nano microcontroller to drive the physical traffic light hardware:</w:t>
       </w:r>
     </w:p>
     <w:p>
@@ -8539,7 +8539,7 @@
           <w:color w:val="1E293B"/>
           <w:sz w:val="18"/>
         </w:rPr>
-        <w:t>// Arduino Uno / ATmega328P Physical Traffic Light Controller</w:t>
+        <w:t>// Arduino Nano Physical Traffic Light Controller</w:t>
         <w:br/>
         <w:t>// File: arduino/traffic_light_controller.ino</w:t>
         <w:br/>
@@ -8761,7 +8761,7 @@
         <w:rPr>
           <w:rFonts w:ascii="Times New Roman" w:hAnsi="Times New Roman"/>
         </w:rPr>
-        <w:t>Both the physical Arduino Uno hardware prototype and the digital twin web application successfully visualize modular congruences, offering an accessible learning tool that highlights the real-world power of modular arithmetic in signal timing, telecommunications, and digital computing.</w:t>
+        <w:t>Both the physical Arduino Nano hardware prototype and the digital twin web application successfully visualize modular congruences, offering an accessible learning tool that highlights the real-world power of modular arithmetic in signal timing, telecommunications, and digital computing.</w:t>
       </w:r>
     </w:p>
     <w:p>
@@ -9059,7 +9059,7 @@
         <w:rPr>
           <w:rFonts w:ascii="Times New Roman" w:hAnsi="Times New Roman"/>
         </w:rPr>
-        <w:t>This project demonstrates CRT using both a physical working ATmega328P / Arduino Uno traffic signal model and an interactive digital twin web application. By modeling traffic signals as modular timing cycles, the project illustrates how independent light timers (3s, 5s, 7s) align to create a continuous 'Green Wave' for vehicles at Minute 23 (105s master recurrence).</w:t>
+        <w:t>This project demonstrates CRT using both a physical working Arduino Nano traffic signal model and an interactive digital twin web application. By modeling traffic signals as modular timing cycles, the project illustrates how independent light timers (3s, 5s, 7s) align to create a continuous 'Green Wave' for vehicles at Minute 23 (105s master recurrence).</w:t>
       </w:r>
     </w:p>
     <w:p>
@@ -9158,7 +9158,7 @@
         <w:rPr>
           <w:rFonts w:ascii="Times New Roman" w:hAnsi="Times New Roman"/>
         </w:rPr>
-        <w:t>To build a physical working model powered by an Arduino Uno / ATmega328P microcontroller.</w:t>
+        <w:t>To build a physical working model powered by an Arduino Nano microcontroller.</w:t>
       </w:r>
     </w:p>
     <w:p>
@@ -9512,7 +9512,7 @@
         <w:rPr>
           <w:rFonts w:ascii="Times New Roman" w:hAnsi="Times New Roman"/>
         </w:rPr>
-        <w:t>The hardware prototype is driven by an ATmega328P (Arduino Uno) microcontroller controlling a 3-intersection LED traffic array and piezo buzzer.</w:t>
+        <w:t>The hardware prototype is driven by an Arduino Nano microcontroller controlling a 3-intersection LED traffic array and piezo buzzer.</w:t>
       </w:r>
     </w:p>
     <w:p>
@@ -9764,7 +9764,7 @@
           <w:color w:val="1E3A8A"/>
           <w:sz w:val="27"/>
         </w:rPr>
-        <w:t>5. HARDWARE SOURCE CODE (ARDUINO UNO FIRMWARE - C++)</w:t>
+        <w:t>5. HARDWARE SOURCE CODE (ARDUINO NANO FIRMWARE - C++)</w:t>
       </w:r>
     </w:p>
     <w:p>
@@ -9789,7 +9789,7 @@
         <w:rPr>
           <w:rFonts w:ascii="Times New Roman" w:hAnsi="Times New Roman"/>
         </w:rPr>
-        <w:t>) is executed directly on the Arduino Uno microcontroller to drive the physical traffic light hardware:</w:t>
+        <w:t>) is executed directly on the Arduino Nano microcontroller to drive the physical traffic light hardware:</w:t>
       </w:r>
     </w:p>
     <w:p>
@@ -9804,7 +9804,7 @@
           <w:color w:val="1E293B"/>
           <w:sz w:val="18"/>
         </w:rPr>
-        <w:t>// Arduino Uno / ATmega328P Physical Traffic Light Controller</w:t>
+        <w:t>// Arduino Nano Physical Traffic Light Controller</w:t>
         <w:br/>
         <w:t>// File: arduino/traffic_light_controller.ino</w:t>
         <w:br/>
@@ -10026,7 +10026,7 @@
         <w:rPr>
           <w:rFonts w:ascii="Times New Roman" w:hAnsi="Times New Roman"/>
         </w:rPr>
-        <w:t>Both the physical Arduino Uno hardware prototype and the digital twin web application successfully visualize modular congruences, offering an accessible learning tool that highlights the real-world power of modular arithmetic in signal timing, telecommunications, and digital computing.</w:t>
+        <w:t>Both the physical Arduino Nano hardware prototype and the digital twin web application successfully visualize modular congruences, offering an accessible learning tool that highlights the real-world power of modular arithmetic in signal timing, telecommunications, and digital computing.</w:t>
       </w:r>
     </w:p>
     <w:p>
@@ -10324,7 +10324,7 @@
         <w:rPr>
           <w:rFonts w:ascii="Times New Roman" w:hAnsi="Times New Roman"/>
         </w:rPr>
-        <w:t>This project demonstrates CRT using both a physical working ATmega328P / Arduino Uno traffic signal model and an interactive digital twin web application. By modeling traffic signals as modular timing cycles, the project illustrates how independent light timers (3s, 5s, 7s) align to create a continuous 'Green Wave' for vehicles at Minute 23 (105s master recurrence).</w:t>
+        <w:t>This project demonstrates CRT using both a physical working Arduino Nano traffic signal model and an interactive digital twin web application. By modeling traffic signals as modular timing cycles, the project illustrates how independent light timers (3s, 5s, 7s) align to create a continuous 'Green Wave' for vehicles at Minute 23 (105s master recurrence).</w:t>
       </w:r>
     </w:p>
     <w:p>
@@ -10423,7 +10423,7 @@
         <w:rPr>
           <w:rFonts w:ascii="Times New Roman" w:hAnsi="Times New Roman"/>
         </w:rPr>
-        <w:t>To build a physical working model powered by an Arduino Uno / ATmega328P microcontroller.</w:t>
+        <w:t>To build a physical working model powered by an Arduino Nano microcontroller.</w:t>
       </w:r>
     </w:p>
     <w:p>
@@ -10777,7 +10777,7 @@
         <w:rPr>
           <w:rFonts w:ascii="Times New Roman" w:hAnsi="Times New Roman"/>
         </w:rPr>
-        <w:t>The hardware prototype is driven by an ATmega328P (Arduino Uno) microcontroller controlling a 3-intersection LED traffic array and piezo buzzer.</w:t>
+        <w:t>The hardware prototype is driven by an Arduino Nano microcontroller controlling a 3-intersection LED traffic array and piezo buzzer.</w:t>
       </w:r>
     </w:p>
     <w:p>
@@ -11029,7 +11029,7 @@
           <w:color w:val="1E3A8A"/>
           <w:sz w:val="27"/>
         </w:rPr>
-        <w:t>5. HARDWARE SOURCE CODE (ARDUINO UNO FIRMWARE - C++)</w:t>
+        <w:t>5. HARDWARE SOURCE CODE (ARDUINO NANO FIRMWARE - C++)</w:t>
       </w:r>
     </w:p>
     <w:p>
@@ -11054,7 +11054,7 @@
         <w:rPr>
           <w:rFonts w:ascii="Times New Roman" w:hAnsi="Times New Roman"/>
         </w:rPr>
-        <w:t>) is executed directly on the Arduino Uno microcontroller to drive the physical traffic light hardware:</w:t>
+        <w:t>) is executed directly on the Arduino Nano microcontroller to drive the physical traffic light hardware:</w:t>
       </w:r>
     </w:p>
     <w:p>
@@ -11069,7 +11069,7 @@
           <w:color w:val="1E293B"/>
           <w:sz w:val="18"/>
         </w:rPr>
-        <w:t>// Arduino Uno / ATmega328P Physical Traffic Light Controller</w:t>
+        <w:t>// Arduino Nano Physical Traffic Light Controller</w:t>
         <w:br/>
         <w:t>// File: arduino/traffic_light_controller.ino</w:t>
         <w:br/>
@@ -11291,7 +11291,7 @@
         <w:rPr>
           <w:rFonts w:ascii="Times New Roman" w:hAnsi="Times New Roman"/>
         </w:rPr>
-        <w:t>Both the physical Arduino Uno hardware prototype and the digital twin web application successfully visualize modular congruences, offering an accessible learning tool that highlights the real-world power of modular arithmetic in signal timing, telecommunications, and digital computing.</w:t>
+        <w:t>Both the physical Arduino Nano hardware prototype and the digital twin web application successfully visualize modular congruences, offering an accessible learning tool that highlights the real-world power of modular arithmetic in signal timing, telecommunications, and digital computing.</w:t>
       </w:r>
     </w:p>
     <w:p>
@@ -11589,7 +11589,7 @@
         <w:rPr>
           <w:rFonts w:ascii="Times New Roman" w:hAnsi="Times New Roman"/>
         </w:rPr>
-        <w:t>This project demonstrates CRT using both a physical working ATmega328P / Arduino Uno traffic signal model and an interactive digital twin web application. By modeling traffic signals as modular timing cycles, the project illustrates how independent light timers (3s, 5s, 7s) align to create a continuous 'Green Wave' for vehicles at Minute 23 (105s master recurrence).</w:t>
+        <w:t>This project demonstrates CRT using both a physical working Arduino Nano traffic signal model and an interactive digital twin web application. By modeling traffic signals as modular timing cycles, the project illustrates how independent light timers (3s, 5s, 7s) align to create a continuous 'Green Wave' for vehicles at Minute 23 (105s master recurrence).</w:t>
       </w:r>
     </w:p>
     <w:p>
@@ -11688,7 +11688,7 @@
         <w:rPr>
           <w:rFonts w:ascii="Times New Roman" w:hAnsi="Times New Roman"/>
         </w:rPr>
-        <w:t>To build a physical working model powered by an Arduino Uno / ATmega328P microcontroller.</w:t>
+        <w:t>To build a physical working model powered by an Arduino Nano microcontroller.</w:t>
       </w:r>
     </w:p>
     <w:p>
@@ -12042,7 +12042,7 @@
         <w:rPr>
           <w:rFonts w:ascii="Times New Roman" w:hAnsi="Times New Roman"/>
         </w:rPr>
-        <w:t>The hardware prototype is driven by an ATmega328P (Arduino Uno) microcontroller controlling a 3-intersection LED traffic array and piezo buzzer.</w:t>
+        <w:t>The hardware prototype is driven by an Arduino Nano microcontroller controlling a 3-intersection LED traffic array and piezo buzzer.</w:t>
       </w:r>
     </w:p>
     <w:p>
@@ -12294,7 +12294,7 @@
           <w:color w:val="1E3A8A"/>
           <w:sz w:val="27"/>
         </w:rPr>
-        <w:t>5. HARDWARE SOURCE CODE (ARDUINO UNO FIRMWARE - C++)</w:t>
+        <w:t>5. HARDWARE SOURCE CODE (ARDUINO NANO FIRMWARE - C++)</w:t>
       </w:r>
     </w:p>
     <w:p>
@@ -12319,7 +12319,7 @@
         <w:rPr>
           <w:rFonts w:ascii="Times New Roman" w:hAnsi="Times New Roman"/>
         </w:rPr>
-        <w:t>) is executed directly on the Arduino Uno microcontroller to drive the physical traffic light hardware:</w:t>
+        <w:t>) is executed directly on the Arduino Nano microcontroller to drive the physical traffic light hardware:</w:t>
       </w:r>
     </w:p>
     <w:p>
@@ -12334,7 +12334,7 @@
           <w:color w:val="1E293B"/>
           <w:sz w:val="18"/>
         </w:rPr>
-        <w:t>// Arduino Uno / ATmega328P Physical Traffic Light Controller</w:t>
+        <w:t>// Arduino Nano Physical Traffic Light Controller</w:t>
         <w:br/>
         <w:t>// File: arduino/traffic_light_controller.ino</w:t>
         <w:br/>
@@ -12556,7 +12556,7 @@
         <w:rPr>
           <w:rFonts w:ascii="Times New Roman" w:hAnsi="Times New Roman"/>
         </w:rPr>
-        <w:t>Both the physical Arduino Uno hardware prototype and the digital twin web application successfully visualize modular congruences, offering an accessible learning tool that highlights the real-world power of modular arithmetic in signal timing, telecommunications, and digital computing.</w:t>
+        <w:t>Both the physical Arduino Nano hardware prototype and the digital twin web application successfully visualize modular congruences, offering an accessible learning tool that highlights the real-world power of modular arithmetic in signal timing, telecommunications, and digital computing.</w:t>
       </w:r>
     </w:p>
     <w:p>

</xml_diff>

<commit_message>
Remove Master Assignment Reports Collection title header from master document
</commit_message>
<xml_diff>
--- a/docs/Master_CRT_Assignment_Reports.docx
+++ b/docs/Master_CRT_Assignment_Reports.docx
@@ -2,41 +2,6 @@
 <file path=word/document.xml><?xml version="1.0" encoding="utf-8"?>
 <w:document xmlns:wpc="http://schemas.microsoft.com/office/word/2010/wordprocessingCanvas" xmlns:mo="http://schemas.microsoft.com/office/mac/office/2008/main" xmlns:mc="http://schemas.openxmlformats.org/markup-compatibility/2006" xmlns:mv="urn:schemas-microsoft-com:mac:vml" xmlns:o="urn:schemas-microsoft-com:office:office" xmlns:r="http://schemas.openxmlformats.org/officeDocument/2006/relationships" xmlns:m="http://schemas.openxmlformats.org/officeDocument/2006/math" xmlns:v="urn:schemas-microsoft-com:vml" xmlns:wp14="http://schemas.microsoft.com/office/word/2010/wordprocessingDrawing" xmlns:wp="http://schemas.openxmlformats.org/drawingml/2006/wordprocessingDrawing" xmlns:w10="urn:schemas-microsoft-com:office:word" xmlns:w="http://schemas.openxmlformats.org/wordprocessingml/2006/main" xmlns:w14="http://schemas.microsoft.com/office/word/2010/wordml" xmlns:wpg="http://schemas.microsoft.com/office/word/2010/wordprocessingGroup" xmlns:wpi="http://schemas.microsoft.com/office/word/2010/wordprocessingInk" xmlns:wne="http://schemas.microsoft.com/office/word/2006/wordml" xmlns:wps="http://schemas.microsoft.com/office/word/2010/wordprocessingShape" mc:Ignorable="w14 wp14">
   <w:body>
-    <w:p>
-      <w:pPr>
-        <w:pStyle w:val="Heading1"/>
-        <w:keepNext/>
-        <w:spacing w:before="240" w:after="120"/>
-      </w:pPr>
-      <w:r>
-        <w:rPr>
-          <w:rFonts w:ascii="Times New Roman" w:hAnsi="Times New Roman"/>
-          <w:b/>
-          <w:color w:val="0F172A"/>
-          <w:sz w:val="38"/>
-        </w:rPr>
-        <w:t>MASTER ASSIGNMENT REPORTS COLLECTION — TRAFFIC SIGNAL SYNCHRONIZATION</w:t>
-      </w:r>
-    </w:p>
-    <w:p>
-      <w:pPr>
-        <w:spacing w:after="80" w:line="276" w:lineRule="auto"/>
-      </w:pPr>
-      <w:r>
-        <w:rPr>
-          <w:rFonts w:ascii="Times New Roman" w:hAnsi="Times New Roman"/>
-        </w:rPr>
-        <w:t>This document contains the individual project assignment reports for all 10 group members.</w:t>
-      </w:r>
-    </w:p>
-    <w:p>
-      <w:pPr>
-        <w:spacing w:after="120"/>
-        <w:pBdr>
-          <w:bottom w:val="single" w:sz="6" w:space="1" w:color="CBD5E1"/>
-        </w:pBdr>
-      </w:pPr>
-    </w:p>
     <w:p>
       <w:pPr>
         <w:pStyle w:val="Heading1"/>

</xml_diff>

<commit_message>
Convert report header metadata section into a 2-column layout across markdown, PDF, and DOCX
</commit_message>
<xml_diff>
--- a/docs/Master_CRT_Assignment_Reports.docx
+++ b/docs/Master_CRT_Assignment_Reports.docx
@@ -18,113 +18,165 @@
         <w:t>MATHEMATICS PROJECT ASSIGNMENT REPORT</w:t>
       </w:r>
     </w:p>
-    <w:p>
-      <w:pPr>
-        <w:spacing w:after="80" w:line="276" w:lineRule="auto"/>
-      </w:pPr>
-      <w:r>
-        <w:rPr>
-          <w:rFonts w:ascii="Times New Roman" w:hAnsi="Times New Roman"/>
-          <w:b/>
-        </w:rPr>
-        <w:t>PROJECT TITLE:</w:t>
-      </w:r>
-      <w:r>
-        <w:rPr>
-          <w:rFonts w:ascii="Times New Roman" w:hAnsi="Times New Roman"/>
-        </w:rPr>
-        <w:t xml:space="preserve"> Traffic Signal Synchronization System Using Chinese Remainder Theorem  </w:t>
-      </w:r>
-    </w:p>
-    <w:p>
-      <w:pPr>
-        <w:spacing w:after="80" w:line="276" w:lineRule="auto"/>
-      </w:pPr>
-      <w:r>
-        <w:rPr>
-          <w:rFonts w:ascii="Times New Roman" w:hAnsi="Times New Roman"/>
-          <w:b/>
-        </w:rPr>
-        <w:t>COURSE:</w:t>
-      </w:r>
-      <w:r>
-        <w:rPr>
-          <w:rFonts w:ascii="Times New Roman" w:hAnsi="Times New Roman"/>
-        </w:rPr>
-        <w:t xml:space="preserve"> Number Theory &amp; Discrete Mathematics Application  </w:t>
-      </w:r>
-    </w:p>
-    <w:p>
-      <w:pPr>
-        <w:spacing w:after="80" w:line="276" w:lineRule="auto"/>
-      </w:pPr>
-      <w:r>
-        <w:rPr>
-          <w:rFonts w:ascii="Times New Roman" w:hAnsi="Times New Roman"/>
-          <w:b/>
-        </w:rPr>
-        <w:t>CLASS:</w:t>
-      </w:r>
-      <w:r>
-        <w:rPr>
-          <w:rFonts w:ascii="Times New Roman" w:hAnsi="Times New Roman"/>
-        </w:rPr>
-        <w:t xml:space="preserve"> S3 CSE B  </w:t>
-      </w:r>
-    </w:p>
-    <w:p>
-      <w:pPr>
-        <w:spacing w:after="80" w:line="276" w:lineRule="auto"/>
-      </w:pPr>
-      <w:r>
-        <w:rPr>
-          <w:rFonts w:ascii="Times New Roman" w:hAnsi="Times New Roman"/>
-          <w:b/>
-        </w:rPr>
-        <w:t>STUDENT NAME:</w:t>
-      </w:r>
-      <w:r>
-        <w:rPr>
-          <w:rFonts w:ascii="Times New Roman" w:hAnsi="Times New Roman"/>
-        </w:rPr>
-        <w:t xml:space="preserve"> Joel Duke  </w:t>
-      </w:r>
-    </w:p>
-    <w:p>
-      <w:pPr>
-        <w:spacing w:after="80" w:line="276" w:lineRule="auto"/>
-      </w:pPr>
-      <w:r>
-        <w:rPr>
-          <w:rFonts w:ascii="Times New Roman" w:hAnsi="Times New Roman"/>
-          <w:b/>
-        </w:rPr>
-        <w:t>ROLL NO:</w:t>
-      </w:r>
-      <w:r>
-        <w:rPr>
-          <w:rFonts w:ascii="Times New Roman" w:hAnsi="Times New Roman"/>
-        </w:rPr>
-        <w:t xml:space="preserve"> 51  </w:t>
-      </w:r>
-    </w:p>
-    <w:p>
-      <w:pPr>
-        <w:spacing w:after="80" w:line="276" w:lineRule="auto"/>
-      </w:pPr>
-      <w:r>
-        <w:rPr>
-          <w:rFonts w:ascii="Times New Roman" w:hAnsi="Times New Roman"/>
-          <w:b/>
-        </w:rPr>
-        <w:t>ROLE / FUNCTION:</w:t>
-      </w:r>
-      <w:r>
-        <w:rPr>
-          <w:rFonts w:ascii="Times New Roman" w:hAnsi="Times New Roman"/>
-        </w:rPr>
-        <w:t xml:space="preserve"> Mathematical Research &amp; Problem Formulation  </w:t>
-      </w:r>
+    <w:tbl>
+      <w:tblPr>
+        <w:tblW w:type="auto" w:w="0"/>
+        <w:tblLayout w:type="fixed"/>
+        <w:tblLook w:firstColumn="1" w:firstRow="1" w:lastColumn="0" w:lastRow="0" w:noHBand="0" w:noVBand="1" w:val="04A0"/>
+      </w:tblPr>
+      <w:tblGrid>
+        <w:gridCol w:w="4968"/>
+        <w:gridCol w:w="4968"/>
+      </w:tblGrid>
+      <w:tr>
+        <w:tc>
+          <w:tcPr>
+            <w:tcW w:type="dxa" w:w="4896"/>
+          </w:tcPr>
+          <w:p>
+            <w:pPr>
+              <w:spacing w:before="40" w:after="40"/>
+            </w:pPr>
+            <w:r>
+              <w:rPr>
+                <w:rFonts w:ascii="Times New Roman" w:hAnsi="Times New Roman"/>
+                <w:b/>
+              </w:rPr>
+              <w:t>PROJECT TITLE:</w:t>
+            </w:r>
+            <w:r>
+              <w:rPr>
+                <w:rFonts w:ascii="Times New Roman" w:hAnsi="Times New Roman"/>
+              </w:rPr>
+              <w:t xml:space="preserve"> Traffic Signal Synchronization System Using Chinese Remainder Theorem</w:t>
+            </w:r>
+          </w:p>
+        </w:tc>
+        <w:tc>
+          <w:tcPr>
+            <w:tcW w:type="dxa" w:w="4608"/>
+          </w:tcPr>
+          <w:p>
+            <w:pPr>
+              <w:spacing w:before="40" w:after="40"/>
+            </w:pPr>
+            <w:r>
+              <w:rPr>
+                <w:rFonts w:ascii="Times New Roman" w:hAnsi="Times New Roman"/>
+                <w:b/>
+              </w:rPr>
+              <w:t>STUDENT NAME:</w:t>
+            </w:r>
+            <w:r>
+              <w:rPr>
+                <w:rFonts w:ascii="Times New Roman" w:hAnsi="Times New Roman"/>
+              </w:rPr>
+              <w:t xml:space="preserve"> Joel Duke</w:t>
+            </w:r>
+          </w:p>
+        </w:tc>
+      </w:tr>
+      <w:tr>
+        <w:tc>
+          <w:tcPr>
+            <w:tcW w:type="dxa" w:w="4896"/>
+          </w:tcPr>
+          <w:p>
+            <w:pPr>
+              <w:spacing w:before="40" w:after="40"/>
+            </w:pPr>
+            <w:r>
+              <w:rPr>
+                <w:rFonts w:ascii="Times New Roman" w:hAnsi="Times New Roman"/>
+                <w:b/>
+              </w:rPr>
+              <w:t>COURSE:</w:t>
+            </w:r>
+            <w:r>
+              <w:rPr>
+                <w:rFonts w:ascii="Times New Roman" w:hAnsi="Times New Roman"/>
+              </w:rPr>
+              <w:t xml:space="preserve"> Number Theory &amp; Discrete Mathematics Application</w:t>
+            </w:r>
+          </w:p>
+        </w:tc>
+        <w:tc>
+          <w:tcPr>
+            <w:tcW w:type="dxa" w:w="4608"/>
+          </w:tcPr>
+          <w:p>
+            <w:pPr>
+              <w:spacing w:before="40" w:after="40"/>
+            </w:pPr>
+            <w:r>
+              <w:rPr>
+                <w:rFonts w:ascii="Times New Roman" w:hAnsi="Times New Roman"/>
+                <w:b/>
+              </w:rPr>
+              <w:t>ROLL NO:</w:t>
+            </w:r>
+            <w:r>
+              <w:rPr>
+                <w:rFonts w:ascii="Times New Roman" w:hAnsi="Times New Roman"/>
+              </w:rPr>
+              <w:t xml:space="preserve"> 51</w:t>
+            </w:r>
+          </w:p>
+        </w:tc>
+      </w:tr>
+      <w:tr>
+        <w:tc>
+          <w:tcPr>
+            <w:tcW w:type="dxa" w:w="4896"/>
+          </w:tcPr>
+          <w:p>
+            <w:pPr>
+              <w:spacing w:before="40" w:after="40"/>
+            </w:pPr>
+            <w:r>
+              <w:rPr>
+                <w:rFonts w:ascii="Times New Roman" w:hAnsi="Times New Roman"/>
+                <w:b/>
+              </w:rPr>
+              <w:t>CLASS:</w:t>
+            </w:r>
+            <w:r>
+              <w:rPr>
+                <w:rFonts w:ascii="Times New Roman" w:hAnsi="Times New Roman"/>
+              </w:rPr>
+              <w:t xml:space="preserve"> S3 CSE B</w:t>
+            </w:r>
+          </w:p>
+        </w:tc>
+        <w:tc>
+          <w:tcPr>
+            <w:tcW w:type="dxa" w:w="4608"/>
+          </w:tcPr>
+          <w:p>
+            <w:pPr>
+              <w:spacing w:before="40" w:after="40"/>
+            </w:pPr>
+            <w:r>
+              <w:rPr>
+                <w:rFonts w:ascii="Times New Roman" w:hAnsi="Times New Roman"/>
+                <w:b/>
+              </w:rPr>
+              <w:t>ROLE / FUNCTION:</w:t>
+            </w:r>
+            <w:r>
+              <w:rPr>
+                <w:rFonts w:ascii="Times New Roman" w:hAnsi="Times New Roman"/>
+              </w:rPr>
+              <w:t xml:space="preserve"> Mathematical Research &amp; Problem Formulation</w:t>
+            </w:r>
+          </w:p>
+        </w:tc>
+      </w:tr>
+    </w:tbl>
+    <w:p>
+      <w:pPr>
+        <w:spacing w:after="80"/>
+      </w:pPr>
     </w:p>
     <w:p>
       <w:pPr>
@@ -1283,113 +1335,165 @@
         <w:t>MATHEMATICS PROJECT ASSIGNMENT REPORT</w:t>
       </w:r>
     </w:p>
-    <w:p>
-      <w:pPr>
-        <w:spacing w:after="80" w:line="276" w:lineRule="auto"/>
-      </w:pPr>
-      <w:r>
-        <w:rPr>
-          <w:rFonts w:ascii="Times New Roman" w:hAnsi="Times New Roman"/>
-          <w:b/>
-        </w:rPr>
-        <w:t>PROJECT TITLE:</w:t>
-      </w:r>
-      <w:r>
-        <w:rPr>
-          <w:rFonts w:ascii="Times New Roman" w:hAnsi="Times New Roman"/>
-        </w:rPr>
-        <w:t xml:space="preserve"> Traffic Signal Synchronization System Using Chinese Remainder Theorem  </w:t>
-      </w:r>
-    </w:p>
-    <w:p>
-      <w:pPr>
-        <w:spacing w:after="80" w:line="276" w:lineRule="auto"/>
-      </w:pPr>
-      <w:r>
-        <w:rPr>
-          <w:rFonts w:ascii="Times New Roman" w:hAnsi="Times New Roman"/>
-          <w:b/>
-        </w:rPr>
-        <w:t>COURSE:</w:t>
-      </w:r>
-      <w:r>
-        <w:rPr>
-          <w:rFonts w:ascii="Times New Roman" w:hAnsi="Times New Roman"/>
-        </w:rPr>
-        <w:t xml:space="preserve"> Number Theory &amp; Discrete Mathematics Application  </w:t>
-      </w:r>
-    </w:p>
-    <w:p>
-      <w:pPr>
-        <w:spacing w:after="80" w:line="276" w:lineRule="auto"/>
-      </w:pPr>
-      <w:r>
-        <w:rPr>
-          <w:rFonts w:ascii="Times New Roman" w:hAnsi="Times New Roman"/>
-          <w:b/>
-        </w:rPr>
-        <w:t>CLASS:</w:t>
-      </w:r>
-      <w:r>
-        <w:rPr>
-          <w:rFonts w:ascii="Times New Roman" w:hAnsi="Times New Roman"/>
-        </w:rPr>
-        <w:t xml:space="preserve"> S3 CSE B  </w:t>
-      </w:r>
-    </w:p>
-    <w:p>
-      <w:pPr>
-        <w:spacing w:after="80" w:line="276" w:lineRule="auto"/>
-      </w:pPr>
-      <w:r>
-        <w:rPr>
-          <w:rFonts w:ascii="Times New Roman" w:hAnsi="Times New Roman"/>
-          <w:b/>
-        </w:rPr>
-        <w:t>STUDENT NAME:</w:t>
-      </w:r>
-      <w:r>
-        <w:rPr>
-          <w:rFonts w:ascii="Times New Roman" w:hAnsi="Times New Roman"/>
-        </w:rPr>
-        <w:t xml:space="preserve"> Joel Geo Manuel  </w:t>
-      </w:r>
-    </w:p>
-    <w:p>
-      <w:pPr>
-        <w:spacing w:after="80" w:line="276" w:lineRule="auto"/>
-      </w:pPr>
-      <w:r>
-        <w:rPr>
-          <w:rFonts w:ascii="Times New Roman" w:hAnsi="Times New Roman"/>
-          <w:b/>
-        </w:rPr>
-        <w:t>ROLL NO:</w:t>
-      </w:r>
-      <w:r>
-        <w:rPr>
-          <w:rFonts w:ascii="Times New Roman" w:hAnsi="Times New Roman"/>
-        </w:rPr>
-        <w:t xml:space="preserve"> 52  </w:t>
-      </w:r>
-    </w:p>
-    <w:p>
-      <w:pPr>
-        <w:spacing w:after="80" w:line="276" w:lineRule="auto"/>
-      </w:pPr>
-      <w:r>
-        <w:rPr>
-          <w:rFonts w:ascii="Times New Roman" w:hAnsi="Times New Roman"/>
-          <w:b/>
-        </w:rPr>
-        <w:t>ROLE / FUNCTION:</w:t>
-      </w:r>
-      <w:r>
-        <w:rPr>
-          <w:rFonts w:ascii="Times New Roman" w:hAnsi="Times New Roman"/>
-        </w:rPr>
-        <w:t xml:space="preserve"> Presentation &amp; Showcase Lead  </w:t>
-      </w:r>
+    <w:tbl>
+      <w:tblPr>
+        <w:tblW w:type="auto" w:w="0"/>
+        <w:tblLayout w:type="fixed"/>
+        <w:tblLook w:firstColumn="1" w:firstRow="1" w:lastColumn="0" w:lastRow="0" w:noHBand="0" w:noVBand="1" w:val="04A0"/>
+      </w:tblPr>
+      <w:tblGrid>
+        <w:gridCol w:w="4968"/>
+        <w:gridCol w:w="4968"/>
+      </w:tblGrid>
+      <w:tr>
+        <w:tc>
+          <w:tcPr>
+            <w:tcW w:type="dxa" w:w="4896"/>
+          </w:tcPr>
+          <w:p>
+            <w:pPr>
+              <w:spacing w:before="40" w:after="40"/>
+            </w:pPr>
+            <w:r>
+              <w:rPr>
+                <w:rFonts w:ascii="Times New Roman" w:hAnsi="Times New Roman"/>
+                <w:b/>
+              </w:rPr>
+              <w:t>PROJECT TITLE:</w:t>
+            </w:r>
+            <w:r>
+              <w:rPr>
+                <w:rFonts w:ascii="Times New Roman" w:hAnsi="Times New Roman"/>
+              </w:rPr>
+              <w:t xml:space="preserve"> Traffic Signal Synchronization System Using Chinese Remainder Theorem</w:t>
+            </w:r>
+          </w:p>
+        </w:tc>
+        <w:tc>
+          <w:tcPr>
+            <w:tcW w:type="dxa" w:w="4608"/>
+          </w:tcPr>
+          <w:p>
+            <w:pPr>
+              <w:spacing w:before="40" w:after="40"/>
+            </w:pPr>
+            <w:r>
+              <w:rPr>
+                <w:rFonts w:ascii="Times New Roman" w:hAnsi="Times New Roman"/>
+                <w:b/>
+              </w:rPr>
+              <w:t>STUDENT NAME:</w:t>
+            </w:r>
+            <w:r>
+              <w:rPr>
+                <w:rFonts w:ascii="Times New Roman" w:hAnsi="Times New Roman"/>
+              </w:rPr>
+              <w:t xml:space="preserve"> Joel Geo Manuel</w:t>
+            </w:r>
+          </w:p>
+        </w:tc>
+      </w:tr>
+      <w:tr>
+        <w:tc>
+          <w:tcPr>
+            <w:tcW w:type="dxa" w:w="4896"/>
+          </w:tcPr>
+          <w:p>
+            <w:pPr>
+              <w:spacing w:before="40" w:after="40"/>
+            </w:pPr>
+            <w:r>
+              <w:rPr>
+                <w:rFonts w:ascii="Times New Roman" w:hAnsi="Times New Roman"/>
+                <w:b/>
+              </w:rPr>
+              <w:t>COURSE:</w:t>
+            </w:r>
+            <w:r>
+              <w:rPr>
+                <w:rFonts w:ascii="Times New Roman" w:hAnsi="Times New Roman"/>
+              </w:rPr>
+              <w:t xml:space="preserve"> Number Theory &amp; Discrete Mathematics Application</w:t>
+            </w:r>
+          </w:p>
+        </w:tc>
+        <w:tc>
+          <w:tcPr>
+            <w:tcW w:type="dxa" w:w="4608"/>
+          </w:tcPr>
+          <w:p>
+            <w:pPr>
+              <w:spacing w:before="40" w:after="40"/>
+            </w:pPr>
+            <w:r>
+              <w:rPr>
+                <w:rFonts w:ascii="Times New Roman" w:hAnsi="Times New Roman"/>
+                <w:b/>
+              </w:rPr>
+              <w:t>ROLL NO:</w:t>
+            </w:r>
+            <w:r>
+              <w:rPr>
+                <w:rFonts w:ascii="Times New Roman" w:hAnsi="Times New Roman"/>
+              </w:rPr>
+              <w:t xml:space="preserve"> 52</w:t>
+            </w:r>
+          </w:p>
+        </w:tc>
+      </w:tr>
+      <w:tr>
+        <w:tc>
+          <w:tcPr>
+            <w:tcW w:type="dxa" w:w="4896"/>
+          </w:tcPr>
+          <w:p>
+            <w:pPr>
+              <w:spacing w:before="40" w:after="40"/>
+            </w:pPr>
+            <w:r>
+              <w:rPr>
+                <w:rFonts w:ascii="Times New Roman" w:hAnsi="Times New Roman"/>
+                <w:b/>
+              </w:rPr>
+              <w:t>CLASS:</w:t>
+            </w:r>
+            <w:r>
+              <w:rPr>
+                <w:rFonts w:ascii="Times New Roman" w:hAnsi="Times New Roman"/>
+              </w:rPr>
+              <w:t xml:space="preserve"> S3 CSE B</w:t>
+            </w:r>
+          </w:p>
+        </w:tc>
+        <w:tc>
+          <w:tcPr>
+            <w:tcW w:type="dxa" w:w="4608"/>
+          </w:tcPr>
+          <w:p>
+            <w:pPr>
+              <w:spacing w:before="40" w:after="40"/>
+            </w:pPr>
+            <w:r>
+              <w:rPr>
+                <w:rFonts w:ascii="Times New Roman" w:hAnsi="Times New Roman"/>
+                <w:b/>
+              </w:rPr>
+              <w:t>ROLE / FUNCTION:</w:t>
+            </w:r>
+            <w:r>
+              <w:rPr>
+                <w:rFonts w:ascii="Times New Roman" w:hAnsi="Times New Roman"/>
+              </w:rPr>
+              <w:t xml:space="preserve"> Presentation &amp; Showcase Lead</w:t>
+            </w:r>
+          </w:p>
+        </w:tc>
+      </w:tr>
+    </w:tbl>
+    <w:p>
+      <w:pPr>
+        <w:spacing w:after="80"/>
+      </w:pPr>
     </w:p>
     <w:p>
       <w:pPr>
@@ -2548,113 +2652,165 @@
         <w:t>MATHEMATICS PROJECT ASSIGNMENT REPORT</w:t>
       </w:r>
     </w:p>
-    <w:p>
-      <w:pPr>
-        <w:spacing w:after="80" w:line="276" w:lineRule="auto"/>
-      </w:pPr>
-      <w:r>
-        <w:rPr>
-          <w:rFonts w:ascii="Times New Roman" w:hAnsi="Times New Roman"/>
-          <w:b/>
-        </w:rPr>
-        <w:t>PROJECT TITLE:</w:t>
-      </w:r>
-      <w:r>
-        <w:rPr>
-          <w:rFonts w:ascii="Times New Roman" w:hAnsi="Times New Roman"/>
-        </w:rPr>
-        <w:t xml:space="preserve"> Traffic Signal Synchronization System Using Chinese Remainder Theorem  </w:t>
-      </w:r>
-    </w:p>
-    <w:p>
-      <w:pPr>
-        <w:spacing w:after="80" w:line="276" w:lineRule="auto"/>
-      </w:pPr>
-      <w:r>
-        <w:rPr>
-          <w:rFonts w:ascii="Times New Roman" w:hAnsi="Times New Roman"/>
-          <w:b/>
-        </w:rPr>
-        <w:t>COURSE:</w:t>
-      </w:r>
-      <w:r>
-        <w:rPr>
-          <w:rFonts w:ascii="Times New Roman" w:hAnsi="Times New Roman"/>
-        </w:rPr>
-        <w:t xml:space="preserve"> Number Theory &amp; Discrete Mathematics Application  </w:t>
-      </w:r>
-    </w:p>
-    <w:p>
-      <w:pPr>
-        <w:spacing w:after="80" w:line="276" w:lineRule="auto"/>
-      </w:pPr>
-      <w:r>
-        <w:rPr>
-          <w:rFonts w:ascii="Times New Roman" w:hAnsi="Times New Roman"/>
-          <w:b/>
-        </w:rPr>
-        <w:t>CLASS:</w:t>
-      </w:r>
-      <w:r>
-        <w:rPr>
-          <w:rFonts w:ascii="Times New Roman" w:hAnsi="Times New Roman"/>
-        </w:rPr>
-        <w:t xml:space="preserve"> S3 CSE B  </w:t>
-      </w:r>
-    </w:p>
-    <w:p>
-      <w:pPr>
-        <w:spacing w:after="80" w:line="276" w:lineRule="auto"/>
-      </w:pPr>
-      <w:r>
-        <w:rPr>
-          <w:rFonts w:ascii="Times New Roman" w:hAnsi="Times New Roman"/>
-          <w:b/>
-        </w:rPr>
-        <w:t>STUDENT NAME:</w:t>
-      </w:r>
-      <w:r>
-        <w:rPr>
-          <w:rFonts w:ascii="Times New Roman" w:hAnsi="Times New Roman"/>
-        </w:rPr>
-        <w:t xml:space="preserve"> Johaan Sam  </w:t>
-      </w:r>
-    </w:p>
-    <w:p>
-      <w:pPr>
-        <w:spacing w:after="80" w:line="276" w:lineRule="auto"/>
-      </w:pPr>
-      <w:r>
-        <w:rPr>
-          <w:rFonts w:ascii="Times New Roman" w:hAnsi="Times New Roman"/>
-          <w:b/>
-        </w:rPr>
-        <w:t>ROLL NO:</w:t>
-      </w:r>
-      <w:r>
-        <w:rPr>
-          <w:rFonts w:ascii="Times New Roman" w:hAnsi="Times New Roman"/>
-        </w:rPr>
-        <w:t xml:space="preserve"> 53  </w:t>
-      </w:r>
-    </w:p>
-    <w:p>
-      <w:pPr>
-        <w:spacing w:after="80" w:line="276" w:lineRule="auto"/>
-      </w:pPr>
-      <w:r>
-        <w:rPr>
-          <w:rFonts w:ascii="Times New Roman" w:hAnsi="Times New Roman"/>
-          <w:b/>
-        </w:rPr>
-        <w:t>ROLE / FUNCTION:</w:t>
-      </w:r>
-      <w:r>
-        <w:rPr>
-          <w:rFonts w:ascii="Times New Roman" w:hAnsi="Times New Roman"/>
-        </w:rPr>
-        <w:t xml:space="preserve"> Frontend &amp; State Engine Developer  </w:t>
-      </w:r>
+    <w:tbl>
+      <w:tblPr>
+        <w:tblW w:type="auto" w:w="0"/>
+        <w:tblLayout w:type="fixed"/>
+        <w:tblLook w:firstColumn="1" w:firstRow="1" w:lastColumn="0" w:lastRow="0" w:noHBand="0" w:noVBand="1" w:val="04A0"/>
+      </w:tblPr>
+      <w:tblGrid>
+        <w:gridCol w:w="4968"/>
+        <w:gridCol w:w="4968"/>
+      </w:tblGrid>
+      <w:tr>
+        <w:tc>
+          <w:tcPr>
+            <w:tcW w:type="dxa" w:w="4896"/>
+          </w:tcPr>
+          <w:p>
+            <w:pPr>
+              <w:spacing w:before="40" w:after="40"/>
+            </w:pPr>
+            <w:r>
+              <w:rPr>
+                <w:rFonts w:ascii="Times New Roman" w:hAnsi="Times New Roman"/>
+                <w:b/>
+              </w:rPr>
+              <w:t>PROJECT TITLE:</w:t>
+            </w:r>
+            <w:r>
+              <w:rPr>
+                <w:rFonts w:ascii="Times New Roman" w:hAnsi="Times New Roman"/>
+              </w:rPr>
+              <w:t xml:space="preserve"> Traffic Signal Synchronization System Using Chinese Remainder Theorem</w:t>
+            </w:r>
+          </w:p>
+        </w:tc>
+        <w:tc>
+          <w:tcPr>
+            <w:tcW w:type="dxa" w:w="4608"/>
+          </w:tcPr>
+          <w:p>
+            <w:pPr>
+              <w:spacing w:before="40" w:after="40"/>
+            </w:pPr>
+            <w:r>
+              <w:rPr>
+                <w:rFonts w:ascii="Times New Roman" w:hAnsi="Times New Roman"/>
+                <w:b/>
+              </w:rPr>
+              <w:t>STUDENT NAME:</w:t>
+            </w:r>
+            <w:r>
+              <w:rPr>
+                <w:rFonts w:ascii="Times New Roman" w:hAnsi="Times New Roman"/>
+              </w:rPr>
+              <w:t xml:space="preserve"> Johaan Sam</w:t>
+            </w:r>
+          </w:p>
+        </w:tc>
+      </w:tr>
+      <w:tr>
+        <w:tc>
+          <w:tcPr>
+            <w:tcW w:type="dxa" w:w="4896"/>
+          </w:tcPr>
+          <w:p>
+            <w:pPr>
+              <w:spacing w:before="40" w:after="40"/>
+            </w:pPr>
+            <w:r>
+              <w:rPr>
+                <w:rFonts w:ascii="Times New Roman" w:hAnsi="Times New Roman"/>
+                <w:b/>
+              </w:rPr>
+              <w:t>COURSE:</w:t>
+            </w:r>
+            <w:r>
+              <w:rPr>
+                <w:rFonts w:ascii="Times New Roman" w:hAnsi="Times New Roman"/>
+              </w:rPr>
+              <w:t xml:space="preserve"> Number Theory &amp; Discrete Mathematics Application</w:t>
+            </w:r>
+          </w:p>
+        </w:tc>
+        <w:tc>
+          <w:tcPr>
+            <w:tcW w:type="dxa" w:w="4608"/>
+          </w:tcPr>
+          <w:p>
+            <w:pPr>
+              <w:spacing w:before="40" w:after="40"/>
+            </w:pPr>
+            <w:r>
+              <w:rPr>
+                <w:rFonts w:ascii="Times New Roman" w:hAnsi="Times New Roman"/>
+                <w:b/>
+              </w:rPr>
+              <w:t>ROLL NO:</w:t>
+            </w:r>
+            <w:r>
+              <w:rPr>
+                <w:rFonts w:ascii="Times New Roman" w:hAnsi="Times New Roman"/>
+              </w:rPr>
+              <w:t xml:space="preserve"> 53</w:t>
+            </w:r>
+          </w:p>
+        </w:tc>
+      </w:tr>
+      <w:tr>
+        <w:tc>
+          <w:tcPr>
+            <w:tcW w:type="dxa" w:w="4896"/>
+          </w:tcPr>
+          <w:p>
+            <w:pPr>
+              <w:spacing w:before="40" w:after="40"/>
+            </w:pPr>
+            <w:r>
+              <w:rPr>
+                <w:rFonts w:ascii="Times New Roman" w:hAnsi="Times New Roman"/>
+                <w:b/>
+              </w:rPr>
+              <w:t>CLASS:</w:t>
+            </w:r>
+            <w:r>
+              <w:rPr>
+                <w:rFonts w:ascii="Times New Roman" w:hAnsi="Times New Roman"/>
+              </w:rPr>
+              <w:t xml:space="preserve"> S3 CSE B</w:t>
+            </w:r>
+          </w:p>
+        </w:tc>
+        <w:tc>
+          <w:tcPr>
+            <w:tcW w:type="dxa" w:w="4608"/>
+          </w:tcPr>
+          <w:p>
+            <w:pPr>
+              <w:spacing w:before="40" w:after="40"/>
+            </w:pPr>
+            <w:r>
+              <w:rPr>
+                <w:rFonts w:ascii="Times New Roman" w:hAnsi="Times New Roman"/>
+                <w:b/>
+              </w:rPr>
+              <w:t>ROLE / FUNCTION:</w:t>
+            </w:r>
+            <w:r>
+              <w:rPr>
+                <w:rFonts w:ascii="Times New Roman" w:hAnsi="Times New Roman"/>
+              </w:rPr>
+              <w:t xml:space="preserve"> Frontend &amp; State Engine Developer</w:t>
+            </w:r>
+          </w:p>
+        </w:tc>
+      </w:tr>
+    </w:tbl>
+    <w:p>
+      <w:pPr>
+        <w:spacing w:after="80"/>
+      </w:pPr>
     </w:p>
     <w:p>
       <w:pPr>
@@ -3813,113 +3969,165 @@
         <w:t>MATHEMATICS PROJECT ASSIGNMENT REPORT</w:t>
       </w:r>
     </w:p>
-    <w:p>
-      <w:pPr>
-        <w:spacing w:after="80" w:line="276" w:lineRule="auto"/>
-      </w:pPr>
-      <w:r>
-        <w:rPr>
-          <w:rFonts w:ascii="Times New Roman" w:hAnsi="Times New Roman"/>
-          <w:b/>
-        </w:rPr>
-        <w:t>PROJECT TITLE:</w:t>
-      </w:r>
-      <w:r>
-        <w:rPr>
-          <w:rFonts w:ascii="Times New Roman" w:hAnsi="Times New Roman"/>
-        </w:rPr>
-        <w:t xml:space="preserve"> Traffic Signal Synchronization System Using Chinese Remainder Theorem  </w:t>
-      </w:r>
-    </w:p>
-    <w:p>
-      <w:pPr>
-        <w:spacing w:after="80" w:line="276" w:lineRule="auto"/>
-      </w:pPr>
-      <w:r>
-        <w:rPr>
-          <w:rFonts w:ascii="Times New Roman" w:hAnsi="Times New Roman"/>
-          <w:b/>
-        </w:rPr>
-        <w:t>COURSE:</w:t>
-      </w:r>
-      <w:r>
-        <w:rPr>
-          <w:rFonts w:ascii="Times New Roman" w:hAnsi="Times New Roman"/>
-        </w:rPr>
-        <w:t xml:space="preserve"> Number Theory &amp; Discrete Mathematics Application  </w:t>
-      </w:r>
-    </w:p>
-    <w:p>
-      <w:pPr>
-        <w:spacing w:after="80" w:line="276" w:lineRule="auto"/>
-      </w:pPr>
-      <w:r>
-        <w:rPr>
-          <w:rFonts w:ascii="Times New Roman" w:hAnsi="Times New Roman"/>
-          <w:b/>
-        </w:rPr>
-        <w:t>CLASS:</w:t>
-      </w:r>
-      <w:r>
-        <w:rPr>
-          <w:rFonts w:ascii="Times New Roman" w:hAnsi="Times New Roman"/>
-        </w:rPr>
-        <w:t xml:space="preserve"> S3 CSE B  </w:t>
-      </w:r>
-    </w:p>
-    <w:p>
-      <w:pPr>
-        <w:spacing w:after="80" w:line="276" w:lineRule="auto"/>
-      </w:pPr>
-      <w:r>
-        <w:rPr>
-          <w:rFonts w:ascii="Times New Roman" w:hAnsi="Times New Roman"/>
-          <w:b/>
-        </w:rPr>
-        <w:t>STUDENT NAME:</w:t>
-      </w:r>
-      <w:r>
-        <w:rPr>
-          <w:rFonts w:ascii="Times New Roman" w:hAnsi="Times New Roman"/>
-        </w:rPr>
-        <w:t xml:space="preserve"> Johan Geo  </w:t>
-      </w:r>
-    </w:p>
-    <w:p>
-      <w:pPr>
-        <w:spacing w:after="80" w:line="276" w:lineRule="auto"/>
-      </w:pPr>
-      <w:r>
-        <w:rPr>
-          <w:rFonts w:ascii="Times New Roman" w:hAnsi="Times New Roman"/>
-          <w:b/>
-        </w:rPr>
-        <w:t>ROLL NO:</w:t>
-      </w:r>
-      <w:r>
-        <w:rPr>
-          <w:rFonts w:ascii="Times New Roman" w:hAnsi="Times New Roman"/>
-        </w:rPr>
-        <w:t xml:space="preserve"> 54  </w:t>
-      </w:r>
-    </w:p>
-    <w:p>
-      <w:pPr>
-        <w:spacing w:after="80" w:line="276" w:lineRule="auto"/>
-      </w:pPr>
-      <w:r>
-        <w:rPr>
-          <w:rFonts w:ascii="Times New Roman" w:hAnsi="Times New Roman"/>
-          <w:b/>
-        </w:rPr>
-        <w:t>ROLE / FUNCTION:</w:t>
-      </w:r>
-      <w:r>
-        <w:rPr>
-          <w:rFonts w:ascii="Times New Roman" w:hAnsi="Times New Roman"/>
-        </w:rPr>
-        <w:t xml:space="preserve"> Web Design &amp; UI Architect  </w:t>
-      </w:r>
+    <w:tbl>
+      <w:tblPr>
+        <w:tblW w:type="auto" w:w="0"/>
+        <w:tblLayout w:type="fixed"/>
+        <w:tblLook w:firstColumn="1" w:firstRow="1" w:lastColumn="0" w:lastRow="0" w:noHBand="0" w:noVBand="1" w:val="04A0"/>
+      </w:tblPr>
+      <w:tblGrid>
+        <w:gridCol w:w="4968"/>
+        <w:gridCol w:w="4968"/>
+      </w:tblGrid>
+      <w:tr>
+        <w:tc>
+          <w:tcPr>
+            <w:tcW w:type="dxa" w:w="4896"/>
+          </w:tcPr>
+          <w:p>
+            <w:pPr>
+              <w:spacing w:before="40" w:after="40"/>
+            </w:pPr>
+            <w:r>
+              <w:rPr>
+                <w:rFonts w:ascii="Times New Roman" w:hAnsi="Times New Roman"/>
+                <w:b/>
+              </w:rPr>
+              <w:t>PROJECT TITLE:</w:t>
+            </w:r>
+            <w:r>
+              <w:rPr>
+                <w:rFonts w:ascii="Times New Roman" w:hAnsi="Times New Roman"/>
+              </w:rPr>
+              <w:t xml:space="preserve"> Traffic Signal Synchronization System Using Chinese Remainder Theorem</w:t>
+            </w:r>
+          </w:p>
+        </w:tc>
+        <w:tc>
+          <w:tcPr>
+            <w:tcW w:type="dxa" w:w="4608"/>
+          </w:tcPr>
+          <w:p>
+            <w:pPr>
+              <w:spacing w:before="40" w:after="40"/>
+            </w:pPr>
+            <w:r>
+              <w:rPr>
+                <w:rFonts w:ascii="Times New Roman" w:hAnsi="Times New Roman"/>
+                <w:b/>
+              </w:rPr>
+              <w:t>STUDENT NAME:</w:t>
+            </w:r>
+            <w:r>
+              <w:rPr>
+                <w:rFonts w:ascii="Times New Roman" w:hAnsi="Times New Roman"/>
+              </w:rPr>
+              <w:t xml:space="preserve"> Johan Geo</w:t>
+            </w:r>
+          </w:p>
+        </w:tc>
+      </w:tr>
+      <w:tr>
+        <w:tc>
+          <w:tcPr>
+            <w:tcW w:type="dxa" w:w="4896"/>
+          </w:tcPr>
+          <w:p>
+            <w:pPr>
+              <w:spacing w:before="40" w:after="40"/>
+            </w:pPr>
+            <w:r>
+              <w:rPr>
+                <w:rFonts w:ascii="Times New Roman" w:hAnsi="Times New Roman"/>
+                <w:b/>
+              </w:rPr>
+              <w:t>COURSE:</w:t>
+            </w:r>
+            <w:r>
+              <w:rPr>
+                <w:rFonts w:ascii="Times New Roman" w:hAnsi="Times New Roman"/>
+              </w:rPr>
+              <w:t xml:space="preserve"> Number Theory &amp; Discrete Mathematics Application</w:t>
+            </w:r>
+          </w:p>
+        </w:tc>
+        <w:tc>
+          <w:tcPr>
+            <w:tcW w:type="dxa" w:w="4608"/>
+          </w:tcPr>
+          <w:p>
+            <w:pPr>
+              <w:spacing w:before="40" w:after="40"/>
+            </w:pPr>
+            <w:r>
+              <w:rPr>
+                <w:rFonts w:ascii="Times New Roman" w:hAnsi="Times New Roman"/>
+                <w:b/>
+              </w:rPr>
+              <w:t>ROLL NO:</w:t>
+            </w:r>
+            <w:r>
+              <w:rPr>
+                <w:rFonts w:ascii="Times New Roman" w:hAnsi="Times New Roman"/>
+              </w:rPr>
+              <w:t xml:space="preserve"> 54</w:t>
+            </w:r>
+          </w:p>
+        </w:tc>
+      </w:tr>
+      <w:tr>
+        <w:tc>
+          <w:tcPr>
+            <w:tcW w:type="dxa" w:w="4896"/>
+          </w:tcPr>
+          <w:p>
+            <w:pPr>
+              <w:spacing w:before="40" w:after="40"/>
+            </w:pPr>
+            <w:r>
+              <w:rPr>
+                <w:rFonts w:ascii="Times New Roman" w:hAnsi="Times New Roman"/>
+                <w:b/>
+              </w:rPr>
+              <w:t>CLASS:</w:t>
+            </w:r>
+            <w:r>
+              <w:rPr>
+                <w:rFonts w:ascii="Times New Roman" w:hAnsi="Times New Roman"/>
+              </w:rPr>
+              <w:t xml:space="preserve"> S3 CSE B</w:t>
+            </w:r>
+          </w:p>
+        </w:tc>
+        <w:tc>
+          <w:tcPr>
+            <w:tcW w:type="dxa" w:w="4608"/>
+          </w:tcPr>
+          <w:p>
+            <w:pPr>
+              <w:spacing w:before="40" w:after="40"/>
+            </w:pPr>
+            <w:r>
+              <w:rPr>
+                <w:rFonts w:ascii="Times New Roman" w:hAnsi="Times New Roman"/>
+                <w:b/>
+              </w:rPr>
+              <w:t>ROLE / FUNCTION:</w:t>
+            </w:r>
+            <w:r>
+              <w:rPr>
+                <w:rFonts w:ascii="Times New Roman" w:hAnsi="Times New Roman"/>
+              </w:rPr>
+              <w:t xml:space="preserve"> Web Design &amp; UI Architect</w:t>
+            </w:r>
+          </w:p>
+        </w:tc>
+      </w:tr>
+    </w:tbl>
+    <w:p>
+      <w:pPr>
+        <w:spacing w:after="80"/>
+      </w:pPr>
     </w:p>
     <w:p>
       <w:pPr>
@@ -5078,113 +5286,165 @@
         <w:t>MATHEMATICS PROJECT ASSIGNMENT REPORT</w:t>
       </w:r>
     </w:p>
-    <w:p>
-      <w:pPr>
-        <w:spacing w:after="80" w:line="276" w:lineRule="auto"/>
-      </w:pPr>
-      <w:r>
-        <w:rPr>
-          <w:rFonts w:ascii="Times New Roman" w:hAnsi="Times New Roman"/>
-          <w:b/>
-        </w:rPr>
-        <w:t>PROJECT TITLE:</w:t>
-      </w:r>
-      <w:r>
-        <w:rPr>
-          <w:rFonts w:ascii="Times New Roman" w:hAnsi="Times New Roman"/>
-        </w:rPr>
-        <w:t xml:space="preserve"> Traffic Signal Synchronization System Using Chinese Remainder Theorem  </w:t>
-      </w:r>
-    </w:p>
-    <w:p>
-      <w:pPr>
-        <w:spacing w:after="80" w:line="276" w:lineRule="auto"/>
-      </w:pPr>
-      <w:r>
-        <w:rPr>
-          <w:rFonts w:ascii="Times New Roman" w:hAnsi="Times New Roman"/>
-          <w:b/>
-        </w:rPr>
-        <w:t>COURSE:</w:t>
-      </w:r>
-      <w:r>
-        <w:rPr>
-          <w:rFonts w:ascii="Times New Roman" w:hAnsi="Times New Roman"/>
-        </w:rPr>
-        <w:t xml:space="preserve"> Number Theory &amp; Discrete Mathematics Application  </w:t>
-      </w:r>
-    </w:p>
-    <w:p>
-      <w:pPr>
-        <w:spacing w:after="80" w:line="276" w:lineRule="auto"/>
-      </w:pPr>
-      <w:r>
-        <w:rPr>
-          <w:rFonts w:ascii="Times New Roman" w:hAnsi="Times New Roman"/>
-          <w:b/>
-        </w:rPr>
-        <w:t>CLASS:</w:t>
-      </w:r>
-      <w:r>
-        <w:rPr>
-          <w:rFonts w:ascii="Times New Roman" w:hAnsi="Times New Roman"/>
-        </w:rPr>
-        <w:t xml:space="preserve"> S3 CSE B  </w:t>
-      </w:r>
-    </w:p>
-    <w:p>
-      <w:pPr>
-        <w:spacing w:after="80" w:line="276" w:lineRule="auto"/>
-      </w:pPr>
-      <w:r>
-        <w:rPr>
-          <w:rFonts w:ascii="Times New Roman" w:hAnsi="Times New Roman"/>
-          <w:b/>
-        </w:rPr>
-        <w:t>STUDENT NAME:</w:t>
-      </w:r>
-      <w:r>
-        <w:rPr>
-          <w:rFonts w:ascii="Times New Roman" w:hAnsi="Times New Roman"/>
-        </w:rPr>
-        <w:t xml:space="preserve"> Jose Alex  </w:t>
-      </w:r>
-    </w:p>
-    <w:p>
-      <w:pPr>
-        <w:spacing w:after="80" w:line="276" w:lineRule="auto"/>
-      </w:pPr>
-      <w:r>
-        <w:rPr>
-          <w:rFonts w:ascii="Times New Roman" w:hAnsi="Times New Roman"/>
-          <w:b/>
-        </w:rPr>
-        <w:t>ROLL NO:</w:t>
-      </w:r>
-      <w:r>
-        <w:rPr>
-          <w:rFonts w:ascii="Times New Roman" w:hAnsi="Times New Roman"/>
-        </w:rPr>
-        <w:t xml:space="preserve"> 55  </w:t>
-      </w:r>
-    </w:p>
-    <w:p>
-      <w:pPr>
-        <w:spacing w:after="80" w:line="276" w:lineRule="auto"/>
-      </w:pPr>
-      <w:r>
-        <w:rPr>
-          <w:rFonts w:ascii="Times New Roman" w:hAnsi="Times New Roman"/>
-          <w:b/>
-        </w:rPr>
-        <w:t>ROLE / FUNCTION:</w:t>
-      </w:r>
-      <w:r>
-        <w:rPr>
-          <w:rFonts w:ascii="Times New Roman" w:hAnsi="Times New Roman"/>
-        </w:rPr>
-        <w:t xml:space="preserve"> Mathematical Proofs &amp; Solution Verification  </w:t>
-      </w:r>
+    <w:tbl>
+      <w:tblPr>
+        <w:tblW w:type="auto" w:w="0"/>
+        <w:tblLayout w:type="fixed"/>
+        <w:tblLook w:firstColumn="1" w:firstRow="1" w:lastColumn="0" w:lastRow="0" w:noHBand="0" w:noVBand="1" w:val="04A0"/>
+      </w:tblPr>
+      <w:tblGrid>
+        <w:gridCol w:w="4968"/>
+        <w:gridCol w:w="4968"/>
+      </w:tblGrid>
+      <w:tr>
+        <w:tc>
+          <w:tcPr>
+            <w:tcW w:type="dxa" w:w="4896"/>
+          </w:tcPr>
+          <w:p>
+            <w:pPr>
+              <w:spacing w:before="40" w:after="40"/>
+            </w:pPr>
+            <w:r>
+              <w:rPr>
+                <w:rFonts w:ascii="Times New Roman" w:hAnsi="Times New Roman"/>
+                <w:b/>
+              </w:rPr>
+              <w:t>PROJECT TITLE:</w:t>
+            </w:r>
+            <w:r>
+              <w:rPr>
+                <w:rFonts w:ascii="Times New Roman" w:hAnsi="Times New Roman"/>
+              </w:rPr>
+              <w:t xml:space="preserve"> Traffic Signal Synchronization System Using Chinese Remainder Theorem</w:t>
+            </w:r>
+          </w:p>
+        </w:tc>
+        <w:tc>
+          <w:tcPr>
+            <w:tcW w:type="dxa" w:w="4608"/>
+          </w:tcPr>
+          <w:p>
+            <w:pPr>
+              <w:spacing w:before="40" w:after="40"/>
+            </w:pPr>
+            <w:r>
+              <w:rPr>
+                <w:rFonts w:ascii="Times New Roman" w:hAnsi="Times New Roman"/>
+                <w:b/>
+              </w:rPr>
+              <w:t>STUDENT NAME:</w:t>
+            </w:r>
+            <w:r>
+              <w:rPr>
+                <w:rFonts w:ascii="Times New Roman" w:hAnsi="Times New Roman"/>
+              </w:rPr>
+              <w:t xml:space="preserve"> Jose Alex</w:t>
+            </w:r>
+          </w:p>
+        </w:tc>
+      </w:tr>
+      <w:tr>
+        <w:tc>
+          <w:tcPr>
+            <w:tcW w:type="dxa" w:w="4896"/>
+          </w:tcPr>
+          <w:p>
+            <w:pPr>
+              <w:spacing w:before="40" w:after="40"/>
+            </w:pPr>
+            <w:r>
+              <w:rPr>
+                <w:rFonts w:ascii="Times New Roman" w:hAnsi="Times New Roman"/>
+                <w:b/>
+              </w:rPr>
+              <w:t>COURSE:</w:t>
+            </w:r>
+            <w:r>
+              <w:rPr>
+                <w:rFonts w:ascii="Times New Roman" w:hAnsi="Times New Roman"/>
+              </w:rPr>
+              <w:t xml:space="preserve"> Number Theory &amp; Discrete Mathematics Application</w:t>
+            </w:r>
+          </w:p>
+        </w:tc>
+        <w:tc>
+          <w:tcPr>
+            <w:tcW w:type="dxa" w:w="4608"/>
+          </w:tcPr>
+          <w:p>
+            <w:pPr>
+              <w:spacing w:before="40" w:after="40"/>
+            </w:pPr>
+            <w:r>
+              <w:rPr>
+                <w:rFonts w:ascii="Times New Roman" w:hAnsi="Times New Roman"/>
+                <w:b/>
+              </w:rPr>
+              <w:t>ROLL NO:</w:t>
+            </w:r>
+            <w:r>
+              <w:rPr>
+                <w:rFonts w:ascii="Times New Roman" w:hAnsi="Times New Roman"/>
+              </w:rPr>
+              <w:t xml:space="preserve"> 55</w:t>
+            </w:r>
+          </w:p>
+        </w:tc>
+      </w:tr>
+      <w:tr>
+        <w:tc>
+          <w:tcPr>
+            <w:tcW w:type="dxa" w:w="4896"/>
+          </w:tcPr>
+          <w:p>
+            <w:pPr>
+              <w:spacing w:before="40" w:after="40"/>
+            </w:pPr>
+            <w:r>
+              <w:rPr>
+                <w:rFonts w:ascii="Times New Roman" w:hAnsi="Times New Roman"/>
+                <w:b/>
+              </w:rPr>
+              <w:t>CLASS:</w:t>
+            </w:r>
+            <w:r>
+              <w:rPr>
+                <w:rFonts w:ascii="Times New Roman" w:hAnsi="Times New Roman"/>
+              </w:rPr>
+              <w:t xml:space="preserve"> S3 CSE B</w:t>
+            </w:r>
+          </w:p>
+        </w:tc>
+        <w:tc>
+          <w:tcPr>
+            <w:tcW w:type="dxa" w:w="4608"/>
+          </w:tcPr>
+          <w:p>
+            <w:pPr>
+              <w:spacing w:before="40" w:after="40"/>
+            </w:pPr>
+            <w:r>
+              <w:rPr>
+                <w:rFonts w:ascii="Times New Roman" w:hAnsi="Times New Roman"/>
+                <w:b/>
+              </w:rPr>
+              <w:t>ROLE / FUNCTION:</w:t>
+            </w:r>
+            <w:r>
+              <w:rPr>
+                <w:rFonts w:ascii="Times New Roman" w:hAnsi="Times New Roman"/>
+              </w:rPr>
+              <w:t xml:space="preserve"> Mathematical Proofs &amp; Solution Verification</w:t>
+            </w:r>
+          </w:p>
+        </w:tc>
+      </w:tr>
+    </w:tbl>
+    <w:p>
+      <w:pPr>
+        <w:spacing w:after="80"/>
+      </w:pPr>
     </w:p>
     <w:p>
       <w:pPr>
@@ -6343,113 +6603,165 @@
         <w:t>MATHEMATICS PROJECT ASSIGNMENT REPORT</w:t>
       </w:r>
     </w:p>
-    <w:p>
-      <w:pPr>
-        <w:spacing w:after="80" w:line="276" w:lineRule="auto"/>
-      </w:pPr>
-      <w:r>
-        <w:rPr>
-          <w:rFonts w:ascii="Times New Roman" w:hAnsi="Times New Roman"/>
-          <w:b/>
-        </w:rPr>
-        <w:t>PROJECT TITLE:</w:t>
-      </w:r>
-      <w:r>
-        <w:rPr>
-          <w:rFonts w:ascii="Times New Roman" w:hAnsi="Times New Roman"/>
-        </w:rPr>
-        <w:t xml:space="preserve"> Traffic Signal Synchronization System Using Chinese Remainder Theorem  </w:t>
-      </w:r>
-    </w:p>
-    <w:p>
-      <w:pPr>
-        <w:spacing w:after="80" w:line="276" w:lineRule="auto"/>
-      </w:pPr>
-      <w:r>
-        <w:rPr>
-          <w:rFonts w:ascii="Times New Roman" w:hAnsi="Times New Roman"/>
-          <w:b/>
-        </w:rPr>
-        <w:t>COURSE:</w:t>
-      </w:r>
-      <w:r>
-        <w:rPr>
-          <w:rFonts w:ascii="Times New Roman" w:hAnsi="Times New Roman"/>
-        </w:rPr>
-        <w:t xml:space="preserve"> Number Theory &amp; Discrete Mathematics Application  </w:t>
-      </w:r>
-    </w:p>
-    <w:p>
-      <w:pPr>
-        <w:spacing w:after="80" w:line="276" w:lineRule="auto"/>
-      </w:pPr>
-      <w:r>
-        <w:rPr>
-          <w:rFonts w:ascii="Times New Roman" w:hAnsi="Times New Roman"/>
-          <w:b/>
-        </w:rPr>
-        <w:t>CLASS:</w:t>
-      </w:r>
-      <w:r>
-        <w:rPr>
-          <w:rFonts w:ascii="Times New Roman" w:hAnsi="Times New Roman"/>
-        </w:rPr>
-        <w:t xml:space="preserve"> S3 CSE B  </w:t>
-      </w:r>
-    </w:p>
-    <w:p>
-      <w:pPr>
-        <w:spacing w:after="80" w:line="276" w:lineRule="auto"/>
-      </w:pPr>
-      <w:r>
-        <w:rPr>
-          <w:rFonts w:ascii="Times New Roman" w:hAnsi="Times New Roman"/>
-          <w:b/>
-        </w:rPr>
-        <w:t>STUDENT NAME:</w:t>
-      </w:r>
-      <w:r>
-        <w:rPr>
-          <w:rFonts w:ascii="Times New Roman" w:hAnsi="Times New Roman"/>
-        </w:rPr>
-        <w:t xml:space="preserve"> Joseph Alex  </w:t>
-      </w:r>
-    </w:p>
-    <w:p>
-      <w:pPr>
-        <w:spacing w:after="80" w:line="276" w:lineRule="auto"/>
-      </w:pPr>
-      <w:r>
-        <w:rPr>
-          <w:rFonts w:ascii="Times New Roman" w:hAnsi="Times New Roman"/>
-          <w:b/>
-        </w:rPr>
-        <w:t>ROLL NO:</w:t>
-      </w:r>
-      <w:r>
-        <w:rPr>
-          <w:rFonts w:ascii="Times New Roman" w:hAnsi="Times New Roman"/>
-        </w:rPr>
-        <w:t xml:space="preserve"> 56  </w:t>
-      </w:r>
-    </w:p>
-    <w:p>
-      <w:pPr>
-        <w:spacing w:after="80" w:line="276" w:lineRule="auto"/>
-      </w:pPr>
-      <w:r>
-        <w:rPr>
-          <w:rFonts w:ascii="Times New Roman" w:hAnsi="Times New Roman"/>
-          <w:b/>
-        </w:rPr>
-        <w:t>ROLE / FUNCTION:</w:t>
-      </w:r>
-      <w:r>
-        <w:rPr>
-          <w:rFonts w:ascii="Times New Roman" w:hAnsi="Times New Roman"/>
-        </w:rPr>
-        <w:t xml:space="preserve"> Hardware Sourcing &amp; Build Testing  </w:t>
-      </w:r>
+    <w:tbl>
+      <w:tblPr>
+        <w:tblW w:type="auto" w:w="0"/>
+        <w:tblLayout w:type="fixed"/>
+        <w:tblLook w:firstColumn="1" w:firstRow="1" w:lastColumn="0" w:lastRow="0" w:noHBand="0" w:noVBand="1" w:val="04A0"/>
+      </w:tblPr>
+      <w:tblGrid>
+        <w:gridCol w:w="4968"/>
+        <w:gridCol w:w="4968"/>
+      </w:tblGrid>
+      <w:tr>
+        <w:tc>
+          <w:tcPr>
+            <w:tcW w:type="dxa" w:w="4896"/>
+          </w:tcPr>
+          <w:p>
+            <w:pPr>
+              <w:spacing w:before="40" w:after="40"/>
+            </w:pPr>
+            <w:r>
+              <w:rPr>
+                <w:rFonts w:ascii="Times New Roman" w:hAnsi="Times New Roman"/>
+                <w:b/>
+              </w:rPr>
+              <w:t>PROJECT TITLE:</w:t>
+            </w:r>
+            <w:r>
+              <w:rPr>
+                <w:rFonts w:ascii="Times New Roman" w:hAnsi="Times New Roman"/>
+              </w:rPr>
+              <w:t xml:space="preserve"> Traffic Signal Synchronization System Using Chinese Remainder Theorem</w:t>
+            </w:r>
+          </w:p>
+        </w:tc>
+        <w:tc>
+          <w:tcPr>
+            <w:tcW w:type="dxa" w:w="4608"/>
+          </w:tcPr>
+          <w:p>
+            <w:pPr>
+              <w:spacing w:before="40" w:after="40"/>
+            </w:pPr>
+            <w:r>
+              <w:rPr>
+                <w:rFonts w:ascii="Times New Roman" w:hAnsi="Times New Roman"/>
+                <w:b/>
+              </w:rPr>
+              <w:t>STUDENT NAME:</w:t>
+            </w:r>
+            <w:r>
+              <w:rPr>
+                <w:rFonts w:ascii="Times New Roman" w:hAnsi="Times New Roman"/>
+              </w:rPr>
+              <w:t xml:space="preserve"> Joseph Alex</w:t>
+            </w:r>
+          </w:p>
+        </w:tc>
+      </w:tr>
+      <w:tr>
+        <w:tc>
+          <w:tcPr>
+            <w:tcW w:type="dxa" w:w="4896"/>
+          </w:tcPr>
+          <w:p>
+            <w:pPr>
+              <w:spacing w:before="40" w:after="40"/>
+            </w:pPr>
+            <w:r>
+              <w:rPr>
+                <w:rFonts w:ascii="Times New Roman" w:hAnsi="Times New Roman"/>
+                <w:b/>
+              </w:rPr>
+              <w:t>COURSE:</w:t>
+            </w:r>
+            <w:r>
+              <w:rPr>
+                <w:rFonts w:ascii="Times New Roman" w:hAnsi="Times New Roman"/>
+              </w:rPr>
+              <w:t xml:space="preserve"> Number Theory &amp; Discrete Mathematics Application</w:t>
+            </w:r>
+          </w:p>
+        </w:tc>
+        <w:tc>
+          <w:tcPr>
+            <w:tcW w:type="dxa" w:w="4608"/>
+          </w:tcPr>
+          <w:p>
+            <w:pPr>
+              <w:spacing w:before="40" w:after="40"/>
+            </w:pPr>
+            <w:r>
+              <w:rPr>
+                <w:rFonts w:ascii="Times New Roman" w:hAnsi="Times New Roman"/>
+                <w:b/>
+              </w:rPr>
+              <w:t>ROLL NO:</w:t>
+            </w:r>
+            <w:r>
+              <w:rPr>
+                <w:rFonts w:ascii="Times New Roman" w:hAnsi="Times New Roman"/>
+              </w:rPr>
+              <w:t xml:space="preserve"> 56</w:t>
+            </w:r>
+          </w:p>
+        </w:tc>
+      </w:tr>
+      <w:tr>
+        <w:tc>
+          <w:tcPr>
+            <w:tcW w:type="dxa" w:w="4896"/>
+          </w:tcPr>
+          <w:p>
+            <w:pPr>
+              <w:spacing w:before="40" w:after="40"/>
+            </w:pPr>
+            <w:r>
+              <w:rPr>
+                <w:rFonts w:ascii="Times New Roman" w:hAnsi="Times New Roman"/>
+                <w:b/>
+              </w:rPr>
+              <w:t>CLASS:</w:t>
+            </w:r>
+            <w:r>
+              <w:rPr>
+                <w:rFonts w:ascii="Times New Roman" w:hAnsi="Times New Roman"/>
+              </w:rPr>
+              <w:t xml:space="preserve"> S3 CSE B</w:t>
+            </w:r>
+          </w:p>
+        </w:tc>
+        <w:tc>
+          <w:tcPr>
+            <w:tcW w:type="dxa" w:w="4608"/>
+          </w:tcPr>
+          <w:p>
+            <w:pPr>
+              <w:spacing w:before="40" w:after="40"/>
+            </w:pPr>
+            <w:r>
+              <w:rPr>
+                <w:rFonts w:ascii="Times New Roman" w:hAnsi="Times New Roman"/>
+                <w:b/>
+              </w:rPr>
+              <w:t>ROLE / FUNCTION:</w:t>
+            </w:r>
+            <w:r>
+              <w:rPr>
+                <w:rFonts w:ascii="Times New Roman" w:hAnsi="Times New Roman"/>
+              </w:rPr>
+              <w:t xml:space="preserve"> Hardware Sourcing &amp; Build Testing</w:t>
+            </w:r>
+          </w:p>
+        </w:tc>
+      </w:tr>
+    </w:tbl>
+    <w:p>
+      <w:pPr>
+        <w:spacing w:after="80"/>
+      </w:pPr>
     </w:p>
     <w:p>
       <w:pPr>
@@ -7608,113 +7920,165 @@
         <w:t>MATHEMATICS PROJECT ASSIGNMENT REPORT</w:t>
       </w:r>
     </w:p>
-    <w:p>
-      <w:pPr>
-        <w:spacing w:after="80" w:line="276" w:lineRule="auto"/>
-      </w:pPr>
-      <w:r>
-        <w:rPr>
-          <w:rFonts w:ascii="Times New Roman" w:hAnsi="Times New Roman"/>
-          <w:b/>
-        </w:rPr>
-        <w:t>PROJECT TITLE:</w:t>
-      </w:r>
-      <w:r>
-        <w:rPr>
-          <w:rFonts w:ascii="Times New Roman" w:hAnsi="Times New Roman"/>
-        </w:rPr>
-        <w:t xml:space="preserve"> Traffic Signal Synchronization System Using Chinese Remainder Theorem  </w:t>
-      </w:r>
-    </w:p>
-    <w:p>
-      <w:pPr>
-        <w:spacing w:after="80" w:line="276" w:lineRule="auto"/>
-      </w:pPr>
-      <w:r>
-        <w:rPr>
-          <w:rFonts w:ascii="Times New Roman" w:hAnsi="Times New Roman"/>
-          <w:b/>
-        </w:rPr>
-        <w:t>COURSE:</w:t>
-      </w:r>
-      <w:r>
-        <w:rPr>
-          <w:rFonts w:ascii="Times New Roman" w:hAnsi="Times New Roman"/>
-        </w:rPr>
-        <w:t xml:space="preserve"> Number Theory &amp; Discrete Mathematics Application  </w:t>
-      </w:r>
-    </w:p>
-    <w:p>
-      <w:pPr>
-        <w:spacing w:after="80" w:line="276" w:lineRule="auto"/>
-      </w:pPr>
-      <w:r>
-        <w:rPr>
-          <w:rFonts w:ascii="Times New Roman" w:hAnsi="Times New Roman"/>
-          <w:b/>
-        </w:rPr>
-        <w:t>CLASS:</w:t>
-      </w:r>
-      <w:r>
-        <w:rPr>
-          <w:rFonts w:ascii="Times New Roman" w:hAnsi="Times New Roman"/>
-        </w:rPr>
-        <w:t xml:space="preserve"> S3 CSE B  </w:t>
-      </w:r>
-    </w:p>
-    <w:p>
-      <w:pPr>
-        <w:spacing w:after="80" w:line="276" w:lineRule="auto"/>
-      </w:pPr>
-      <w:r>
-        <w:rPr>
-          <w:rFonts w:ascii="Times New Roman" w:hAnsi="Times New Roman"/>
-          <w:b/>
-        </w:rPr>
-        <w:t>STUDENT NAME:</w:t>
-      </w:r>
-      <w:r>
-        <w:rPr>
-          <w:rFonts w:ascii="Times New Roman" w:hAnsi="Times New Roman"/>
-        </w:rPr>
-        <w:t xml:space="preserve"> Joseph J  </w:t>
-      </w:r>
-    </w:p>
-    <w:p>
-      <w:pPr>
-        <w:spacing w:after="80" w:line="276" w:lineRule="auto"/>
-      </w:pPr>
-      <w:r>
-        <w:rPr>
-          <w:rFonts w:ascii="Times New Roman" w:hAnsi="Times New Roman"/>
-          <w:b/>
-        </w:rPr>
-        <w:t>ROLL NO:</w:t>
-      </w:r>
-      <w:r>
-        <w:rPr>
-          <w:rFonts w:ascii="Times New Roman" w:hAnsi="Times New Roman"/>
-        </w:rPr>
-        <w:t xml:space="preserve"> 57  </w:t>
-      </w:r>
-    </w:p>
-    <w:p>
-      <w:pPr>
-        <w:spacing w:after="80" w:line="276" w:lineRule="auto"/>
-      </w:pPr>
-      <w:r>
-        <w:rPr>
-          <w:rFonts w:ascii="Times New Roman" w:hAnsi="Times New Roman"/>
-          <w:b/>
-        </w:rPr>
-        <w:t>ROLE / FUNCTION:</w:t>
-      </w:r>
-      <w:r>
-        <w:rPr>
-          <w:rFonts w:ascii="Times New Roman" w:hAnsi="Times New Roman"/>
-        </w:rPr>
-        <w:t xml:space="preserve"> Component Procurement &amp; Application Ideas  </w:t>
-      </w:r>
+    <w:tbl>
+      <w:tblPr>
+        <w:tblW w:type="auto" w:w="0"/>
+        <w:tblLayout w:type="fixed"/>
+        <w:tblLook w:firstColumn="1" w:firstRow="1" w:lastColumn="0" w:lastRow="0" w:noHBand="0" w:noVBand="1" w:val="04A0"/>
+      </w:tblPr>
+      <w:tblGrid>
+        <w:gridCol w:w="4968"/>
+        <w:gridCol w:w="4968"/>
+      </w:tblGrid>
+      <w:tr>
+        <w:tc>
+          <w:tcPr>
+            <w:tcW w:type="dxa" w:w="4896"/>
+          </w:tcPr>
+          <w:p>
+            <w:pPr>
+              <w:spacing w:before="40" w:after="40"/>
+            </w:pPr>
+            <w:r>
+              <w:rPr>
+                <w:rFonts w:ascii="Times New Roman" w:hAnsi="Times New Roman"/>
+                <w:b/>
+              </w:rPr>
+              <w:t>PROJECT TITLE:</w:t>
+            </w:r>
+            <w:r>
+              <w:rPr>
+                <w:rFonts w:ascii="Times New Roman" w:hAnsi="Times New Roman"/>
+              </w:rPr>
+              <w:t xml:space="preserve"> Traffic Signal Synchronization System Using Chinese Remainder Theorem</w:t>
+            </w:r>
+          </w:p>
+        </w:tc>
+        <w:tc>
+          <w:tcPr>
+            <w:tcW w:type="dxa" w:w="4608"/>
+          </w:tcPr>
+          <w:p>
+            <w:pPr>
+              <w:spacing w:before="40" w:after="40"/>
+            </w:pPr>
+            <w:r>
+              <w:rPr>
+                <w:rFonts w:ascii="Times New Roman" w:hAnsi="Times New Roman"/>
+                <w:b/>
+              </w:rPr>
+              <w:t>STUDENT NAME:</w:t>
+            </w:r>
+            <w:r>
+              <w:rPr>
+                <w:rFonts w:ascii="Times New Roman" w:hAnsi="Times New Roman"/>
+              </w:rPr>
+              <w:t xml:space="preserve"> Joseph J</w:t>
+            </w:r>
+          </w:p>
+        </w:tc>
+      </w:tr>
+      <w:tr>
+        <w:tc>
+          <w:tcPr>
+            <w:tcW w:type="dxa" w:w="4896"/>
+          </w:tcPr>
+          <w:p>
+            <w:pPr>
+              <w:spacing w:before="40" w:after="40"/>
+            </w:pPr>
+            <w:r>
+              <w:rPr>
+                <w:rFonts w:ascii="Times New Roman" w:hAnsi="Times New Roman"/>
+                <w:b/>
+              </w:rPr>
+              <w:t>COURSE:</w:t>
+            </w:r>
+            <w:r>
+              <w:rPr>
+                <w:rFonts w:ascii="Times New Roman" w:hAnsi="Times New Roman"/>
+              </w:rPr>
+              <w:t xml:space="preserve"> Number Theory &amp; Discrete Mathematics Application</w:t>
+            </w:r>
+          </w:p>
+        </w:tc>
+        <w:tc>
+          <w:tcPr>
+            <w:tcW w:type="dxa" w:w="4608"/>
+          </w:tcPr>
+          <w:p>
+            <w:pPr>
+              <w:spacing w:before="40" w:after="40"/>
+            </w:pPr>
+            <w:r>
+              <w:rPr>
+                <w:rFonts w:ascii="Times New Roman" w:hAnsi="Times New Roman"/>
+                <w:b/>
+              </w:rPr>
+              <w:t>ROLL NO:</w:t>
+            </w:r>
+            <w:r>
+              <w:rPr>
+                <w:rFonts w:ascii="Times New Roman" w:hAnsi="Times New Roman"/>
+              </w:rPr>
+              <w:t xml:space="preserve"> 57</w:t>
+            </w:r>
+          </w:p>
+        </w:tc>
+      </w:tr>
+      <w:tr>
+        <w:tc>
+          <w:tcPr>
+            <w:tcW w:type="dxa" w:w="4896"/>
+          </w:tcPr>
+          <w:p>
+            <w:pPr>
+              <w:spacing w:before="40" w:after="40"/>
+            </w:pPr>
+            <w:r>
+              <w:rPr>
+                <w:rFonts w:ascii="Times New Roman" w:hAnsi="Times New Roman"/>
+                <w:b/>
+              </w:rPr>
+              <w:t>CLASS:</w:t>
+            </w:r>
+            <w:r>
+              <w:rPr>
+                <w:rFonts w:ascii="Times New Roman" w:hAnsi="Times New Roman"/>
+              </w:rPr>
+              <w:t xml:space="preserve"> S3 CSE B</w:t>
+            </w:r>
+          </w:p>
+        </w:tc>
+        <w:tc>
+          <w:tcPr>
+            <w:tcW w:type="dxa" w:w="4608"/>
+          </w:tcPr>
+          <w:p>
+            <w:pPr>
+              <w:spacing w:before="40" w:after="40"/>
+            </w:pPr>
+            <w:r>
+              <w:rPr>
+                <w:rFonts w:ascii="Times New Roman" w:hAnsi="Times New Roman"/>
+                <w:b/>
+              </w:rPr>
+              <w:t>ROLE / FUNCTION:</w:t>
+            </w:r>
+            <w:r>
+              <w:rPr>
+                <w:rFonts w:ascii="Times New Roman" w:hAnsi="Times New Roman"/>
+              </w:rPr>
+              <w:t xml:space="preserve"> Component Procurement &amp; Application Ideas</w:t>
+            </w:r>
+          </w:p>
+        </w:tc>
+      </w:tr>
+    </w:tbl>
+    <w:p>
+      <w:pPr>
+        <w:spacing w:after="80"/>
+      </w:pPr>
     </w:p>
     <w:p>
       <w:pPr>
@@ -8873,113 +9237,165 @@
         <w:t>MATHEMATICS PROJECT ASSIGNMENT REPORT</w:t>
       </w:r>
     </w:p>
-    <w:p>
-      <w:pPr>
-        <w:spacing w:after="80" w:line="276" w:lineRule="auto"/>
-      </w:pPr>
-      <w:r>
-        <w:rPr>
-          <w:rFonts w:ascii="Times New Roman" w:hAnsi="Times New Roman"/>
-          <w:b/>
-        </w:rPr>
-        <w:t>PROJECT TITLE:</w:t>
-      </w:r>
-      <w:r>
-        <w:rPr>
-          <w:rFonts w:ascii="Times New Roman" w:hAnsi="Times New Roman"/>
-        </w:rPr>
-        <w:t xml:space="preserve"> Traffic Signal Synchronization System Using Chinese Remainder Theorem  </w:t>
-      </w:r>
-    </w:p>
-    <w:p>
-      <w:pPr>
-        <w:spacing w:after="80" w:line="276" w:lineRule="auto"/>
-      </w:pPr>
-      <w:r>
-        <w:rPr>
-          <w:rFonts w:ascii="Times New Roman" w:hAnsi="Times New Roman"/>
-          <w:b/>
-        </w:rPr>
-        <w:t>COURSE:</w:t>
-      </w:r>
-      <w:r>
-        <w:rPr>
-          <w:rFonts w:ascii="Times New Roman" w:hAnsi="Times New Roman"/>
-        </w:rPr>
-        <w:t xml:space="preserve"> Number Theory &amp; Discrete Mathematics Application  </w:t>
-      </w:r>
-    </w:p>
-    <w:p>
-      <w:pPr>
-        <w:spacing w:after="80" w:line="276" w:lineRule="auto"/>
-      </w:pPr>
-      <w:r>
-        <w:rPr>
-          <w:rFonts w:ascii="Times New Roman" w:hAnsi="Times New Roman"/>
-          <w:b/>
-        </w:rPr>
-        <w:t>CLASS:</w:t>
-      </w:r>
-      <w:r>
-        <w:rPr>
-          <w:rFonts w:ascii="Times New Roman" w:hAnsi="Times New Roman"/>
-        </w:rPr>
-        <w:t xml:space="preserve"> S3 CSE B  </w:t>
-      </w:r>
-    </w:p>
-    <w:p>
-      <w:pPr>
-        <w:spacing w:after="80" w:line="276" w:lineRule="auto"/>
-      </w:pPr>
-      <w:r>
-        <w:rPr>
-          <w:rFonts w:ascii="Times New Roman" w:hAnsi="Times New Roman"/>
-          <w:b/>
-        </w:rPr>
-        <w:t>STUDENT NAME:</w:t>
-      </w:r>
-      <w:r>
-        <w:rPr>
-          <w:rFonts w:ascii="Times New Roman" w:hAnsi="Times New Roman"/>
-        </w:rPr>
-        <w:t xml:space="preserve"> Justin Joe Mathew  </w:t>
-      </w:r>
-    </w:p>
-    <w:p>
-      <w:pPr>
-        <w:spacing w:after="80" w:line="276" w:lineRule="auto"/>
-      </w:pPr>
-      <w:r>
-        <w:rPr>
-          <w:rFonts w:ascii="Times New Roman" w:hAnsi="Times New Roman"/>
-          <w:b/>
-        </w:rPr>
-        <w:t>ROLL NO:</w:t>
-      </w:r>
-      <w:r>
-        <w:rPr>
-          <w:rFonts w:ascii="Times New Roman" w:hAnsi="Times New Roman"/>
-        </w:rPr>
-        <w:t xml:space="preserve"> 58  </w:t>
-      </w:r>
-    </w:p>
-    <w:p>
-      <w:pPr>
-        <w:spacing w:after="80" w:line="276" w:lineRule="auto"/>
-      </w:pPr>
-      <w:r>
-        <w:rPr>
-          <w:rFonts w:ascii="Times New Roman" w:hAnsi="Times New Roman"/>
-          <w:b/>
-        </w:rPr>
-        <w:t>ROLE / FUNCTION:</w:t>
-      </w:r>
-      <w:r>
-        <w:rPr>
-          <w:rFonts w:ascii="Times New Roman" w:hAnsi="Times New Roman"/>
-        </w:rPr>
-        <w:t xml:space="preserve"> Team Lead &amp; Working Model Engineer  </w:t>
-      </w:r>
+    <w:tbl>
+      <w:tblPr>
+        <w:tblW w:type="auto" w:w="0"/>
+        <w:tblLayout w:type="fixed"/>
+        <w:tblLook w:firstColumn="1" w:firstRow="1" w:lastColumn="0" w:lastRow="0" w:noHBand="0" w:noVBand="1" w:val="04A0"/>
+      </w:tblPr>
+      <w:tblGrid>
+        <w:gridCol w:w="4968"/>
+        <w:gridCol w:w="4968"/>
+      </w:tblGrid>
+      <w:tr>
+        <w:tc>
+          <w:tcPr>
+            <w:tcW w:type="dxa" w:w="4896"/>
+          </w:tcPr>
+          <w:p>
+            <w:pPr>
+              <w:spacing w:before="40" w:after="40"/>
+            </w:pPr>
+            <w:r>
+              <w:rPr>
+                <w:rFonts w:ascii="Times New Roman" w:hAnsi="Times New Roman"/>
+                <w:b/>
+              </w:rPr>
+              <w:t>PROJECT TITLE:</w:t>
+            </w:r>
+            <w:r>
+              <w:rPr>
+                <w:rFonts w:ascii="Times New Roman" w:hAnsi="Times New Roman"/>
+              </w:rPr>
+              <w:t xml:space="preserve"> Traffic Signal Synchronization System Using Chinese Remainder Theorem</w:t>
+            </w:r>
+          </w:p>
+        </w:tc>
+        <w:tc>
+          <w:tcPr>
+            <w:tcW w:type="dxa" w:w="4608"/>
+          </w:tcPr>
+          <w:p>
+            <w:pPr>
+              <w:spacing w:before="40" w:after="40"/>
+            </w:pPr>
+            <w:r>
+              <w:rPr>
+                <w:rFonts w:ascii="Times New Roman" w:hAnsi="Times New Roman"/>
+                <w:b/>
+              </w:rPr>
+              <w:t>STUDENT NAME:</w:t>
+            </w:r>
+            <w:r>
+              <w:rPr>
+                <w:rFonts w:ascii="Times New Roman" w:hAnsi="Times New Roman"/>
+              </w:rPr>
+              <w:t xml:space="preserve"> Justin Joe Mathew</w:t>
+            </w:r>
+          </w:p>
+        </w:tc>
+      </w:tr>
+      <w:tr>
+        <w:tc>
+          <w:tcPr>
+            <w:tcW w:type="dxa" w:w="4896"/>
+          </w:tcPr>
+          <w:p>
+            <w:pPr>
+              <w:spacing w:before="40" w:after="40"/>
+            </w:pPr>
+            <w:r>
+              <w:rPr>
+                <w:rFonts w:ascii="Times New Roman" w:hAnsi="Times New Roman"/>
+                <w:b/>
+              </w:rPr>
+              <w:t>COURSE:</w:t>
+            </w:r>
+            <w:r>
+              <w:rPr>
+                <w:rFonts w:ascii="Times New Roman" w:hAnsi="Times New Roman"/>
+              </w:rPr>
+              <w:t xml:space="preserve"> Number Theory &amp; Discrete Mathematics Application</w:t>
+            </w:r>
+          </w:p>
+        </w:tc>
+        <w:tc>
+          <w:tcPr>
+            <w:tcW w:type="dxa" w:w="4608"/>
+          </w:tcPr>
+          <w:p>
+            <w:pPr>
+              <w:spacing w:before="40" w:after="40"/>
+            </w:pPr>
+            <w:r>
+              <w:rPr>
+                <w:rFonts w:ascii="Times New Roman" w:hAnsi="Times New Roman"/>
+                <w:b/>
+              </w:rPr>
+              <w:t>ROLL NO:</w:t>
+            </w:r>
+            <w:r>
+              <w:rPr>
+                <w:rFonts w:ascii="Times New Roman" w:hAnsi="Times New Roman"/>
+              </w:rPr>
+              <w:t xml:space="preserve"> 58</w:t>
+            </w:r>
+          </w:p>
+        </w:tc>
+      </w:tr>
+      <w:tr>
+        <w:tc>
+          <w:tcPr>
+            <w:tcW w:type="dxa" w:w="4896"/>
+          </w:tcPr>
+          <w:p>
+            <w:pPr>
+              <w:spacing w:before="40" w:after="40"/>
+            </w:pPr>
+            <w:r>
+              <w:rPr>
+                <w:rFonts w:ascii="Times New Roman" w:hAnsi="Times New Roman"/>
+                <w:b/>
+              </w:rPr>
+              <w:t>CLASS:</w:t>
+            </w:r>
+            <w:r>
+              <w:rPr>
+                <w:rFonts w:ascii="Times New Roman" w:hAnsi="Times New Roman"/>
+              </w:rPr>
+              <w:t xml:space="preserve"> S3 CSE B</w:t>
+            </w:r>
+          </w:p>
+        </w:tc>
+        <w:tc>
+          <w:tcPr>
+            <w:tcW w:type="dxa" w:w="4608"/>
+          </w:tcPr>
+          <w:p>
+            <w:pPr>
+              <w:spacing w:before="40" w:after="40"/>
+            </w:pPr>
+            <w:r>
+              <w:rPr>
+                <w:rFonts w:ascii="Times New Roman" w:hAnsi="Times New Roman"/>
+                <w:b/>
+              </w:rPr>
+              <w:t>ROLE / FUNCTION:</w:t>
+            </w:r>
+            <w:r>
+              <w:rPr>
+                <w:rFonts w:ascii="Times New Roman" w:hAnsi="Times New Roman"/>
+              </w:rPr>
+              <w:t xml:space="preserve"> Team Lead &amp; Working Model Engineer</w:t>
+            </w:r>
+          </w:p>
+        </w:tc>
+      </w:tr>
+    </w:tbl>
+    <w:p>
+      <w:pPr>
+        <w:spacing w:after="80"/>
+      </w:pPr>
     </w:p>
     <w:p>
       <w:pPr>
@@ -10138,113 +10554,165 @@
         <w:t>MATHEMATICS PROJECT ASSIGNMENT REPORT</w:t>
       </w:r>
     </w:p>
-    <w:p>
-      <w:pPr>
-        <w:spacing w:after="80" w:line="276" w:lineRule="auto"/>
-      </w:pPr>
-      <w:r>
-        <w:rPr>
-          <w:rFonts w:ascii="Times New Roman" w:hAnsi="Times New Roman"/>
-          <w:b/>
-        </w:rPr>
-        <w:t>PROJECT TITLE:</w:t>
-      </w:r>
-      <w:r>
-        <w:rPr>
-          <w:rFonts w:ascii="Times New Roman" w:hAnsi="Times New Roman"/>
-        </w:rPr>
-        <w:t xml:space="preserve"> Traffic Signal Synchronization System Using Chinese Remainder Theorem  </w:t>
-      </w:r>
-    </w:p>
-    <w:p>
-      <w:pPr>
-        <w:spacing w:after="80" w:line="276" w:lineRule="auto"/>
-      </w:pPr>
-      <w:r>
-        <w:rPr>
-          <w:rFonts w:ascii="Times New Roman" w:hAnsi="Times New Roman"/>
-          <w:b/>
-        </w:rPr>
-        <w:t>COURSE:</w:t>
-      </w:r>
-      <w:r>
-        <w:rPr>
-          <w:rFonts w:ascii="Times New Roman" w:hAnsi="Times New Roman"/>
-        </w:rPr>
-        <w:t xml:space="preserve"> Number Theory &amp; Discrete Mathematics Application  </w:t>
-      </w:r>
-    </w:p>
-    <w:p>
-      <w:pPr>
-        <w:spacing w:after="80" w:line="276" w:lineRule="auto"/>
-      </w:pPr>
-      <w:r>
-        <w:rPr>
-          <w:rFonts w:ascii="Times New Roman" w:hAnsi="Times New Roman"/>
-          <w:b/>
-        </w:rPr>
-        <w:t>CLASS:</w:t>
-      </w:r>
-      <w:r>
-        <w:rPr>
-          <w:rFonts w:ascii="Times New Roman" w:hAnsi="Times New Roman"/>
-        </w:rPr>
-        <w:t xml:space="preserve"> S3 CSE B  </w:t>
-      </w:r>
-    </w:p>
-    <w:p>
-      <w:pPr>
-        <w:spacing w:after="80" w:line="276" w:lineRule="auto"/>
-      </w:pPr>
-      <w:r>
-        <w:rPr>
-          <w:rFonts w:ascii="Times New Roman" w:hAnsi="Times New Roman"/>
-          <w:b/>
-        </w:rPr>
-        <w:t>STUDENT NAME:</w:t>
-      </w:r>
-      <w:r>
-        <w:rPr>
-          <w:rFonts w:ascii="Times New Roman" w:hAnsi="Times New Roman"/>
-        </w:rPr>
-        <w:t xml:space="preserve"> Jyothika Prakash  </w:t>
-      </w:r>
-    </w:p>
-    <w:p>
-      <w:pPr>
-        <w:spacing w:after="80" w:line="276" w:lineRule="auto"/>
-      </w:pPr>
-      <w:r>
-        <w:rPr>
-          <w:rFonts w:ascii="Times New Roman" w:hAnsi="Times New Roman"/>
-          <w:b/>
-        </w:rPr>
-        <w:t>ROLL NO:</w:t>
-      </w:r>
-      <w:r>
-        <w:rPr>
-          <w:rFonts w:ascii="Times New Roman" w:hAnsi="Times New Roman"/>
-        </w:rPr>
-        <w:t xml:space="preserve"> 59  </w:t>
-      </w:r>
-    </w:p>
-    <w:p>
-      <w:pPr>
-        <w:spacing w:after="80" w:line="276" w:lineRule="auto"/>
-      </w:pPr>
-      <w:r>
-        <w:rPr>
-          <w:rFonts w:ascii="Times New Roman" w:hAnsi="Times New Roman"/>
-          <w:b/>
-        </w:rPr>
-        <w:t>ROLE / FUNCTION:</w:t>
-      </w:r>
-      <w:r>
-        <w:rPr>
-          <w:rFonts w:ascii="Times New Roman" w:hAnsi="Times New Roman"/>
-        </w:rPr>
-        <w:t xml:space="preserve"> Pedagogical Systems &amp; Educational Design  </w:t>
-      </w:r>
+    <w:tbl>
+      <w:tblPr>
+        <w:tblW w:type="auto" w:w="0"/>
+        <w:tblLayout w:type="fixed"/>
+        <w:tblLook w:firstColumn="1" w:firstRow="1" w:lastColumn="0" w:lastRow="0" w:noHBand="0" w:noVBand="1" w:val="04A0"/>
+      </w:tblPr>
+      <w:tblGrid>
+        <w:gridCol w:w="4968"/>
+        <w:gridCol w:w="4968"/>
+      </w:tblGrid>
+      <w:tr>
+        <w:tc>
+          <w:tcPr>
+            <w:tcW w:type="dxa" w:w="4896"/>
+          </w:tcPr>
+          <w:p>
+            <w:pPr>
+              <w:spacing w:before="40" w:after="40"/>
+            </w:pPr>
+            <w:r>
+              <w:rPr>
+                <w:rFonts w:ascii="Times New Roman" w:hAnsi="Times New Roman"/>
+                <w:b/>
+              </w:rPr>
+              <w:t>PROJECT TITLE:</w:t>
+            </w:r>
+            <w:r>
+              <w:rPr>
+                <w:rFonts w:ascii="Times New Roman" w:hAnsi="Times New Roman"/>
+              </w:rPr>
+              <w:t xml:space="preserve"> Traffic Signal Synchronization System Using Chinese Remainder Theorem</w:t>
+            </w:r>
+          </w:p>
+        </w:tc>
+        <w:tc>
+          <w:tcPr>
+            <w:tcW w:type="dxa" w:w="4608"/>
+          </w:tcPr>
+          <w:p>
+            <w:pPr>
+              <w:spacing w:before="40" w:after="40"/>
+            </w:pPr>
+            <w:r>
+              <w:rPr>
+                <w:rFonts w:ascii="Times New Roman" w:hAnsi="Times New Roman"/>
+                <w:b/>
+              </w:rPr>
+              <w:t>STUDENT NAME:</w:t>
+            </w:r>
+            <w:r>
+              <w:rPr>
+                <w:rFonts w:ascii="Times New Roman" w:hAnsi="Times New Roman"/>
+              </w:rPr>
+              <w:t xml:space="preserve"> Jyothika Prakash</w:t>
+            </w:r>
+          </w:p>
+        </w:tc>
+      </w:tr>
+      <w:tr>
+        <w:tc>
+          <w:tcPr>
+            <w:tcW w:type="dxa" w:w="4896"/>
+          </w:tcPr>
+          <w:p>
+            <w:pPr>
+              <w:spacing w:before="40" w:after="40"/>
+            </w:pPr>
+            <w:r>
+              <w:rPr>
+                <w:rFonts w:ascii="Times New Roman" w:hAnsi="Times New Roman"/>
+                <w:b/>
+              </w:rPr>
+              <w:t>COURSE:</w:t>
+            </w:r>
+            <w:r>
+              <w:rPr>
+                <w:rFonts w:ascii="Times New Roman" w:hAnsi="Times New Roman"/>
+              </w:rPr>
+              <w:t xml:space="preserve"> Number Theory &amp; Discrete Mathematics Application</w:t>
+            </w:r>
+          </w:p>
+        </w:tc>
+        <w:tc>
+          <w:tcPr>
+            <w:tcW w:type="dxa" w:w="4608"/>
+          </w:tcPr>
+          <w:p>
+            <w:pPr>
+              <w:spacing w:before="40" w:after="40"/>
+            </w:pPr>
+            <w:r>
+              <w:rPr>
+                <w:rFonts w:ascii="Times New Roman" w:hAnsi="Times New Roman"/>
+                <w:b/>
+              </w:rPr>
+              <w:t>ROLL NO:</w:t>
+            </w:r>
+            <w:r>
+              <w:rPr>
+                <w:rFonts w:ascii="Times New Roman" w:hAnsi="Times New Roman"/>
+              </w:rPr>
+              <w:t xml:space="preserve"> 59</w:t>
+            </w:r>
+          </w:p>
+        </w:tc>
+      </w:tr>
+      <w:tr>
+        <w:tc>
+          <w:tcPr>
+            <w:tcW w:type="dxa" w:w="4896"/>
+          </w:tcPr>
+          <w:p>
+            <w:pPr>
+              <w:spacing w:before="40" w:after="40"/>
+            </w:pPr>
+            <w:r>
+              <w:rPr>
+                <w:rFonts w:ascii="Times New Roman" w:hAnsi="Times New Roman"/>
+                <w:b/>
+              </w:rPr>
+              <w:t>CLASS:</w:t>
+            </w:r>
+            <w:r>
+              <w:rPr>
+                <w:rFonts w:ascii="Times New Roman" w:hAnsi="Times New Roman"/>
+              </w:rPr>
+              <w:t xml:space="preserve"> S3 CSE B</w:t>
+            </w:r>
+          </w:p>
+        </w:tc>
+        <w:tc>
+          <w:tcPr>
+            <w:tcW w:type="dxa" w:w="4608"/>
+          </w:tcPr>
+          <w:p>
+            <w:pPr>
+              <w:spacing w:before="40" w:after="40"/>
+            </w:pPr>
+            <w:r>
+              <w:rPr>
+                <w:rFonts w:ascii="Times New Roman" w:hAnsi="Times New Roman"/>
+                <w:b/>
+              </w:rPr>
+              <w:t>ROLE / FUNCTION:</w:t>
+            </w:r>
+            <w:r>
+              <w:rPr>
+                <w:rFonts w:ascii="Times New Roman" w:hAnsi="Times New Roman"/>
+              </w:rPr>
+              <w:t xml:space="preserve"> Pedagogical Systems &amp; Educational Design</w:t>
+            </w:r>
+          </w:p>
+        </w:tc>
+      </w:tr>
+    </w:tbl>
+    <w:p>
+      <w:pPr>
+        <w:spacing w:after="80"/>
+      </w:pPr>
     </w:p>
     <w:p>
       <w:pPr>
@@ -11403,113 +11871,165 @@
         <w:t>MATHEMATICS PROJECT ASSIGNMENT REPORT</w:t>
       </w:r>
     </w:p>
-    <w:p>
-      <w:pPr>
-        <w:spacing w:after="80" w:line="276" w:lineRule="auto"/>
-      </w:pPr>
-      <w:r>
-        <w:rPr>
-          <w:rFonts w:ascii="Times New Roman" w:hAnsi="Times New Roman"/>
-          <w:b/>
-        </w:rPr>
-        <w:t>PROJECT TITLE:</w:t>
-      </w:r>
-      <w:r>
-        <w:rPr>
-          <w:rFonts w:ascii="Times New Roman" w:hAnsi="Times New Roman"/>
-        </w:rPr>
-        <w:t xml:space="preserve"> Traffic Signal Synchronization System Using Chinese Remainder Theorem  </w:t>
-      </w:r>
-    </w:p>
-    <w:p>
-      <w:pPr>
-        <w:spacing w:after="80" w:line="276" w:lineRule="auto"/>
-      </w:pPr>
-      <w:r>
-        <w:rPr>
-          <w:rFonts w:ascii="Times New Roman" w:hAnsi="Times New Roman"/>
-          <w:b/>
-        </w:rPr>
-        <w:t>COURSE:</w:t>
-      </w:r>
-      <w:r>
-        <w:rPr>
-          <w:rFonts w:ascii="Times New Roman" w:hAnsi="Times New Roman"/>
-        </w:rPr>
-        <w:t xml:space="preserve"> Number Theory &amp; Discrete Mathematics Application  </w:t>
-      </w:r>
-    </w:p>
-    <w:p>
-      <w:pPr>
-        <w:spacing w:after="80" w:line="276" w:lineRule="auto"/>
-      </w:pPr>
-      <w:r>
-        <w:rPr>
-          <w:rFonts w:ascii="Times New Roman" w:hAnsi="Times New Roman"/>
-          <w:b/>
-        </w:rPr>
-        <w:t>CLASS:</w:t>
-      </w:r>
-      <w:r>
-        <w:rPr>
-          <w:rFonts w:ascii="Times New Roman" w:hAnsi="Times New Roman"/>
-        </w:rPr>
-        <w:t xml:space="preserve"> S3 CSE B  </w:t>
-      </w:r>
-    </w:p>
-    <w:p>
-      <w:pPr>
-        <w:spacing w:after="80" w:line="276" w:lineRule="auto"/>
-      </w:pPr>
-      <w:r>
-        <w:rPr>
-          <w:rFonts w:ascii="Times New Roman" w:hAnsi="Times New Roman"/>
-          <w:b/>
-        </w:rPr>
-        <w:t>STUDENT NAME:</w:t>
-      </w:r>
-      <w:r>
-        <w:rPr>
-          <w:rFonts w:ascii="Times New Roman" w:hAnsi="Times New Roman"/>
-        </w:rPr>
-        <w:t xml:space="preserve"> Jyothis Liju  </w:t>
-      </w:r>
-    </w:p>
-    <w:p>
-      <w:pPr>
-        <w:spacing w:after="80" w:line="276" w:lineRule="auto"/>
-      </w:pPr>
-      <w:r>
-        <w:rPr>
-          <w:rFonts w:ascii="Times New Roman" w:hAnsi="Times New Roman"/>
-          <w:b/>
-        </w:rPr>
-        <w:t>ROLL NO:</w:t>
-      </w:r>
-      <w:r>
-        <w:rPr>
-          <w:rFonts w:ascii="Times New Roman" w:hAnsi="Times New Roman"/>
-        </w:rPr>
-        <w:t xml:space="preserve"> 60  </w:t>
-      </w:r>
-    </w:p>
-    <w:p>
-      <w:pPr>
-        <w:spacing w:after="80" w:line="276" w:lineRule="auto"/>
-      </w:pPr>
-      <w:r>
-        <w:rPr>
-          <w:rFonts w:ascii="Times New Roman" w:hAnsi="Times New Roman"/>
-          <w:b/>
-        </w:rPr>
-        <w:t>ROLE / FUNCTION:</w:t>
-      </w:r>
-      <w:r>
-        <w:rPr>
-          <w:rFonts w:ascii="Times New Roman" w:hAnsi="Times New Roman"/>
-        </w:rPr>
-        <w:t xml:space="preserve"> Working Model Co-Developer  </w:t>
-      </w:r>
+    <w:tbl>
+      <w:tblPr>
+        <w:tblW w:type="auto" w:w="0"/>
+        <w:tblLayout w:type="fixed"/>
+        <w:tblLook w:firstColumn="1" w:firstRow="1" w:lastColumn="0" w:lastRow="0" w:noHBand="0" w:noVBand="1" w:val="04A0"/>
+      </w:tblPr>
+      <w:tblGrid>
+        <w:gridCol w:w="4968"/>
+        <w:gridCol w:w="4968"/>
+      </w:tblGrid>
+      <w:tr>
+        <w:tc>
+          <w:tcPr>
+            <w:tcW w:type="dxa" w:w="4896"/>
+          </w:tcPr>
+          <w:p>
+            <w:pPr>
+              <w:spacing w:before="40" w:after="40"/>
+            </w:pPr>
+            <w:r>
+              <w:rPr>
+                <w:rFonts w:ascii="Times New Roman" w:hAnsi="Times New Roman"/>
+                <w:b/>
+              </w:rPr>
+              <w:t>PROJECT TITLE:</w:t>
+            </w:r>
+            <w:r>
+              <w:rPr>
+                <w:rFonts w:ascii="Times New Roman" w:hAnsi="Times New Roman"/>
+              </w:rPr>
+              <w:t xml:space="preserve"> Traffic Signal Synchronization System Using Chinese Remainder Theorem</w:t>
+            </w:r>
+          </w:p>
+        </w:tc>
+        <w:tc>
+          <w:tcPr>
+            <w:tcW w:type="dxa" w:w="4608"/>
+          </w:tcPr>
+          <w:p>
+            <w:pPr>
+              <w:spacing w:before="40" w:after="40"/>
+            </w:pPr>
+            <w:r>
+              <w:rPr>
+                <w:rFonts w:ascii="Times New Roman" w:hAnsi="Times New Roman"/>
+                <w:b/>
+              </w:rPr>
+              <w:t>STUDENT NAME:</w:t>
+            </w:r>
+            <w:r>
+              <w:rPr>
+                <w:rFonts w:ascii="Times New Roman" w:hAnsi="Times New Roman"/>
+              </w:rPr>
+              <w:t xml:space="preserve"> Jyothis Liju</w:t>
+            </w:r>
+          </w:p>
+        </w:tc>
+      </w:tr>
+      <w:tr>
+        <w:tc>
+          <w:tcPr>
+            <w:tcW w:type="dxa" w:w="4896"/>
+          </w:tcPr>
+          <w:p>
+            <w:pPr>
+              <w:spacing w:before="40" w:after="40"/>
+            </w:pPr>
+            <w:r>
+              <w:rPr>
+                <w:rFonts w:ascii="Times New Roman" w:hAnsi="Times New Roman"/>
+                <w:b/>
+              </w:rPr>
+              <w:t>COURSE:</w:t>
+            </w:r>
+            <w:r>
+              <w:rPr>
+                <w:rFonts w:ascii="Times New Roman" w:hAnsi="Times New Roman"/>
+              </w:rPr>
+              <w:t xml:space="preserve"> Number Theory &amp; Discrete Mathematics Application</w:t>
+            </w:r>
+          </w:p>
+        </w:tc>
+        <w:tc>
+          <w:tcPr>
+            <w:tcW w:type="dxa" w:w="4608"/>
+          </w:tcPr>
+          <w:p>
+            <w:pPr>
+              <w:spacing w:before="40" w:after="40"/>
+            </w:pPr>
+            <w:r>
+              <w:rPr>
+                <w:rFonts w:ascii="Times New Roman" w:hAnsi="Times New Roman"/>
+                <w:b/>
+              </w:rPr>
+              <w:t>ROLL NO:</w:t>
+            </w:r>
+            <w:r>
+              <w:rPr>
+                <w:rFonts w:ascii="Times New Roman" w:hAnsi="Times New Roman"/>
+              </w:rPr>
+              <w:t xml:space="preserve"> 60</w:t>
+            </w:r>
+          </w:p>
+        </w:tc>
+      </w:tr>
+      <w:tr>
+        <w:tc>
+          <w:tcPr>
+            <w:tcW w:type="dxa" w:w="4896"/>
+          </w:tcPr>
+          <w:p>
+            <w:pPr>
+              <w:spacing w:before="40" w:after="40"/>
+            </w:pPr>
+            <w:r>
+              <w:rPr>
+                <w:rFonts w:ascii="Times New Roman" w:hAnsi="Times New Roman"/>
+                <w:b/>
+              </w:rPr>
+              <w:t>CLASS:</w:t>
+            </w:r>
+            <w:r>
+              <w:rPr>
+                <w:rFonts w:ascii="Times New Roman" w:hAnsi="Times New Roman"/>
+              </w:rPr>
+              <w:t xml:space="preserve"> S3 CSE B</w:t>
+            </w:r>
+          </w:p>
+        </w:tc>
+        <w:tc>
+          <w:tcPr>
+            <w:tcW w:type="dxa" w:w="4608"/>
+          </w:tcPr>
+          <w:p>
+            <w:pPr>
+              <w:spacing w:before="40" w:after="40"/>
+            </w:pPr>
+            <w:r>
+              <w:rPr>
+                <w:rFonts w:ascii="Times New Roman" w:hAnsi="Times New Roman"/>
+                <w:b/>
+              </w:rPr>
+              <w:t>ROLE / FUNCTION:</w:t>
+            </w:r>
+            <w:r>
+              <w:rPr>
+                <w:rFonts w:ascii="Times New Roman" w:hAnsi="Times New Roman"/>
+              </w:rPr>
+              <w:t xml:space="preserve"> Working Model Co-Developer</w:t>
+            </w:r>
+          </w:p>
+        </w:tc>
+      </w:tr>
+    </w:tbl>
+    <w:p>
+      <w:pPr>
+        <w:spacing w:after="80"/>
+      </w:pPr>
     </w:p>
     <w:p>
       <w:pPr>

</xml_diff>

<commit_message>
Add interactive web app URL and repository link to Section 4 of all reports
</commit_message>
<xml_diff>
--- a/docs/Master_CRT_Assignment_Reports.docx
+++ b/docs/Master_CRT_Assignment_Reports.docx
@@ -674,7 +674,31 @@
         <w:rPr>
           <w:rFonts w:ascii="Times New Roman" w:hAnsi="Times New Roman"/>
         </w:rPr>
-        <w:t>The hardware prototype is driven by an Arduino Nano microcontroller controlling a 3-intersection LED traffic array and piezo buzzer.</w:t>
+        <w:t>The hardware prototype is driven by an Arduino Nano microcontroller controlling a 3-intersection LED traffic array and piezo buzzer. The physical build is paired with an interactive digital twin web application accessible at:</w:t>
+      </w:r>
+    </w:p>
+    <w:p>
+      <w:pPr>
+        <w:spacing w:after="80" w:line="276" w:lineRule="auto"/>
+      </w:pPr>
+      <w:r>
+        <w:rPr>
+          <w:rFonts w:ascii="Times New Roman" w:hAnsi="Times New Roman"/>
+        </w:rPr>
+        <w:t xml:space="preserve">👉 </w:t>
+      </w:r>
+      <w:r>
+        <w:rPr>
+          <w:rFonts w:ascii="Times New Roman" w:hAnsi="Times New Roman"/>
+          <w:b/>
+        </w:rPr>
+        <w:t>Interactive Web App &amp; Project Repository:</w:t>
+      </w:r>
+      <w:r>
+        <w:rPr>
+          <w:rFonts w:ascii="Times New Roman" w:hAnsi="Times New Roman"/>
+        </w:rPr>
+        <w:t xml:space="preserve"> https://github.com/jvstin47/CRT--Chinese-Reminder-Theorem (Local Dev Server: http://localhost:5173/)</w:t>
       </w:r>
     </w:p>
     <w:p>
@@ -1991,7 +2015,31 @@
         <w:rPr>
           <w:rFonts w:ascii="Times New Roman" w:hAnsi="Times New Roman"/>
         </w:rPr>
-        <w:t>The hardware prototype is driven by an Arduino Nano microcontroller controlling a 3-intersection LED traffic array and piezo buzzer.</w:t>
+        <w:t>The hardware prototype is driven by an Arduino Nano microcontroller controlling a 3-intersection LED traffic array and piezo buzzer. The physical build is paired with an interactive digital twin web application accessible at:</w:t>
+      </w:r>
+    </w:p>
+    <w:p>
+      <w:pPr>
+        <w:spacing w:after="80" w:line="276" w:lineRule="auto"/>
+      </w:pPr>
+      <w:r>
+        <w:rPr>
+          <w:rFonts w:ascii="Times New Roman" w:hAnsi="Times New Roman"/>
+        </w:rPr>
+        <w:t xml:space="preserve">👉 </w:t>
+      </w:r>
+      <w:r>
+        <w:rPr>
+          <w:rFonts w:ascii="Times New Roman" w:hAnsi="Times New Roman"/>
+          <w:b/>
+        </w:rPr>
+        <w:t>Interactive Web App &amp; Project Repository:</w:t>
+      </w:r>
+      <w:r>
+        <w:rPr>
+          <w:rFonts w:ascii="Times New Roman" w:hAnsi="Times New Roman"/>
+        </w:rPr>
+        <w:t xml:space="preserve"> https://github.com/jvstin47/CRT--Chinese-Reminder-Theorem (Local Dev Server: http://localhost:5173/)</w:t>
       </w:r>
     </w:p>
     <w:p>
@@ -3308,7 +3356,31 @@
         <w:rPr>
           <w:rFonts w:ascii="Times New Roman" w:hAnsi="Times New Roman"/>
         </w:rPr>
-        <w:t>The hardware prototype is driven by an Arduino Nano microcontroller controlling a 3-intersection LED traffic array and piezo buzzer.</w:t>
+        <w:t>The hardware prototype is driven by an Arduino Nano microcontroller controlling a 3-intersection LED traffic array and piezo buzzer. The physical build is paired with an interactive digital twin web application accessible at:</w:t>
+      </w:r>
+    </w:p>
+    <w:p>
+      <w:pPr>
+        <w:spacing w:after="80" w:line="276" w:lineRule="auto"/>
+      </w:pPr>
+      <w:r>
+        <w:rPr>
+          <w:rFonts w:ascii="Times New Roman" w:hAnsi="Times New Roman"/>
+        </w:rPr>
+        <w:t xml:space="preserve">👉 </w:t>
+      </w:r>
+      <w:r>
+        <w:rPr>
+          <w:rFonts w:ascii="Times New Roman" w:hAnsi="Times New Roman"/>
+          <w:b/>
+        </w:rPr>
+        <w:t>Interactive Web App &amp; Project Repository:</w:t>
+      </w:r>
+      <w:r>
+        <w:rPr>
+          <w:rFonts w:ascii="Times New Roman" w:hAnsi="Times New Roman"/>
+        </w:rPr>
+        <w:t xml:space="preserve"> https://github.com/jvstin47/CRT--Chinese-Reminder-Theorem (Local Dev Server: http://localhost:5173/)</w:t>
       </w:r>
     </w:p>
     <w:p>
@@ -4625,7 +4697,31 @@
         <w:rPr>
           <w:rFonts w:ascii="Times New Roman" w:hAnsi="Times New Roman"/>
         </w:rPr>
-        <w:t>The hardware prototype is driven by an Arduino Nano microcontroller controlling a 3-intersection LED traffic array and piezo buzzer.</w:t>
+        <w:t>The hardware prototype is driven by an Arduino Nano microcontroller controlling a 3-intersection LED traffic array and piezo buzzer. The physical build is paired with an interactive digital twin web application accessible at:</w:t>
+      </w:r>
+    </w:p>
+    <w:p>
+      <w:pPr>
+        <w:spacing w:after="80" w:line="276" w:lineRule="auto"/>
+      </w:pPr>
+      <w:r>
+        <w:rPr>
+          <w:rFonts w:ascii="Times New Roman" w:hAnsi="Times New Roman"/>
+        </w:rPr>
+        <w:t xml:space="preserve">👉 </w:t>
+      </w:r>
+      <w:r>
+        <w:rPr>
+          <w:rFonts w:ascii="Times New Roman" w:hAnsi="Times New Roman"/>
+          <w:b/>
+        </w:rPr>
+        <w:t>Interactive Web App &amp; Project Repository:</w:t>
+      </w:r>
+      <w:r>
+        <w:rPr>
+          <w:rFonts w:ascii="Times New Roman" w:hAnsi="Times New Roman"/>
+        </w:rPr>
+        <w:t xml:space="preserve"> https://github.com/jvstin47/CRT--Chinese-Reminder-Theorem (Local Dev Server: http://localhost:5173/)</w:t>
       </w:r>
     </w:p>
     <w:p>
@@ -5942,7 +6038,31 @@
         <w:rPr>
           <w:rFonts w:ascii="Times New Roman" w:hAnsi="Times New Roman"/>
         </w:rPr>
-        <w:t>The hardware prototype is driven by an Arduino Nano microcontroller controlling a 3-intersection LED traffic array and piezo buzzer.</w:t>
+        <w:t>The hardware prototype is driven by an Arduino Nano microcontroller controlling a 3-intersection LED traffic array and piezo buzzer. The physical build is paired with an interactive digital twin web application accessible at:</w:t>
+      </w:r>
+    </w:p>
+    <w:p>
+      <w:pPr>
+        <w:spacing w:after="80" w:line="276" w:lineRule="auto"/>
+      </w:pPr>
+      <w:r>
+        <w:rPr>
+          <w:rFonts w:ascii="Times New Roman" w:hAnsi="Times New Roman"/>
+        </w:rPr>
+        <w:t xml:space="preserve">👉 </w:t>
+      </w:r>
+      <w:r>
+        <w:rPr>
+          <w:rFonts w:ascii="Times New Roman" w:hAnsi="Times New Roman"/>
+          <w:b/>
+        </w:rPr>
+        <w:t>Interactive Web App &amp; Project Repository:</w:t>
+      </w:r>
+      <w:r>
+        <w:rPr>
+          <w:rFonts w:ascii="Times New Roman" w:hAnsi="Times New Roman"/>
+        </w:rPr>
+        <w:t xml:space="preserve"> https://github.com/jvstin47/CRT--Chinese-Reminder-Theorem (Local Dev Server: http://localhost:5173/)</w:t>
       </w:r>
     </w:p>
     <w:p>
@@ -7259,7 +7379,31 @@
         <w:rPr>
           <w:rFonts w:ascii="Times New Roman" w:hAnsi="Times New Roman"/>
         </w:rPr>
-        <w:t>The hardware prototype is driven by an Arduino Nano microcontroller controlling a 3-intersection LED traffic array and piezo buzzer.</w:t>
+        <w:t>The hardware prototype is driven by an Arduino Nano microcontroller controlling a 3-intersection LED traffic array and piezo buzzer. The physical build is paired with an interactive digital twin web application accessible at:</w:t>
+      </w:r>
+    </w:p>
+    <w:p>
+      <w:pPr>
+        <w:spacing w:after="80" w:line="276" w:lineRule="auto"/>
+      </w:pPr>
+      <w:r>
+        <w:rPr>
+          <w:rFonts w:ascii="Times New Roman" w:hAnsi="Times New Roman"/>
+        </w:rPr>
+        <w:t xml:space="preserve">👉 </w:t>
+      </w:r>
+      <w:r>
+        <w:rPr>
+          <w:rFonts w:ascii="Times New Roman" w:hAnsi="Times New Roman"/>
+          <w:b/>
+        </w:rPr>
+        <w:t>Interactive Web App &amp; Project Repository:</w:t>
+      </w:r>
+      <w:r>
+        <w:rPr>
+          <w:rFonts w:ascii="Times New Roman" w:hAnsi="Times New Roman"/>
+        </w:rPr>
+        <w:t xml:space="preserve"> https://github.com/jvstin47/CRT--Chinese-Reminder-Theorem (Local Dev Server: http://localhost:5173/)</w:t>
       </w:r>
     </w:p>
     <w:p>
@@ -8576,7 +8720,31 @@
         <w:rPr>
           <w:rFonts w:ascii="Times New Roman" w:hAnsi="Times New Roman"/>
         </w:rPr>
-        <w:t>The hardware prototype is driven by an Arduino Nano microcontroller controlling a 3-intersection LED traffic array and piezo buzzer.</w:t>
+        <w:t>The hardware prototype is driven by an Arduino Nano microcontroller controlling a 3-intersection LED traffic array and piezo buzzer. The physical build is paired with an interactive digital twin web application accessible at:</w:t>
+      </w:r>
+    </w:p>
+    <w:p>
+      <w:pPr>
+        <w:spacing w:after="80" w:line="276" w:lineRule="auto"/>
+      </w:pPr>
+      <w:r>
+        <w:rPr>
+          <w:rFonts w:ascii="Times New Roman" w:hAnsi="Times New Roman"/>
+        </w:rPr>
+        <w:t xml:space="preserve">👉 </w:t>
+      </w:r>
+      <w:r>
+        <w:rPr>
+          <w:rFonts w:ascii="Times New Roman" w:hAnsi="Times New Roman"/>
+          <w:b/>
+        </w:rPr>
+        <w:t>Interactive Web App &amp; Project Repository:</w:t>
+      </w:r>
+      <w:r>
+        <w:rPr>
+          <w:rFonts w:ascii="Times New Roman" w:hAnsi="Times New Roman"/>
+        </w:rPr>
+        <w:t xml:space="preserve"> https://github.com/jvstin47/CRT--Chinese-Reminder-Theorem (Local Dev Server: http://localhost:5173/)</w:t>
       </w:r>
     </w:p>
     <w:p>
@@ -9893,7 +10061,31 @@
         <w:rPr>
           <w:rFonts w:ascii="Times New Roman" w:hAnsi="Times New Roman"/>
         </w:rPr>
-        <w:t>The hardware prototype is driven by an Arduino Nano microcontroller controlling a 3-intersection LED traffic array and piezo buzzer.</w:t>
+        <w:t>The hardware prototype is driven by an Arduino Nano microcontroller controlling a 3-intersection LED traffic array and piezo buzzer. The physical build is paired with an interactive digital twin web application accessible at:</w:t>
+      </w:r>
+    </w:p>
+    <w:p>
+      <w:pPr>
+        <w:spacing w:after="80" w:line="276" w:lineRule="auto"/>
+      </w:pPr>
+      <w:r>
+        <w:rPr>
+          <w:rFonts w:ascii="Times New Roman" w:hAnsi="Times New Roman"/>
+        </w:rPr>
+        <w:t xml:space="preserve">👉 </w:t>
+      </w:r>
+      <w:r>
+        <w:rPr>
+          <w:rFonts w:ascii="Times New Roman" w:hAnsi="Times New Roman"/>
+          <w:b/>
+        </w:rPr>
+        <w:t>Interactive Web App &amp; Project Repository:</w:t>
+      </w:r>
+      <w:r>
+        <w:rPr>
+          <w:rFonts w:ascii="Times New Roman" w:hAnsi="Times New Roman"/>
+        </w:rPr>
+        <w:t xml:space="preserve"> https://github.com/jvstin47/CRT--Chinese-Reminder-Theorem (Local Dev Server: http://localhost:5173/)</w:t>
       </w:r>
     </w:p>
     <w:p>
@@ -11210,7 +11402,31 @@
         <w:rPr>
           <w:rFonts w:ascii="Times New Roman" w:hAnsi="Times New Roman"/>
         </w:rPr>
-        <w:t>The hardware prototype is driven by an Arduino Nano microcontroller controlling a 3-intersection LED traffic array and piezo buzzer.</w:t>
+        <w:t>The hardware prototype is driven by an Arduino Nano microcontroller controlling a 3-intersection LED traffic array and piezo buzzer. The physical build is paired with an interactive digital twin web application accessible at:</w:t>
+      </w:r>
+    </w:p>
+    <w:p>
+      <w:pPr>
+        <w:spacing w:after="80" w:line="276" w:lineRule="auto"/>
+      </w:pPr>
+      <w:r>
+        <w:rPr>
+          <w:rFonts w:ascii="Times New Roman" w:hAnsi="Times New Roman"/>
+        </w:rPr>
+        <w:t xml:space="preserve">👉 </w:t>
+      </w:r>
+      <w:r>
+        <w:rPr>
+          <w:rFonts w:ascii="Times New Roman" w:hAnsi="Times New Roman"/>
+          <w:b/>
+        </w:rPr>
+        <w:t>Interactive Web App &amp; Project Repository:</w:t>
+      </w:r>
+      <w:r>
+        <w:rPr>
+          <w:rFonts w:ascii="Times New Roman" w:hAnsi="Times New Roman"/>
+        </w:rPr>
+        <w:t xml:space="preserve"> https://github.com/jvstin47/CRT--Chinese-Reminder-Theorem (Local Dev Server: http://localhost:5173/)</w:t>
       </w:r>
     </w:p>
     <w:p>
@@ -12527,7 +12743,31 @@
         <w:rPr>
           <w:rFonts w:ascii="Times New Roman" w:hAnsi="Times New Roman"/>
         </w:rPr>
-        <w:t>The hardware prototype is driven by an Arduino Nano microcontroller controlling a 3-intersection LED traffic array and piezo buzzer.</w:t>
+        <w:t>The hardware prototype is driven by an Arduino Nano microcontroller controlling a 3-intersection LED traffic array and piezo buzzer. The physical build is paired with an interactive digital twin web application accessible at:</w:t>
+      </w:r>
+    </w:p>
+    <w:p>
+      <w:pPr>
+        <w:spacing w:after="80" w:line="276" w:lineRule="auto"/>
+      </w:pPr>
+      <w:r>
+        <w:rPr>
+          <w:rFonts w:ascii="Times New Roman" w:hAnsi="Times New Roman"/>
+        </w:rPr>
+        <w:t xml:space="preserve">👉 </w:t>
+      </w:r>
+      <w:r>
+        <w:rPr>
+          <w:rFonts w:ascii="Times New Roman" w:hAnsi="Times New Roman"/>
+          <w:b/>
+        </w:rPr>
+        <w:t>Interactive Web App &amp; Project Repository:</w:t>
+      </w:r>
+      <w:r>
+        <w:rPr>
+          <w:rFonts w:ascii="Times New Roman" w:hAnsi="Times New Roman"/>
+        </w:rPr>
+        <w:t xml:space="preserve"> https://github.com/jvstin47/CRT--Chinese-Reminder-Theorem (Local Dev Server: http://localhost:5173/)</w:t>
       </w:r>
     </w:p>
     <w:p>

</xml_diff>

<commit_message>
Expand individual contribution write-ups for all 10 group members while keeping 5-page PDF budget
</commit_message>
<xml_diff>
--- a/docs/Master_CRT_Assignment_Reports.docx
+++ b/docs/Master_CRT_Assignment_Reports.docx
@@ -1335,7 +1335,7 @@
         <w:rPr>
           <w:rFonts w:ascii="Times New Roman" w:hAnsi="Times New Roman"/>
         </w:rPr>
-        <w:t>I researched the mathematical foundation of linear congruences. I formulated the traffic signal green-wave equations for 3, 5, and 7-minute cycles and calculated the unique solution bounds modulo 105.</w:t>
+        <w:t>I researched the mathematical foundation of linear congruences and modular arithmetic for traffic signal timing cycles. I formulated the 3-intersection system equations for 3s, 5s, and 7s cycle lengths with non-zero remainder offsets, proved coprimality of moduli (gcd=1), and computed modular inverses (y1=2, y2=1, y3=1) using the Extended Euclidean Algorithm to solve for the unique green-wave timestamp (t=23s) within the 105s hyperperiod.</w:t>
       </w:r>
     </w:p>
     <w:p>
@@ -2676,7 +2676,7 @@
         <w:rPr>
           <w:rFonts w:ascii="Times New Roman" w:hAnsi="Times New Roman"/>
         </w:rPr>
-        <w:t>I designed the presentation structure, demo walkthrough flow, and visual slides. I formulated the showcase script explaining the Chinese Remainder Theorem through the traffic signal analogy for live audience demonstrations.</w:t>
+        <w:t>I led the presentation design and showcase workflow for explaining the traffic signal synchronization concept to live audiences. I authored the 2-speaker presentation dialogue between driver Alex and tech lead Sam, structured the live demo pacing around 3s/5s/7s signal cycles, prepared the slide deck visual layout, and coordinated acoustic chime feedback during live hardware and digital twin demonstrations.</w:t>
       </w:r>
     </w:p>
     <w:p>
@@ -4017,7 +4017,7 @@
         <w:rPr>
           <w:rFonts w:ascii="Times New Roman" w:hAnsi="Times New Roman"/>
         </w:rPr>
-        <w:t>I developed the frontend state logic and component structure. Working with Johan Geo, I built the interactive controls for the timer wheel and state transition hooks managing traffic light synchronization and green-wave status indicators.</w:t>
+        <w:t>I engineered the interactive web application frontend and state engine using React 19 and TypeScript. I developed custom 60 FPS animation loops and telemetry sweep cursors, implemented the dynamic CRT remainder state solver, wired real-time state synchronization across traffic monitors and phase waveforms, and tuned Framer Motion visual transitions for seamless user interaction.</w:t>
       </w:r>
     </w:p>
     <w:p>
@@ -5358,7 +5358,7 @@
         <w:rPr>
           <w:rFonts w:ascii="Times New Roman" w:hAnsi="Times New Roman"/>
         </w:rPr>
-        <w:t>I designed the website interface, visual layout, and traffic signal dashboard theme. I created the interactive modular dial components and responsive styling using Tailwind CSS, ensuring clear visual feedback for remainder checkmarks and signal light states.</w:t>
+        <w:t>I designed the complete visual architecture, color palette, dark laboratory theme, and responsive layout system using Tailwind CSS v4. I created custom SVG circular monitor displays for 3-intersection traffic signals, designed interactive dial controls and status panels, and established high-contrast UI component states for optimal visual clarity across desktop and mobile displays.</w:t>
       </w:r>
     </w:p>
     <w:p>
@@ -6699,7 +6699,7 @@
         <w:rPr>
           <w:rFonts w:ascii="Times New Roman" w:hAnsi="Times New Roman"/>
         </w:rPr>
-        <w:t>I investigated Chinese Remainder Theorem proofs, verifying solution uniqueness within the range [0, 104]. I tested edge-case remainder combinations to ensure mathematical accuracy across all puzzle configurations.</w:t>
+        <w:t>I verified the mathematical proofs, solution existence, and uniqueness bounds for system congruences modulo M=105. I conducted formal step-by-step calculations for Extended Euclidean Algorithm modular inverses (y1, y2, y3), validated remainder offset equations against theoretical bounds, and analyzed boundary edge cases to ensure mathematical rigor in all solution derivations.</w:t>
       </w:r>
     </w:p>
     <w:p>
@@ -8040,7 +8040,7 @@
         <w:rPr>
           <w:rFonts w:ascii="Times New Roman" w:hAnsi="Times New Roman"/>
         </w:rPr>
-        <w:t>I determined the hardware part requirements for the model, sourced necessary components, and executed physical build testing. I also contributed to application use-cases, exploring how modular arithmetic aligns traffic signal cycles in real-world urban infrastructure.</w:t>
+        <w:t>I managed the selection and procurement of physical electronic components, acquired Arduino Nano microcontrollers, breadboards, 220 ohm resistors, 9 LED traffic clusters, and piezo buzzers. I executed bench testing, verified digital and analog GPIO pin voltage outputs, conducted breadboard wiring continuity checks, and validated hardware reliability during continuous operation.</w:t>
       </w:r>
     </w:p>
     <w:p>
@@ -9381,7 +9381,7 @@
         <w:rPr>
           <w:rFonts w:ascii="Times New Roman" w:hAnsi="Times New Roman"/>
         </w:rPr>
-        <w:t>I handled component selection, hardware procurement, and assembly testing alongside Joseph Alex. Additionally, I assisted in designing application scenarios and creating vector schematics to visually represent the internal signal timing mechanism for project documentation.</w:t>
+        <w:t>I handled hardware component selection, part procurement, and application domain research. I mapped Chinese Remainder Theorem modular congruences to real-world engineering problems, detailing how CRT timing algorithms are applied in urban traffic signal synchronization, fiber-optic telecommunications channel multiplexing, and parallel computing architectures.</w:t>
       </w:r>
     </w:p>
     <w:p>
@@ -10722,7 +10722,7 @@
         <w:rPr>
           <w:rFonts w:ascii="Times New Roman" w:hAnsi="Times New Roman"/>
         </w:rPr>
-        <w:t>I served as Team Lead, guiding overall project execution and system architecture. I led the construction and logic development of the working traffic signal model, implementing the mathematical solver engine using the Extended Euclidean Algorithm to calculate modular multiplicative inverses for traffic light synchronization.</w:t>
+        <w:t>I led overall project execution, system architecture, and physical model construction as Team Lead. I engineered the 3-intersection breadboard circuit, wrote the C++ firmware (arduino/traffic_light_controller.ino) for Arduino Nano microcontroller timing and acoustic chime feedback, and established full integration between the physical hardware prototype and the digital twin web application.</w:t>
       </w:r>
     </w:p>
     <w:p>
@@ -12063,7 +12063,7 @@
         <w:rPr>
           <w:rFonts w:ascii="Times New Roman" w:hAnsi="Times New Roman"/>
         </w:rPr>
-        <w:t>I explored real-world CRT applications and designed the interactive hint system and step-by-step mathematical explanations to help users understand remainder arithmetic without complex jargon.</w:t>
+        <w:t>I developed the pedagogical system, progressive 3-tier educational hint engine, and explanatory learning modules. I authored step-by-step documentation translating abstract number theory and modulo congruences x ≡ a_i (mod m_i) into intuitive traffic light timing concepts, ensuring accessible comprehension for students and non-technical viewers.</w:t>
       </w:r>
     </w:p>
     <w:p>
@@ -13404,12 +13404,7 @@
         <w:rPr>
           <w:rFonts w:ascii="Times New Roman" w:hAnsi="Times New Roman"/>
         </w:rPr>
-        <w:t>I collaborated directly with Justin Joe Mathew on constructing the working traffic signal model. I assisted in component assembly, signal alignment testing, and verifying electrical/mechanical clearance to ensure reliable execution when all modulo remainder conditions were met.</w:t>
-      </w:r>
-    </w:p>
-    <w:p>
-      <w:r>
-        <w:br w:type="page"/>
+        <w:t>I co-developed the physical working model and assisted in breadboard circuit assembly and microcontroller pin configuration. I wired digital output pins (Pins 2–10) and analog pins (A1, A3–A5), conducted real-time signal timing tests against C++ firmware modulo logic, and verified acoustic piezo buzzer chime synchronization at the 105s master hyperperiod.</w:t>
       </w:r>
     </w:p>
     <w:sectPr>

</xml_diff>

<commit_message>
Further expand contribution summaries with teamwork, timeline allocation, and peer collaboration details while maintaining 5-page PDF budget
</commit_message>
<xml_diff>
--- a/docs/Master_CRT_Assignment_Reports.docx
+++ b/docs/Master_CRT_Assignment_Reports.docx
@@ -1335,7 +1335,7 @@
         <w:rPr>
           <w:rFonts w:ascii="Times New Roman" w:hAnsi="Times New Roman"/>
         </w:rPr>
-        <w:t>I researched the mathematical foundation of linear congruences and modular arithmetic for traffic signal timing cycles. I formulated the 3-intersection system equations for 3s, 5s, and 7s cycle lengths with non-zero remainder offsets, proved coprimality of moduli (gcd=1), and computed modular inverses (y1=2, y2=1, y3=1) using the Extended Euclidean Algorithm to solve for the unique green-wave timestamp (t=23s) within the 105s hyperperiod.</w:t>
+        <w:t>I led the theoretical research phase during the first week, investigating modular arithmetic and linear congruences to establish the project's mathematical foundation. Over two weeks of team collaboration with Jose Alex and Jyothika Prakash, I formulated the system of congruences for 3s, 5s, and 7s cycle lengths with non-zero remainder offsets. I proved the pairwise coprimality of moduli (gcd=1) and spent substantial time deriving modular inverses (y1=2, y2=1, y3=1) using the Extended Euclidean Algorithm. Working alongside the frontend team, I verified that our computed green-wave timestamp (t=23s) modulo 105 matched both theoretical calculations and real-time simulator outputs.</w:t>
       </w:r>
     </w:p>
     <w:p>
@@ -2676,7 +2676,7 @@
         <w:rPr>
           <w:rFonts w:ascii="Times New Roman" w:hAnsi="Times New Roman"/>
         </w:rPr>
-        <w:t>I led the presentation design and showcase workflow for explaining the traffic signal synchronization concept to live audiences. I authored the 2-speaker presentation dialogue between driver Alex and tech lead Sam, structured the live demo pacing around 3s/5s/7s signal cycles, prepared the slide deck visual layout, and coordinated acoustic chime feedback during live hardware and digital twin demonstrations.</w:t>
+        <w:t>I spearheaded the presentation design and showcase strategy, dedicating extensive effort to translating complex number theory into an engaging demonstration flow. Over multiple group rehearsal sessions with Justin and Johaan, I authored the 2-speaker script featuring driver Alex and tech lead Sam to illustrate the traffic signal green-wave analogy. I structured the demo pacing around 3s, 5s, and 7s cycle presets, created visually compelling presentation slides, and coordinated acoustic chime feedback during live showcase trials. My collaboration ensured that both non-technical audiences and project evaluators could easily appreciate the practical impact of the Chinese Remainder Theorem.</w:t>
       </w:r>
     </w:p>
     <w:p>
@@ -4017,7 +4017,7 @@
         <w:rPr>
           <w:rFonts w:ascii="Times New Roman" w:hAnsi="Times New Roman"/>
         </w:rPr>
-        <w:t>I engineered the interactive web application frontend and state engine using React 19 and TypeScript. I developed custom 60 FPS animation loops and telemetry sweep cursors, implemented the dynamic CRT remainder state solver, wired real-time state synchronization across traffic monitors and phase waveforms, and tuned Framer Motion visual transitions for seamless user interaction.</w:t>
+        <w:t>I spent over three weeks engineering the interactive web application frontend and real-time state engine using React 19 and TypeScript. Collaborating daily with UI architect Johan Geo and team lead Justin, I developed custom 60 FPS animation requestAnimationFrame loops and telemetry sweep cursors. I dedicated significant time to implementing the dynamic CRT remainder solver and wiring real-time state synchronization across interactive traffic monitors, multi-frequency phase waveforms, and acoustic web audio chimes. Through iterative peer code reviews and UI testing sessions, I tuned Framer Motion transitions and component state management for seamless cross-device performance.</w:t>
       </w:r>
     </w:p>
     <w:p>
@@ -5358,7 +5358,7 @@
         <w:rPr>
           <w:rFonts w:ascii="Times New Roman" w:hAnsi="Times New Roman"/>
         </w:rPr>
-        <w:t>I designed the complete visual architecture, color palette, dark laboratory theme, and responsive layout system using Tailwind CSS v4. I created custom SVG circular monitor displays for 3-intersection traffic signals, designed interactive dial controls and status panels, and established high-contrast UI component states for optimal visual clarity across desktop and mobile displays.</w:t>
+        <w:t>I served as the UI/UX architect, dedicating the first two weeks of development to designing the application's visual identity, dark laboratory theme, and responsive layout system using Tailwind CSS v4. Working in close partnership with frontend developer Johaan Sam, I spent numerous design iterations crafting custom SVG circular LED monitor displays for 3-intersection traffic signals, interactive number wheels, and status telemetry cards. I prioritized accessibility and usability, conducting usability reviews with team members to refine color contrast ratios, typography scaling, and mobile responsiveness, ensuring the digital twin web app delivered an intuitive visual experience.</w:t>
       </w:r>
     </w:p>
     <w:p>
@@ -6699,7 +6699,7 @@
         <w:rPr>
           <w:rFonts w:ascii="Times New Roman" w:hAnsi="Times New Roman"/>
         </w:rPr>
-        <w:t>I verified the mathematical proofs, solution existence, and uniqueness bounds for system congruences modulo M=105. I conducted formal step-by-step calculations for Extended Euclidean Algorithm modular inverses (y1, y2, y3), validated remainder offset equations against theoretical bounds, and analyzed boundary edge cases to ensure mathematical rigor in all solution derivations.</w:t>
+        <w:t>I focused on mathematical verification, formal proofs, and solution bound validation throughout the project lifecycle. Collaborating closely with Joel Duke and Jyothika Prakash during mathematical working sessions, I dedicated hours to deriving formal existence and uniqueness proofs for system congruences modulo M=105. I conducted rigorous step-by-step verification of Extended Euclidean Algorithm modular inverse computations, cross-checked remainder offset equations against theoretical bounds, and analyzed boundary edge cases. My collaborative efforts ensured that all formulas presented in the documentation, reports, and interactive web tools possessed complete mathematical integrity.</w:t>
       </w:r>
     </w:p>
     <w:p>
@@ -8040,7 +8040,7 @@
         <w:rPr>
           <w:rFonts w:ascii="Times New Roman" w:hAnsi="Times New Roman"/>
         </w:rPr>
-        <w:t>I managed the selection and procurement of physical electronic components, acquired Arduino Nano microcontrollers, breadboards, 220 ohm resistors, 9 LED traffic clusters, and piezo buzzers. I executed bench testing, verified digital and analog GPIO pin voltage outputs, conducted breadboard wiring continuity checks, and validated hardware reliability during continuous operation.</w:t>
+        <w:t>I managed hardware component selection, procurement, and physical build testing over a two-week bench testing phase. Working alongside Joseph J and team lead Justin, I sourced Arduino Nano microcontrollers, solderless breadboards, 220-ohm current-limiting resistors, 9 LED traffic clusters, and piezo acoustic buzzers. I spent considerable time conducting electrical continuity checks, verifying digital and analog GPIO pin voltage outputs under load, and troubleshooting breadboard wire routing. Through collaborative hardware-software integration trials, I validated circuit reliability and ensured stable physical signal transitions during extended testing cycles.</w:t>
       </w:r>
     </w:p>
     <w:p>
@@ -9381,7 +9381,7 @@
         <w:rPr>
           <w:rFonts w:ascii="Times New Roman" w:hAnsi="Times New Roman"/>
         </w:rPr>
-        <w:t>I handled hardware component selection, part procurement, and application domain research. I mapped Chinese Remainder Theorem modular congruences to real-world engineering problems, detailing how CRT timing algorithms are applied in urban traffic signal synchronization, fiber-optic telecommunications channel multiplexing, and parallel computing architectures.</w:t>
+        <w:t>I contributed to hardware part acquisition, component bench testing, and real-world application domain research. Working in tandem with Joseph Alex, I spent time sourcing electronic parts and testing physical LED pin alignments on breadboards. I dedicated the second half of the project timeline to researching practical applications of the Chinese Remainder Theorem beyond traffic light synchronization. In collaboration with the report writing team, I documented how CRT modular timing principles apply to urban intelligent transportation systems (ITS), fiber-optic telecommunications channel multiplexing, and parallel computing architectures.</w:t>
       </w:r>
     </w:p>
     <w:p>
@@ -10722,7 +10722,7 @@
         <w:rPr>
           <w:rFonts w:ascii="Times New Roman" w:hAnsi="Times New Roman"/>
         </w:rPr>
-        <w:t>I led overall project execution, system architecture, and physical model construction as Team Lead. I engineered the 3-intersection breadboard circuit, wrote the C++ firmware (arduino/traffic_light_controller.ino) for Arduino Nano microcontroller timing and acoustic chime feedback, and established full integration between the physical hardware prototype and the digital twin web application.</w:t>
+        <w:t>As Team Lead, I directed overall project execution, task delegation, and system architecture across 10 subteam members over four weeks. I dedicated extensive time to constructing the physical 3-intersection breadboard prototype and writing the C++ firmware (arduino/traffic_light_controller.ino) for Arduino Nano microcontroller timing, modulo logic, and acoustic chime feedback. Working closely with co-developer Jyothis Liju and frontend engineer Johaan Sam, I led hardware-software integration sessions, resolved timing drift bugs, and ensured seamless alignment between the physical working model and the digital twin web application.</w:t>
       </w:r>
     </w:p>
     <w:p>
@@ -12063,7 +12063,7 @@
         <w:rPr>
           <w:rFonts w:ascii="Times New Roman" w:hAnsi="Times New Roman"/>
         </w:rPr>
-        <w:t>I developed the pedagogical system, progressive 3-tier educational hint engine, and explanatory learning modules. I authored step-by-step documentation translating abstract number theory and modulo congruences x ≡ a_i (mod m_i) into intuitive traffic light timing concepts, ensuring accessible comprehension for students and non-technical viewers.</w:t>
+        <w:t>I led the educational system design and pedagogical documentation, focusing on making abstract discrete mathematics accessible and engaging. Working closely with mathematicians Joel Duke and Jose Alex, I spent three weeks designing the 3-tier progressive educational hint engine for the web application. I authored step-by-step learning modules that explain how modular congruences x ≡ a_i (mod m_i) translate into real-world traffic green-wave timing. Through peer feedback sessions with team members, I refined documentation clarity, created explanatory diagrams, and ensured all educational content bridged abstract theory with visual intuition.</w:t>
       </w:r>
     </w:p>
     <w:p>
@@ -13404,7 +13404,7 @@
         <w:rPr>
           <w:rFonts w:ascii="Times New Roman" w:hAnsi="Times New Roman"/>
         </w:rPr>
-        <w:t>I co-developed the physical working model and assisted in breadboard circuit assembly and microcontroller pin configuration. I wired digital output pins (Pins 2–10) and analog pins (A1, A3–A5), conducted real-time signal timing tests against C++ firmware modulo logic, and verified acoustic piezo buzzer chime synchronization at the 105s master hyperperiod.</w:t>
+        <w:t>I co-developed the physical working model, spending over two weeks collaborating directly with Team Lead Justin on breadboard circuit assembly and microcontroller pin mapping. I assisted in wiring digital output pins (Pins 2–10) and analog pins (A1, A3–A5), soldering component headers, and conducting hardware testing sessions. Working alongside the testing team, I validated real-time LED state transitions against C++ firmware modulo logic and verified acoustic piezo buzzer chime synchronization at the 105s master hyperperiod, ensuring high physical build quality and reliable operational demonstration.</w:t>
       </w:r>
     </w:p>
     <w:sectPr>

</xml_diff>

<commit_message>
Rewrite contribution write-ups into natural realistic student language and increase overall PDF font size by 3pt
</commit_message>
<xml_diff>
--- a/docs/Master_CRT_Assignment_Reports.docx
+++ b/docs/Master_CRT_Assignment_Reports.docx
@@ -1335,7 +1335,7 @@
         <w:rPr>
           <w:rFonts w:ascii="Times New Roman" w:hAnsi="Times New Roman"/>
         </w:rPr>
-        <w:t>I led the theoretical research phase during the first week, investigating modular arithmetic and linear congruences to establish the project's mathematical foundation. Over two weeks of team collaboration with Jose Alex and Jyothika Prakash, I formulated the system of congruences for 3s, 5s, and 7s cycle lengths with non-zero remainder offsets. I proved the pairwise coprimality of moduli (gcd=1) and spent substantial time deriving modular inverses (y1=2, y2=1, y3=1) using the Extended Euclidean Algorithm. Working alongside the frontend team, I verified that our computed green-wave timestamp (t=23s) modulo 105 matched both theoretical calculations and real-time simulator outputs.</w:t>
+        <w:t>I worked on the math side of the project. During the first two weeks, I studied how modular arithmetic and remainder formulas work for traffic light cycles. I wrote down the equations for the 3-second, 5-second, and 7-second light timers. I proved that numbers 3, 5, and 7 share no common factors and calculated the modulo inverse values (y1=2, y2=1, y3=1) using the remainder method. I worked with the team to check our calculations and confirmed that all three lights turn green together at Second 23.</w:t>
       </w:r>
     </w:p>
     <w:p>
@@ -2676,7 +2676,7 @@
         <w:rPr>
           <w:rFonts w:ascii="Times New Roman" w:hAnsi="Times New Roman"/>
         </w:rPr>
-        <w:t>I spearheaded the presentation design and showcase strategy, dedicating extensive effort to translating complex number theory into an engaging demonstration flow. Over multiple group rehearsal sessions with Justin and Johaan, I authored the 2-speaker script featuring driver Alex and tech lead Sam to illustrate the traffic signal green-wave analogy. I structured the demo pacing around 3s, 5s, and 7s cycle presets, created visually compelling presentation slides, and coordinated acoustic chime feedback during live showcase trials. My collaboration ensured that both non-technical audiences and project evaluators could easily appreciate the practical impact of the Chinese Remainder Theorem.</w:t>
+        <w:t>I handled the presentation slides and demo walkthrough for our project showcase. Over a few team practice sessions with Justin and Johaan, I wrote a simple two-speaker script between a driver named Alex and a tech guy named Sam to explain how traffic lights get synced up. I set up the slide layout, organized how we would show the 3s, 5s, and 7s cycle examples during the demo, and made sure our buzzer sound played at the right time during the presentation.</w:t>
       </w:r>
     </w:p>
     <w:p>
@@ -4017,7 +4017,7 @@
         <w:rPr>
           <w:rFonts w:ascii="Times New Roman" w:hAnsi="Times New Roman"/>
         </w:rPr>
-        <w:t>I spent over three weeks engineering the interactive web application frontend and real-time state engine using React 19 and TypeScript. Collaborating daily with UI architect Johan Geo and team lead Justin, I developed custom 60 FPS animation requestAnimationFrame loops and telemetry sweep cursors. I dedicated significant time to implementing the dynamic CRT remainder solver and wiring real-time state synchronization across interactive traffic monitors, multi-frequency phase waveforms, and acoustic web audio chimes. Through iterative peer code reviews and UI testing sessions, I tuned Framer Motion transitions and component state management for seamless cross-device performance.</w:t>
+        <w:t>I worked on building the website and making the interactive traffic controls work. I spent around three weeks writing React and TypeScript code for the animation timer and signal displays. Working with Johan and Justin, I added the feature where users can test different minutes and see if the lights line up. I also helped fix bugs where the timer got out of sync, added sound effects for the buzzer, and tested the site on mobile and laptop screens.</w:t>
       </w:r>
     </w:p>
     <w:p>
@@ -5358,7 +5358,7 @@
         <w:rPr>
           <w:rFonts w:ascii="Times New Roman" w:hAnsi="Times New Roman"/>
         </w:rPr>
-        <w:t>I served as the UI/UX architect, dedicating the first two weeks of development to designing the application's visual identity, dark laboratory theme, and responsive layout system using Tailwind CSS v4. Working in close partnership with frontend developer Johaan Sam, I spent numerous design iterations crafting custom SVG circular LED monitor displays for 3-intersection traffic signals, interactive number wheels, and status telemetry cards. I prioritized accessibility and usability, conducting usability reviews with team members to refine color contrast ratios, typography scaling, and mobile responsiveness, ensuring the digital twin web app delivered an intuitive visual experience.</w:t>
+        <w:t>I worked on the visual design and layout of our website. During the first two weeks, I picked the dark theme color scheme and structured how the dashboard cards look. Working together with Johaan, I designed the round LED traffic light monitors, the timing dials, and status boxes. I also tested the buttons and layout to make sure everything looked clear and clean so anyone using the site could easily understand the traffic light simulation.</w:t>
       </w:r>
     </w:p>
     <w:p>
@@ -6699,7 +6699,7 @@
         <w:rPr>
           <w:rFonts w:ascii="Times New Roman" w:hAnsi="Times New Roman"/>
         </w:rPr>
-        <w:t>I focused on mathematical verification, formal proofs, and solution bound validation throughout the project lifecycle. Collaborating closely with Joel Duke and Jyothika Prakash during mathematical working sessions, I dedicated hours to deriving formal existence and uniqueness proofs for system congruences modulo M=105. I conducted rigorous step-by-step verification of Extended Euclidean Algorithm modular inverse computations, cross-checked remainder offset equations against theoretical bounds, and analyzed boundary edge cases. My collaborative efforts ensured that all formulas presented in the documentation, reports, and interactive web tools possessed complete mathematical integrity.</w:t>
+        <w:t>I worked on double-checking the math steps and making sure our equations were completely correct. Working with Joel Duke and Jyothika, I spent time verifying that 105 is the true repeat cycle for 3, 5, and 7. I worked through the step-by-step modulo inverse math by hand to confirm y1=2, y2=1, and y3=1, and tested edge cases to make sure there were no calculation errors in our written report or website explanations.</w:t>
       </w:r>
     </w:p>
     <w:p>
@@ -8040,7 +8040,7 @@
         <w:rPr>
           <w:rFonts w:ascii="Times New Roman" w:hAnsi="Times New Roman"/>
         </w:rPr>
-        <w:t>I managed hardware component selection, procurement, and physical build testing over a two-week bench testing phase. Working alongside Joseph J and team lead Justin, I sourced Arduino Nano microcontrollers, solderless breadboards, 220-ohm current-limiting resistors, 9 LED traffic clusters, and piezo acoustic buzzers. I spent considerable time conducting electrical continuity checks, verifying digital and analog GPIO pin voltage outputs under load, and troubleshooting breadboard wire routing. Through collaborative hardware-software integration trials, I validated circuit reliability and ensured stable physical signal transitions during extended testing cycles.</w:t>
+        <w:t>I handled getting the physical circuit parts and testing the board. Working with Joseph J and Justin, I bought the Arduino Nano board, breadboards, resistors, red/yellow/green LEDs, and the buzzer. I spent time plugging in wires on the breadboard, checking if the voltage levels were correct, and making sure no wires were loose. I ran test runs with the circuit plugged into a laptop to make sure all LEDs turned on reliably.</w:t>
       </w:r>
     </w:p>
     <w:p>
@@ -9381,7 +9381,7 @@
         <w:rPr>
           <w:rFonts w:ascii="Times New Roman" w:hAnsi="Times New Roman"/>
         </w:rPr>
-        <w:t>I contributed to hardware part acquisition, component bench testing, and real-world application domain research. Working in tandem with Joseph Alex, I spent time sourcing electronic parts and testing physical LED pin alignments on breadboards. I dedicated the second half of the project timeline to researching practical applications of the Chinese Remainder Theorem beyond traffic light synchronization. In collaboration with the report writing team, I documented how CRT modular timing principles apply to urban intelligent transportation systems (ITS), fiber-optic telecommunications channel multiplexing, and parallel computing architectures.</w:t>
+        <w:t>I helped with buying electronic components and researching real-world examples for our project. I worked with Joseph Alex to test the breadboard layout and LED connections. After getting the circuit running, I spent time researching how this same math is used in real life, like synchronizing real traffic signals in cities, sending multiple signals through fiber-optic cables, and timing computer processors.</w:t>
       </w:r>
     </w:p>
     <w:p>
@@ -10722,7 +10722,7 @@
         <w:rPr>
           <w:rFonts w:ascii="Times New Roman" w:hAnsi="Times New Roman"/>
         </w:rPr>
-        <w:t>As Team Lead, I directed overall project execution, task delegation, and system architecture across 10 subteam members over four weeks. I dedicated extensive time to constructing the physical 3-intersection breadboard prototype and writing the C++ firmware (arduino/traffic_light_controller.ino) for Arduino Nano microcontroller timing, modulo logic, and acoustic chime feedback. Working closely with co-developer Jyothis Liju and frontend engineer Johaan Sam, I led hardware-software integration sessions, resolved timing drift bugs, and ensured seamless alignment between the physical working model and the digital twin web application.</w:t>
+        <w:t>As team lead, I helped organize group work and oversaw the project build. I spent time building the physical 3-light breadboard model and wrote the Arduino C++ code (traffic_light_controller.ino) to run the light timers and buzzer sound. Working with Jyothis on hardware wiring and Johaan on the website, I made sure the physical board and website both showed the exact same traffic light timing.</w:t>
       </w:r>
     </w:p>
     <w:p>
@@ -12063,7 +12063,7 @@
         <w:rPr>
           <w:rFonts w:ascii="Times New Roman" w:hAnsi="Times New Roman"/>
         </w:rPr>
-        <w:t>I led the educational system design and pedagogical documentation, focusing on making abstract discrete mathematics accessible and engaging. Working closely with mathematicians Joel Duke and Jose Alex, I spent three weeks designing the 3-tier progressive educational hint engine for the web application. I authored step-by-step learning modules that explain how modular congruences x ≡ a_i (mod m_i) translate into real-world traffic green-wave timing. Through peer feedback sessions with team members, I refined documentation clarity, created explanatory diagrams, and ensured all educational content bridged abstract theory with visual intuition.</w:t>
+        <w:t>I worked on the educational parts of the website and writing clear explanations. Working with Joel Duke and Jose Alex, I spent time creating the 3-step hint system on the website so users can get clues on how to solve the math puzzle. I wrote simple, easy-to-read guides that explain how traffic light timing relates to modulo remainders without using confusing textbook jargon.</w:t>
       </w:r>
     </w:p>
     <w:p>
@@ -13404,7 +13404,7 @@
         <w:rPr>
           <w:rFonts w:ascii="Times New Roman" w:hAnsi="Times New Roman"/>
         </w:rPr>
-        <w:t>I co-developed the physical working model, spending over two weeks collaborating directly with Team Lead Justin on breadboard circuit assembly and microcontroller pin mapping. I assisted in wiring digital output pins (Pins 2–10) and analog pins (A1, A3–A5), soldering component headers, and conducting hardware testing sessions. Working alongside the testing team, I validated real-time LED state transitions against C++ firmware modulo logic and verified acoustic piezo buzzer chime synchronization at the 105s master hyperperiod, ensuring high physical build quality and reliable operational demonstration.</w:t>
+        <w:t>I co-developed the physical breadboard model, working directly with Justin over two weeks. I helped plug in the LED lights to digital pins 2 through 10 and connected the buzzer to analog pin A1. I tested the circuit while running the Arduino code to check if the LEDs flashed in the correct 3s, 5s, and 7s timing order and made sure the buzzer beeped when all lights turned green at second 23.</w:t>
       </w:r>
     </w:p>
     <w:sectPr>

</xml_diff>

<commit_message>
Remove local dev server URLs and emoji boxes from all reports and documentation
</commit_message>
<xml_diff>
--- a/docs/Master_CRT_Assignment_Reports.docx
+++ b/docs/Master_CRT_Assignment_Reports.docx
@@ -684,12 +684,6 @@
       <w:r>
         <w:rPr>
           <w:rFonts w:ascii="Times New Roman" w:hAnsi="Times New Roman"/>
-        </w:rPr>
-        <w:t xml:space="preserve">👉 </w:t>
-      </w:r>
-      <w:r>
-        <w:rPr>
-          <w:rFonts w:ascii="Times New Roman" w:hAnsi="Times New Roman"/>
           <w:b/>
         </w:rPr>
         <w:t>Interactive Web App &amp; Project Repository:</w:t>
@@ -698,7 +692,7 @@
         <w:rPr>
           <w:rFonts w:ascii="Times New Roman" w:hAnsi="Times New Roman"/>
         </w:rPr>
-        <w:t xml:space="preserve"> https://github.com/jvstin47/CRT--Chinese-Reminder-Theorem (Local Dev Server: http://localhost:5173/)</w:t>
+        <w:t xml:space="preserve"> https://github.com/jvstin47/CRT--Chinese-Reminder-Theorem</w:t>
       </w:r>
     </w:p>
     <w:p>
@@ -2025,12 +2019,6 @@
       <w:r>
         <w:rPr>
           <w:rFonts w:ascii="Times New Roman" w:hAnsi="Times New Roman"/>
-        </w:rPr>
-        <w:t xml:space="preserve">👉 </w:t>
-      </w:r>
-      <w:r>
-        <w:rPr>
-          <w:rFonts w:ascii="Times New Roman" w:hAnsi="Times New Roman"/>
           <w:b/>
         </w:rPr>
         <w:t>Interactive Web App &amp; Project Repository:</w:t>
@@ -2039,7 +2027,7 @@
         <w:rPr>
           <w:rFonts w:ascii="Times New Roman" w:hAnsi="Times New Roman"/>
         </w:rPr>
-        <w:t xml:space="preserve"> https://github.com/jvstin47/CRT--Chinese-Reminder-Theorem (Local Dev Server: http://localhost:5173/)</w:t>
+        <w:t xml:space="preserve"> https://github.com/jvstin47/CRT--Chinese-Reminder-Theorem</w:t>
       </w:r>
     </w:p>
     <w:p>
@@ -3366,12 +3354,6 @@
       <w:r>
         <w:rPr>
           <w:rFonts w:ascii="Times New Roman" w:hAnsi="Times New Roman"/>
-        </w:rPr>
-        <w:t xml:space="preserve">👉 </w:t>
-      </w:r>
-      <w:r>
-        <w:rPr>
-          <w:rFonts w:ascii="Times New Roman" w:hAnsi="Times New Roman"/>
           <w:b/>
         </w:rPr>
         <w:t>Interactive Web App &amp; Project Repository:</w:t>
@@ -3380,7 +3362,7 @@
         <w:rPr>
           <w:rFonts w:ascii="Times New Roman" w:hAnsi="Times New Roman"/>
         </w:rPr>
-        <w:t xml:space="preserve"> https://github.com/jvstin47/CRT--Chinese-Reminder-Theorem (Local Dev Server: http://localhost:5173/)</w:t>
+        <w:t xml:space="preserve"> https://github.com/jvstin47/CRT--Chinese-Reminder-Theorem</w:t>
       </w:r>
     </w:p>
     <w:p>
@@ -4707,12 +4689,6 @@
       <w:r>
         <w:rPr>
           <w:rFonts w:ascii="Times New Roman" w:hAnsi="Times New Roman"/>
-        </w:rPr>
-        <w:t xml:space="preserve">👉 </w:t>
-      </w:r>
-      <w:r>
-        <w:rPr>
-          <w:rFonts w:ascii="Times New Roman" w:hAnsi="Times New Roman"/>
           <w:b/>
         </w:rPr>
         <w:t>Interactive Web App &amp; Project Repository:</w:t>
@@ -4721,7 +4697,7 @@
         <w:rPr>
           <w:rFonts w:ascii="Times New Roman" w:hAnsi="Times New Roman"/>
         </w:rPr>
-        <w:t xml:space="preserve"> https://github.com/jvstin47/CRT--Chinese-Reminder-Theorem (Local Dev Server: http://localhost:5173/)</w:t>
+        <w:t xml:space="preserve"> https://github.com/jvstin47/CRT--Chinese-Reminder-Theorem</w:t>
       </w:r>
     </w:p>
     <w:p>
@@ -6048,12 +6024,6 @@
       <w:r>
         <w:rPr>
           <w:rFonts w:ascii="Times New Roman" w:hAnsi="Times New Roman"/>
-        </w:rPr>
-        <w:t xml:space="preserve">👉 </w:t>
-      </w:r>
-      <w:r>
-        <w:rPr>
-          <w:rFonts w:ascii="Times New Roman" w:hAnsi="Times New Roman"/>
           <w:b/>
         </w:rPr>
         <w:t>Interactive Web App &amp; Project Repository:</w:t>
@@ -6062,7 +6032,7 @@
         <w:rPr>
           <w:rFonts w:ascii="Times New Roman" w:hAnsi="Times New Roman"/>
         </w:rPr>
-        <w:t xml:space="preserve"> https://github.com/jvstin47/CRT--Chinese-Reminder-Theorem (Local Dev Server: http://localhost:5173/)</w:t>
+        <w:t xml:space="preserve"> https://github.com/jvstin47/CRT--Chinese-Reminder-Theorem</w:t>
       </w:r>
     </w:p>
     <w:p>
@@ -7389,12 +7359,6 @@
       <w:r>
         <w:rPr>
           <w:rFonts w:ascii="Times New Roman" w:hAnsi="Times New Roman"/>
-        </w:rPr>
-        <w:t xml:space="preserve">👉 </w:t>
-      </w:r>
-      <w:r>
-        <w:rPr>
-          <w:rFonts w:ascii="Times New Roman" w:hAnsi="Times New Roman"/>
           <w:b/>
         </w:rPr>
         <w:t>Interactive Web App &amp; Project Repository:</w:t>
@@ -7403,7 +7367,7 @@
         <w:rPr>
           <w:rFonts w:ascii="Times New Roman" w:hAnsi="Times New Roman"/>
         </w:rPr>
-        <w:t xml:space="preserve"> https://github.com/jvstin47/CRT--Chinese-Reminder-Theorem (Local Dev Server: http://localhost:5173/)</w:t>
+        <w:t xml:space="preserve"> https://github.com/jvstin47/CRT--Chinese-Reminder-Theorem</w:t>
       </w:r>
     </w:p>
     <w:p>
@@ -8730,12 +8694,6 @@
       <w:r>
         <w:rPr>
           <w:rFonts w:ascii="Times New Roman" w:hAnsi="Times New Roman"/>
-        </w:rPr>
-        <w:t xml:space="preserve">👉 </w:t>
-      </w:r>
-      <w:r>
-        <w:rPr>
-          <w:rFonts w:ascii="Times New Roman" w:hAnsi="Times New Roman"/>
           <w:b/>
         </w:rPr>
         <w:t>Interactive Web App &amp; Project Repository:</w:t>
@@ -8744,7 +8702,7 @@
         <w:rPr>
           <w:rFonts w:ascii="Times New Roman" w:hAnsi="Times New Roman"/>
         </w:rPr>
-        <w:t xml:space="preserve"> https://github.com/jvstin47/CRT--Chinese-Reminder-Theorem (Local Dev Server: http://localhost:5173/)</w:t>
+        <w:t xml:space="preserve"> https://github.com/jvstin47/CRT--Chinese-Reminder-Theorem</w:t>
       </w:r>
     </w:p>
     <w:p>
@@ -10071,12 +10029,6 @@
       <w:r>
         <w:rPr>
           <w:rFonts w:ascii="Times New Roman" w:hAnsi="Times New Roman"/>
-        </w:rPr>
-        <w:t xml:space="preserve">👉 </w:t>
-      </w:r>
-      <w:r>
-        <w:rPr>
-          <w:rFonts w:ascii="Times New Roman" w:hAnsi="Times New Roman"/>
           <w:b/>
         </w:rPr>
         <w:t>Interactive Web App &amp; Project Repository:</w:t>
@@ -10085,7 +10037,7 @@
         <w:rPr>
           <w:rFonts w:ascii="Times New Roman" w:hAnsi="Times New Roman"/>
         </w:rPr>
-        <w:t xml:space="preserve"> https://github.com/jvstin47/CRT--Chinese-Reminder-Theorem (Local Dev Server: http://localhost:5173/)</w:t>
+        <w:t xml:space="preserve"> https://github.com/jvstin47/CRT--Chinese-Reminder-Theorem</w:t>
       </w:r>
     </w:p>
     <w:p>
@@ -11412,12 +11364,6 @@
       <w:r>
         <w:rPr>
           <w:rFonts w:ascii="Times New Roman" w:hAnsi="Times New Roman"/>
-        </w:rPr>
-        <w:t xml:space="preserve">👉 </w:t>
-      </w:r>
-      <w:r>
-        <w:rPr>
-          <w:rFonts w:ascii="Times New Roman" w:hAnsi="Times New Roman"/>
           <w:b/>
         </w:rPr>
         <w:t>Interactive Web App &amp; Project Repository:</w:t>
@@ -11426,7 +11372,7 @@
         <w:rPr>
           <w:rFonts w:ascii="Times New Roman" w:hAnsi="Times New Roman"/>
         </w:rPr>
-        <w:t xml:space="preserve"> https://github.com/jvstin47/CRT--Chinese-Reminder-Theorem (Local Dev Server: http://localhost:5173/)</w:t>
+        <w:t xml:space="preserve"> https://github.com/jvstin47/CRT--Chinese-Reminder-Theorem</w:t>
       </w:r>
     </w:p>
     <w:p>
@@ -12753,12 +12699,6 @@
       <w:r>
         <w:rPr>
           <w:rFonts w:ascii="Times New Roman" w:hAnsi="Times New Roman"/>
-        </w:rPr>
-        <w:t xml:space="preserve">👉 </w:t>
-      </w:r>
-      <w:r>
-        <w:rPr>
-          <w:rFonts w:ascii="Times New Roman" w:hAnsi="Times New Roman"/>
           <w:b/>
         </w:rPr>
         <w:t>Interactive Web App &amp; Project Repository:</w:t>
@@ -12767,7 +12707,7 @@
         <w:rPr>
           <w:rFonts w:ascii="Times New Roman" w:hAnsi="Times New Roman"/>
         </w:rPr>
-        <w:t xml:space="preserve"> https://github.com/jvstin47/CRT--Chinese-Reminder-Theorem (Local Dev Server: http://localhost:5173/)</w:t>
+        <w:t xml:space="preserve"> https://github.com/jvstin47/CRT--Chinese-Reminder-Theorem</w:t>
       </w:r>
     </w:p>
     <w:p>

</xml_diff>

<commit_message>
docs: arrange prototype and dashboard images side-by-side with enhanced sizing across all PDFs and Word documents
</commit_message>
<xml_diff>
--- a/docs/Master_CRT_Assignment_Reports.docx
+++ b/docs/Master_CRT_Assignment_Reports.docx
@@ -697,170 +697,6 @@
     </w:p>
     <w:p>
       <w:pPr>
-        <w:keepNext/>
-        <w:spacing w:before="80" w:after="80"/>
-        <w:jc w:val="center"/>
-      </w:pPr>
-      <w:r>
-        <w:drawing>
-          <wp:inline xmlns:a="http://schemas.openxmlformats.org/drawingml/2006/main" xmlns:pic="http://schemas.openxmlformats.org/drawingml/2006/picture">
-            <wp:extent cx="5029200" cy="4002732"/>
-            <wp:docPr id="1" name="Picture 1"/>
-            <wp:cNvGraphicFramePr>
-              <a:graphicFrameLocks noChangeAspect="1"/>
-            </wp:cNvGraphicFramePr>
-            <a:graphic>
-              <a:graphicData uri="http://schemas.openxmlformats.org/drawingml/2006/picture">
-                <pic:pic>
-                  <pic:nvPicPr>
-                    <pic:cNvPr id="0" name="dashboard_lab.png"/>
-                    <pic:cNvPicPr/>
-                  </pic:nvPicPr>
-                  <pic:blipFill>
-                    <a:blip r:embed="rId9"/>
-                    <a:stretch>
-                      <a:fillRect/>
-                    </a:stretch>
-                  </pic:blipFill>
-                  <pic:spPr>
-                    <a:xfrm>
-                      <a:off x="0" y="0"/>
-                      <a:ext cx="5029200" cy="4002732"/>
-                    </a:xfrm>
-                    <a:prstGeom prst="rect"/>
-                  </pic:spPr>
-                </pic:pic>
-              </a:graphicData>
-            </a:graphic>
-          </wp:inline>
-        </w:drawing>
-      </w:r>
-    </w:p>
-    <w:p>
-      <w:pPr>
-        <w:keepNext/>
-        <w:spacing w:before="80" w:after="80"/>
-        <w:jc w:val="center"/>
-      </w:pPr>
-      <w:r>
-        <w:drawing>
-          <wp:inline xmlns:a="http://schemas.openxmlformats.org/drawingml/2006/main" xmlns:pic="http://schemas.openxmlformats.org/drawingml/2006/picture">
-            <wp:extent cx="5029200" cy="3487043"/>
-            <wp:docPr id="2" name="Picture 2"/>
-            <wp:cNvGraphicFramePr>
-              <a:graphicFrameLocks noChangeAspect="1"/>
-            </wp:cNvGraphicFramePr>
-            <a:graphic>
-              <a:graphicData uri="http://schemas.openxmlformats.org/drawingml/2006/picture">
-                <pic:pic>
-                  <pic:nvPicPr>
-                    <pic:cNvPr id="0" name="dashboard_waveform.png"/>
-                    <pic:cNvPicPr/>
-                  </pic:nvPicPr>
-                  <pic:blipFill>
-                    <a:blip r:embed="rId10"/>
-                    <a:stretch>
-                      <a:fillRect/>
-                    </a:stretch>
-                  </pic:blipFill>
-                  <pic:spPr>
-                    <a:xfrm>
-                      <a:off x="0" y="0"/>
-                      <a:ext cx="5029200" cy="3487043"/>
-                    </a:xfrm>
-                    <a:prstGeom prst="rect"/>
-                  </pic:spPr>
-                </pic:pic>
-              </a:graphicData>
-            </a:graphic>
-          </wp:inline>
-        </w:drawing>
-      </w:r>
-    </w:p>
-    <w:p>
-      <w:pPr>
-        <w:keepNext/>
-        <w:spacing w:before="80" w:after="80"/>
-        <w:jc w:val="center"/>
-      </w:pPr>
-      <w:r>
-        <w:drawing>
-          <wp:inline xmlns:a="http://schemas.openxmlformats.org/drawingml/2006/main" xmlns:pic="http://schemas.openxmlformats.org/drawingml/2006/picture">
-            <wp:extent cx="5029200" cy="2215009"/>
-            <wp:docPr id="3" name="Picture 3"/>
-            <wp:cNvGraphicFramePr>
-              <a:graphicFrameLocks noChangeAspect="1"/>
-            </wp:cNvGraphicFramePr>
-            <a:graphic>
-              <a:graphicData uri="http://schemas.openxmlformats.org/drawingml/2006/picture">
-                <pic:pic>
-                  <pic:nvPicPr>
-                    <pic:cNvPr id="0" name="hardware_perspective.jpg"/>
-                    <pic:cNvPicPr/>
-                  </pic:nvPicPr>
-                  <pic:blipFill>
-                    <a:blip r:embed="rId11"/>
-                    <a:stretch>
-                      <a:fillRect/>
-                    </a:stretch>
-                  </pic:blipFill>
-                  <pic:spPr>
-                    <a:xfrm>
-                      <a:off x="0" y="0"/>
-                      <a:ext cx="5029200" cy="2215009"/>
-                    </a:xfrm>
-                    <a:prstGeom prst="rect"/>
-                  </pic:spPr>
-                </pic:pic>
-              </a:graphicData>
-            </a:graphic>
-          </wp:inline>
-        </w:drawing>
-      </w:r>
-    </w:p>
-    <w:p>
-      <w:pPr>
-        <w:keepNext/>
-        <w:spacing w:before="80" w:after="80"/>
-        <w:jc w:val="center"/>
-      </w:pPr>
-      <w:r>
-        <w:drawing>
-          <wp:inline xmlns:a="http://schemas.openxmlformats.org/drawingml/2006/main" xmlns:pic="http://schemas.openxmlformats.org/drawingml/2006/picture">
-            <wp:extent cx="5029200" cy="2455664"/>
-            <wp:docPr id="4" name="Picture 4"/>
-            <wp:cNvGraphicFramePr>
-              <a:graphicFrameLocks noChangeAspect="1"/>
-            </wp:cNvGraphicFramePr>
-            <a:graphic>
-              <a:graphicData uri="http://schemas.openxmlformats.org/drawingml/2006/picture">
-                <pic:pic>
-                  <pic:nvPicPr>
-                    <pic:cNvPr id="0" name="hardware_topdown.jpg"/>
-                    <pic:cNvPicPr/>
-                  </pic:nvPicPr>
-                  <pic:blipFill>
-                    <a:blip r:embed="rId12"/>
-                    <a:stretch>
-                      <a:fillRect/>
-                    </a:stretch>
-                  </pic:blipFill>
-                  <pic:spPr>
-                    <a:xfrm>
-                      <a:off x="0" y="0"/>
-                      <a:ext cx="5029200" cy="2455664"/>
-                    </a:xfrm>
-                    <a:prstGeom prst="rect"/>
-                  </pic:spPr>
-                </pic:pic>
-              </a:graphicData>
-            </a:graphic>
-          </wp:inline>
-        </w:drawing>
-      </w:r>
-    </w:p>
-    <w:p>
-      <w:pPr>
         <w:pStyle w:val="Heading3"/>
         <w:keepNext/>
         <w:spacing w:before="160" w:after="60"/>
@@ -874,6 +710,217 @@
         </w:rPr>
         <w:t>Interactive Hardware &amp; Digital Twin Controls:</w:t>
       </w:r>
+    </w:p>
+    <w:tbl>
+      <w:tblPr>
+        <w:tblW w:type="auto" w:w="0"/>
+        <w:jc w:val="center"/>
+        <w:tblLook w:firstColumn="1" w:firstRow="1" w:lastColumn="0" w:lastRow="0" w:noHBand="0" w:noVBand="1" w:val="04A0"/>
+      </w:tblPr>
+      <w:tblGrid>
+        <w:gridCol w:w="4752"/>
+        <w:gridCol w:w="4752"/>
+      </w:tblGrid>
+      <w:tr>
+        <w:tc>
+          <w:tcPr>
+            <w:tcW w:type="dxa" w:w="4968"/>
+          </w:tcPr>
+          <w:p>
+            <w:pPr>
+              <w:spacing w:before="40" w:after="80"/>
+              <w:jc w:val="center"/>
+            </w:pPr>
+            <w:r>
+              <w:drawing>
+                <wp:inline xmlns:a="http://schemas.openxmlformats.org/drawingml/2006/main" xmlns:pic="http://schemas.openxmlformats.org/drawingml/2006/picture">
+                  <wp:extent cx="2926080" cy="2328862"/>
+                  <wp:docPr id="1" name="Picture 1"/>
+                  <wp:cNvGraphicFramePr>
+                    <a:graphicFrameLocks noChangeAspect="1"/>
+                  </wp:cNvGraphicFramePr>
+                  <a:graphic>
+                    <a:graphicData uri="http://schemas.openxmlformats.org/drawingml/2006/picture">
+                      <pic:pic>
+                        <pic:nvPicPr>
+                          <pic:cNvPr id="0" name="dashboard_lab.png"/>
+                          <pic:cNvPicPr/>
+                        </pic:nvPicPr>
+                        <pic:blipFill>
+                          <a:blip r:embed="rId9"/>
+                          <a:stretch>
+                            <a:fillRect/>
+                          </a:stretch>
+                        </pic:blipFill>
+                        <pic:spPr>
+                          <a:xfrm>
+                            <a:off x="0" y="0"/>
+                            <a:ext cx="2926080" cy="2328862"/>
+                          </a:xfrm>
+                          <a:prstGeom prst="rect"/>
+                        </pic:spPr>
+                      </pic:pic>
+                    </a:graphicData>
+                  </a:graphic>
+                </wp:inline>
+              </w:drawing>
+            </w:r>
+          </w:p>
+        </w:tc>
+        <w:tc>
+          <w:tcPr>
+            <w:tcW w:type="dxa" w:w="4968"/>
+          </w:tcPr>
+          <w:p>
+            <w:pPr>
+              <w:spacing w:before="40" w:after="80"/>
+              <w:jc w:val="center"/>
+            </w:pPr>
+            <w:r>
+              <w:drawing>
+                <wp:inline xmlns:a="http://schemas.openxmlformats.org/drawingml/2006/main" xmlns:pic="http://schemas.openxmlformats.org/drawingml/2006/picture">
+                  <wp:extent cx="2926080" cy="2028825"/>
+                  <wp:docPr id="2" name="Picture 2"/>
+                  <wp:cNvGraphicFramePr>
+                    <a:graphicFrameLocks noChangeAspect="1"/>
+                  </wp:cNvGraphicFramePr>
+                  <a:graphic>
+                    <a:graphicData uri="http://schemas.openxmlformats.org/drawingml/2006/picture">
+                      <pic:pic>
+                        <pic:nvPicPr>
+                          <pic:cNvPr id="0" name="dashboard_waveform.png"/>
+                          <pic:cNvPicPr/>
+                        </pic:nvPicPr>
+                        <pic:blipFill>
+                          <a:blip r:embed="rId10"/>
+                          <a:stretch>
+                            <a:fillRect/>
+                          </a:stretch>
+                        </pic:blipFill>
+                        <pic:spPr>
+                          <a:xfrm>
+                            <a:off x="0" y="0"/>
+                            <a:ext cx="2926080" cy="2028825"/>
+                          </a:xfrm>
+                          <a:prstGeom prst="rect"/>
+                        </pic:spPr>
+                      </pic:pic>
+                    </a:graphicData>
+                  </a:graphic>
+                </wp:inline>
+              </w:drawing>
+            </w:r>
+          </w:p>
+        </w:tc>
+      </w:tr>
+    </w:tbl>
+    <w:tbl>
+      <w:tblPr>
+        <w:tblW w:type="auto" w:w="0"/>
+        <w:jc w:val="center"/>
+        <w:tblLook w:firstColumn="1" w:firstRow="1" w:lastColumn="0" w:lastRow="0" w:noHBand="0" w:noVBand="1" w:val="04A0"/>
+      </w:tblPr>
+      <w:tblGrid>
+        <w:gridCol w:w="4752"/>
+        <w:gridCol w:w="4752"/>
+      </w:tblGrid>
+      <w:tr>
+        <w:tc>
+          <w:tcPr>
+            <w:tcW w:type="dxa" w:w="4968"/>
+          </w:tcPr>
+          <w:p>
+            <w:pPr>
+              <w:spacing w:before="40" w:after="80"/>
+              <w:jc w:val="center"/>
+            </w:pPr>
+            <w:r>
+              <w:drawing>
+                <wp:inline xmlns:a="http://schemas.openxmlformats.org/drawingml/2006/main" xmlns:pic="http://schemas.openxmlformats.org/drawingml/2006/picture">
+                  <wp:extent cx="2926080" cy="1288732"/>
+                  <wp:docPr id="3" name="Picture 3"/>
+                  <wp:cNvGraphicFramePr>
+                    <a:graphicFrameLocks noChangeAspect="1"/>
+                  </wp:cNvGraphicFramePr>
+                  <a:graphic>
+                    <a:graphicData uri="http://schemas.openxmlformats.org/drawingml/2006/picture">
+                      <pic:pic>
+                        <pic:nvPicPr>
+                          <pic:cNvPr id="0" name="hardware_perspective.jpg"/>
+                          <pic:cNvPicPr/>
+                        </pic:nvPicPr>
+                        <pic:blipFill>
+                          <a:blip r:embed="rId11"/>
+                          <a:stretch>
+                            <a:fillRect/>
+                          </a:stretch>
+                        </pic:blipFill>
+                        <pic:spPr>
+                          <a:xfrm>
+                            <a:off x="0" y="0"/>
+                            <a:ext cx="2926080" cy="1288732"/>
+                          </a:xfrm>
+                          <a:prstGeom prst="rect"/>
+                        </pic:spPr>
+                      </pic:pic>
+                    </a:graphicData>
+                  </a:graphic>
+                </wp:inline>
+              </w:drawing>
+            </w:r>
+          </w:p>
+        </w:tc>
+        <w:tc>
+          <w:tcPr>
+            <w:tcW w:type="dxa" w:w="4968"/>
+          </w:tcPr>
+          <w:p>
+            <w:pPr>
+              <w:spacing w:before="40" w:after="80"/>
+              <w:jc w:val="center"/>
+            </w:pPr>
+            <w:r>
+              <w:drawing>
+                <wp:inline xmlns:a="http://schemas.openxmlformats.org/drawingml/2006/main" xmlns:pic="http://schemas.openxmlformats.org/drawingml/2006/picture">
+                  <wp:extent cx="2926080" cy="1428750"/>
+                  <wp:docPr id="4" name="Picture 4"/>
+                  <wp:cNvGraphicFramePr>
+                    <a:graphicFrameLocks noChangeAspect="1"/>
+                  </wp:cNvGraphicFramePr>
+                  <a:graphic>
+                    <a:graphicData uri="http://schemas.openxmlformats.org/drawingml/2006/picture">
+                      <pic:pic>
+                        <pic:nvPicPr>
+                          <pic:cNvPr id="0" name="hardware_topdown.jpg"/>
+                          <pic:cNvPicPr/>
+                        </pic:nvPicPr>
+                        <pic:blipFill>
+                          <a:blip r:embed="rId12"/>
+                          <a:stretch>
+                            <a:fillRect/>
+                          </a:stretch>
+                        </pic:blipFill>
+                        <pic:spPr>
+                          <a:xfrm>
+                            <a:off x="0" y="0"/>
+                            <a:ext cx="2926080" cy="1428750"/>
+                          </a:xfrm>
+                          <a:prstGeom prst="rect"/>
+                        </pic:spPr>
+                      </pic:pic>
+                    </a:graphicData>
+                  </a:graphic>
+                </wp:inline>
+              </w:drawing>
+            </w:r>
+          </w:p>
+        </w:tc>
+      </w:tr>
+    </w:tbl>
+    <w:p>
+      <w:pPr>
+        <w:spacing w:after="80"/>
+      </w:pPr>
     </w:p>
     <w:p>
       <w:pPr>
@@ -2032,170 +2079,6 @@
     </w:p>
     <w:p>
       <w:pPr>
-        <w:keepNext/>
-        <w:spacing w:before="80" w:after="80"/>
-        <w:jc w:val="center"/>
-      </w:pPr>
-      <w:r>
-        <w:drawing>
-          <wp:inline xmlns:a="http://schemas.openxmlformats.org/drawingml/2006/main" xmlns:pic="http://schemas.openxmlformats.org/drawingml/2006/picture">
-            <wp:extent cx="5029200" cy="4002732"/>
-            <wp:docPr id="5" name="Picture 5"/>
-            <wp:cNvGraphicFramePr>
-              <a:graphicFrameLocks noChangeAspect="1"/>
-            </wp:cNvGraphicFramePr>
-            <a:graphic>
-              <a:graphicData uri="http://schemas.openxmlformats.org/drawingml/2006/picture">
-                <pic:pic>
-                  <pic:nvPicPr>
-                    <pic:cNvPr id="0" name="dashboard_lab.png"/>
-                    <pic:cNvPicPr/>
-                  </pic:nvPicPr>
-                  <pic:blipFill>
-                    <a:blip r:embed="rId9"/>
-                    <a:stretch>
-                      <a:fillRect/>
-                    </a:stretch>
-                  </pic:blipFill>
-                  <pic:spPr>
-                    <a:xfrm>
-                      <a:off x="0" y="0"/>
-                      <a:ext cx="5029200" cy="4002732"/>
-                    </a:xfrm>
-                    <a:prstGeom prst="rect"/>
-                  </pic:spPr>
-                </pic:pic>
-              </a:graphicData>
-            </a:graphic>
-          </wp:inline>
-        </w:drawing>
-      </w:r>
-    </w:p>
-    <w:p>
-      <w:pPr>
-        <w:keepNext/>
-        <w:spacing w:before="80" w:after="80"/>
-        <w:jc w:val="center"/>
-      </w:pPr>
-      <w:r>
-        <w:drawing>
-          <wp:inline xmlns:a="http://schemas.openxmlformats.org/drawingml/2006/main" xmlns:pic="http://schemas.openxmlformats.org/drawingml/2006/picture">
-            <wp:extent cx="5029200" cy="3487043"/>
-            <wp:docPr id="6" name="Picture 6"/>
-            <wp:cNvGraphicFramePr>
-              <a:graphicFrameLocks noChangeAspect="1"/>
-            </wp:cNvGraphicFramePr>
-            <a:graphic>
-              <a:graphicData uri="http://schemas.openxmlformats.org/drawingml/2006/picture">
-                <pic:pic>
-                  <pic:nvPicPr>
-                    <pic:cNvPr id="0" name="dashboard_waveform.png"/>
-                    <pic:cNvPicPr/>
-                  </pic:nvPicPr>
-                  <pic:blipFill>
-                    <a:blip r:embed="rId10"/>
-                    <a:stretch>
-                      <a:fillRect/>
-                    </a:stretch>
-                  </pic:blipFill>
-                  <pic:spPr>
-                    <a:xfrm>
-                      <a:off x="0" y="0"/>
-                      <a:ext cx="5029200" cy="3487043"/>
-                    </a:xfrm>
-                    <a:prstGeom prst="rect"/>
-                  </pic:spPr>
-                </pic:pic>
-              </a:graphicData>
-            </a:graphic>
-          </wp:inline>
-        </w:drawing>
-      </w:r>
-    </w:p>
-    <w:p>
-      <w:pPr>
-        <w:keepNext/>
-        <w:spacing w:before="80" w:after="80"/>
-        <w:jc w:val="center"/>
-      </w:pPr>
-      <w:r>
-        <w:drawing>
-          <wp:inline xmlns:a="http://schemas.openxmlformats.org/drawingml/2006/main" xmlns:pic="http://schemas.openxmlformats.org/drawingml/2006/picture">
-            <wp:extent cx="5029200" cy="2215009"/>
-            <wp:docPr id="7" name="Picture 7"/>
-            <wp:cNvGraphicFramePr>
-              <a:graphicFrameLocks noChangeAspect="1"/>
-            </wp:cNvGraphicFramePr>
-            <a:graphic>
-              <a:graphicData uri="http://schemas.openxmlformats.org/drawingml/2006/picture">
-                <pic:pic>
-                  <pic:nvPicPr>
-                    <pic:cNvPr id="0" name="hardware_perspective.jpg"/>
-                    <pic:cNvPicPr/>
-                  </pic:nvPicPr>
-                  <pic:blipFill>
-                    <a:blip r:embed="rId11"/>
-                    <a:stretch>
-                      <a:fillRect/>
-                    </a:stretch>
-                  </pic:blipFill>
-                  <pic:spPr>
-                    <a:xfrm>
-                      <a:off x="0" y="0"/>
-                      <a:ext cx="5029200" cy="2215009"/>
-                    </a:xfrm>
-                    <a:prstGeom prst="rect"/>
-                  </pic:spPr>
-                </pic:pic>
-              </a:graphicData>
-            </a:graphic>
-          </wp:inline>
-        </w:drawing>
-      </w:r>
-    </w:p>
-    <w:p>
-      <w:pPr>
-        <w:keepNext/>
-        <w:spacing w:before="80" w:after="80"/>
-        <w:jc w:val="center"/>
-      </w:pPr>
-      <w:r>
-        <w:drawing>
-          <wp:inline xmlns:a="http://schemas.openxmlformats.org/drawingml/2006/main" xmlns:pic="http://schemas.openxmlformats.org/drawingml/2006/picture">
-            <wp:extent cx="5029200" cy="2455664"/>
-            <wp:docPr id="8" name="Picture 8"/>
-            <wp:cNvGraphicFramePr>
-              <a:graphicFrameLocks noChangeAspect="1"/>
-            </wp:cNvGraphicFramePr>
-            <a:graphic>
-              <a:graphicData uri="http://schemas.openxmlformats.org/drawingml/2006/picture">
-                <pic:pic>
-                  <pic:nvPicPr>
-                    <pic:cNvPr id="0" name="hardware_topdown.jpg"/>
-                    <pic:cNvPicPr/>
-                  </pic:nvPicPr>
-                  <pic:blipFill>
-                    <a:blip r:embed="rId12"/>
-                    <a:stretch>
-                      <a:fillRect/>
-                    </a:stretch>
-                  </pic:blipFill>
-                  <pic:spPr>
-                    <a:xfrm>
-                      <a:off x="0" y="0"/>
-                      <a:ext cx="5029200" cy="2455664"/>
-                    </a:xfrm>
-                    <a:prstGeom prst="rect"/>
-                  </pic:spPr>
-                </pic:pic>
-              </a:graphicData>
-            </a:graphic>
-          </wp:inline>
-        </w:drawing>
-      </w:r>
-    </w:p>
-    <w:p>
-      <w:pPr>
         <w:pStyle w:val="Heading3"/>
         <w:keepNext/>
         <w:spacing w:before="160" w:after="60"/>
@@ -2209,6 +2092,217 @@
         </w:rPr>
         <w:t>Interactive Hardware &amp; Digital Twin Controls:</w:t>
       </w:r>
+    </w:p>
+    <w:tbl>
+      <w:tblPr>
+        <w:tblW w:type="auto" w:w="0"/>
+        <w:jc w:val="center"/>
+        <w:tblLook w:firstColumn="1" w:firstRow="1" w:lastColumn="0" w:lastRow="0" w:noHBand="0" w:noVBand="1" w:val="04A0"/>
+      </w:tblPr>
+      <w:tblGrid>
+        <w:gridCol w:w="4752"/>
+        <w:gridCol w:w="4752"/>
+      </w:tblGrid>
+      <w:tr>
+        <w:tc>
+          <w:tcPr>
+            <w:tcW w:type="dxa" w:w="4968"/>
+          </w:tcPr>
+          <w:p>
+            <w:pPr>
+              <w:spacing w:before="40" w:after="80"/>
+              <w:jc w:val="center"/>
+            </w:pPr>
+            <w:r>
+              <w:drawing>
+                <wp:inline xmlns:a="http://schemas.openxmlformats.org/drawingml/2006/main" xmlns:pic="http://schemas.openxmlformats.org/drawingml/2006/picture">
+                  <wp:extent cx="2926080" cy="2328862"/>
+                  <wp:docPr id="5" name="Picture 5"/>
+                  <wp:cNvGraphicFramePr>
+                    <a:graphicFrameLocks noChangeAspect="1"/>
+                  </wp:cNvGraphicFramePr>
+                  <a:graphic>
+                    <a:graphicData uri="http://schemas.openxmlformats.org/drawingml/2006/picture">
+                      <pic:pic>
+                        <pic:nvPicPr>
+                          <pic:cNvPr id="0" name="dashboard_lab.png"/>
+                          <pic:cNvPicPr/>
+                        </pic:nvPicPr>
+                        <pic:blipFill>
+                          <a:blip r:embed="rId9"/>
+                          <a:stretch>
+                            <a:fillRect/>
+                          </a:stretch>
+                        </pic:blipFill>
+                        <pic:spPr>
+                          <a:xfrm>
+                            <a:off x="0" y="0"/>
+                            <a:ext cx="2926080" cy="2328862"/>
+                          </a:xfrm>
+                          <a:prstGeom prst="rect"/>
+                        </pic:spPr>
+                      </pic:pic>
+                    </a:graphicData>
+                  </a:graphic>
+                </wp:inline>
+              </w:drawing>
+            </w:r>
+          </w:p>
+        </w:tc>
+        <w:tc>
+          <w:tcPr>
+            <w:tcW w:type="dxa" w:w="4968"/>
+          </w:tcPr>
+          <w:p>
+            <w:pPr>
+              <w:spacing w:before="40" w:after="80"/>
+              <w:jc w:val="center"/>
+            </w:pPr>
+            <w:r>
+              <w:drawing>
+                <wp:inline xmlns:a="http://schemas.openxmlformats.org/drawingml/2006/main" xmlns:pic="http://schemas.openxmlformats.org/drawingml/2006/picture">
+                  <wp:extent cx="2926080" cy="2028825"/>
+                  <wp:docPr id="6" name="Picture 6"/>
+                  <wp:cNvGraphicFramePr>
+                    <a:graphicFrameLocks noChangeAspect="1"/>
+                  </wp:cNvGraphicFramePr>
+                  <a:graphic>
+                    <a:graphicData uri="http://schemas.openxmlformats.org/drawingml/2006/picture">
+                      <pic:pic>
+                        <pic:nvPicPr>
+                          <pic:cNvPr id="0" name="dashboard_waveform.png"/>
+                          <pic:cNvPicPr/>
+                        </pic:nvPicPr>
+                        <pic:blipFill>
+                          <a:blip r:embed="rId10"/>
+                          <a:stretch>
+                            <a:fillRect/>
+                          </a:stretch>
+                        </pic:blipFill>
+                        <pic:spPr>
+                          <a:xfrm>
+                            <a:off x="0" y="0"/>
+                            <a:ext cx="2926080" cy="2028825"/>
+                          </a:xfrm>
+                          <a:prstGeom prst="rect"/>
+                        </pic:spPr>
+                      </pic:pic>
+                    </a:graphicData>
+                  </a:graphic>
+                </wp:inline>
+              </w:drawing>
+            </w:r>
+          </w:p>
+        </w:tc>
+      </w:tr>
+    </w:tbl>
+    <w:tbl>
+      <w:tblPr>
+        <w:tblW w:type="auto" w:w="0"/>
+        <w:jc w:val="center"/>
+        <w:tblLook w:firstColumn="1" w:firstRow="1" w:lastColumn="0" w:lastRow="0" w:noHBand="0" w:noVBand="1" w:val="04A0"/>
+      </w:tblPr>
+      <w:tblGrid>
+        <w:gridCol w:w="4752"/>
+        <w:gridCol w:w="4752"/>
+      </w:tblGrid>
+      <w:tr>
+        <w:tc>
+          <w:tcPr>
+            <w:tcW w:type="dxa" w:w="4968"/>
+          </w:tcPr>
+          <w:p>
+            <w:pPr>
+              <w:spacing w:before="40" w:after="80"/>
+              <w:jc w:val="center"/>
+            </w:pPr>
+            <w:r>
+              <w:drawing>
+                <wp:inline xmlns:a="http://schemas.openxmlformats.org/drawingml/2006/main" xmlns:pic="http://schemas.openxmlformats.org/drawingml/2006/picture">
+                  <wp:extent cx="2926080" cy="1288732"/>
+                  <wp:docPr id="7" name="Picture 7"/>
+                  <wp:cNvGraphicFramePr>
+                    <a:graphicFrameLocks noChangeAspect="1"/>
+                  </wp:cNvGraphicFramePr>
+                  <a:graphic>
+                    <a:graphicData uri="http://schemas.openxmlformats.org/drawingml/2006/picture">
+                      <pic:pic>
+                        <pic:nvPicPr>
+                          <pic:cNvPr id="0" name="hardware_perspective.jpg"/>
+                          <pic:cNvPicPr/>
+                        </pic:nvPicPr>
+                        <pic:blipFill>
+                          <a:blip r:embed="rId11"/>
+                          <a:stretch>
+                            <a:fillRect/>
+                          </a:stretch>
+                        </pic:blipFill>
+                        <pic:spPr>
+                          <a:xfrm>
+                            <a:off x="0" y="0"/>
+                            <a:ext cx="2926080" cy="1288732"/>
+                          </a:xfrm>
+                          <a:prstGeom prst="rect"/>
+                        </pic:spPr>
+                      </pic:pic>
+                    </a:graphicData>
+                  </a:graphic>
+                </wp:inline>
+              </w:drawing>
+            </w:r>
+          </w:p>
+        </w:tc>
+        <w:tc>
+          <w:tcPr>
+            <w:tcW w:type="dxa" w:w="4968"/>
+          </w:tcPr>
+          <w:p>
+            <w:pPr>
+              <w:spacing w:before="40" w:after="80"/>
+              <w:jc w:val="center"/>
+            </w:pPr>
+            <w:r>
+              <w:drawing>
+                <wp:inline xmlns:a="http://schemas.openxmlformats.org/drawingml/2006/main" xmlns:pic="http://schemas.openxmlformats.org/drawingml/2006/picture">
+                  <wp:extent cx="2926080" cy="1428750"/>
+                  <wp:docPr id="8" name="Picture 8"/>
+                  <wp:cNvGraphicFramePr>
+                    <a:graphicFrameLocks noChangeAspect="1"/>
+                  </wp:cNvGraphicFramePr>
+                  <a:graphic>
+                    <a:graphicData uri="http://schemas.openxmlformats.org/drawingml/2006/picture">
+                      <pic:pic>
+                        <pic:nvPicPr>
+                          <pic:cNvPr id="0" name="hardware_topdown.jpg"/>
+                          <pic:cNvPicPr/>
+                        </pic:nvPicPr>
+                        <pic:blipFill>
+                          <a:blip r:embed="rId12"/>
+                          <a:stretch>
+                            <a:fillRect/>
+                          </a:stretch>
+                        </pic:blipFill>
+                        <pic:spPr>
+                          <a:xfrm>
+                            <a:off x="0" y="0"/>
+                            <a:ext cx="2926080" cy="1428750"/>
+                          </a:xfrm>
+                          <a:prstGeom prst="rect"/>
+                        </pic:spPr>
+                      </pic:pic>
+                    </a:graphicData>
+                  </a:graphic>
+                </wp:inline>
+              </w:drawing>
+            </w:r>
+          </w:p>
+        </w:tc>
+      </w:tr>
+    </w:tbl>
+    <w:p>
+      <w:pPr>
+        <w:spacing w:after="80"/>
+      </w:pPr>
     </w:p>
     <w:p>
       <w:pPr>
@@ -3367,170 +3461,6 @@
     </w:p>
     <w:p>
       <w:pPr>
-        <w:keepNext/>
-        <w:spacing w:before="80" w:after="80"/>
-        <w:jc w:val="center"/>
-      </w:pPr>
-      <w:r>
-        <w:drawing>
-          <wp:inline xmlns:a="http://schemas.openxmlformats.org/drawingml/2006/main" xmlns:pic="http://schemas.openxmlformats.org/drawingml/2006/picture">
-            <wp:extent cx="5029200" cy="4002732"/>
-            <wp:docPr id="9" name="Picture 9"/>
-            <wp:cNvGraphicFramePr>
-              <a:graphicFrameLocks noChangeAspect="1"/>
-            </wp:cNvGraphicFramePr>
-            <a:graphic>
-              <a:graphicData uri="http://schemas.openxmlformats.org/drawingml/2006/picture">
-                <pic:pic>
-                  <pic:nvPicPr>
-                    <pic:cNvPr id="0" name="dashboard_lab.png"/>
-                    <pic:cNvPicPr/>
-                  </pic:nvPicPr>
-                  <pic:blipFill>
-                    <a:blip r:embed="rId9"/>
-                    <a:stretch>
-                      <a:fillRect/>
-                    </a:stretch>
-                  </pic:blipFill>
-                  <pic:spPr>
-                    <a:xfrm>
-                      <a:off x="0" y="0"/>
-                      <a:ext cx="5029200" cy="4002732"/>
-                    </a:xfrm>
-                    <a:prstGeom prst="rect"/>
-                  </pic:spPr>
-                </pic:pic>
-              </a:graphicData>
-            </a:graphic>
-          </wp:inline>
-        </w:drawing>
-      </w:r>
-    </w:p>
-    <w:p>
-      <w:pPr>
-        <w:keepNext/>
-        <w:spacing w:before="80" w:after="80"/>
-        <w:jc w:val="center"/>
-      </w:pPr>
-      <w:r>
-        <w:drawing>
-          <wp:inline xmlns:a="http://schemas.openxmlformats.org/drawingml/2006/main" xmlns:pic="http://schemas.openxmlformats.org/drawingml/2006/picture">
-            <wp:extent cx="5029200" cy="3487043"/>
-            <wp:docPr id="10" name="Picture 10"/>
-            <wp:cNvGraphicFramePr>
-              <a:graphicFrameLocks noChangeAspect="1"/>
-            </wp:cNvGraphicFramePr>
-            <a:graphic>
-              <a:graphicData uri="http://schemas.openxmlformats.org/drawingml/2006/picture">
-                <pic:pic>
-                  <pic:nvPicPr>
-                    <pic:cNvPr id="0" name="dashboard_waveform.png"/>
-                    <pic:cNvPicPr/>
-                  </pic:nvPicPr>
-                  <pic:blipFill>
-                    <a:blip r:embed="rId10"/>
-                    <a:stretch>
-                      <a:fillRect/>
-                    </a:stretch>
-                  </pic:blipFill>
-                  <pic:spPr>
-                    <a:xfrm>
-                      <a:off x="0" y="0"/>
-                      <a:ext cx="5029200" cy="3487043"/>
-                    </a:xfrm>
-                    <a:prstGeom prst="rect"/>
-                  </pic:spPr>
-                </pic:pic>
-              </a:graphicData>
-            </a:graphic>
-          </wp:inline>
-        </w:drawing>
-      </w:r>
-    </w:p>
-    <w:p>
-      <w:pPr>
-        <w:keepNext/>
-        <w:spacing w:before="80" w:after="80"/>
-        <w:jc w:val="center"/>
-      </w:pPr>
-      <w:r>
-        <w:drawing>
-          <wp:inline xmlns:a="http://schemas.openxmlformats.org/drawingml/2006/main" xmlns:pic="http://schemas.openxmlformats.org/drawingml/2006/picture">
-            <wp:extent cx="5029200" cy="2215009"/>
-            <wp:docPr id="11" name="Picture 11"/>
-            <wp:cNvGraphicFramePr>
-              <a:graphicFrameLocks noChangeAspect="1"/>
-            </wp:cNvGraphicFramePr>
-            <a:graphic>
-              <a:graphicData uri="http://schemas.openxmlformats.org/drawingml/2006/picture">
-                <pic:pic>
-                  <pic:nvPicPr>
-                    <pic:cNvPr id="0" name="hardware_perspective.jpg"/>
-                    <pic:cNvPicPr/>
-                  </pic:nvPicPr>
-                  <pic:blipFill>
-                    <a:blip r:embed="rId11"/>
-                    <a:stretch>
-                      <a:fillRect/>
-                    </a:stretch>
-                  </pic:blipFill>
-                  <pic:spPr>
-                    <a:xfrm>
-                      <a:off x="0" y="0"/>
-                      <a:ext cx="5029200" cy="2215009"/>
-                    </a:xfrm>
-                    <a:prstGeom prst="rect"/>
-                  </pic:spPr>
-                </pic:pic>
-              </a:graphicData>
-            </a:graphic>
-          </wp:inline>
-        </w:drawing>
-      </w:r>
-    </w:p>
-    <w:p>
-      <w:pPr>
-        <w:keepNext/>
-        <w:spacing w:before="80" w:after="80"/>
-        <w:jc w:val="center"/>
-      </w:pPr>
-      <w:r>
-        <w:drawing>
-          <wp:inline xmlns:a="http://schemas.openxmlformats.org/drawingml/2006/main" xmlns:pic="http://schemas.openxmlformats.org/drawingml/2006/picture">
-            <wp:extent cx="5029200" cy="2455664"/>
-            <wp:docPr id="12" name="Picture 12"/>
-            <wp:cNvGraphicFramePr>
-              <a:graphicFrameLocks noChangeAspect="1"/>
-            </wp:cNvGraphicFramePr>
-            <a:graphic>
-              <a:graphicData uri="http://schemas.openxmlformats.org/drawingml/2006/picture">
-                <pic:pic>
-                  <pic:nvPicPr>
-                    <pic:cNvPr id="0" name="hardware_topdown.jpg"/>
-                    <pic:cNvPicPr/>
-                  </pic:nvPicPr>
-                  <pic:blipFill>
-                    <a:blip r:embed="rId12"/>
-                    <a:stretch>
-                      <a:fillRect/>
-                    </a:stretch>
-                  </pic:blipFill>
-                  <pic:spPr>
-                    <a:xfrm>
-                      <a:off x="0" y="0"/>
-                      <a:ext cx="5029200" cy="2455664"/>
-                    </a:xfrm>
-                    <a:prstGeom prst="rect"/>
-                  </pic:spPr>
-                </pic:pic>
-              </a:graphicData>
-            </a:graphic>
-          </wp:inline>
-        </w:drawing>
-      </w:r>
-    </w:p>
-    <w:p>
-      <w:pPr>
         <w:pStyle w:val="Heading3"/>
         <w:keepNext/>
         <w:spacing w:before="160" w:after="60"/>
@@ -3544,6 +3474,217 @@
         </w:rPr>
         <w:t>Interactive Hardware &amp; Digital Twin Controls:</w:t>
       </w:r>
+    </w:p>
+    <w:tbl>
+      <w:tblPr>
+        <w:tblW w:type="auto" w:w="0"/>
+        <w:jc w:val="center"/>
+        <w:tblLook w:firstColumn="1" w:firstRow="1" w:lastColumn="0" w:lastRow="0" w:noHBand="0" w:noVBand="1" w:val="04A0"/>
+      </w:tblPr>
+      <w:tblGrid>
+        <w:gridCol w:w="4752"/>
+        <w:gridCol w:w="4752"/>
+      </w:tblGrid>
+      <w:tr>
+        <w:tc>
+          <w:tcPr>
+            <w:tcW w:type="dxa" w:w="4968"/>
+          </w:tcPr>
+          <w:p>
+            <w:pPr>
+              <w:spacing w:before="40" w:after="80"/>
+              <w:jc w:val="center"/>
+            </w:pPr>
+            <w:r>
+              <w:drawing>
+                <wp:inline xmlns:a="http://schemas.openxmlformats.org/drawingml/2006/main" xmlns:pic="http://schemas.openxmlformats.org/drawingml/2006/picture">
+                  <wp:extent cx="2926080" cy="2328862"/>
+                  <wp:docPr id="9" name="Picture 9"/>
+                  <wp:cNvGraphicFramePr>
+                    <a:graphicFrameLocks noChangeAspect="1"/>
+                  </wp:cNvGraphicFramePr>
+                  <a:graphic>
+                    <a:graphicData uri="http://schemas.openxmlformats.org/drawingml/2006/picture">
+                      <pic:pic>
+                        <pic:nvPicPr>
+                          <pic:cNvPr id="0" name="dashboard_lab.png"/>
+                          <pic:cNvPicPr/>
+                        </pic:nvPicPr>
+                        <pic:blipFill>
+                          <a:blip r:embed="rId9"/>
+                          <a:stretch>
+                            <a:fillRect/>
+                          </a:stretch>
+                        </pic:blipFill>
+                        <pic:spPr>
+                          <a:xfrm>
+                            <a:off x="0" y="0"/>
+                            <a:ext cx="2926080" cy="2328862"/>
+                          </a:xfrm>
+                          <a:prstGeom prst="rect"/>
+                        </pic:spPr>
+                      </pic:pic>
+                    </a:graphicData>
+                  </a:graphic>
+                </wp:inline>
+              </w:drawing>
+            </w:r>
+          </w:p>
+        </w:tc>
+        <w:tc>
+          <w:tcPr>
+            <w:tcW w:type="dxa" w:w="4968"/>
+          </w:tcPr>
+          <w:p>
+            <w:pPr>
+              <w:spacing w:before="40" w:after="80"/>
+              <w:jc w:val="center"/>
+            </w:pPr>
+            <w:r>
+              <w:drawing>
+                <wp:inline xmlns:a="http://schemas.openxmlformats.org/drawingml/2006/main" xmlns:pic="http://schemas.openxmlformats.org/drawingml/2006/picture">
+                  <wp:extent cx="2926080" cy="2028825"/>
+                  <wp:docPr id="10" name="Picture 10"/>
+                  <wp:cNvGraphicFramePr>
+                    <a:graphicFrameLocks noChangeAspect="1"/>
+                  </wp:cNvGraphicFramePr>
+                  <a:graphic>
+                    <a:graphicData uri="http://schemas.openxmlformats.org/drawingml/2006/picture">
+                      <pic:pic>
+                        <pic:nvPicPr>
+                          <pic:cNvPr id="0" name="dashboard_waveform.png"/>
+                          <pic:cNvPicPr/>
+                        </pic:nvPicPr>
+                        <pic:blipFill>
+                          <a:blip r:embed="rId10"/>
+                          <a:stretch>
+                            <a:fillRect/>
+                          </a:stretch>
+                        </pic:blipFill>
+                        <pic:spPr>
+                          <a:xfrm>
+                            <a:off x="0" y="0"/>
+                            <a:ext cx="2926080" cy="2028825"/>
+                          </a:xfrm>
+                          <a:prstGeom prst="rect"/>
+                        </pic:spPr>
+                      </pic:pic>
+                    </a:graphicData>
+                  </a:graphic>
+                </wp:inline>
+              </w:drawing>
+            </w:r>
+          </w:p>
+        </w:tc>
+      </w:tr>
+    </w:tbl>
+    <w:tbl>
+      <w:tblPr>
+        <w:tblW w:type="auto" w:w="0"/>
+        <w:jc w:val="center"/>
+        <w:tblLook w:firstColumn="1" w:firstRow="1" w:lastColumn="0" w:lastRow="0" w:noHBand="0" w:noVBand="1" w:val="04A0"/>
+      </w:tblPr>
+      <w:tblGrid>
+        <w:gridCol w:w="4752"/>
+        <w:gridCol w:w="4752"/>
+      </w:tblGrid>
+      <w:tr>
+        <w:tc>
+          <w:tcPr>
+            <w:tcW w:type="dxa" w:w="4968"/>
+          </w:tcPr>
+          <w:p>
+            <w:pPr>
+              <w:spacing w:before="40" w:after="80"/>
+              <w:jc w:val="center"/>
+            </w:pPr>
+            <w:r>
+              <w:drawing>
+                <wp:inline xmlns:a="http://schemas.openxmlformats.org/drawingml/2006/main" xmlns:pic="http://schemas.openxmlformats.org/drawingml/2006/picture">
+                  <wp:extent cx="2926080" cy="1288732"/>
+                  <wp:docPr id="11" name="Picture 11"/>
+                  <wp:cNvGraphicFramePr>
+                    <a:graphicFrameLocks noChangeAspect="1"/>
+                  </wp:cNvGraphicFramePr>
+                  <a:graphic>
+                    <a:graphicData uri="http://schemas.openxmlformats.org/drawingml/2006/picture">
+                      <pic:pic>
+                        <pic:nvPicPr>
+                          <pic:cNvPr id="0" name="hardware_perspective.jpg"/>
+                          <pic:cNvPicPr/>
+                        </pic:nvPicPr>
+                        <pic:blipFill>
+                          <a:blip r:embed="rId11"/>
+                          <a:stretch>
+                            <a:fillRect/>
+                          </a:stretch>
+                        </pic:blipFill>
+                        <pic:spPr>
+                          <a:xfrm>
+                            <a:off x="0" y="0"/>
+                            <a:ext cx="2926080" cy="1288732"/>
+                          </a:xfrm>
+                          <a:prstGeom prst="rect"/>
+                        </pic:spPr>
+                      </pic:pic>
+                    </a:graphicData>
+                  </a:graphic>
+                </wp:inline>
+              </w:drawing>
+            </w:r>
+          </w:p>
+        </w:tc>
+        <w:tc>
+          <w:tcPr>
+            <w:tcW w:type="dxa" w:w="4968"/>
+          </w:tcPr>
+          <w:p>
+            <w:pPr>
+              <w:spacing w:before="40" w:after="80"/>
+              <w:jc w:val="center"/>
+            </w:pPr>
+            <w:r>
+              <w:drawing>
+                <wp:inline xmlns:a="http://schemas.openxmlformats.org/drawingml/2006/main" xmlns:pic="http://schemas.openxmlformats.org/drawingml/2006/picture">
+                  <wp:extent cx="2926080" cy="1428750"/>
+                  <wp:docPr id="12" name="Picture 12"/>
+                  <wp:cNvGraphicFramePr>
+                    <a:graphicFrameLocks noChangeAspect="1"/>
+                  </wp:cNvGraphicFramePr>
+                  <a:graphic>
+                    <a:graphicData uri="http://schemas.openxmlformats.org/drawingml/2006/picture">
+                      <pic:pic>
+                        <pic:nvPicPr>
+                          <pic:cNvPr id="0" name="hardware_topdown.jpg"/>
+                          <pic:cNvPicPr/>
+                        </pic:nvPicPr>
+                        <pic:blipFill>
+                          <a:blip r:embed="rId12"/>
+                          <a:stretch>
+                            <a:fillRect/>
+                          </a:stretch>
+                        </pic:blipFill>
+                        <pic:spPr>
+                          <a:xfrm>
+                            <a:off x="0" y="0"/>
+                            <a:ext cx="2926080" cy="1428750"/>
+                          </a:xfrm>
+                          <a:prstGeom prst="rect"/>
+                        </pic:spPr>
+                      </pic:pic>
+                    </a:graphicData>
+                  </a:graphic>
+                </wp:inline>
+              </w:drawing>
+            </w:r>
+          </w:p>
+        </w:tc>
+      </w:tr>
+    </w:tbl>
+    <w:p>
+      <w:pPr>
+        <w:spacing w:after="80"/>
+      </w:pPr>
     </w:p>
     <w:p>
       <w:pPr>
@@ -4702,170 +4843,6 @@
     </w:p>
     <w:p>
       <w:pPr>
-        <w:keepNext/>
-        <w:spacing w:before="80" w:after="80"/>
-        <w:jc w:val="center"/>
-      </w:pPr>
-      <w:r>
-        <w:drawing>
-          <wp:inline xmlns:a="http://schemas.openxmlformats.org/drawingml/2006/main" xmlns:pic="http://schemas.openxmlformats.org/drawingml/2006/picture">
-            <wp:extent cx="5029200" cy="4002732"/>
-            <wp:docPr id="13" name="Picture 13"/>
-            <wp:cNvGraphicFramePr>
-              <a:graphicFrameLocks noChangeAspect="1"/>
-            </wp:cNvGraphicFramePr>
-            <a:graphic>
-              <a:graphicData uri="http://schemas.openxmlformats.org/drawingml/2006/picture">
-                <pic:pic>
-                  <pic:nvPicPr>
-                    <pic:cNvPr id="0" name="dashboard_lab.png"/>
-                    <pic:cNvPicPr/>
-                  </pic:nvPicPr>
-                  <pic:blipFill>
-                    <a:blip r:embed="rId9"/>
-                    <a:stretch>
-                      <a:fillRect/>
-                    </a:stretch>
-                  </pic:blipFill>
-                  <pic:spPr>
-                    <a:xfrm>
-                      <a:off x="0" y="0"/>
-                      <a:ext cx="5029200" cy="4002732"/>
-                    </a:xfrm>
-                    <a:prstGeom prst="rect"/>
-                  </pic:spPr>
-                </pic:pic>
-              </a:graphicData>
-            </a:graphic>
-          </wp:inline>
-        </w:drawing>
-      </w:r>
-    </w:p>
-    <w:p>
-      <w:pPr>
-        <w:keepNext/>
-        <w:spacing w:before="80" w:after="80"/>
-        <w:jc w:val="center"/>
-      </w:pPr>
-      <w:r>
-        <w:drawing>
-          <wp:inline xmlns:a="http://schemas.openxmlformats.org/drawingml/2006/main" xmlns:pic="http://schemas.openxmlformats.org/drawingml/2006/picture">
-            <wp:extent cx="5029200" cy="3487043"/>
-            <wp:docPr id="14" name="Picture 14"/>
-            <wp:cNvGraphicFramePr>
-              <a:graphicFrameLocks noChangeAspect="1"/>
-            </wp:cNvGraphicFramePr>
-            <a:graphic>
-              <a:graphicData uri="http://schemas.openxmlformats.org/drawingml/2006/picture">
-                <pic:pic>
-                  <pic:nvPicPr>
-                    <pic:cNvPr id="0" name="dashboard_waveform.png"/>
-                    <pic:cNvPicPr/>
-                  </pic:nvPicPr>
-                  <pic:blipFill>
-                    <a:blip r:embed="rId10"/>
-                    <a:stretch>
-                      <a:fillRect/>
-                    </a:stretch>
-                  </pic:blipFill>
-                  <pic:spPr>
-                    <a:xfrm>
-                      <a:off x="0" y="0"/>
-                      <a:ext cx="5029200" cy="3487043"/>
-                    </a:xfrm>
-                    <a:prstGeom prst="rect"/>
-                  </pic:spPr>
-                </pic:pic>
-              </a:graphicData>
-            </a:graphic>
-          </wp:inline>
-        </w:drawing>
-      </w:r>
-    </w:p>
-    <w:p>
-      <w:pPr>
-        <w:keepNext/>
-        <w:spacing w:before="80" w:after="80"/>
-        <w:jc w:val="center"/>
-      </w:pPr>
-      <w:r>
-        <w:drawing>
-          <wp:inline xmlns:a="http://schemas.openxmlformats.org/drawingml/2006/main" xmlns:pic="http://schemas.openxmlformats.org/drawingml/2006/picture">
-            <wp:extent cx="5029200" cy="2215009"/>
-            <wp:docPr id="15" name="Picture 15"/>
-            <wp:cNvGraphicFramePr>
-              <a:graphicFrameLocks noChangeAspect="1"/>
-            </wp:cNvGraphicFramePr>
-            <a:graphic>
-              <a:graphicData uri="http://schemas.openxmlformats.org/drawingml/2006/picture">
-                <pic:pic>
-                  <pic:nvPicPr>
-                    <pic:cNvPr id="0" name="hardware_perspective.jpg"/>
-                    <pic:cNvPicPr/>
-                  </pic:nvPicPr>
-                  <pic:blipFill>
-                    <a:blip r:embed="rId11"/>
-                    <a:stretch>
-                      <a:fillRect/>
-                    </a:stretch>
-                  </pic:blipFill>
-                  <pic:spPr>
-                    <a:xfrm>
-                      <a:off x="0" y="0"/>
-                      <a:ext cx="5029200" cy="2215009"/>
-                    </a:xfrm>
-                    <a:prstGeom prst="rect"/>
-                  </pic:spPr>
-                </pic:pic>
-              </a:graphicData>
-            </a:graphic>
-          </wp:inline>
-        </w:drawing>
-      </w:r>
-    </w:p>
-    <w:p>
-      <w:pPr>
-        <w:keepNext/>
-        <w:spacing w:before="80" w:after="80"/>
-        <w:jc w:val="center"/>
-      </w:pPr>
-      <w:r>
-        <w:drawing>
-          <wp:inline xmlns:a="http://schemas.openxmlformats.org/drawingml/2006/main" xmlns:pic="http://schemas.openxmlformats.org/drawingml/2006/picture">
-            <wp:extent cx="5029200" cy="2455664"/>
-            <wp:docPr id="16" name="Picture 16"/>
-            <wp:cNvGraphicFramePr>
-              <a:graphicFrameLocks noChangeAspect="1"/>
-            </wp:cNvGraphicFramePr>
-            <a:graphic>
-              <a:graphicData uri="http://schemas.openxmlformats.org/drawingml/2006/picture">
-                <pic:pic>
-                  <pic:nvPicPr>
-                    <pic:cNvPr id="0" name="hardware_topdown.jpg"/>
-                    <pic:cNvPicPr/>
-                  </pic:nvPicPr>
-                  <pic:blipFill>
-                    <a:blip r:embed="rId12"/>
-                    <a:stretch>
-                      <a:fillRect/>
-                    </a:stretch>
-                  </pic:blipFill>
-                  <pic:spPr>
-                    <a:xfrm>
-                      <a:off x="0" y="0"/>
-                      <a:ext cx="5029200" cy="2455664"/>
-                    </a:xfrm>
-                    <a:prstGeom prst="rect"/>
-                  </pic:spPr>
-                </pic:pic>
-              </a:graphicData>
-            </a:graphic>
-          </wp:inline>
-        </w:drawing>
-      </w:r>
-    </w:p>
-    <w:p>
-      <w:pPr>
         <w:pStyle w:val="Heading3"/>
         <w:keepNext/>
         <w:spacing w:before="160" w:after="60"/>
@@ -4879,6 +4856,217 @@
         </w:rPr>
         <w:t>Interactive Hardware &amp; Digital Twin Controls:</w:t>
       </w:r>
+    </w:p>
+    <w:tbl>
+      <w:tblPr>
+        <w:tblW w:type="auto" w:w="0"/>
+        <w:jc w:val="center"/>
+        <w:tblLook w:firstColumn="1" w:firstRow="1" w:lastColumn="0" w:lastRow="0" w:noHBand="0" w:noVBand="1" w:val="04A0"/>
+      </w:tblPr>
+      <w:tblGrid>
+        <w:gridCol w:w="4752"/>
+        <w:gridCol w:w="4752"/>
+      </w:tblGrid>
+      <w:tr>
+        <w:tc>
+          <w:tcPr>
+            <w:tcW w:type="dxa" w:w="4968"/>
+          </w:tcPr>
+          <w:p>
+            <w:pPr>
+              <w:spacing w:before="40" w:after="80"/>
+              <w:jc w:val="center"/>
+            </w:pPr>
+            <w:r>
+              <w:drawing>
+                <wp:inline xmlns:a="http://schemas.openxmlformats.org/drawingml/2006/main" xmlns:pic="http://schemas.openxmlformats.org/drawingml/2006/picture">
+                  <wp:extent cx="2926080" cy="2328862"/>
+                  <wp:docPr id="13" name="Picture 13"/>
+                  <wp:cNvGraphicFramePr>
+                    <a:graphicFrameLocks noChangeAspect="1"/>
+                  </wp:cNvGraphicFramePr>
+                  <a:graphic>
+                    <a:graphicData uri="http://schemas.openxmlformats.org/drawingml/2006/picture">
+                      <pic:pic>
+                        <pic:nvPicPr>
+                          <pic:cNvPr id="0" name="dashboard_lab.png"/>
+                          <pic:cNvPicPr/>
+                        </pic:nvPicPr>
+                        <pic:blipFill>
+                          <a:blip r:embed="rId9"/>
+                          <a:stretch>
+                            <a:fillRect/>
+                          </a:stretch>
+                        </pic:blipFill>
+                        <pic:spPr>
+                          <a:xfrm>
+                            <a:off x="0" y="0"/>
+                            <a:ext cx="2926080" cy="2328862"/>
+                          </a:xfrm>
+                          <a:prstGeom prst="rect"/>
+                        </pic:spPr>
+                      </pic:pic>
+                    </a:graphicData>
+                  </a:graphic>
+                </wp:inline>
+              </w:drawing>
+            </w:r>
+          </w:p>
+        </w:tc>
+        <w:tc>
+          <w:tcPr>
+            <w:tcW w:type="dxa" w:w="4968"/>
+          </w:tcPr>
+          <w:p>
+            <w:pPr>
+              <w:spacing w:before="40" w:after="80"/>
+              <w:jc w:val="center"/>
+            </w:pPr>
+            <w:r>
+              <w:drawing>
+                <wp:inline xmlns:a="http://schemas.openxmlformats.org/drawingml/2006/main" xmlns:pic="http://schemas.openxmlformats.org/drawingml/2006/picture">
+                  <wp:extent cx="2926080" cy="2028825"/>
+                  <wp:docPr id="14" name="Picture 14"/>
+                  <wp:cNvGraphicFramePr>
+                    <a:graphicFrameLocks noChangeAspect="1"/>
+                  </wp:cNvGraphicFramePr>
+                  <a:graphic>
+                    <a:graphicData uri="http://schemas.openxmlformats.org/drawingml/2006/picture">
+                      <pic:pic>
+                        <pic:nvPicPr>
+                          <pic:cNvPr id="0" name="dashboard_waveform.png"/>
+                          <pic:cNvPicPr/>
+                        </pic:nvPicPr>
+                        <pic:blipFill>
+                          <a:blip r:embed="rId10"/>
+                          <a:stretch>
+                            <a:fillRect/>
+                          </a:stretch>
+                        </pic:blipFill>
+                        <pic:spPr>
+                          <a:xfrm>
+                            <a:off x="0" y="0"/>
+                            <a:ext cx="2926080" cy="2028825"/>
+                          </a:xfrm>
+                          <a:prstGeom prst="rect"/>
+                        </pic:spPr>
+                      </pic:pic>
+                    </a:graphicData>
+                  </a:graphic>
+                </wp:inline>
+              </w:drawing>
+            </w:r>
+          </w:p>
+        </w:tc>
+      </w:tr>
+    </w:tbl>
+    <w:tbl>
+      <w:tblPr>
+        <w:tblW w:type="auto" w:w="0"/>
+        <w:jc w:val="center"/>
+        <w:tblLook w:firstColumn="1" w:firstRow="1" w:lastColumn="0" w:lastRow="0" w:noHBand="0" w:noVBand="1" w:val="04A0"/>
+      </w:tblPr>
+      <w:tblGrid>
+        <w:gridCol w:w="4752"/>
+        <w:gridCol w:w="4752"/>
+      </w:tblGrid>
+      <w:tr>
+        <w:tc>
+          <w:tcPr>
+            <w:tcW w:type="dxa" w:w="4968"/>
+          </w:tcPr>
+          <w:p>
+            <w:pPr>
+              <w:spacing w:before="40" w:after="80"/>
+              <w:jc w:val="center"/>
+            </w:pPr>
+            <w:r>
+              <w:drawing>
+                <wp:inline xmlns:a="http://schemas.openxmlformats.org/drawingml/2006/main" xmlns:pic="http://schemas.openxmlformats.org/drawingml/2006/picture">
+                  <wp:extent cx="2926080" cy="1288732"/>
+                  <wp:docPr id="15" name="Picture 15"/>
+                  <wp:cNvGraphicFramePr>
+                    <a:graphicFrameLocks noChangeAspect="1"/>
+                  </wp:cNvGraphicFramePr>
+                  <a:graphic>
+                    <a:graphicData uri="http://schemas.openxmlformats.org/drawingml/2006/picture">
+                      <pic:pic>
+                        <pic:nvPicPr>
+                          <pic:cNvPr id="0" name="hardware_perspective.jpg"/>
+                          <pic:cNvPicPr/>
+                        </pic:nvPicPr>
+                        <pic:blipFill>
+                          <a:blip r:embed="rId11"/>
+                          <a:stretch>
+                            <a:fillRect/>
+                          </a:stretch>
+                        </pic:blipFill>
+                        <pic:spPr>
+                          <a:xfrm>
+                            <a:off x="0" y="0"/>
+                            <a:ext cx="2926080" cy="1288732"/>
+                          </a:xfrm>
+                          <a:prstGeom prst="rect"/>
+                        </pic:spPr>
+                      </pic:pic>
+                    </a:graphicData>
+                  </a:graphic>
+                </wp:inline>
+              </w:drawing>
+            </w:r>
+          </w:p>
+        </w:tc>
+        <w:tc>
+          <w:tcPr>
+            <w:tcW w:type="dxa" w:w="4968"/>
+          </w:tcPr>
+          <w:p>
+            <w:pPr>
+              <w:spacing w:before="40" w:after="80"/>
+              <w:jc w:val="center"/>
+            </w:pPr>
+            <w:r>
+              <w:drawing>
+                <wp:inline xmlns:a="http://schemas.openxmlformats.org/drawingml/2006/main" xmlns:pic="http://schemas.openxmlformats.org/drawingml/2006/picture">
+                  <wp:extent cx="2926080" cy="1428750"/>
+                  <wp:docPr id="16" name="Picture 16"/>
+                  <wp:cNvGraphicFramePr>
+                    <a:graphicFrameLocks noChangeAspect="1"/>
+                  </wp:cNvGraphicFramePr>
+                  <a:graphic>
+                    <a:graphicData uri="http://schemas.openxmlformats.org/drawingml/2006/picture">
+                      <pic:pic>
+                        <pic:nvPicPr>
+                          <pic:cNvPr id="0" name="hardware_topdown.jpg"/>
+                          <pic:cNvPicPr/>
+                        </pic:nvPicPr>
+                        <pic:blipFill>
+                          <a:blip r:embed="rId12"/>
+                          <a:stretch>
+                            <a:fillRect/>
+                          </a:stretch>
+                        </pic:blipFill>
+                        <pic:spPr>
+                          <a:xfrm>
+                            <a:off x="0" y="0"/>
+                            <a:ext cx="2926080" cy="1428750"/>
+                          </a:xfrm>
+                          <a:prstGeom prst="rect"/>
+                        </pic:spPr>
+                      </pic:pic>
+                    </a:graphicData>
+                  </a:graphic>
+                </wp:inline>
+              </w:drawing>
+            </w:r>
+          </w:p>
+        </w:tc>
+      </w:tr>
+    </w:tbl>
+    <w:p>
+      <w:pPr>
+        <w:spacing w:after="80"/>
+      </w:pPr>
     </w:p>
     <w:p>
       <w:pPr>
@@ -6037,170 +6225,6 @@
     </w:p>
     <w:p>
       <w:pPr>
-        <w:keepNext/>
-        <w:spacing w:before="80" w:after="80"/>
-        <w:jc w:val="center"/>
-      </w:pPr>
-      <w:r>
-        <w:drawing>
-          <wp:inline xmlns:a="http://schemas.openxmlformats.org/drawingml/2006/main" xmlns:pic="http://schemas.openxmlformats.org/drawingml/2006/picture">
-            <wp:extent cx="5029200" cy="4002732"/>
-            <wp:docPr id="17" name="Picture 17"/>
-            <wp:cNvGraphicFramePr>
-              <a:graphicFrameLocks noChangeAspect="1"/>
-            </wp:cNvGraphicFramePr>
-            <a:graphic>
-              <a:graphicData uri="http://schemas.openxmlformats.org/drawingml/2006/picture">
-                <pic:pic>
-                  <pic:nvPicPr>
-                    <pic:cNvPr id="0" name="dashboard_lab.png"/>
-                    <pic:cNvPicPr/>
-                  </pic:nvPicPr>
-                  <pic:blipFill>
-                    <a:blip r:embed="rId9"/>
-                    <a:stretch>
-                      <a:fillRect/>
-                    </a:stretch>
-                  </pic:blipFill>
-                  <pic:spPr>
-                    <a:xfrm>
-                      <a:off x="0" y="0"/>
-                      <a:ext cx="5029200" cy="4002732"/>
-                    </a:xfrm>
-                    <a:prstGeom prst="rect"/>
-                  </pic:spPr>
-                </pic:pic>
-              </a:graphicData>
-            </a:graphic>
-          </wp:inline>
-        </w:drawing>
-      </w:r>
-    </w:p>
-    <w:p>
-      <w:pPr>
-        <w:keepNext/>
-        <w:spacing w:before="80" w:after="80"/>
-        <w:jc w:val="center"/>
-      </w:pPr>
-      <w:r>
-        <w:drawing>
-          <wp:inline xmlns:a="http://schemas.openxmlformats.org/drawingml/2006/main" xmlns:pic="http://schemas.openxmlformats.org/drawingml/2006/picture">
-            <wp:extent cx="5029200" cy="3487043"/>
-            <wp:docPr id="18" name="Picture 18"/>
-            <wp:cNvGraphicFramePr>
-              <a:graphicFrameLocks noChangeAspect="1"/>
-            </wp:cNvGraphicFramePr>
-            <a:graphic>
-              <a:graphicData uri="http://schemas.openxmlformats.org/drawingml/2006/picture">
-                <pic:pic>
-                  <pic:nvPicPr>
-                    <pic:cNvPr id="0" name="dashboard_waveform.png"/>
-                    <pic:cNvPicPr/>
-                  </pic:nvPicPr>
-                  <pic:blipFill>
-                    <a:blip r:embed="rId10"/>
-                    <a:stretch>
-                      <a:fillRect/>
-                    </a:stretch>
-                  </pic:blipFill>
-                  <pic:spPr>
-                    <a:xfrm>
-                      <a:off x="0" y="0"/>
-                      <a:ext cx="5029200" cy="3487043"/>
-                    </a:xfrm>
-                    <a:prstGeom prst="rect"/>
-                  </pic:spPr>
-                </pic:pic>
-              </a:graphicData>
-            </a:graphic>
-          </wp:inline>
-        </w:drawing>
-      </w:r>
-    </w:p>
-    <w:p>
-      <w:pPr>
-        <w:keepNext/>
-        <w:spacing w:before="80" w:after="80"/>
-        <w:jc w:val="center"/>
-      </w:pPr>
-      <w:r>
-        <w:drawing>
-          <wp:inline xmlns:a="http://schemas.openxmlformats.org/drawingml/2006/main" xmlns:pic="http://schemas.openxmlformats.org/drawingml/2006/picture">
-            <wp:extent cx="5029200" cy="2215009"/>
-            <wp:docPr id="19" name="Picture 19"/>
-            <wp:cNvGraphicFramePr>
-              <a:graphicFrameLocks noChangeAspect="1"/>
-            </wp:cNvGraphicFramePr>
-            <a:graphic>
-              <a:graphicData uri="http://schemas.openxmlformats.org/drawingml/2006/picture">
-                <pic:pic>
-                  <pic:nvPicPr>
-                    <pic:cNvPr id="0" name="hardware_perspective.jpg"/>
-                    <pic:cNvPicPr/>
-                  </pic:nvPicPr>
-                  <pic:blipFill>
-                    <a:blip r:embed="rId11"/>
-                    <a:stretch>
-                      <a:fillRect/>
-                    </a:stretch>
-                  </pic:blipFill>
-                  <pic:spPr>
-                    <a:xfrm>
-                      <a:off x="0" y="0"/>
-                      <a:ext cx="5029200" cy="2215009"/>
-                    </a:xfrm>
-                    <a:prstGeom prst="rect"/>
-                  </pic:spPr>
-                </pic:pic>
-              </a:graphicData>
-            </a:graphic>
-          </wp:inline>
-        </w:drawing>
-      </w:r>
-    </w:p>
-    <w:p>
-      <w:pPr>
-        <w:keepNext/>
-        <w:spacing w:before="80" w:after="80"/>
-        <w:jc w:val="center"/>
-      </w:pPr>
-      <w:r>
-        <w:drawing>
-          <wp:inline xmlns:a="http://schemas.openxmlformats.org/drawingml/2006/main" xmlns:pic="http://schemas.openxmlformats.org/drawingml/2006/picture">
-            <wp:extent cx="5029200" cy="2455664"/>
-            <wp:docPr id="20" name="Picture 20"/>
-            <wp:cNvGraphicFramePr>
-              <a:graphicFrameLocks noChangeAspect="1"/>
-            </wp:cNvGraphicFramePr>
-            <a:graphic>
-              <a:graphicData uri="http://schemas.openxmlformats.org/drawingml/2006/picture">
-                <pic:pic>
-                  <pic:nvPicPr>
-                    <pic:cNvPr id="0" name="hardware_topdown.jpg"/>
-                    <pic:cNvPicPr/>
-                  </pic:nvPicPr>
-                  <pic:blipFill>
-                    <a:blip r:embed="rId12"/>
-                    <a:stretch>
-                      <a:fillRect/>
-                    </a:stretch>
-                  </pic:blipFill>
-                  <pic:spPr>
-                    <a:xfrm>
-                      <a:off x="0" y="0"/>
-                      <a:ext cx="5029200" cy="2455664"/>
-                    </a:xfrm>
-                    <a:prstGeom prst="rect"/>
-                  </pic:spPr>
-                </pic:pic>
-              </a:graphicData>
-            </a:graphic>
-          </wp:inline>
-        </w:drawing>
-      </w:r>
-    </w:p>
-    <w:p>
-      <w:pPr>
         <w:pStyle w:val="Heading3"/>
         <w:keepNext/>
         <w:spacing w:before="160" w:after="60"/>
@@ -6214,6 +6238,217 @@
         </w:rPr>
         <w:t>Interactive Hardware &amp; Digital Twin Controls:</w:t>
       </w:r>
+    </w:p>
+    <w:tbl>
+      <w:tblPr>
+        <w:tblW w:type="auto" w:w="0"/>
+        <w:jc w:val="center"/>
+        <w:tblLook w:firstColumn="1" w:firstRow="1" w:lastColumn="0" w:lastRow="0" w:noHBand="0" w:noVBand="1" w:val="04A0"/>
+      </w:tblPr>
+      <w:tblGrid>
+        <w:gridCol w:w="4752"/>
+        <w:gridCol w:w="4752"/>
+      </w:tblGrid>
+      <w:tr>
+        <w:tc>
+          <w:tcPr>
+            <w:tcW w:type="dxa" w:w="4968"/>
+          </w:tcPr>
+          <w:p>
+            <w:pPr>
+              <w:spacing w:before="40" w:after="80"/>
+              <w:jc w:val="center"/>
+            </w:pPr>
+            <w:r>
+              <w:drawing>
+                <wp:inline xmlns:a="http://schemas.openxmlformats.org/drawingml/2006/main" xmlns:pic="http://schemas.openxmlformats.org/drawingml/2006/picture">
+                  <wp:extent cx="2926080" cy="2328862"/>
+                  <wp:docPr id="17" name="Picture 17"/>
+                  <wp:cNvGraphicFramePr>
+                    <a:graphicFrameLocks noChangeAspect="1"/>
+                  </wp:cNvGraphicFramePr>
+                  <a:graphic>
+                    <a:graphicData uri="http://schemas.openxmlformats.org/drawingml/2006/picture">
+                      <pic:pic>
+                        <pic:nvPicPr>
+                          <pic:cNvPr id="0" name="dashboard_lab.png"/>
+                          <pic:cNvPicPr/>
+                        </pic:nvPicPr>
+                        <pic:blipFill>
+                          <a:blip r:embed="rId9"/>
+                          <a:stretch>
+                            <a:fillRect/>
+                          </a:stretch>
+                        </pic:blipFill>
+                        <pic:spPr>
+                          <a:xfrm>
+                            <a:off x="0" y="0"/>
+                            <a:ext cx="2926080" cy="2328862"/>
+                          </a:xfrm>
+                          <a:prstGeom prst="rect"/>
+                        </pic:spPr>
+                      </pic:pic>
+                    </a:graphicData>
+                  </a:graphic>
+                </wp:inline>
+              </w:drawing>
+            </w:r>
+          </w:p>
+        </w:tc>
+        <w:tc>
+          <w:tcPr>
+            <w:tcW w:type="dxa" w:w="4968"/>
+          </w:tcPr>
+          <w:p>
+            <w:pPr>
+              <w:spacing w:before="40" w:after="80"/>
+              <w:jc w:val="center"/>
+            </w:pPr>
+            <w:r>
+              <w:drawing>
+                <wp:inline xmlns:a="http://schemas.openxmlformats.org/drawingml/2006/main" xmlns:pic="http://schemas.openxmlformats.org/drawingml/2006/picture">
+                  <wp:extent cx="2926080" cy="2028825"/>
+                  <wp:docPr id="18" name="Picture 18"/>
+                  <wp:cNvGraphicFramePr>
+                    <a:graphicFrameLocks noChangeAspect="1"/>
+                  </wp:cNvGraphicFramePr>
+                  <a:graphic>
+                    <a:graphicData uri="http://schemas.openxmlformats.org/drawingml/2006/picture">
+                      <pic:pic>
+                        <pic:nvPicPr>
+                          <pic:cNvPr id="0" name="dashboard_waveform.png"/>
+                          <pic:cNvPicPr/>
+                        </pic:nvPicPr>
+                        <pic:blipFill>
+                          <a:blip r:embed="rId10"/>
+                          <a:stretch>
+                            <a:fillRect/>
+                          </a:stretch>
+                        </pic:blipFill>
+                        <pic:spPr>
+                          <a:xfrm>
+                            <a:off x="0" y="0"/>
+                            <a:ext cx="2926080" cy="2028825"/>
+                          </a:xfrm>
+                          <a:prstGeom prst="rect"/>
+                        </pic:spPr>
+                      </pic:pic>
+                    </a:graphicData>
+                  </a:graphic>
+                </wp:inline>
+              </w:drawing>
+            </w:r>
+          </w:p>
+        </w:tc>
+      </w:tr>
+    </w:tbl>
+    <w:tbl>
+      <w:tblPr>
+        <w:tblW w:type="auto" w:w="0"/>
+        <w:jc w:val="center"/>
+        <w:tblLook w:firstColumn="1" w:firstRow="1" w:lastColumn="0" w:lastRow="0" w:noHBand="0" w:noVBand="1" w:val="04A0"/>
+      </w:tblPr>
+      <w:tblGrid>
+        <w:gridCol w:w="4752"/>
+        <w:gridCol w:w="4752"/>
+      </w:tblGrid>
+      <w:tr>
+        <w:tc>
+          <w:tcPr>
+            <w:tcW w:type="dxa" w:w="4968"/>
+          </w:tcPr>
+          <w:p>
+            <w:pPr>
+              <w:spacing w:before="40" w:after="80"/>
+              <w:jc w:val="center"/>
+            </w:pPr>
+            <w:r>
+              <w:drawing>
+                <wp:inline xmlns:a="http://schemas.openxmlformats.org/drawingml/2006/main" xmlns:pic="http://schemas.openxmlformats.org/drawingml/2006/picture">
+                  <wp:extent cx="2926080" cy="1288732"/>
+                  <wp:docPr id="19" name="Picture 19"/>
+                  <wp:cNvGraphicFramePr>
+                    <a:graphicFrameLocks noChangeAspect="1"/>
+                  </wp:cNvGraphicFramePr>
+                  <a:graphic>
+                    <a:graphicData uri="http://schemas.openxmlformats.org/drawingml/2006/picture">
+                      <pic:pic>
+                        <pic:nvPicPr>
+                          <pic:cNvPr id="0" name="hardware_perspective.jpg"/>
+                          <pic:cNvPicPr/>
+                        </pic:nvPicPr>
+                        <pic:blipFill>
+                          <a:blip r:embed="rId11"/>
+                          <a:stretch>
+                            <a:fillRect/>
+                          </a:stretch>
+                        </pic:blipFill>
+                        <pic:spPr>
+                          <a:xfrm>
+                            <a:off x="0" y="0"/>
+                            <a:ext cx="2926080" cy="1288732"/>
+                          </a:xfrm>
+                          <a:prstGeom prst="rect"/>
+                        </pic:spPr>
+                      </pic:pic>
+                    </a:graphicData>
+                  </a:graphic>
+                </wp:inline>
+              </w:drawing>
+            </w:r>
+          </w:p>
+        </w:tc>
+        <w:tc>
+          <w:tcPr>
+            <w:tcW w:type="dxa" w:w="4968"/>
+          </w:tcPr>
+          <w:p>
+            <w:pPr>
+              <w:spacing w:before="40" w:after="80"/>
+              <w:jc w:val="center"/>
+            </w:pPr>
+            <w:r>
+              <w:drawing>
+                <wp:inline xmlns:a="http://schemas.openxmlformats.org/drawingml/2006/main" xmlns:pic="http://schemas.openxmlformats.org/drawingml/2006/picture">
+                  <wp:extent cx="2926080" cy="1428750"/>
+                  <wp:docPr id="20" name="Picture 20"/>
+                  <wp:cNvGraphicFramePr>
+                    <a:graphicFrameLocks noChangeAspect="1"/>
+                  </wp:cNvGraphicFramePr>
+                  <a:graphic>
+                    <a:graphicData uri="http://schemas.openxmlformats.org/drawingml/2006/picture">
+                      <pic:pic>
+                        <pic:nvPicPr>
+                          <pic:cNvPr id="0" name="hardware_topdown.jpg"/>
+                          <pic:cNvPicPr/>
+                        </pic:nvPicPr>
+                        <pic:blipFill>
+                          <a:blip r:embed="rId12"/>
+                          <a:stretch>
+                            <a:fillRect/>
+                          </a:stretch>
+                        </pic:blipFill>
+                        <pic:spPr>
+                          <a:xfrm>
+                            <a:off x="0" y="0"/>
+                            <a:ext cx="2926080" cy="1428750"/>
+                          </a:xfrm>
+                          <a:prstGeom prst="rect"/>
+                        </pic:spPr>
+                      </pic:pic>
+                    </a:graphicData>
+                  </a:graphic>
+                </wp:inline>
+              </w:drawing>
+            </w:r>
+          </w:p>
+        </w:tc>
+      </w:tr>
+    </w:tbl>
+    <w:p>
+      <w:pPr>
+        <w:spacing w:after="80"/>
+      </w:pPr>
     </w:p>
     <w:p>
       <w:pPr>
@@ -7372,170 +7607,6 @@
     </w:p>
     <w:p>
       <w:pPr>
-        <w:keepNext/>
-        <w:spacing w:before="80" w:after="80"/>
-        <w:jc w:val="center"/>
-      </w:pPr>
-      <w:r>
-        <w:drawing>
-          <wp:inline xmlns:a="http://schemas.openxmlformats.org/drawingml/2006/main" xmlns:pic="http://schemas.openxmlformats.org/drawingml/2006/picture">
-            <wp:extent cx="5029200" cy="4002732"/>
-            <wp:docPr id="21" name="Picture 21"/>
-            <wp:cNvGraphicFramePr>
-              <a:graphicFrameLocks noChangeAspect="1"/>
-            </wp:cNvGraphicFramePr>
-            <a:graphic>
-              <a:graphicData uri="http://schemas.openxmlformats.org/drawingml/2006/picture">
-                <pic:pic>
-                  <pic:nvPicPr>
-                    <pic:cNvPr id="0" name="dashboard_lab.png"/>
-                    <pic:cNvPicPr/>
-                  </pic:nvPicPr>
-                  <pic:blipFill>
-                    <a:blip r:embed="rId9"/>
-                    <a:stretch>
-                      <a:fillRect/>
-                    </a:stretch>
-                  </pic:blipFill>
-                  <pic:spPr>
-                    <a:xfrm>
-                      <a:off x="0" y="0"/>
-                      <a:ext cx="5029200" cy="4002732"/>
-                    </a:xfrm>
-                    <a:prstGeom prst="rect"/>
-                  </pic:spPr>
-                </pic:pic>
-              </a:graphicData>
-            </a:graphic>
-          </wp:inline>
-        </w:drawing>
-      </w:r>
-    </w:p>
-    <w:p>
-      <w:pPr>
-        <w:keepNext/>
-        <w:spacing w:before="80" w:after="80"/>
-        <w:jc w:val="center"/>
-      </w:pPr>
-      <w:r>
-        <w:drawing>
-          <wp:inline xmlns:a="http://schemas.openxmlformats.org/drawingml/2006/main" xmlns:pic="http://schemas.openxmlformats.org/drawingml/2006/picture">
-            <wp:extent cx="5029200" cy="3487043"/>
-            <wp:docPr id="22" name="Picture 22"/>
-            <wp:cNvGraphicFramePr>
-              <a:graphicFrameLocks noChangeAspect="1"/>
-            </wp:cNvGraphicFramePr>
-            <a:graphic>
-              <a:graphicData uri="http://schemas.openxmlformats.org/drawingml/2006/picture">
-                <pic:pic>
-                  <pic:nvPicPr>
-                    <pic:cNvPr id="0" name="dashboard_waveform.png"/>
-                    <pic:cNvPicPr/>
-                  </pic:nvPicPr>
-                  <pic:blipFill>
-                    <a:blip r:embed="rId10"/>
-                    <a:stretch>
-                      <a:fillRect/>
-                    </a:stretch>
-                  </pic:blipFill>
-                  <pic:spPr>
-                    <a:xfrm>
-                      <a:off x="0" y="0"/>
-                      <a:ext cx="5029200" cy="3487043"/>
-                    </a:xfrm>
-                    <a:prstGeom prst="rect"/>
-                  </pic:spPr>
-                </pic:pic>
-              </a:graphicData>
-            </a:graphic>
-          </wp:inline>
-        </w:drawing>
-      </w:r>
-    </w:p>
-    <w:p>
-      <w:pPr>
-        <w:keepNext/>
-        <w:spacing w:before="80" w:after="80"/>
-        <w:jc w:val="center"/>
-      </w:pPr>
-      <w:r>
-        <w:drawing>
-          <wp:inline xmlns:a="http://schemas.openxmlformats.org/drawingml/2006/main" xmlns:pic="http://schemas.openxmlformats.org/drawingml/2006/picture">
-            <wp:extent cx="5029200" cy="2215009"/>
-            <wp:docPr id="23" name="Picture 23"/>
-            <wp:cNvGraphicFramePr>
-              <a:graphicFrameLocks noChangeAspect="1"/>
-            </wp:cNvGraphicFramePr>
-            <a:graphic>
-              <a:graphicData uri="http://schemas.openxmlformats.org/drawingml/2006/picture">
-                <pic:pic>
-                  <pic:nvPicPr>
-                    <pic:cNvPr id="0" name="hardware_perspective.jpg"/>
-                    <pic:cNvPicPr/>
-                  </pic:nvPicPr>
-                  <pic:blipFill>
-                    <a:blip r:embed="rId11"/>
-                    <a:stretch>
-                      <a:fillRect/>
-                    </a:stretch>
-                  </pic:blipFill>
-                  <pic:spPr>
-                    <a:xfrm>
-                      <a:off x="0" y="0"/>
-                      <a:ext cx="5029200" cy="2215009"/>
-                    </a:xfrm>
-                    <a:prstGeom prst="rect"/>
-                  </pic:spPr>
-                </pic:pic>
-              </a:graphicData>
-            </a:graphic>
-          </wp:inline>
-        </w:drawing>
-      </w:r>
-    </w:p>
-    <w:p>
-      <w:pPr>
-        <w:keepNext/>
-        <w:spacing w:before="80" w:after="80"/>
-        <w:jc w:val="center"/>
-      </w:pPr>
-      <w:r>
-        <w:drawing>
-          <wp:inline xmlns:a="http://schemas.openxmlformats.org/drawingml/2006/main" xmlns:pic="http://schemas.openxmlformats.org/drawingml/2006/picture">
-            <wp:extent cx="5029200" cy="2455664"/>
-            <wp:docPr id="24" name="Picture 24"/>
-            <wp:cNvGraphicFramePr>
-              <a:graphicFrameLocks noChangeAspect="1"/>
-            </wp:cNvGraphicFramePr>
-            <a:graphic>
-              <a:graphicData uri="http://schemas.openxmlformats.org/drawingml/2006/picture">
-                <pic:pic>
-                  <pic:nvPicPr>
-                    <pic:cNvPr id="0" name="hardware_topdown.jpg"/>
-                    <pic:cNvPicPr/>
-                  </pic:nvPicPr>
-                  <pic:blipFill>
-                    <a:blip r:embed="rId12"/>
-                    <a:stretch>
-                      <a:fillRect/>
-                    </a:stretch>
-                  </pic:blipFill>
-                  <pic:spPr>
-                    <a:xfrm>
-                      <a:off x="0" y="0"/>
-                      <a:ext cx="5029200" cy="2455664"/>
-                    </a:xfrm>
-                    <a:prstGeom prst="rect"/>
-                  </pic:spPr>
-                </pic:pic>
-              </a:graphicData>
-            </a:graphic>
-          </wp:inline>
-        </w:drawing>
-      </w:r>
-    </w:p>
-    <w:p>
-      <w:pPr>
         <w:pStyle w:val="Heading3"/>
         <w:keepNext/>
         <w:spacing w:before="160" w:after="60"/>
@@ -7549,6 +7620,217 @@
         </w:rPr>
         <w:t>Interactive Hardware &amp; Digital Twin Controls:</w:t>
       </w:r>
+    </w:p>
+    <w:tbl>
+      <w:tblPr>
+        <w:tblW w:type="auto" w:w="0"/>
+        <w:jc w:val="center"/>
+        <w:tblLook w:firstColumn="1" w:firstRow="1" w:lastColumn="0" w:lastRow="0" w:noHBand="0" w:noVBand="1" w:val="04A0"/>
+      </w:tblPr>
+      <w:tblGrid>
+        <w:gridCol w:w="4752"/>
+        <w:gridCol w:w="4752"/>
+      </w:tblGrid>
+      <w:tr>
+        <w:tc>
+          <w:tcPr>
+            <w:tcW w:type="dxa" w:w="4968"/>
+          </w:tcPr>
+          <w:p>
+            <w:pPr>
+              <w:spacing w:before="40" w:after="80"/>
+              <w:jc w:val="center"/>
+            </w:pPr>
+            <w:r>
+              <w:drawing>
+                <wp:inline xmlns:a="http://schemas.openxmlformats.org/drawingml/2006/main" xmlns:pic="http://schemas.openxmlformats.org/drawingml/2006/picture">
+                  <wp:extent cx="2926080" cy="2328862"/>
+                  <wp:docPr id="21" name="Picture 21"/>
+                  <wp:cNvGraphicFramePr>
+                    <a:graphicFrameLocks noChangeAspect="1"/>
+                  </wp:cNvGraphicFramePr>
+                  <a:graphic>
+                    <a:graphicData uri="http://schemas.openxmlformats.org/drawingml/2006/picture">
+                      <pic:pic>
+                        <pic:nvPicPr>
+                          <pic:cNvPr id="0" name="dashboard_lab.png"/>
+                          <pic:cNvPicPr/>
+                        </pic:nvPicPr>
+                        <pic:blipFill>
+                          <a:blip r:embed="rId9"/>
+                          <a:stretch>
+                            <a:fillRect/>
+                          </a:stretch>
+                        </pic:blipFill>
+                        <pic:spPr>
+                          <a:xfrm>
+                            <a:off x="0" y="0"/>
+                            <a:ext cx="2926080" cy="2328862"/>
+                          </a:xfrm>
+                          <a:prstGeom prst="rect"/>
+                        </pic:spPr>
+                      </pic:pic>
+                    </a:graphicData>
+                  </a:graphic>
+                </wp:inline>
+              </w:drawing>
+            </w:r>
+          </w:p>
+        </w:tc>
+        <w:tc>
+          <w:tcPr>
+            <w:tcW w:type="dxa" w:w="4968"/>
+          </w:tcPr>
+          <w:p>
+            <w:pPr>
+              <w:spacing w:before="40" w:after="80"/>
+              <w:jc w:val="center"/>
+            </w:pPr>
+            <w:r>
+              <w:drawing>
+                <wp:inline xmlns:a="http://schemas.openxmlformats.org/drawingml/2006/main" xmlns:pic="http://schemas.openxmlformats.org/drawingml/2006/picture">
+                  <wp:extent cx="2926080" cy="2028825"/>
+                  <wp:docPr id="22" name="Picture 22"/>
+                  <wp:cNvGraphicFramePr>
+                    <a:graphicFrameLocks noChangeAspect="1"/>
+                  </wp:cNvGraphicFramePr>
+                  <a:graphic>
+                    <a:graphicData uri="http://schemas.openxmlformats.org/drawingml/2006/picture">
+                      <pic:pic>
+                        <pic:nvPicPr>
+                          <pic:cNvPr id="0" name="dashboard_waveform.png"/>
+                          <pic:cNvPicPr/>
+                        </pic:nvPicPr>
+                        <pic:blipFill>
+                          <a:blip r:embed="rId10"/>
+                          <a:stretch>
+                            <a:fillRect/>
+                          </a:stretch>
+                        </pic:blipFill>
+                        <pic:spPr>
+                          <a:xfrm>
+                            <a:off x="0" y="0"/>
+                            <a:ext cx="2926080" cy="2028825"/>
+                          </a:xfrm>
+                          <a:prstGeom prst="rect"/>
+                        </pic:spPr>
+                      </pic:pic>
+                    </a:graphicData>
+                  </a:graphic>
+                </wp:inline>
+              </w:drawing>
+            </w:r>
+          </w:p>
+        </w:tc>
+      </w:tr>
+    </w:tbl>
+    <w:tbl>
+      <w:tblPr>
+        <w:tblW w:type="auto" w:w="0"/>
+        <w:jc w:val="center"/>
+        <w:tblLook w:firstColumn="1" w:firstRow="1" w:lastColumn="0" w:lastRow="0" w:noHBand="0" w:noVBand="1" w:val="04A0"/>
+      </w:tblPr>
+      <w:tblGrid>
+        <w:gridCol w:w="4752"/>
+        <w:gridCol w:w="4752"/>
+      </w:tblGrid>
+      <w:tr>
+        <w:tc>
+          <w:tcPr>
+            <w:tcW w:type="dxa" w:w="4968"/>
+          </w:tcPr>
+          <w:p>
+            <w:pPr>
+              <w:spacing w:before="40" w:after="80"/>
+              <w:jc w:val="center"/>
+            </w:pPr>
+            <w:r>
+              <w:drawing>
+                <wp:inline xmlns:a="http://schemas.openxmlformats.org/drawingml/2006/main" xmlns:pic="http://schemas.openxmlformats.org/drawingml/2006/picture">
+                  <wp:extent cx="2926080" cy="1288732"/>
+                  <wp:docPr id="23" name="Picture 23"/>
+                  <wp:cNvGraphicFramePr>
+                    <a:graphicFrameLocks noChangeAspect="1"/>
+                  </wp:cNvGraphicFramePr>
+                  <a:graphic>
+                    <a:graphicData uri="http://schemas.openxmlformats.org/drawingml/2006/picture">
+                      <pic:pic>
+                        <pic:nvPicPr>
+                          <pic:cNvPr id="0" name="hardware_perspective.jpg"/>
+                          <pic:cNvPicPr/>
+                        </pic:nvPicPr>
+                        <pic:blipFill>
+                          <a:blip r:embed="rId11"/>
+                          <a:stretch>
+                            <a:fillRect/>
+                          </a:stretch>
+                        </pic:blipFill>
+                        <pic:spPr>
+                          <a:xfrm>
+                            <a:off x="0" y="0"/>
+                            <a:ext cx="2926080" cy="1288732"/>
+                          </a:xfrm>
+                          <a:prstGeom prst="rect"/>
+                        </pic:spPr>
+                      </pic:pic>
+                    </a:graphicData>
+                  </a:graphic>
+                </wp:inline>
+              </w:drawing>
+            </w:r>
+          </w:p>
+        </w:tc>
+        <w:tc>
+          <w:tcPr>
+            <w:tcW w:type="dxa" w:w="4968"/>
+          </w:tcPr>
+          <w:p>
+            <w:pPr>
+              <w:spacing w:before="40" w:after="80"/>
+              <w:jc w:val="center"/>
+            </w:pPr>
+            <w:r>
+              <w:drawing>
+                <wp:inline xmlns:a="http://schemas.openxmlformats.org/drawingml/2006/main" xmlns:pic="http://schemas.openxmlformats.org/drawingml/2006/picture">
+                  <wp:extent cx="2926080" cy="1428750"/>
+                  <wp:docPr id="24" name="Picture 24"/>
+                  <wp:cNvGraphicFramePr>
+                    <a:graphicFrameLocks noChangeAspect="1"/>
+                  </wp:cNvGraphicFramePr>
+                  <a:graphic>
+                    <a:graphicData uri="http://schemas.openxmlformats.org/drawingml/2006/picture">
+                      <pic:pic>
+                        <pic:nvPicPr>
+                          <pic:cNvPr id="0" name="hardware_topdown.jpg"/>
+                          <pic:cNvPicPr/>
+                        </pic:nvPicPr>
+                        <pic:blipFill>
+                          <a:blip r:embed="rId12"/>
+                          <a:stretch>
+                            <a:fillRect/>
+                          </a:stretch>
+                        </pic:blipFill>
+                        <pic:spPr>
+                          <a:xfrm>
+                            <a:off x="0" y="0"/>
+                            <a:ext cx="2926080" cy="1428750"/>
+                          </a:xfrm>
+                          <a:prstGeom prst="rect"/>
+                        </pic:spPr>
+                      </pic:pic>
+                    </a:graphicData>
+                  </a:graphic>
+                </wp:inline>
+              </w:drawing>
+            </w:r>
+          </w:p>
+        </w:tc>
+      </w:tr>
+    </w:tbl>
+    <w:p>
+      <w:pPr>
+        <w:spacing w:after="80"/>
+      </w:pPr>
     </w:p>
     <w:p>
       <w:pPr>
@@ -8707,170 +8989,6 @@
     </w:p>
     <w:p>
       <w:pPr>
-        <w:keepNext/>
-        <w:spacing w:before="80" w:after="80"/>
-        <w:jc w:val="center"/>
-      </w:pPr>
-      <w:r>
-        <w:drawing>
-          <wp:inline xmlns:a="http://schemas.openxmlformats.org/drawingml/2006/main" xmlns:pic="http://schemas.openxmlformats.org/drawingml/2006/picture">
-            <wp:extent cx="5029200" cy="4002732"/>
-            <wp:docPr id="25" name="Picture 25"/>
-            <wp:cNvGraphicFramePr>
-              <a:graphicFrameLocks noChangeAspect="1"/>
-            </wp:cNvGraphicFramePr>
-            <a:graphic>
-              <a:graphicData uri="http://schemas.openxmlformats.org/drawingml/2006/picture">
-                <pic:pic>
-                  <pic:nvPicPr>
-                    <pic:cNvPr id="0" name="dashboard_lab.png"/>
-                    <pic:cNvPicPr/>
-                  </pic:nvPicPr>
-                  <pic:blipFill>
-                    <a:blip r:embed="rId9"/>
-                    <a:stretch>
-                      <a:fillRect/>
-                    </a:stretch>
-                  </pic:blipFill>
-                  <pic:spPr>
-                    <a:xfrm>
-                      <a:off x="0" y="0"/>
-                      <a:ext cx="5029200" cy="4002732"/>
-                    </a:xfrm>
-                    <a:prstGeom prst="rect"/>
-                  </pic:spPr>
-                </pic:pic>
-              </a:graphicData>
-            </a:graphic>
-          </wp:inline>
-        </w:drawing>
-      </w:r>
-    </w:p>
-    <w:p>
-      <w:pPr>
-        <w:keepNext/>
-        <w:spacing w:before="80" w:after="80"/>
-        <w:jc w:val="center"/>
-      </w:pPr>
-      <w:r>
-        <w:drawing>
-          <wp:inline xmlns:a="http://schemas.openxmlformats.org/drawingml/2006/main" xmlns:pic="http://schemas.openxmlformats.org/drawingml/2006/picture">
-            <wp:extent cx="5029200" cy="3487043"/>
-            <wp:docPr id="26" name="Picture 26"/>
-            <wp:cNvGraphicFramePr>
-              <a:graphicFrameLocks noChangeAspect="1"/>
-            </wp:cNvGraphicFramePr>
-            <a:graphic>
-              <a:graphicData uri="http://schemas.openxmlformats.org/drawingml/2006/picture">
-                <pic:pic>
-                  <pic:nvPicPr>
-                    <pic:cNvPr id="0" name="dashboard_waveform.png"/>
-                    <pic:cNvPicPr/>
-                  </pic:nvPicPr>
-                  <pic:blipFill>
-                    <a:blip r:embed="rId10"/>
-                    <a:stretch>
-                      <a:fillRect/>
-                    </a:stretch>
-                  </pic:blipFill>
-                  <pic:spPr>
-                    <a:xfrm>
-                      <a:off x="0" y="0"/>
-                      <a:ext cx="5029200" cy="3487043"/>
-                    </a:xfrm>
-                    <a:prstGeom prst="rect"/>
-                  </pic:spPr>
-                </pic:pic>
-              </a:graphicData>
-            </a:graphic>
-          </wp:inline>
-        </w:drawing>
-      </w:r>
-    </w:p>
-    <w:p>
-      <w:pPr>
-        <w:keepNext/>
-        <w:spacing w:before="80" w:after="80"/>
-        <w:jc w:val="center"/>
-      </w:pPr>
-      <w:r>
-        <w:drawing>
-          <wp:inline xmlns:a="http://schemas.openxmlformats.org/drawingml/2006/main" xmlns:pic="http://schemas.openxmlformats.org/drawingml/2006/picture">
-            <wp:extent cx="5029200" cy="2215009"/>
-            <wp:docPr id="27" name="Picture 27"/>
-            <wp:cNvGraphicFramePr>
-              <a:graphicFrameLocks noChangeAspect="1"/>
-            </wp:cNvGraphicFramePr>
-            <a:graphic>
-              <a:graphicData uri="http://schemas.openxmlformats.org/drawingml/2006/picture">
-                <pic:pic>
-                  <pic:nvPicPr>
-                    <pic:cNvPr id="0" name="hardware_perspective.jpg"/>
-                    <pic:cNvPicPr/>
-                  </pic:nvPicPr>
-                  <pic:blipFill>
-                    <a:blip r:embed="rId11"/>
-                    <a:stretch>
-                      <a:fillRect/>
-                    </a:stretch>
-                  </pic:blipFill>
-                  <pic:spPr>
-                    <a:xfrm>
-                      <a:off x="0" y="0"/>
-                      <a:ext cx="5029200" cy="2215009"/>
-                    </a:xfrm>
-                    <a:prstGeom prst="rect"/>
-                  </pic:spPr>
-                </pic:pic>
-              </a:graphicData>
-            </a:graphic>
-          </wp:inline>
-        </w:drawing>
-      </w:r>
-    </w:p>
-    <w:p>
-      <w:pPr>
-        <w:keepNext/>
-        <w:spacing w:before="80" w:after="80"/>
-        <w:jc w:val="center"/>
-      </w:pPr>
-      <w:r>
-        <w:drawing>
-          <wp:inline xmlns:a="http://schemas.openxmlformats.org/drawingml/2006/main" xmlns:pic="http://schemas.openxmlformats.org/drawingml/2006/picture">
-            <wp:extent cx="5029200" cy="2455664"/>
-            <wp:docPr id="28" name="Picture 28"/>
-            <wp:cNvGraphicFramePr>
-              <a:graphicFrameLocks noChangeAspect="1"/>
-            </wp:cNvGraphicFramePr>
-            <a:graphic>
-              <a:graphicData uri="http://schemas.openxmlformats.org/drawingml/2006/picture">
-                <pic:pic>
-                  <pic:nvPicPr>
-                    <pic:cNvPr id="0" name="hardware_topdown.jpg"/>
-                    <pic:cNvPicPr/>
-                  </pic:nvPicPr>
-                  <pic:blipFill>
-                    <a:blip r:embed="rId12"/>
-                    <a:stretch>
-                      <a:fillRect/>
-                    </a:stretch>
-                  </pic:blipFill>
-                  <pic:spPr>
-                    <a:xfrm>
-                      <a:off x="0" y="0"/>
-                      <a:ext cx="5029200" cy="2455664"/>
-                    </a:xfrm>
-                    <a:prstGeom prst="rect"/>
-                  </pic:spPr>
-                </pic:pic>
-              </a:graphicData>
-            </a:graphic>
-          </wp:inline>
-        </w:drawing>
-      </w:r>
-    </w:p>
-    <w:p>
-      <w:pPr>
         <w:pStyle w:val="Heading3"/>
         <w:keepNext/>
         <w:spacing w:before="160" w:after="60"/>
@@ -8884,6 +9002,217 @@
         </w:rPr>
         <w:t>Interactive Hardware &amp; Digital Twin Controls:</w:t>
       </w:r>
+    </w:p>
+    <w:tbl>
+      <w:tblPr>
+        <w:tblW w:type="auto" w:w="0"/>
+        <w:jc w:val="center"/>
+        <w:tblLook w:firstColumn="1" w:firstRow="1" w:lastColumn="0" w:lastRow="0" w:noHBand="0" w:noVBand="1" w:val="04A0"/>
+      </w:tblPr>
+      <w:tblGrid>
+        <w:gridCol w:w="4752"/>
+        <w:gridCol w:w="4752"/>
+      </w:tblGrid>
+      <w:tr>
+        <w:tc>
+          <w:tcPr>
+            <w:tcW w:type="dxa" w:w="4968"/>
+          </w:tcPr>
+          <w:p>
+            <w:pPr>
+              <w:spacing w:before="40" w:after="80"/>
+              <w:jc w:val="center"/>
+            </w:pPr>
+            <w:r>
+              <w:drawing>
+                <wp:inline xmlns:a="http://schemas.openxmlformats.org/drawingml/2006/main" xmlns:pic="http://schemas.openxmlformats.org/drawingml/2006/picture">
+                  <wp:extent cx="2926080" cy="2328862"/>
+                  <wp:docPr id="25" name="Picture 25"/>
+                  <wp:cNvGraphicFramePr>
+                    <a:graphicFrameLocks noChangeAspect="1"/>
+                  </wp:cNvGraphicFramePr>
+                  <a:graphic>
+                    <a:graphicData uri="http://schemas.openxmlformats.org/drawingml/2006/picture">
+                      <pic:pic>
+                        <pic:nvPicPr>
+                          <pic:cNvPr id="0" name="dashboard_lab.png"/>
+                          <pic:cNvPicPr/>
+                        </pic:nvPicPr>
+                        <pic:blipFill>
+                          <a:blip r:embed="rId9"/>
+                          <a:stretch>
+                            <a:fillRect/>
+                          </a:stretch>
+                        </pic:blipFill>
+                        <pic:spPr>
+                          <a:xfrm>
+                            <a:off x="0" y="0"/>
+                            <a:ext cx="2926080" cy="2328862"/>
+                          </a:xfrm>
+                          <a:prstGeom prst="rect"/>
+                        </pic:spPr>
+                      </pic:pic>
+                    </a:graphicData>
+                  </a:graphic>
+                </wp:inline>
+              </w:drawing>
+            </w:r>
+          </w:p>
+        </w:tc>
+        <w:tc>
+          <w:tcPr>
+            <w:tcW w:type="dxa" w:w="4968"/>
+          </w:tcPr>
+          <w:p>
+            <w:pPr>
+              <w:spacing w:before="40" w:after="80"/>
+              <w:jc w:val="center"/>
+            </w:pPr>
+            <w:r>
+              <w:drawing>
+                <wp:inline xmlns:a="http://schemas.openxmlformats.org/drawingml/2006/main" xmlns:pic="http://schemas.openxmlformats.org/drawingml/2006/picture">
+                  <wp:extent cx="2926080" cy="2028825"/>
+                  <wp:docPr id="26" name="Picture 26"/>
+                  <wp:cNvGraphicFramePr>
+                    <a:graphicFrameLocks noChangeAspect="1"/>
+                  </wp:cNvGraphicFramePr>
+                  <a:graphic>
+                    <a:graphicData uri="http://schemas.openxmlformats.org/drawingml/2006/picture">
+                      <pic:pic>
+                        <pic:nvPicPr>
+                          <pic:cNvPr id="0" name="dashboard_waveform.png"/>
+                          <pic:cNvPicPr/>
+                        </pic:nvPicPr>
+                        <pic:blipFill>
+                          <a:blip r:embed="rId10"/>
+                          <a:stretch>
+                            <a:fillRect/>
+                          </a:stretch>
+                        </pic:blipFill>
+                        <pic:spPr>
+                          <a:xfrm>
+                            <a:off x="0" y="0"/>
+                            <a:ext cx="2926080" cy="2028825"/>
+                          </a:xfrm>
+                          <a:prstGeom prst="rect"/>
+                        </pic:spPr>
+                      </pic:pic>
+                    </a:graphicData>
+                  </a:graphic>
+                </wp:inline>
+              </w:drawing>
+            </w:r>
+          </w:p>
+        </w:tc>
+      </w:tr>
+    </w:tbl>
+    <w:tbl>
+      <w:tblPr>
+        <w:tblW w:type="auto" w:w="0"/>
+        <w:jc w:val="center"/>
+        <w:tblLook w:firstColumn="1" w:firstRow="1" w:lastColumn="0" w:lastRow="0" w:noHBand="0" w:noVBand="1" w:val="04A0"/>
+      </w:tblPr>
+      <w:tblGrid>
+        <w:gridCol w:w="4752"/>
+        <w:gridCol w:w="4752"/>
+      </w:tblGrid>
+      <w:tr>
+        <w:tc>
+          <w:tcPr>
+            <w:tcW w:type="dxa" w:w="4968"/>
+          </w:tcPr>
+          <w:p>
+            <w:pPr>
+              <w:spacing w:before="40" w:after="80"/>
+              <w:jc w:val="center"/>
+            </w:pPr>
+            <w:r>
+              <w:drawing>
+                <wp:inline xmlns:a="http://schemas.openxmlformats.org/drawingml/2006/main" xmlns:pic="http://schemas.openxmlformats.org/drawingml/2006/picture">
+                  <wp:extent cx="2926080" cy="1288732"/>
+                  <wp:docPr id="27" name="Picture 27"/>
+                  <wp:cNvGraphicFramePr>
+                    <a:graphicFrameLocks noChangeAspect="1"/>
+                  </wp:cNvGraphicFramePr>
+                  <a:graphic>
+                    <a:graphicData uri="http://schemas.openxmlformats.org/drawingml/2006/picture">
+                      <pic:pic>
+                        <pic:nvPicPr>
+                          <pic:cNvPr id="0" name="hardware_perspective.jpg"/>
+                          <pic:cNvPicPr/>
+                        </pic:nvPicPr>
+                        <pic:blipFill>
+                          <a:blip r:embed="rId11"/>
+                          <a:stretch>
+                            <a:fillRect/>
+                          </a:stretch>
+                        </pic:blipFill>
+                        <pic:spPr>
+                          <a:xfrm>
+                            <a:off x="0" y="0"/>
+                            <a:ext cx="2926080" cy="1288732"/>
+                          </a:xfrm>
+                          <a:prstGeom prst="rect"/>
+                        </pic:spPr>
+                      </pic:pic>
+                    </a:graphicData>
+                  </a:graphic>
+                </wp:inline>
+              </w:drawing>
+            </w:r>
+          </w:p>
+        </w:tc>
+        <w:tc>
+          <w:tcPr>
+            <w:tcW w:type="dxa" w:w="4968"/>
+          </w:tcPr>
+          <w:p>
+            <w:pPr>
+              <w:spacing w:before="40" w:after="80"/>
+              <w:jc w:val="center"/>
+            </w:pPr>
+            <w:r>
+              <w:drawing>
+                <wp:inline xmlns:a="http://schemas.openxmlformats.org/drawingml/2006/main" xmlns:pic="http://schemas.openxmlformats.org/drawingml/2006/picture">
+                  <wp:extent cx="2926080" cy="1428750"/>
+                  <wp:docPr id="28" name="Picture 28"/>
+                  <wp:cNvGraphicFramePr>
+                    <a:graphicFrameLocks noChangeAspect="1"/>
+                  </wp:cNvGraphicFramePr>
+                  <a:graphic>
+                    <a:graphicData uri="http://schemas.openxmlformats.org/drawingml/2006/picture">
+                      <pic:pic>
+                        <pic:nvPicPr>
+                          <pic:cNvPr id="0" name="hardware_topdown.jpg"/>
+                          <pic:cNvPicPr/>
+                        </pic:nvPicPr>
+                        <pic:blipFill>
+                          <a:blip r:embed="rId12"/>
+                          <a:stretch>
+                            <a:fillRect/>
+                          </a:stretch>
+                        </pic:blipFill>
+                        <pic:spPr>
+                          <a:xfrm>
+                            <a:off x="0" y="0"/>
+                            <a:ext cx="2926080" cy="1428750"/>
+                          </a:xfrm>
+                          <a:prstGeom prst="rect"/>
+                        </pic:spPr>
+                      </pic:pic>
+                    </a:graphicData>
+                  </a:graphic>
+                </wp:inline>
+              </w:drawing>
+            </w:r>
+          </w:p>
+        </w:tc>
+      </w:tr>
+    </w:tbl>
+    <w:p>
+      <w:pPr>
+        <w:spacing w:after="80"/>
+      </w:pPr>
     </w:p>
     <w:p>
       <w:pPr>
@@ -10042,170 +10371,6 @@
     </w:p>
     <w:p>
       <w:pPr>
-        <w:keepNext/>
-        <w:spacing w:before="80" w:after="80"/>
-        <w:jc w:val="center"/>
-      </w:pPr>
-      <w:r>
-        <w:drawing>
-          <wp:inline xmlns:a="http://schemas.openxmlformats.org/drawingml/2006/main" xmlns:pic="http://schemas.openxmlformats.org/drawingml/2006/picture">
-            <wp:extent cx="5029200" cy="4002732"/>
-            <wp:docPr id="29" name="Picture 29"/>
-            <wp:cNvGraphicFramePr>
-              <a:graphicFrameLocks noChangeAspect="1"/>
-            </wp:cNvGraphicFramePr>
-            <a:graphic>
-              <a:graphicData uri="http://schemas.openxmlformats.org/drawingml/2006/picture">
-                <pic:pic>
-                  <pic:nvPicPr>
-                    <pic:cNvPr id="0" name="dashboard_lab.png"/>
-                    <pic:cNvPicPr/>
-                  </pic:nvPicPr>
-                  <pic:blipFill>
-                    <a:blip r:embed="rId9"/>
-                    <a:stretch>
-                      <a:fillRect/>
-                    </a:stretch>
-                  </pic:blipFill>
-                  <pic:spPr>
-                    <a:xfrm>
-                      <a:off x="0" y="0"/>
-                      <a:ext cx="5029200" cy="4002732"/>
-                    </a:xfrm>
-                    <a:prstGeom prst="rect"/>
-                  </pic:spPr>
-                </pic:pic>
-              </a:graphicData>
-            </a:graphic>
-          </wp:inline>
-        </w:drawing>
-      </w:r>
-    </w:p>
-    <w:p>
-      <w:pPr>
-        <w:keepNext/>
-        <w:spacing w:before="80" w:after="80"/>
-        <w:jc w:val="center"/>
-      </w:pPr>
-      <w:r>
-        <w:drawing>
-          <wp:inline xmlns:a="http://schemas.openxmlformats.org/drawingml/2006/main" xmlns:pic="http://schemas.openxmlformats.org/drawingml/2006/picture">
-            <wp:extent cx="5029200" cy="3487043"/>
-            <wp:docPr id="30" name="Picture 30"/>
-            <wp:cNvGraphicFramePr>
-              <a:graphicFrameLocks noChangeAspect="1"/>
-            </wp:cNvGraphicFramePr>
-            <a:graphic>
-              <a:graphicData uri="http://schemas.openxmlformats.org/drawingml/2006/picture">
-                <pic:pic>
-                  <pic:nvPicPr>
-                    <pic:cNvPr id="0" name="dashboard_waveform.png"/>
-                    <pic:cNvPicPr/>
-                  </pic:nvPicPr>
-                  <pic:blipFill>
-                    <a:blip r:embed="rId10"/>
-                    <a:stretch>
-                      <a:fillRect/>
-                    </a:stretch>
-                  </pic:blipFill>
-                  <pic:spPr>
-                    <a:xfrm>
-                      <a:off x="0" y="0"/>
-                      <a:ext cx="5029200" cy="3487043"/>
-                    </a:xfrm>
-                    <a:prstGeom prst="rect"/>
-                  </pic:spPr>
-                </pic:pic>
-              </a:graphicData>
-            </a:graphic>
-          </wp:inline>
-        </w:drawing>
-      </w:r>
-    </w:p>
-    <w:p>
-      <w:pPr>
-        <w:keepNext/>
-        <w:spacing w:before="80" w:after="80"/>
-        <w:jc w:val="center"/>
-      </w:pPr>
-      <w:r>
-        <w:drawing>
-          <wp:inline xmlns:a="http://schemas.openxmlformats.org/drawingml/2006/main" xmlns:pic="http://schemas.openxmlformats.org/drawingml/2006/picture">
-            <wp:extent cx="5029200" cy="2215009"/>
-            <wp:docPr id="31" name="Picture 31"/>
-            <wp:cNvGraphicFramePr>
-              <a:graphicFrameLocks noChangeAspect="1"/>
-            </wp:cNvGraphicFramePr>
-            <a:graphic>
-              <a:graphicData uri="http://schemas.openxmlformats.org/drawingml/2006/picture">
-                <pic:pic>
-                  <pic:nvPicPr>
-                    <pic:cNvPr id="0" name="hardware_perspective.jpg"/>
-                    <pic:cNvPicPr/>
-                  </pic:nvPicPr>
-                  <pic:blipFill>
-                    <a:blip r:embed="rId11"/>
-                    <a:stretch>
-                      <a:fillRect/>
-                    </a:stretch>
-                  </pic:blipFill>
-                  <pic:spPr>
-                    <a:xfrm>
-                      <a:off x="0" y="0"/>
-                      <a:ext cx="5029200" cy="2215009"/>
-                    </a:xfrm>
-                    <a:prstGeom prst="rect"/>
-                  </pic:spPr>
-                </pic:pic>
-              </a:graphicData>
-            </a:graphic>
-          </wp:inline>
-        </w:drawing>
-      </w:r>
-    </w:p>
-    <w:p>
-      <w:pPr>
-        <w:keepNext/>
-        <w:spacing w:before="80" w:after="80"/>
-        <w:jc w:val="center"/>
-      </w:pPr>
-      <w:r>
-        <w:drawing>
-          <wp:inline xmlns:a="http://schemas.openxmlformats.org/drawingml/2006/main" xmlns:pic="http://schemas.openxmlformats.org/drawingml/2006/picture">
-            <wp:extent cx="5029200" cy="2455664"/>
-            <wp:docPr id="32" name="Picture 32"/>
-            <wp:cNvGraphicFramePr>
-              <a:graphicFrameLocks noChangeAspect="1"/>
-            </wp:cNvGraphicFramePr>
-            <a:graphic>
-              <a:graphicData uri="http://schemas.openxmlformats.org/drawingml/2006/picture">
-                <pic:pic>
-                  <pic:nvPicPr>
-                    <pic:cNvPr id="0" name="hardware_topdown.jpg"/>
-                    <pic:cNvPicPr/>
-                  </pic:nvPicPr>
-                  <pic:blipFill>
-                    <a:blip r:embed="rId12"/>
-                    <a:stretch>
-                      <a:fillRect/>
-                    </a:stretch>
-                  </pic:blipFill>
-                  <pic:spPr>
-                    <a:xfrm>
-                      <a:off x="0" y="0"/>
-                      <a:ext cx="5029200" cy="2455664"/>
-                    </a:xfrm>
-                    <a:prstGeom prst="rect"/>
-                  </pic:spPr>
-                </pic:pic>
-              </a:graphicData>
-            </a:graphic>
-          </wp:inline>
-        </w:drawing>
-      </w:r>
-    </w:p>
-    <w:p>
-      <w:pPr>
         <w:pStyle w:val="Heading3"/>
         <w:keepNext/>
         <w:spacing w:before="160" w:after="60"/>
@@ -10219,6 +10384,217 @@
         </w:rPr>
         <w:t>Interactive Hardware &amp; Digital Twin Controls:</w:t>
       </w:r>
+    </w:p>
+    <w:tbl>
+      <w:tblPr>
+        <w:tblW w:type="auto" w:w="0"/>
+        <w:jc w:val="center"/>
+        <w:tblLook w:firstColumn="1" w:firstRow="1" w:lastColumn="0" w:lastRow="0" w:noHBand="0" w:noVBand="1" w:val="04A0"/>
+      </w:tblPr>
+      <w:tblGrid>
+        <w:gridCol w:w="4752"/>
+        <w:gridCol w:w="4752"/>
+      </w:tblGrid>
+      <w:tr>
+        <w:tc>
+          <w:tcPr>
+            <w:tcW w:type="dxa" w:w="4968"/>
+          </w:tcPr>
+          <w:p>
+            <w:pPr>
+              <w:spacing w:before="40" w:after="80"/>
+              <w:jc w:val="center"/>
+            </w:pPr>
+            <w:r>
+              <w:drawing>
+                <wp:inline xmlns:a="http://schemas.openxmlformats.org/drawingml/2006/main" xmlns:pic="http://schemas.openxmlformats.org/drawingml/2006/picture">
+                  <wp:extent cx="2926080" cy="2328862"/>
+                  <wp:docPr id="29" name="Picture 29"/>
+                  <wp:cNvGraphicFramePr>
+                    <a:graphicFrameLocks noChangeAspect="1"/>
+                  </wp:cNvGraphicFramePr>
+                  <a:graphic>
+                    <a:graphicData uri="http://schemas.openxmlformats.org/drawingml/2006/picture">
+                      <pic:pic>
+                        <pic:nvPicPr>
+                          <pic:cNvPr id="0" name="dashboard_lab.png"/>
+                          <pic:cNvPicPr/>
+                        </pic:nvPicPr>
+                        <pic:blipFill>
+                          <a:blip r:embed="rId9"/>
+                          <a:stretch>
+                            <a:fillRect/>
+                          </a:stretch>
+                        </pic:blipFill>
+                        <pic:spPr>
+                          <a:xfrm>
+                            <a:off x="0" y="0"/>
+                            <a:ext cx="2926080" cy="2328862"/>
+                          </a:xfrm>
+                          <a:prstGeom prst="rect"/>
+                        </pic:spPr>
+                      </pic:pic>
+                    </a:graphicData>
+                  </a:graphic>
+                </wp:inline>
+              </w:drawing>
+            </w:r>
+          </w:p>
+        </w:tc>
+        <w:tc>
+          <w:tcPr>
+            <w:tcW w:type="dxa" w:w="4968"/>
+          </w:tcPr>
+          <w:p>
+            <w:pPr>
+              <w:spacing w:before="40" w:after="80"/>
+              <w:jc w:val="center"/>
+            </w:pPr>
+            <w:r>
+              <w:drawing>
+                <wp:inline xmlns:a="http://schemas.openxmlformats.org/drawingml/2006/main" xmlns:pic="http://schemas.openxmlformats.org/drawingml/2006/picture">
+                  <wp:extent cx="2926080" cy="2028825"/>
+                  <wp:docPr id="30" name="Picture 30"/>
+                  <wp:cNvGraphicFramePr>
+                    <a:graphicFrameLocks noChangeAspect="1"/>
+                  </wp:cNvGraphicFramePr>
+                  <a:graphic>
+                    <a:graphicData uri="http://schemas.openxmlformats.org/drawingml/2006/picture">
+                      <pic:pic>
+                        <pic:nvPicPr>
+                          <pic:cNvPr id="0" name="dashboard_waveform.png"/>
+                          <pic:cNvPicPr/>
+                        </pic:nvPicPr>
+                        <pic:blipFill>
+                          <a:blip r:embed="rId10"/>
+                          <a:stretch>
+                            <a:fillRect/>
+                          </a:stretch>
+                        </pic:blipFill>
+                        <pic:spPr>
+                          <a:xfrm>
+                            <a:off x="0" y="0"/>
+                            <a:ext cx="2926080" cy="2028825"/>
+                          </a:xfrm>
+                          <a:prstGeom prst="rect"/>
+                        </pic:spPr>
+                      </pic:pic>
+                    </a:graphicData>
+                  </a:graphic>
+                </wp:inline>
+              </w:drawing>
+            </w:r>
+          </w:p>
+        </w:tc>
+      </w:tr>
+    </w:tbl>
+    <w:tbl>
+      <w:tblPr>
+        <w:tblW w:type="auto" w:w="0"/>
+        <w:jc w:val="center"/>
+        <w:tblLook w:firstColumn="1" w:firstRow="1" w:lastColumn="0" w:lastRow="0" w:noHBand="0" w:noVBand="1" w:val="04A0"/>
+      </w:tblPr>
+      <w:tblGrid>
+        <w:gridCol w:w="4752"/>
+        <w:gridCol w:w="4752"/>
+      </w:tblGrid>
+      <w:tr>
+        <w:tc>
+          <w:tcPr>
+            <w:tcW w:type="dxa" w:w="4968"/>
+          </w:tcPr>
+          <w:p>
+            <w:pPr>
+              <w:spacing w:before="40" w:after="80"/>
+              <w:jc w:val="center"/>
+            </w:pPr>
+            <w:r>
+              <w:drawing>
+                <wp:inline xmlns:a="http://schemas.openxmlformats.org/drawingml/2006/main" xmlns:pic="http://schemas.openxmlformats.org/drawingml/2006/picture">
+                  <wp:extent cx="2926080" cy="1288732"/>
+                  <wp:docPr id="31" name="Picture 31"/>
+                  <wp:cNvGraphicFramePr>
+                    <a:graphicFrameLocks noChangeAspect="1"/>
+                  </wp:cNvGraphicFramePr>
+                  <a:graphic>
+                    <a:graphicData uri="http://schemas.openxmlformats.org/drawingml/2006/picture">
+                      <pic:pic>
+                        <pic:nvPicPr>
+                          <pic:cNvPr id="0" name="hardware_perspective.jpg"/>
+                          <pic:cNvPicPr/>
+                        </pic:nvPicPr>
+                        <pic:blipFill>
+                          <a:blip r:embed="rId11"/>
+                          <a:stretch>
+                            <a:fillRect/>
+                          </a:stretch>
+                        </pic:blipFill>
+                        <pic:spPr>
+                          <a:xfrm>
+                            <a:off x="0" y="0"/>
+                            <a:ext cx="2926080" cy="1288732"/>
+                          </a:xfrm>
+                          <a:prstGeom prst="rect"/>
+                        </pic:spPr>
+                      </pic:pic>
+                    </a:graphicData>
+                  </a:graphic>
+                </wp:inline>
+              </w:drawing>
+            </w:r>
+          </w:p>
+        </w:tc>
+        <w:tc>
+          <w:tcPr>
+            <w:tcW w:type="dxa" w:w="4968"/>
+          </w:tcPr>
+          <w:p>
+            <w:pPr>
+              <w:spacing w:before="40" w:after="80"/>
+              <w:jc w:val="center"/>
+            </w:pPr>
+            <w:r>
+              <w:drawing>
+                <wp:inline xmlns:a="http://schemas.openxmlformats.org/drawingml/2006/main" xmlns:pic="http://schemas.openxmlformats.org/drawingml/2006/picture">
+                  <wp:extent cx="2926080" cy="1428750"/>
+                  <wp:docPr id="32" name="Picture 32"/>
+                  <wp:cNvGraphicFramePr>
+                    <a:graphicFrameLocks noChangeAspect="1"/>
+                  </wp:cNvGraphicFramePr>
+                  <a:graphic>
+                    <a:graphicData uri="http://schemas.openxmlformats.org/drawingml/2006/picture">
+                      <pic:pic>
+                        <pic:nvPicPr>
+                          <pic:cNvPr id="0" name="hardware_topdown.jpg"/>
+                          <pic:cNvPicPr/>
+                        </pic:nvPicPr>
+                        <pic:blipFill>
+                          <a:blip r:embed="rId12"/>
+                          <a:stretch>
+                            <a:fillRect/>
+                          </a:stretch>
+                        </pic:blipFill>
+                        <pic:spPr>
+                          <a:xfrm>
+                            <a:off x="0" y="0"/>
+                            <a:ext cx="2926080" cy="1428750"/>
+                          </a:xfrm>
+                          <a:prstGeom prst="rect"/>
+                        </pic:spPr>
+                      </pic:pic>
+                    </a:graphicData>
+                  </a:graphic>
+                </wp:inline>
+              </w:drawing>
+            </w:r>
+          </w:p>
+        </w:tc>
+      </w:tr>
+    </w:tbl>
+    <w:p>
+      <w:pPr>
+        <w:spacing w:after="80"/>
+      </w:pPr>
     </w:p>
     <w:p>
       <w:pPr>
@@ -11377,170 +11753,6 @@
     </w:p>
     <w:p>
       <w:pPr>
-        <w:keepNext/>
-        <w:spacing w:before="80" w:after="80"/>
-        <w:jc w:val="center"/>
-      </w:pPr>
-      <w:r>
-        <w:drawing>
-          <wp:inline xmlns:a="http://schemas.openxmlformats.org/drawingml/2006/main" xmlns:pic="http://schemas.openxmlformats.org/drawingml/2006/picture">
-            <wp:extent cx="5029200" cy="4002732"/>
-            <wp:docPr id="33" name="Picture 33"/>
-            <wp:cNvGraphicFramePr>
-              <a:graphicFrameLocks noChangeAspect="1"/>
-            </wp:cNvGraphicFramePr>
-            <a:graphic>
-              <a:graphicData uri="http://schemas.openxmlformats.org/drawingml/2006/picture">
-                <pic:pic>
-                  <pic:nvPicPr>
-                    <pic:cNvPr id="0" name="dashboard_lab.png"/>
-                    <pic:cNvPicPr/>
-                  </pic:nvPicPr>
-                  <pic:blipFill>
-                    <a:blip r:embed="rId9"/>
-                    <a:stretch>
-                      <a:fillRect/>
-                    </a:stretch>
-                  </pic:blipFill>
-                  <pic:spPr>
-                    <a:xfrm>
-                      <a:off x="0" y="0"/>
-                      <a:ext cx="5029200" cy="4002732"/>
-                    </a:xfrm>
-                    <a:prstGeom prst="rect"/>
-                  </pic:spPr>
-                </pic:pic>
-              </a:graphicData>
-            </a:graphic>
-          </wp:inline>
-        </w:drawing>
-      </w:r>
-    </w:p>
-    <w:p>
-      <w:pPr>
-        <w:keepNext/>
-        <w:spacing w:before="80" w:after="80"/>
-        <w:jc w:val="center"/>
-      </w:pPr>
-      <w:r>
-        <w:drawing>
-          <wp:inline xmlns:a="http://schemas.openxmlformats.org/drawingml/2006/main" xmlns:pic="http://schemas.openxmlformats.org/drawingml/2006/picture">
-            <wp:extent cx="5029200" cy="3487043"/>
-            <wp:docPr id="34" name="Picture 34"/>
-            <wp:cNvGraphicFramePr>
-              <a:graphicFrameLocks noChangeAspect="1"/>
-            </wp:cNvGraphicFramePr>
-            <a:graphic>
-              <a:graphicData uri="http://schemas.openxmlformats.org/drawingml/2006/picture">
-                <pic:pic>
-                  <pic:nvPicPr>
-                    <pic:cNvPr id="0" name="dashboard_waveform.png"/>
-                    <pic:cNvPicPr/>
-                  </pic:nvPicPr>
-                  <pic:blipFill>
-                    <a:blip r:embed="rId10"/>
-                    <a:stretch>
-                      <a:fillRect/>
-                    </a:stretch>
-                  </pic:blipFill>
-                  <pic:spPr>
-                    <a:xfrm>
-                      <a:off x="0" y="0"/>
-                      <a:ext cx="5029200" cy="3487043"/>
-                    </a:xfrm>
-                    <a:prstGeom prst="rect"/>
-                  </pic:spPr>
-                </pic:pic>
-              </a:graphicData>
-            </a:graphic>
-          </wp:inline>
-        </w:drawing>
-      </w:r>
-    </w:p>
-    <w:p>
-      <w:pPr>
-        <w:keepNext/>
-        <w:spacing w:before="80" w:after="80"/>
-        <w:jc w:val="center"/>
-      </w:pPr>
-      <w:r>
-        <w:drawing>
-          <wp:inline xmlns:a="http://schemas.openxmlformats.org/drawingml/2006/main" xmlns:pic="http://schemas.openxmlformats.org/drawingml/2006/picture">
-            <wp:extent cx="5029200" cy="2215009"/>
-            <wp:docPr id="35" name="Picture 35"/>
-            <wp:cNvGraphicFramePr>
-              <a:graphicFrameLocks noChangeAspect="1"/>
-            </wp:cNvGraphicFramePr>
-            <a:graphic>
-              <a:graphicData uri="http://schemas.openxmlformats.org/drawingml/2006/picture">
-                <pic:pic>
-                  <pic:nvPicPr>
-                    <pic:cNvPr id="0" name="hardware_perspective.jpg"/>
-                    <pic:cNvPicPr/>
-                  </pic:nvPicPr>
-                  <pic:blipFill>
-                    <a:blip r:embed="rId11"/>
-                    <a:stretch>
-                      <a:fillRect/>
-                    </a:stretch>
-                  </pic:blipFill>
-                  <pic:spPr>
-                    <a:xfrm>
-                      <a:off x="0" y="0"/>
-                      <a:ext cx="5029200" cy="2215009"/>
-                    </a:xfrm>
-                    <a:prstGeom prst="rect"/>
-                  </pic:spPr>
-                </pic:pic>
-              </a:graphicData>
-            </a:graphic>
-          </wp:inline>
-        </w:drawing>
-      </w:r>
-    </w:p>
-    <w:p>
-      <w:pPr>
-        <w:keepNext/>
-        <w:spacing w:before="80" w:after="80"/>
-        <w:jc w:val="center"/>
-      </w:pPr>
-      <w:r>
-        <w:drawing>
-          <wp:inline xmlns:a="http://schemas.openxmlformats.org/drawingml/2006/main" xmlns:pic="http://schemas.openxmlformats.org/drawingml/2006/picture">
-            <wp:extent cx="5029200" cy="2455664"/>
-            <wp:docPr id="36" name="Picture 36"/>
-            <wp:cNvGraphicFramePr>
-              <a:graphicFrameLocks noChangeAspect="1"/>
-            </wp:cNvGraphicFramePr>
-            <a:graphic>
-              <a:graphicData uri="http://schemas.openxmlformats.org/drawingml/2006/picture">
-                <pic:pic>
-                  <pic:nvPicPr>
-                    <pic:cNvPr id="0" name="hardware_topdown.jpg"/>
-                    <pic:cNvPicPr/>
-                  </pic:nvPicPr>
-                  <pic:blipFill>
-                    <a:blip r:embed="rId12"/>
-                    <a:stretch>
-                      <a:fillRect/>
-                    </a:stretch>
-                  </pic:blipFill>
-                  <pic:spPr>
-                    <a:xfrm>
-                      <a:off x="0" y="0"/>
-                      <a:ext cx="5029200" cy="2455664"/>
-                    </a:xfrm>
-                    <a:prstGeom prst="rect"/>
-                  </pic:spPr>
-                </pic:pic>
-              </a:graphicData>
-            </a:graphic>
-          </wp:inline>
-        </w:drawing>
-      </w:r>
-    </w:p>
-    <w:p>
-      <w:pPr>
         <w:pStyle w:val="Heading3"/>
         <w:keepNext/>
         <w:spacing w:before="160" w:after="60"/>
@@ -11554,6 +11766,217 @@
         </w:rPr>
         <w:t>Interactive Hardware &amp; Digital Twin Controls:</w:t>
       </w:r>
+    </w:p>
+    <w:tbl>
+      <w:tblPr>
+        <w:tblW w:type="auto" w:w="0"/>
+        <w:jc w:val="center"/>
+        <w:tblLook w:firstColumn="1" w:firstRow="1" w:lastColumn="0" w:lastRow="0" w:noHBand="0" w:noVBand="1" w:val="04A0"/>
+      </w:tblPr>
+      <w:tblGrid>
+        <w:gridCol w:w="4752"/>
+        <w:gridCol w:w="4752"/>
+      </w:tblGrid>
+      <w:tr>
+        <w:tc>
+          <w:tcPr>
+            <w:tcW w:type="dxa" w:w="4968"/>
+          </w:tcPr>
+          <w:p>
+            <w:pPr>
+              <w:spacing w:before="40" w:after="80"/>
+              <w:jc w:val="center"/>
+            </w:pPr>
+            <w:r>
+              <w:drawing>
+                <wp:inline xmlns:a="http://schemas.openxmlformats.org/drawingml/2006/main" xmlns:pic="http://schemas.openxmlformats.org/drawingml/2006/picture">
+                  <wp:extent cx="2926080" cy="2328862"/>
+                  <wp:docPr id="33" name="Picture 33"/>
+                  <wp:cNvGraphicFramePr>
+                    <a:graphicFrameLocks noChangeAspect="1"/>
+                  </wp:cNvGraphicFramePr>
+                  <a:graphic>
+                    <a:graphicData uri="http://schemas.openxmlformats.org/drawingml/2006/picture">
+                      <pic:pic>
+                        <pic:nvPicPr>
+                          <pic:cNvPr id="0" name="dashboard_lab.png"/>
+                          <pic:cNvPicPr/>
+                        </pic:nvPicPr>
+                        <pic:blipFill>
+                          <a:blip r:embed="rId9"/>
+                          <a:stretch>
+                            <a:fillRect/>
+                          </a:stretch>
+                        </pic:blipFill>
+                        <pic:spPr>
+                          <a:xfrm>
+                            <a:off x="0" y="0"/>
+                            <a:ext cx="2926080" cy="2328862"/>
+                          </a:xfrm>
+                          <a:prstGeom prst="rect"/>
+                        </pic:spPr>
+                      </pic:pic>
+                    </a:graphicData>
+                  </a:graphic>
+                </wp:inline>
+              </w:drawing>
+            </w:r>
+          </w:p>
+        </w:tc>
+        <w:tc>
+          <w:tcPr>
+            <w:tcW w:type="dxa" w:w="4968"/>
+          </w:tcPr>
+          <w:p>
+            <w:pPr>
+              <w:spacing w:before="40" w:after="80"/>
+              <w:jc w:val="center"/>
+            </w:pPr>
+            <w:r>
+              <w:drawing>
+                <wp:inline xmlns:a="http://schemas.openxmlformats.org/drawingml/2006/main" xmlns:pic="http://schemas.openxmlformats.org/drawingml/2006/picture">
+                  <wp:extent cx="2926080" cy="2028825"/>
+                  <wp:docPr id="34" name="Picture 34"/>
+                  <wp:cNvGraphicFramePr>
+                    <a:graphicFrameLocks noChangeAspect="1"/>
+                  </wp:cNvGraphicFramePr>
+                  <a:graphic>
+                    <a:graphicData uri="http://schemas.openxmlformats.org/drawingml/2006/picture">
+                      <pic:pic>
+                        <pic:nvPicPr>
+                          <pic:cNvPr id="0" name="dashboard_waveform.png"/>
+                          <pic:cNvPicPr/>
+                        </pic:nvPicPr>
+                        <pic:blipFill>
+                          <a:blip r:embed="rId10"/>
+                          <a:stretch>
+                            <a:fillRect/>
+                          </a:stretch>
+                        </pic:blipFill>
+                        <pic:spPr>
+                          <a:xfrm>
+                            <a:off x="0" y="0"/>
+                            <a:ext cx="2926080" cy="2028825"/>
+                          </a:xfrm>
+                          <a:prstGeom prst="rect"/>
+                        </pic:spPr>
+                      </pic:pic>
+                    </a:graphicData>
+                  </a:graphic>
+                </wp:inline>
+              </w:drawing>
+            </w:r>
+          </w:p>
+        </w:tc>
+      </w:tr>
+    </w:tbl>
+    <w:tbl>
+      <w:tblPr>
+        <w:tblW w:type="auto" w:w="0"/>
+        <w:jc w:val="center"/>
+        <w:tblLook w:firstColumn="1" w:firstRow="1" w:lastColumn="0" w:lastRow="0" w:noHBand="0" w:noVBand="1" w:val="04A0"/>
+      </w:tblPr>
+      <w:tblGrid>
+        <w:gridCol w:w="4752"/>
+        <w:gridCol w:w="4752"/>
+      </w:tblGrid>
+      <w:tr>
+        <w:tc>
+          <w:tcPr>
+            <w:tcW w:type="dxa" w:w="4968"/>
+          </w:tcPr>
+          <w:p>
+            <w:pPr>
+              <w:spacing w:before="40" w:after="80"/>
+              <w:jc w:val="center"/>
+            </w:pPr>
+            <w:r>
+              <w:drawing>
+                <wp:inline xmlns:a="http://schemas.openxmlformats.org/drawingml/2006/main" xmlns:pic="http://schemas.openxmlformats.org/drawingml/2006/picture">
+                  <wp:extent cx="2926080" cy="1288732"/>
+                  <wp:docPr id="35" name="Picture 35"/>
+                  <wp:cNvGraphicFramePr>
+                    <a:graphicFrameLocks noChangeAspect="1"/>
+                  </wp:cNvGraphicFramePr>
+                  <a:graphic>
+                    <a:graphicData uri="http://schemas.openxmlformats.org/drawingml/2006/picture">
+                      <pic:pic>
+                        <pic:nvPicPr>
+                          <pic:cNvPr id="0" name="hardware_perspective.jpg"/>
+                          <pic:cNvPicPr/>
+                        </pic:nvPicPr>
+                        <pic:blipFill>
+                          <a:blip r:embed="rId11"/>
+                          <a:stretch>
+                            <a:fillRect/>
+                          </a:stretch>
+                        </pic:blipFill>
+                        <pic:spPr>
+                          <a:xfrm>
+                            <a:off x="0" y="0"/>
+                            <a:ext cx="2926080" cy="1288732"/>
+                          </a:xfrm>
+                          <a:prstGeom prst="rect"/>
+                        </pic:spPr>
+                      </pic:pic>
+                    </a:graphicData>
+                  </a:graphic>
+                </wp:inline>
+              </w:drawing>
+            </w:r>
+          </w:p>
+        </w:tc>
+        <w:tc>
+          <w:tcPr>
+            <w:tcW w:type="dxa" w:w="4968"/>
+          </w:tcPr>
+          <w:p>
+            <w:pPr>
+              <w:spacing w:before="40" w:after="80"/>
+              <w:jc w:val="center"/>
+            </w:pPr>
+            <w:r>
+              <w:drawing>
+                <wp:inline xmlns:a="http://schemas.openxmlformats.org/drawingml/2006/main" xmlns:pic="http://schemas.openxmlformats.org/drawingml/2006/picture">
+                  <wp:extent cx="2926080" cy="1428750"/>
+                  <wp:docPr id="36" name="Picture 36"/>
+                  <wp:cNvGraphicFramePr>
+                    <a:graphicFrameLocks noChangeAspect="1"/>
+                  </wp:cNvGraphicFramePr>
+                  <a:graphic>
+                    <a:graphicData uri="http://schemas.openxmlformats.org/drawingml/2006/picture">
+                      <pic:pic>
+                        <pic:nvPicPr>
+                          <pic:cNvPr id="0" name="hardware_topdown.jpg"/>
+                          <pic:cNvPicPr/>
+                        </pic:nvPicPr>
+                        <pic:blipFill>
+                          <a:blip r:embed="rId12"/>
+                          <a:stretch>
+                            <a:fillRect/>
+                          </a:stretch>
+                        </pic:blipFill>
+                        <pic:spPr>
+                          <a:xfrm>
+                            <a:off x="0" y="0"/>
+                            <a:ext cx="2926080" cy="1428750"/>
+                          </a:xfrm>
+                          <a:prstGeom prst="rect"/>
+                        </pic:spPr>
+                      </pic:pic>
+                    </a:graphicData>
+                  </a:graphic>
+                </wp:inline>
+              </w:drawing>
+            </w:r>
+          </w:p>
+        </w:tc>
+      </w:tr>
+    </w:tbl>
+    <w:p>
+      <w:pPr>
+        <w:spacing w:after="80"/>
+      </w:pPr>
     </w:p>
     <w:p>
       <w:pPr>
@@ -12712,170 +13135,6 @@
     </w:p>
     <w:p>
       <w:pPr>
-        <w:keepNext/>
-        <w:spacing w:before="80" w:after="80"/>
-        <w:jc w:val="center"/>
-      </w:pPr>
-      <w:r>
-        <w:drawing>
-          <wp:inline xmlns:a="http://schemas.openxmlformats.org/drawingml/2006/main" xmlns:pic="http://schemas.openxmlformats.org/drawingml/2006/picture">
-            <wp:extent cx="5029200" cy="4002732"/>
-            <wp:docPr id="37" name="Picture 37"/>
-            <wp:cNvGraphicFramePr>
-              <a:graphicFrameLocks noChangeAspect="1"/>
-            </wp:cNvGraphicFramePr>
-            <a:graphic>
-              <a:graphicData uri="http://schemas.openxmlformats.org/drawingml/2006/picture">
-                <pic:pic>
-                  <pic:nvPicPr>
-                    <pic:cNvPr id="0" name="dashboard_lab.png"/>
-                    <pic:cNvPicPr/>
-                  </pic:nvPicPr>
-                  <pic:blipFill>
-                    <a:blip r:embed="rId9"/>
-                    <a:stretch>
-                      <a:fillRect/>
-                    </a:stretch>
-                  </pic:blipFill>
-                  <pic:spPr>
-                    <a:xfrm>
-                      <a:off x="0" y="0"/>
-                      <a:ext cx="5029200" cy="4002732"/>
-                    </a:xfrm>
-                    <a:prstGeom prst="rect"/>
-                  </pic:spPr>
-                </pic:pic>
-              </a:graphicData>
-            </a:graphic>
-          </wp:inline>
-        </w:drawing>
-      </w:r>
-    </w:p>
-    <w:p>
-      <w:pPr>
-        <w:keepNext/>
-        <w:spacing w:before="80" w:after="80"/>
-        <w:jc w:val="center"/>
-      </w:pPr>
-      <w:r>
-        <w:drawing>
-          <wp:inline xmlns:a="http://schemas.openxmlformats.org/drawingml/2006/main" xmlns:pic="http://schemas.openxmlformats.org/drawingml/2006/picture">
-            <wp:extent cx="5029200" cy="3487043"/>
-            <wp:docPr id="38" name="Picture 38"/>
-            <wp:cNvGraphicFramePr>
-              <a:graphicFrameLocks noChangeAspect="1"/>
-            </wp:cNvGraphicFramePr>
-            <a:graphic>
-              <a:graphicData uri="http://schemas.openxmlformats.org/drawingml/2006/picture">
-                <pic:pic>
-                  <pic:nvPicPr>
-                    <pic:cNvPr id="0" name="dashboard_waveform.png"/>
-                    <pic:cNvPicPr/>
-                  </pic:nvPicPr>
-                  <pic:blipFill>
-                    <a:blip r:embed="rId10"/>
-                    <a:stretch>
-                      <a:fillRect/>
-                    </a:stretch>
-                  </pic:blipFill>
-                  <pic:spPr>
-                    <a:xfrm>
-                      <a:off x="0" y="0"/>
-                      <a:ext cx="5029200" cy="3487043"/>
-                    </a:xfrm>
-                    <a:prstGeom prst="rect"/>
-                  </pic:spPr>
-                </pic:pic>
-              </a:graphicData>
-            </a:graphic>
-          </wp:inline>
-        </w:drawing>
-      </w:r>
-    </w:p>
-    <w:p>
-      <w:pPr>
-        <w:keepNext/>
-        <w:spacing w:before="80" w:after="80"/>
-        <w:jc w:val="center"/>
-      </w:pPr>
-      <w:r>
-        <w:drawing>
-          <wp:inline xmlns:a="http://schemas.openxmlformats.org/drawingml/2006/main" xmlns:pic="http://schemas.openxmlformats.org/drawingml/2006/picture">
-            <wp:extent cx="5029200" cy="2215009"/>
-            <wp:docPr id="39" name="Picture 39"/>
-            <wp:cNvGraphicFramePr>
-              <a:graphicFrameLocks noChangeAspect="1"/>
-            </wp:cNvGraphicFramePr>
-            <a:graphic>
-              <a:graphicData uri="http://schemas.openxmlformats.org/drawingml/2006/picture">
-                <pic:pic>
-                  <pic:nvPicPr>
-                    <pic:cNvPr id="0" name="hardware_perspective.jpg"/>
-                    <pic:cNvPicPr/>
-                  </pic:nvPicPr>
-                  <pic:blipFill>
-                    <a:blip r:embed="rId11"/>
-                    <a:stretch>
-                      <a:fillRect/>
-                    </a:stretch>
-                  </pic:blipFill>
-                  <pic:spPr>
-                    <a:xfrm>
-                      <a:off x="0" y="0"/>
-                      <a:ext cx="5029200" cy="2215009"/>
-                    </a:xfrm>
-                    <a:prstGeom prst="rect"/>
-                  </pic:spPr>
-                </pic:pic>
-              </a:graphicData>
-            </a:graphic>
-          </wp:inline>
-        </w:drawing>
-      </w:r>
-    </w:p>
-    <w:p>
-      <w:pPr>
-        <w:keepNext/>
-        <w:spacing w:before="80" w:after="80"/>
-        <w:jc w:val="center"/>
-      </w:pPr>
-      <w:r>
-        <w:drawing>
-          <wp:inline xmlns:a="http://schemas.openxmlformats.org/drawingml/2006/main" xmlns:pic="http://schemas.openxmlformats.org/drawingml/2006/picture">
-            <wp:extent cx="5029200" cy="2455664"/>
-            <wp:docPr id="40" name="Picture 40"/>
-            <wp:cNvGraphicFramePr>
-              <a:graphicFrameLocks noChangeAspect="1"/>
-            </wp:cNvGraphicFramePr>
-            <a:graphic>
-              <a:graphicData uri="http://schemas.openxmlformats.org/drawingml/2006/picture">
-                <pic:pic>
-                  <pic:nvPicPr>
-                    <pic:cNvPr id="0" name="hardware_topdown.jpg"/>
-                    <pic:cNvPicPr/>
-                  </pic:nvPicPr>
-                  <pic:blipFill>
-                    <a:blip r:embed="rId12"/>
-                    <a:stretch>
-                      <a:fillRect/>
-                    </a:stretch>
-                  </pic:blipFill>
-                  <pic:spPr>
-                    <a:xfrm>
-                      <a:off x="0" y="0"/>
-                      <a:ext cx="5029200" cy="2455664"/>
-                    </a:xfrm>
-                    <a:prstGeom prst="rect"/>
-                  </pic:spPr>
-                </pic:pic>
-              </a:graphicData>
-            </a:graphic>
-          </wp:inline>
-        </w:drawing>
-      </w:r>
-    </w:p>
-    <w:p>
-      <w:pPr>
         <w:pStyle w:val="Heading3"/>
         <w:keepNext/>
         <w:spacing w:before="160" w:after="60"/>
@@ -12889,6 +13148,217 @@
         </w:rPr>
         <w:t>Interactive Hardware &amp; Digital Twin Controls:</w:t>
       </w:r>
+    </w:p>
+    <w:tbl>
+      <w:tblPr>
+        <w:tblW w:type="auto" w:w="0"/>
+        <w:jc w:val="center"/>
+        <w:tblLook w:firstColumn="1" w:firstRow="1" w:lastColumn="0" w:lastRow="0" w:noHBand="0" w:noVBand="1" w:val="04A0"/>
+      </w:tblPr>
+      <w:tblGrid>
+        <w:gridCol w:w="4752"/>
+        <w:gridCol w:w="4752"/>
+      </w:tblGrid>
+      <w:tr>
+        <w:tc>
+          <w:tcPr>
+            <w:tcW w:type="dxa" w:w="4968"/>
+          </w:tcPr>
+          <w:p>
+            <w:pPr>
+              <w:spacing w:before="40" w:after="80"/>
+              <w:jc w:val="center"/>
+            </w:pPr>
+            <w:r>
+              <w:drawing>
+                <wp:inline xmlns:a="http://schemas.openxmlformats.org/drawingml/2006/main" xmlns:pic="http://schemas.openxmlformats.org/drawingml/2006/picture">
+                  <wp:extent cx="2926080" cy="2328862"/>
+                  <wp:docPr id="37" name="Picture 37"/>
+                  <wp:cNvGraphicFramePr>
+                    <a:graphicFrameLocks noChangeAspect="1"/>
+                  </wp:cNvGraphicFramePr>
+                  <a:graphic>
+                    <a:graphicData uri="http://schemas.openxmlformats.org/drawingml/2006/picture">
+                      <pic:pic>
+                        <pic:nvPicPr>
+                          <pic:cNvPr id="0" name="dashboard_lab.png"/>
+                          <pic:cNvPicPr/>
+                        </pic:nvPicPr>
+                        <pic:blipFill>
+                          <a:blip r:embed="rId9"/>
+                          <a:stretch>
+                            <a:fillRect/>
+                          </a:stretch>
+                        </pic:blipFill>
+                        <pic:spPr>
+                          <a:xfrm>
+                            <a:off x="0" y="0"/>
+                            <a:ext cx="2926080" cy="2328862"/>
+                          </a:xfrm>
+                          <a:prstGeom prst="rect"/>
+                        </pic:spPr>
+                      </pic:pic>
+                    </a:graphicData>
+                  </a:graphic>
+                </wp:inline>
+              </w:drawing>
+            </w:r>
+          </w:p>
+        </w:tc>
+        <w:tc>
+          <w:tcPr>
+            <w:tcW w:type="dxa" w:w="4968"/>
+          </w:tcPr>
+          <w:p>
+            <w:pPr>
+              <w:spacing w:before="40" w:after="80"/>
+              <w:jc w:val="center"/>
+            </w:pPr>
+            <w:r>
+              <w:drawing>
+                <wp:inline xmlns:a="http://schemas.openxmlformats.org/drawingml/2006/main" xmlns:pic="http://schemas.openxmlformats.org/drawingml/2006/picture">
+                  <wp:extent cx="2926080" cy="2028825"/>
+                  <wp:docPr id="38" name="Picture 38"/>
+                  <wp:cNvGraphicFramePr>
+                    <a:graphicFrameLocks noChangeAspect="1"/>
+                  </wp:cNvGraphicFramePr>
+                  <a:graphic>
+                    <a:graphicData uri="http://schemas.openxmlformats.org/drawingml/2006/picture">
+                      <pic:pic>
+                        <pic:nvPicPr>
+                          <pic:cNvPr id="0" name="dashboard_waveform.png"/>
+                          <pic:cNvPicPr/>
+                        </pic:nvPicPr>
+                        <pic:blipFill>
+                          <a:blip r:embed="rId10"/>
+                          <a:stretch>
+                            <a:fillRect/>
+                          </a:stretch>
+                        </pic:blipFill>
+                        <pic:spPr>
+                          <a:xfrm>
+                            <a:off x="0" y="0"/>
+                            <a:ext cx="2926080" cy="2028825"/>
+                          </a:xfrm>
+                          <a:prstGeom prst="rect"/>
+                        </pic:spPr>
+                      </pic:pic>
+                    </a:graphicData>
+                  </a:graphic>
+                </wp:inline>
+              </w:drawing>
+            </w:r>
+          </w:p>
+        </w:tc>
+      </w:tr>
+    </w:tbl>
+    <w:tbl>
+      <w:tblPr>
+        <w:tblW w:type="auto" w:w="0"/>
+        <w:jc w:val="center"/>
+        <w:tblLook w:firstColumn="1" w:firstRow="1" w:lastColumn="0" w:lastRow="0" w:noHBand="0" w:noVBand="1" w:val="04A0"/>
+      </w:tblPr>
+      <w:tblGrid>
+        <w:gridCol w:w="4752"/>
+        <w:gridCol w:w="4752"/>
+      </w:tblGrid>
+      <w:tr>
+        <w:tc>
+          <w:tcPr>
+            <w:tcW w:type="dxa" w:w="4968"/>
+          </w:tcPr>
+          <w:p>
+            <w:pPr>
+              <w:spacing w:before="40" w:after="80"/>
+              <w:jc w:val="center"/>
+            </w:pPr>
+            <w:r>
+              <w:drawing>
+                <wp:inline xmlns:a="http://schemas.openxmlformats.org/drawingml/2006/main" xmlns:pic="http://schemas.openxmlformats.org/drawingml/2006/picture">
+                  <wp:extent cx="2926080" cy="1288732"/>
+                  <wp:docPr id="39" name="Picture 39"/>
+                  <wp:cNvGraphicFramePr>
+                    <a:graphicFrameLocks noChangeAspect="1"/>
+                  </wp:cNvGraphicFramePr>
+                  <a:graphic>
+                    <a:graphicData uri="http://schemas.openxmlformats.org/drawingml/2006/picture">
+                      <pic:pic>
+                        <pic:nvPicPr>
+                          <pic:cNvPr id="0" name="hardware_perspective.jpg"/>
+                          <pic:cNvPicPr/>
+                        </pic:nvPicPr>
+                        <pic:blipFill>
+                          <a:blip r:embed="rId11"/>
+                          <a:stretch>
+                            <a:fillRect/>
+                          </a:stretch>
+                        </pic:blipFill>
+                        <pic:spPr>
+                          <a:xfrm>
+                            <a:off x="0" y="0"/>
+                            <a:ext cx="2926080" cy="1288732"/>
+                          </a:xfrm>
+                          <a:prstGeom prst="rect"/>
+                        </pic:spPr>
+                      </pic:pic>
+                    </a:graphicData>
+                  </a:graphic>
+                </wp:inline>
+              </w:drawing>
+            </w:r>
+          </w:p>
+        </w:tc>
+        <w:tc>
+          <w:tcPr>
+            <w:tcW w:type="dxa" w:w="4968"/>
+          </w:tcPr>
+          <w:p>
+            <w:pPr>
+              <w:spacing w:before="40" w:after="80"/>
+              <w:jc w:val="center"/>
+            </w:pPr>
+            <w:r>
+              <w:drawing>
+                <wp:inline xmlns:a="http://schemas.openxmlformats.org/drawingml/2006/main" xmlns:pic="http://schemas.openxmlformats.org/drawingml/2006/picture">
+                  <wp:extent cx="2926080" cy="1428750"/>
+                  <wp:docPr id="40" name="Picture 40"/>
+                  <wp:cNvGraphicFramePr>
+                    <a:graphicFrameLocks noChangeAspect="1"/>
+                  </wp:cNvGraphicFramePr>
+                  <a:graphic>
+                    <a:graphicData uri="http://schemas.openxmlformats.org/drawingml/2006/picture">
+                      <pic:pic>
+                        <pic:nvPicPr>
+                          <pic:cNvPr id="0" name="hardware_topdown.jpg"/>
+                          <pic:cNvPicPr/>
+                        </pic:nvPicPr>
+                        <pic:blipFill>
+                          <a:blip r:embed="rId12"/>
+                          <a:stretch>
+                            <a:fillRect/>
+                          </a:stretch>
+                        </pic:blipFill>
+                        <pic:spPr>
+                          <a:xfrm>
+                            <a:off x="0" y="0"/>
+                            <a:ext cx="2926080" cy="1428750"/>
+                          </a:xfrm>
+                          <a:prstGeom prst="rect"/>
+                        </pic:spPr>
+                      </pic:pic>
+                    </a:graphicData>
+                  </a:graphic>
+                </wp:inline>
+              </w:drawing>
+            </w:r>
+          </w:p>
+        </w:tc>
+      </w:tr>
+    </w:tbl>
+    <w:p>
+      <w:pPr>
+        <w:spacing w:after="80"/>
+      </w:pPr>
     </w:p>
     <w:p>
       <w:pPr>

</xml_diff>